<commit_message>
subimos el word actualizado
</commit_message>
<xml_diff>
--- a/SONAURA.docx
+++ b/SONAURA.docx
@@ -899,6 +899,48 @@
           </w:p>
         </w:tc>
       </w:tr>
+      <w:tr>
+        <w:trPr>
+          <w:trHeight w:val="1872"/>
+        </w:trPr>
+        <w:tc>
+          <w:tcPr>
+            <w:tcW w:w="2520" w:type="dxa"/>
+            <w:vAlign w:val="center"/>
+          </w:tcPr>
+          <w:p>
+            <w:pPr>
+              <w:pStyle w:val="NmerodepginadeTDC"/>
+            </w:pPr>
+            <w:r>
+              <w:rPr>
+                <w:lang w:bidi="es-ES"/>
+              </w:rPr>
+              <w:t>0</w:t>
+            </w:r>
+            <w:r>
+              <w:rPr>
+                <w:lang w:bidi="es-ES"/>
+              </w:rPr>
+              <w:t>2</w:t>
+            </w:r>
+          </w:p>
+        </w:tc>
+        <w:tc>
+          <w:tcPr>
+            <w:tcW w:w="5805" w:type="dxa"/>
+            <w:vAlign w:val="center"/>
+          </w:tcPr>
+          <w:p>
+            <w:pPr>
+              <w:pStyle w:val="TItledeTDC"/>
+            </w:pPr>
+            <w:r>
+              <w:t>ESPECIFICACIÓN, GUIAS Y PLANIFICACIÓN</w:t>
+            </w:r>
+          </w:p>
+        </w:tc>
+      </w:tr>
     </w:tbl>
     <w:p>
       <w:pPr>
@@ -924,7 +966,7 @@
         <mc:AlternateContent>
           <mc:Choice Requires="wps">
             <w:drawing>
-              <wp:anchor distT="0" distB="0" distL="114300" distR="114300" simplePos="0" relativeHeight="251663360" behindDoc="1" locked="1" layoutInCell="1" allowOverlap="1" wp14:anchorId="15801C00" wp14:editId="099B3896">
+              <wp:anchor distT="0" distB="0" distL="114300" distR="114300" simplePos="0" relativeHeight="251663360" behindDoc="1" locked="1" layoutInCell="1" allowOverlap="1" wp14:anchorId="15801C00" wp14:editId="67630199">
                 <wp:simplePos x="0" y="0"/>
                 <wp:positionH relativeFrom="column">
                   <wp:posOffset>-1828800</wp:posOffset>
@@ -1112,7 +1154,7 @@
         </w:trPr>
         <w:tc>
           <w:tcPr>
-            <w:tcW w:w="8325" w:type="dxa"/>
+            <w:tcW w:w="8623" w:type="dxa"/>
             <w:gridSpan w:val="2"/>
             <w:tcBorders>
               <w:bottom w:val="single" w:sz="8" w:space="0" w:color="C9C9C9" w:themeColor="text2" w:themeTint="40"/>
@@ -1167,7 +1209,7 @@
         </w:trPr>
         <w:tc>
           <w:tcPr>
-            <w:tcW w:w="8325" w:type="dxa"/>
+            <w:tcW w:w="8623" w:type="dxa"/>
             <w:gridSpan w:val="2"/>
             <w:tcBorders>
               <w:top w:val="single" w:sz="8" w:space="0" w:color="C9C9C9" w:themeColor="text2" w:themeTint="40"/>
@@ -1209,7 +1251,7 @@
         </w:trPr>
         <w:tc>
           <w:tcPr>
-            <w:tcW w:w="8325" w:type="dxa"/>
+            <w:tcW w:w="8623" w:type="dxa"/>
             <w:gridSpan w:val="2"/>
             <w:tcBorders>
               <w:top w:val="nil"/>
@@ -1366,16 +1408,7 @@
                 <w:sz w:val="32"/>
                 <w:szCs w:val="32"/>
               </w:rPr>
-              <w:t xml:space="preserve">SOLUCIÓN </w:t>
-            </w:r>
-            <w:r>
-              <w:rPr>
-                <w:b/>
-                <w:bCs/>
-                <w:sz w:val="32"/>
-                <w:szCs w:val="32"/>
-              </w:rPr>
-              <w:t>EXISTENTE</w:t>
+              <w:t>SOLUCIÓN EXISTENTE</w:t>
             </w:r>
           </w:p>
           <w:p>
@@ -1675,9 +1708,473 @@
         </w:tc>
       </w:tr>
     </w:tbl>
-    <w:p/>
+    <w:p>
+      <w:pPr>
+        <w:ind w:left="142"/>
+      </w:pPr>
+      <w:r>
+        <w:rPr>
+          <w:noProof/>
+          <w:lang w:bidi="es-ES"/>
+        </w:rPr>
+        <mc:AlternateContent>
+          <mc:Choice Requires="wps">
+            <w:drawing>
+              <wp:anchor distT="0" distB="0" distL="114300" distR="114300" simplePos="0" relativeHeight="251675648" behindDoc="1" locked="1" layoutInCell="1" allowOverlap="1" wp14:anchorId="4FBFBBF7" wp14:editId="5B73620D">
+                <wp:simplePos x="0" y="0"/>
+                <wp:positionH relativeFrom="page">
+                  <wp:align>left</wp:align>
+                </wp:positionH>
+                <wp:positionV relativeFrom="paragraph">
+                  <wp:posOffset>-6377940</wp:posOffset>
+                </wp:positionV>
+                <wp:extent cx="1377315" cy="10888980"/>
+                <wp:effectExtent l="0" t="0" r="0" b="7620"/>
+                <wp:wrapNone/>
+                <wp:docPr id="2128784141" name="Rectángulo 2">
+                  <a:extLst xmlns:a="http://schemas.openxmlformats.org/drawingml/2006/main">
+                    <a:ext uri="{C183D7F6-B498-43B3-948B-1728B52AA6E4}">
+                      <adec:decorative xmlns:adec="http://schemas.microsoft.com/office/drawing/2017/decorative" val="1"/>
+                    </a:ext>
+                  </a:extLst>
+                </wp:docPr>
+                <wp:cNvGraphicFramePr/>
+                <a:graphic xmlns:a="http://schemas.openxmlformats.org/drawingml/2006/main">
+                  <a:graphicData uri="http://schemas.microsoft.com/office/word/2010/wordprocessingShape">
+                    <wps:wsp>
+                      <wps:cNvSpPr/>
+                      <wps:spPr>
+                        <a:xfrm>
+                          <a:off x="0" y="0"/>
+                          <a:ext cx="1377538" cy="10888980"/>
+                        </a:xfrm>
+                        <a:prstGeom prst="rect">
+                          <a:avLst/>
+                        </a:prstGeom>
+                        <a:solidFill>
+                          <a:schemeClr val="tx1">
+                            <a:lumMod val="75000"/>
+                            <a:lumOff val="25000"/>
+                          </a:schemeClr>
+                        </a:solidFill>
+                        <a:ln>
+                          <a:noFill/>
+                        </a:ln>
+                      </wps:spPr>
+                      <wps:style>
+                        <a:lnRef idx="2">
+                          <a:schemeClr val="accent1">
+                            <a:shade val="50000"/>
+                          </a:schemeClr>
+                        </a:lnRef>
+                        <a:fillRef idx="1">
+                          <a:schemeClr val="accent1"/>
+                        </a:fillRef>
+                        <a:effectRef idx="0">
+                          <a:schemeClr val="accent1"/>
+                        </a:effectRef>
+                        <a:fontRef idx="minor">
+                          <a:schemeClr val="lt1"/>
+                        </a:fontRef>
+                      </wps:style>
+                      <wps:txbx>
+                        <w:txbxContent>
+                          <w:p>
+                            <w:pPr>
+                              <w:pStyle w:val="Piedepginablanco"/>
+                            </w:pPr>
+                            <w:r>
+                              <w:rPr>
+                                <w:lang w:bidi="es-ES"/>
+                              </w:rPr>
+                              <w:t>2</w:t>
+                            </w:r>
+                          </w:p>
+                        </w:txbxContent>
+                      </wps:txbx>
+                      <wps:bodyPr rot="0" spcFirstLastPara="0" vertOverflow="overflow" horzOverflow="overflow" vert="horz" wrap="square" lIns="91440" tIns="45720" rIns="91440" bIns="45720" numCol="1" spcCol="0" rtlCol="0" fromWordArt="0" anchor="b" anchorCtr="0" forceAA="0" compatLnSpc="1">
+                        <a:prstTxWarp prst="textNoShape">
+                          <a:avLst/>
+                        </a:prstTxWarp>
+                        <a:noAutofit/>
+                      </wps:bodyPr>
+                    </wps:wsp>
+                  </a:graphicData>
+                </a:graphic>
+                <wp14:sizeRelH relativeFrom="margin">
+                  <wp14:pctWidth>0</wp14:pctWidth>
+                </wp14:sizeRelH>
+                <wp14:sizeRelV relativeFrom="margin">
+                  <wp14:pctHeight>0</wp14:pctHeight>
+                </wp14:sizeRelV>
+              </wp:anchor>
+            </w:drawing>
+          </mc:Choice>
+          <mc:Fallback>
+            <w:pict>
+              <v:rect w14:anchorId="4FBFBBF7" id="_x0000_s1031" alt="&quot;&quot;" style="position:absolute;left:0;text-align:left;margin-left:0;margin-top:-502.2pt;width:108.45pt;height:857.4pt;z-index:-251640832;visibility:visible;mso-wrap-style:square;mso-width-percent:0;mso-height-percent:0;mso-wrap-distance-left:9pt;mso-wrap-distance-top:0;mso-wrap-distance-right:9pt;mso-wrap-distance-bottom:0;mso-position-horizontal:left;mso-position-horizontal-relative:page;mso-position-vertical:absolute;mso-position-vertical-relative:text;mso-width-percent:0;mso-height-percent:0;mso-width-relative:margin;mso-height-relative:margin;v-text-anchor:bottom" o:gfxdata="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" fillcolor="#404040 [2429]" stroked="f" strokeweight="1pt">
+                <v:textbox>
+                  <w:txbxContent>
+                    <w:p>
+                      <w:pPr>
+                        <w:pStyle w:val="Piedepginablanco"/>
+                      </w:pPr>
+                      <w:r>
+                        <w:rPr>
+                          <w:lang w:bidi="es-ES"/>
+                        </w:rPr>
+                        <w:t>2</w:t>
+                      </w:r>
+                    </w:p>
+                  </w:txbxContent>
+                </v:textbox>
+                <w10:wrap anchorx="page"/>
+                <w10:anchorlock/>
+              </v:rect>
+            </w:pict>
+          </mc:Fallback>
+        </mc:AlternateContent>
+      </w:r>
+    </w:p>
+    <w:p>
+      <w:pPr>
+        <w:ind w:left="142"/>
+      </w:pPr>
+    </w:p>
+    <w:p>
+      <w:pPr>
+        <w:ind w:left="142"/>
+      </w:pPr>
+    </w:p>
+    <w:p>
+      <w:pPr>
+        <w:ind w:left="142"/>
+      </w:pPr>
+    </w:p>
+    <w:p>
+      <w:pPr>
+        <w:ind w:left="142"/>
+      </w:pPr>
+    </w:p>
+    <w:p>
+      <w:pPr>
+        <w:ind w:left="142"/>
+      </w:pPr>
+    </w:p>
+    <w:p>
+      <w:pPr>
+        <w:ind w:left="142"/>
+      </w:pPr>
+    </w:p>
+    <w:p>
+      <w:pPr>
+        <w:ind w:left="142"/>
+      </w:pPr>
+    </w:p>
+    <w:p>
+      <w:pPr>
+        <w:ind w:left="142"/>
+      </w:pPr>
+    </w:p>
+    <w:tbl>
+      <w:tblPr>
+        <w:tblStyle w:val="Tablageneral"/>
+        <w:tblW w:w="8623" w:type="dxa"/>
+        <w:tblLayout w:type="fixed"/>
+        <w:tblCellMar>
+          <w:right w:w="0" w:type="dxa"/>
+        </w:tblCellMar>
+        <w:tblLook w:val="0620" w:firstRow="1" w:lastRow="0" w:firstColumn="0" w:lastColumn="0" w:noHBand="1" w:noVBand="1"/>
+      </w:tblPr>
+      <w:tblGrid>
+        <w:gridCol w:w="8623"/>
+      </w:tblGrid>
+      <w:tr>
+        <w:trPr>
+          <w:cnfStyle w:val="100000000000" w:firstRow="1" w:lastRow="0" w:firstColumn="0" w:lastColumn="0" w:oddVBand="0" w:evenVBand="0" w:oddHBand="0" w:evenHBand="0" w:firstRowFirstColumn="0" w:firstRowLastColumn="0" w:lastRowFirstColumn="0" w:lastRowLastColumn="0"/>
+          <w:trHeight w:val="1177"/>
+        </w:trPr>
+        <w:tc>
+          <w:tcPr>
+            <w:tcW w:w="8623" w:type="dxa"/>
+            <w:tcBorders>
+              <w:bottom w:val="single" w:sz="8" w:space="0" w:color="C9C9C9" w:themeColor="text2" w:themeTint="40"/>
+            </w:tcBorders>
+            <w:tcMar>
+              <w:top w:w="0" w:type="dxa"/>
+              <w:bottom w:w="0" w:type="dxa"/>
+            </w:tcMar>
+          </w:tcPr>
+          <w:p>
+            <w:pPr>
+              <w:pStyle w:val="Ttulo1"/>
+              <w:ind w:left="0"/>
+            </w:pPr>
+            <w:sdt>
+              <w:sdtPr>
+                <w:rPr>
+                  <w:sz w:val="72"/>
+                  <w:szCs w:val="30"/>
+                </w:rPr>
+                <w:id w:val="977106971"/>
+                <w:placeholder>
+                  <w:docPart w:val="708AA35B683A44B3B39B5F6B22249425"/>
+                </w:placeholder>
+                <w15:appearance w15:val="hidden"/>
+              </w:sdtPr>
+              <w:sdtContent>
+                <w:r>
+                  <w:rPr>
+                    <w:sz w:val="72"/>
+                    <w:szCs w:val="30"/>
+                  </w:rPr>
+                  <w:t>ESPECIFICACION, GUIAS Y PLANIFICACIÓN</w:t>
+                </w:r>
+              </w:sdtContent>
+            </w:sdt>
+            <w:r>
+              <w:rPr>
+                <w:sz w:val="72"/>
+                <w:szCs w:val="30"/>
+                <w:lang w:bidi="es-ES"/>
+              </w:rPr>
+              <w:t xml:space="preserve"> </w:t>
+            </w:r>
+          </w:p>
+        </w:tc>
+      </w:tr>
+      <w:tr>
+        <w:trPr>
+          <w:trHeight w:hRule="exact" w:val="806"/>
+        </w:trPr>
+        <w:tc>
+          <w:tcPr>
+            <w:tcW w:w="8623" w:type="dxa"/>
+            <w:tcBorders>
+              <w:top w:val="single" w:sz="8" w:space="0" w:color="C9C9C9" w:themeColor="text2" w:themeTint="40"/>
+              <w:bottom w:val="nil"/>
+            </w:tcBorders>
+            <w:vAlign w:val="center"/>
+          </w:tcPr>
+          <w:p>
+            <w:pPr>
+              <w:pStyle w:val="Ttulo2"/>
+            </w:pPr>
+            <w:sdt>
+              <w:sdtPr>
+                <w:id w:val="-265540026"/>
+                <w:placeholder>
+                  <w:docPart w:val="54E40328D5D64C90A6EF8250521A599A"/>
+                </w:placeholder>
+                <w15:appearance w15:val="hidden"/>
+              </w:sdtPr>
+              <w:sdtContent>
+                <w:r>
+                  <w:t>SOBRE LA APLICACIÓN WEB</w:t>
+                </w:r>
+              </w:sdtContent>
+            </w:sdt>
+            <w:r>
+              <w:rPr>
+                <w:lang w:bidi="es-ES"/>
+              </w:rPr>
+              <w:t xml:space="preserve"> </w:t>
+            </w:r>
+          </w:p>
+        </w:tc>
+      </w:tr>
+    </w:tbl>
+    <w:p>
+      <w:pPr>
+        <w:ind w:left="142"/>
+      </w:pPr>
+      <w:r>
+        <w:rPr>
+          <w:noProof/>
+        </w:rPr>
+        <w:drawing>
+          <wp:anchor distT="0" distB="0" distL="114300" distR="114300" simplePos="0" relativeHeight="251678720" behindDoc="0" locked="0" layoutInCell="1" allowOverlap="1" wp14:anchorId="2EABA91E" wp14:editId="0DE0482C">
+            <wp:simplePos x="0" y="0"/>
+            <wp:positionH relativeFrom="margin">
+              <wp:posOffset>-97790</wp:posOffset>
+            </wp:positionH>
+            <wp:positionV relativeFrom="paragraph">
+              <wp:posOffset>457200</wp:posOffset>
+            </wp:positionV>
+            <wp:extent cx="5272405" cy="4690745"/>
+            <wp:effectExtent l="0" t="0" r="4445" b="0"/>
+            <wp:wrapNone/>
+            <wp:docPr id="1351879061" name="Imagen 19"/>
+            <wp:cNvGraphicFramePr>
+              <a:graphicFrameLocks xmlns:a="http://schemas.openxmlformats.org/drawingml/2006/main" noChangeAspect="1"/>
+            </wp:cNvGraphicFramePr>
+            <a:graphic xmlns:a="http://schemas.openxmlformats.org/drawingml/2006/main">
+              <a:graphicData uri="http://schemas.openxmlformats.org/drawingml/2006/picture">
+                <pic:pic xmlns:pic="http://schemas.openxmlformats.org/drawingml/2006/picture">
+                  <pic:nvPicPr>
+                    <pic:cNvPr id="0" name="Picture 47"/>
+                    <pic:cNvPicPr>
+                      <a:picLocks noChangeAspect="1" noChangeArrowheads="1"/>
+                    </pic:cNvPicPr>
+                  </pic:nvPicPr>
+                  <pic:blipFill>
+                    <a:blip r:embed="rId15">
+                      <a:extLst>
+                        <a:ext uri="{28A0092B-C50C-407E-A947-70E740481C1C}">
+                          <a14:useLocalDpi xmlns:a14="http://schemas.microsoft.com/office/drawing/2010/main" val="0"/>
+                        </a:ext>
+                      </a:extLst>
+                    </a:blip>
+                    <a:srcRect/>
+                    <a:stretch>
+                      <a:fillRect/>
+                    </a:stretch>
+                  </pic:blipFill>
+                  <pic:spPr bwMode="auto">
+                    <a:xfrm>
+                      <a:off x="0" y="0"/>
+                      <a:ext cx="5272405" cy="4690745"/>
+                    </a:xfrm>
+                    <a:prstGeom prst="rect">
+                      <a:avLst/>
+                    </a:prstGeom>
+                    <a:noFill/>
+                    <a:ln>
+                      <a:noFill/>
+                    </a:ln>
+                  </pic:spPr>
+                </pic:pic>
+              </a:graphicData>
+            </a:graphic>
+          </wp:anchor>
+        </w:drawing>
+      </w:r>
+      <w:r>
+        <w:rPr>
+          <w:noProof/>
+          <w:lang w:bidi="es-ES"/>
+        </w:rPr>
+        <mc:AlternateContent>
+          <mc:Choice Requires="wps">
+            <w:drawing>
+              <wp:anchor distT="0" distB="0" distL="114300" distR="114300" simplePos="0" relativeHeight="251677696" behindDoc="1" locked="1" layoutInCell="1" allowOverlap="1" wp14:anchorId="47D832B6" wp14:editId="19C7034D">
+                <wp:simplePos x="0" y="0"/>
+                <wp:positionH relativeFrom="page">
+                  <wp:align>left</wp:align>
+                </wp:positionH>
+                <wp:positionV relativeFrom="paragraph">
+                  <wp:posOffset>-2973070</wp:posOffset>
+                </wp:positionV>
+                <wp:extent cx="1428750" cy="10817860"/>
+                <wp:effectExtent l="0" t="0" r="0" b="2540"/>
+                <wp:wrapNone/>
+                <wp:docPr id="366556837" name="Rectángulo 2">
+                  <a:extLst xmlns:a="http://schemas.openxmlformats.org/drawingml/2006/main">
+                    <a:ext uri="{C183D7F6-B498-43B3-948B-1728B52AA6E4}">
+                      <adec:decorative xmlns:adec="http://schemas.microsoft.com/office/drawing/2017/decorative" val="1"/>
+                    </a:ext>
+                  </a:extLst>
+                </wp:docPr>
+                <wp:cNvGraphicFramePr/>
+                <a:graphic xmlns:a="http://schemas.openxmlformats.org/drawingml/2006/main">
+                  <a:graphicData uri="http://schemas.microsoft.com/office/word/2010/wordprocessingShape">
+                    <wps:wsp>
+                      <wps:cNvSpPr/>
+                      <wps:spPr>
+                        <a:xfrm>
+                          <a:off x="0" y="0"/>
+                          <a:ext cx="1428750" cy="10817860"/>
+                        </a:xfrm>
+                        <a:prstGeom prst="rect">
+                          <a:avLst/>
+                        </a:prstGeom>
+                        <a:solidFill>
+                          <a:schemeClr val="tx1">
+                            <a:lumMod val="75000"/>
+                            <a:lumOff val="25000"/>
+                          </a:schemeClr>
+                        </a:solidFill>
+                        <a:ln>
+                          <a:noFill/>
+                        </a:ln>
+                      </wps:spPr>
+                      <wps:style>
+                        <a:lnRef idx="2">
+                          <a:schemeClr val="accent1">
+                            <a:shade val="50000"/>
+                          </a:schemeClr>
+                        </a:lnRef>
+                        <a:fillRef idx="1">
+                          <a:schemeClr val="accent1"/>
+                        </a:fillRef>
+                        <a:effectRef idx="0">
+                          <a:schemeClr val="accent1"/>
+                        </a:effectRef>
+                        <a:fontRef idx="minor">
+                          <a:schemeClr val="lt1"/>
+                        </a:fontRef>
+                      </wps:style>
+                      <wps:txbx>
+                        <w:txbxContent>
+                          <w:p>
+                            <w:pPr>
+                              <w:pStyle w:val="Piedepginablanco"/>
+                            </w:pPr>
+                            <w:r>
+                              <w:rPr>
+                                <w:lang w:bidi="es-ES"/>
+                              </w:rPr>
+                              <w:t>3</w:t>
+                            </w:r>
+                          </w:p>
+                        </w:txbxContent>
+                      </wps:txbx>
+                      <wps:bodyPr rot="0" spcFirstLastPara="0" vertOverflow="overflow" horzOverflow="overflow" vert="horz" wrap="square" lIns="91440" tIns="45720" rIns="91440" bIns="45720" numCol="1" spcCol="0" rtlCol="0" fromWordArt="0" anchor="b" anchorCtr="0" forceAA="0" compatLnSpc="1">
+                        <a:prstTxWarp prst="textNoShape">
+                          <a:avLst/>
+                        </a:prstTxWarp>
+                        <a:noAutofit/>
+                      </wps:bodyPr>
+                    </wps:wsp>
+                  </a:graphicData>
+                </a:graphic>
+                <wp14:sizeRelH relativeFrom="margin">
+                  <wp14:pctWidth>0</wp14:pctWidth>
+                </wp14:sizeRelH>
+                <wp14:sizeRelV relativeFrom="margin">
+                  <wp14:pctHeight>0</wp14:pctHeight>
+                </wp14:sizeRelV>
+              </wp:anchor>
+            </w:drawing>
+          </mc:Choice>
+          <mc:Fallback>
+            <w:pict>
+              <v:rect w14:anchorId="47D832B6" id="_x0000_s1032" alt="&quot;&quot;" style="position:absolute;left:0;text-align:left;margin-left:0;margin-top:-234.1pt;width:112.5pt;height:851.8pt;z-index:-251638784;visibility:visible;mso-wrap-style:square;mso-width-percent:0;mso-height-percent:0;mso-wrap-distance-left:9pt;mso-wrap-distance-top:0;mso-wrap-distance-right:9pt;mso-wrap-distance-bottom:0;mso-position-horizontal:left;mso-position-horizontal-relative:page;mso-position-vertical:absolute;mso-position-vertical-relative:text;mso-width-percent:0;mso-height-percent:0;mso-width-relative:margin;mso-height-relative:margin;v-text-anchor:bottom" o:gfxdata="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" fillcolor="#404040 [2429]" stroked="f" strokeweight="1pt">
+                <v:textbox>
+                  <w:txbxContent>
+                    <w:p>
+                      <w:pPr>
+                        <w:pStyle w:val="Piedepginablanco"/>
+                      </w:pPr>
+                      <w:r>
+                        <w:rPr>
+                          <w:lang w:bidi="es-ES"/>
+                        </w:rPr>
+                        <w:t>3</w:t>
+                      </w:r>
+                    </w:p>
+                  </w:txbxContent>
+                </v:textbox>
+                <w10:wrap anchorx="page"/>
+                <w10:anchorlock/>
+              </v:rect>
+            </w:pict>
+          </mc:Fallback>
+        </mc:AlternateContent>
+      </w:r>
+    </w:p>
     <w:sectPr>
-      <w:footerReference w:type="default" r:id="rId15"/>
+      <w:footerReference w:type="default" r:id="rId16"/>
       <w:pgSz w:w="11906" w:h="16838" w:code="9"/>
       <w:pgMar w:top="720" w:right="720" w:bottom="720" w:left="2880" w:header="720" w:footer="432" w:gutter="0"/>
       <w:cols w:space="720"/>
@@ -5108,6 +5605,68 @@
         </w:p>
       </w:docPartBody>
     </w:docPart>
+    <w:docPart>
+      <w:docPartPr>
+        <w:name w:val="708AA35B683A44B3B39B5F6B22249425"/>
+        <w:category>
+          <w:name w:val="General"/>
+          <w:gallery w:val="placeholder"/>
+        </w:category>
+        <w:types>
+          <w:type w:val="bbPlcHdr"/>
+        </w:types>
+        <w:behaviors>
+          <w:behavior w:val="content"/>
+        </w:behaviors>
+        <w:guid w:val="{828705F1-99E8-4E95-A46C-97690E466B53}"/>
+      </w:docPartPr>
+      <w:docPartBody>
+        <w:p>
+          <w:pPr>
+            <w:pStyle w:val="708AA35B683A44B3B39B5F6B22249425"/>
+          </w:pPr>
+          <w:r>
+            <w:rPr>
+              <w:lang w:bidi="es-ES"/>
+            </w:rPr>
+            <w:t>El efecto</w:t>
+          </w:r>
+          <w:r>
+            <w:rPr>
+              <w:lang w:bidi="es-ES"/>
+            </w:rPr>
+            <w:br/>
+            <w:t>carbonizado</w:t>
+          </w:r>
+        </w:p>
+      </w:docPartBody>
+    </w:docPart>
+    <w:docPart>
+      <w:docPartPr>
+        <w:name w:val="54E40328D5D64C90A6EF8250521A599A"/>
+        <w:category>
+          <w:name w:val="General"/>
+          <w:gallery w:val="placeholder"/>
+        </w:category>
+        <w:types>
+          <w:type w:val="bbPlcHdr"/>
+        </w:types>
+        <w:behaviors>
+          <w:behavior w:val="content"/>
+        </w:behaviors>
+        <w:guid w:val="{E685C75D-C22D-41A7-B1CE-9A23FAD5ADFC}"/>
+      </w:docPartPr>
+      <w:docPartBody>
+        <w:p>
+          <w:pPr>
+            <w:pStyle w:val="54E40328D5D64C90A6EF8250521A599A"/>
+          </w:pPr>
+          <w:r>
+            <w:t>Una recorrido de riesgo y recompensa</w:t>
+          </w:r>
+        </w:p>
+      </w:docPartBody>
+    </w:docPart>
   </w:docParts>
 </w:glossaryDocument>
 </file>
@@ -5476,12 +6035,14 @@
     <w:rsid w:val="00364CC0"/>
     <w:rsid w:val="003718C0"/>
     <w:rsid w:val="00494B77"/>
+    <w:rsid w:val="0050145C"/>
     <w:rsid w:val="005A1988"/>
     <w:rsid w:val="00640AD2"/>
     <w:rsid w:val="006A7A1C"/>
     <w:rsid w:val="00706E66"/>
     <w:rsid w:val="007074DB"/>
     <w:rsid w:val="00880F52"/>
+    <w:rsid w:val="00A80C9D"/>
     <w:rsid w:val="00B506B8"/>
     <w:rsid w:val="00C45535"/>
     <w:rsid w:val="00D35DB1"/>
@@ -6197,6 +6758,42 @@
       <w:lang w:eastAsia="ja-JP"/>
     </w:rPr>
   </w:style>
+  <w:style w:type="paragraph" w:customStyle="1" w:styleId="708AA35B683A44B3B39B5F6B22249425">
+    <w:name w:val="708AA35B683A44B3B39B5F6B22249425"/>
+    <w:rsid w:val="0050145C"/>
+    <w:pPr>
+      <w:spacing w:after="160" w:line="278" w:lineRule="auto"/>
+    </w:pPr>
+    <w:rPr>
+      <w:kern w:val="2"/>
+      <w:lang w:eastAsia="es-ES"/>
+      <w14:ligatures w14:val="standardContextual"/>
+    </w:rPr>
+  </w:style>
+  <w:style w:type="paragraph" w:customStyle="1" w:styleId="54E40328D5D64C90A6EF8250521A599A">
+    <w:name w:val="54E40328D5D64C90A6EF8250521A599A"/>
+    <w:rsid w:val="0050145C"/>
+    <w:pPr>
+      <w:spacing w:after="160" w:line="278" w:lineRule="auto"/>
+    </w:pPr>
+    <w:rPr>
+      <w:kern w:val="2"/>
+      <w:lang w:eastAsia="es-ES"/>
+      <w14:ligatures w14:val="standardContextual"/>
+    </w:rPr>
+  </w:style>
+  <w:style w:type="paragraph" w:customStyle="1" w:styleId="AAC01AD6E4554E18A5C69A7DF30D03C4">
+    <w:name w:val="AAC01AD6E4554E18A5C69A7DF30D03C4"/>
+    <w:rsid w:val="0050145C"/>
+    <w:pPr>
+      <w:spacing w:after="160" w:line="278" w:lineRule="auto"/>
+    </w:pPr>
+    <w:rPr>
+      <w:kern w:val="2"/>
+      <w:lang w:eastAsia="es-ES"/>
+      <w14:ligatures w14:val="standardContextual"/>
+    </w:rPr>
+  </w:style>
 </w:styles>
 </file>
 
@@ -6409,6 +7006,15 @@
 </file>
 
 <file path=customXml/item1.xml><?xml version="1.0" encoding="utf-8"?>
+<?mso-contentType ?>
+<FormTemplates xmlns="http://schemas.microsoft.com/sharepoint/v3/contenttype/forms">
+  <Display>DocumentLibraryForm</Display>
+  <Edit>DocumentLibraryForm</Edit>
+  <New>DocumentLibraryForm</New>
+</FormTemplates>
+</file>
+
+<file path=customXml/item2.xml><?xml version="1.0" encoding="utf-8"?>
 <p:properties xmlns:p="http://schemas.microsoft.com/office/2006/metadata/properties" xmlns:xsi="http://www.w3.org/2001/XMLSchema-instance" xmlns:pc="http://schemas.microsoft.com/office/infopath/2007/PartnerControls">
   <documentManagement>
     <_ip_UnifiedCompliancePolicyUIAction xmlns="http://schemas.microsoft.com/sharepoint/v3" xsi:nil="true"/>
@@ -6428,16 +7034,11 @@
 </p:properties>
 </file>
 
-<file path=customXml/item2.xml><?xml version="1.0" encoding="utf-8"?>
-<?mso-contentType ?>
-<FormTemplates xmlns="http://schemas.microsoft.com/sharepoint/v3/contenttype/forms">
-  <Display>DocumentLibraryForm</Display>
-  <Edit>DocumentLibraryForm</Edit>
-  <New>DocumentLibraryForm</New>
-</FormTemplates>
+<file path=customXml/item3.xml><?xml version="1.0" encoding="utf-8"?>
+<b:Sources xmlns:b="http://schemas.openxmlformats.org/officeDocument/2006/bibliography" xmlns="http://schemas.openxmlformats.org/officeDocument/2006/bibliography" SelectedStyle="/APASixthEditionOfficeOnline.xsl" StyleName="APA" Version="6"/>
 </file>
 
-<file path=customXml/item3.xml><?xml version="1.0" encoding="utf-8"?>
+<file path=customXml/item4.xml><?xml version="1.0" encoding="utf-8"?>
 <ct:contentTypeSchema xmlns:ct="http://schemas.microsoft.com/office/2006/metadata/contentType" xmlns:ma="http://schemas.microsoft.com/office/2006/metadata/properties/metaAttributes" ct:_="" ma:_="" ma:contentTypeName="Document" ma:contentTypeID="0x01010079F111ED35F8CC479449609E8A0923A6" ma:contentTypeVersion="26" ma:contentTypeDescription="Create a new document." ma:contentTypeScope="" ma:versionID="ac37c1753acd5e330d2062ccec26ea66">
   <xsd:schema xmlns:xsd="http://www.w3.org/2001/XMLSchema" xmlns:xs="http://www.w3.org/2001/XMLSchema" xmlns:p="http://schemas.microsoft.com/office/2006/metadata/properties" xmlns:ns1="http://schemas.microsoft.com/sharepoint/v3" xmlns:ns2="71af3243-3dd4-4a8d-8c0d-dd76da1f02a5" xmlns:ns3="16c05727-aa75-4e4a-9b5f-8a80a1165891" xmlns:ns4="230e9df3-be65-4c73-a93b-d1236ebd677e" targetNamespace="http://schemas.microsoft.com/office/2006/metadata/properties" ma:root="true" ma:fieldsID="3b340c7101c92c5120abd06486f94548" ns1:_="" ns2:_="" ns3:_="" ns4:_="">
     <xsd:import namespace="http://schemas.microsoft.com/sharepoint/v3"/>
@@ -6737,11 +7338,15 @@
 </ct:contentTypeSchema>
 </file>
 
-<file path=customXml/item4.xml><?xml version="1.0" encoding="utf-8"?>
-<b:Sources xmlns:b="http://schemas.openxmlformats.org/officeDocument/2006/bibliography" xmlns="http://schemas.openxmlformats.org/officeDocument/2006/bibliography" SelectedStyle="/APASixthEditionOfficeOnline.xsl" StyleName="APA" Version="6"/>
+<file path=customXml/itemProps1.xml><?xml version="1.0" encoding="utf-8"?>
+<ds:datastoreItem xmlns:ds="http://schemas.openxmlformats.org/officeDocument/2006/customXml" ds:itemID="{268A88EA-2CD1-4EB5-AD27-A1454BEC753F}">
+  <ds:schemaRefs>
+    <ds:schemaRef ds:uri="http://schemas.microsoft.com/sharepoint/v3/contenttype/forms"/>
+  </ds:schemaRefs>
+</ds:datastoreItem>
 </file>
 
-<file path=customXml/itemProps1.xml><?xml version="1.0" encoding="utf-8"?>
+<file path=customXml/itemProps2.xml><?xml version="1.0" encoding="utf-8"?>
 <ds:datastoreItem xmlns:ds="http://schemas.openxmlformats.org/officeDocument/2006/customXml" ds:itemID="{E046B6FE-75F5-4A4A-ADF9-3D55C2808F6A}">
   <ds:schemaRefs>
     <ds:schemaRef ds:uri="http://schemas.microsoft.com/office/2006/metadata/properties"/>
@@ -6753,15 +7358,15 @@
 </ds:datastoreItem>
 </file>
 
-<file path=customXml/itemProps2.xml><?xml version="1.0" encoding="utf-8"?>
-<ds:datastoreItem xmlns:ds="http://schemas.openxmlformats.org/officeDocument/2006/customXml" ds:itemID="{268A88EA-2CD1-4EB5-AD27-A1454BEC753F}">
+<file path=customXml/itemProps3.xml><?xml version="1.0" encoding="utf-8"?>
+<ds:datastoreItem xmlns:ds="http://schemas.openxmlformats.org/officeDocument/2006/customXml" ds:itemID="{C36A12F8-4A9B-4F64-B978-B0EE1FD97EBF}">
   <ds:schemaRefs>
-    <ds:schemaRef ds:uri="http://schemas.microsoft.com/sharepoint/v3/contenttype/forms"/>
+    <ds:schemaRef ds:uri="http://schemas.openxmlformats.org/officeDocument/2006/bibliography"/>
   </ds:schemaRefs>
 </ds:datastoreItem>
 </file>
 
-<file path=customXml/itemProps3.xml><?xml version="1.0" encoding="utf-8"?>
+<file path=customXml/itemProps4.xml><?xml version="1.0" encoding="utf-8"?>
 <ds:datastoreItem xmlns:ds="http://schemas.openxmlformats.org/officeDocument/2006/customXml" ds:itemID="{3B486F6C-1123-466C-A9D5-986F0A3EF9D1}">
   <ds:schemaRefs>
     <ds:schemaRef ds:uri="http://schemas.microsoft.com/office/2006/metadata/contentType"/>
@@ -6782,14 +7387,6 @@
 </ds:datastoreItem>
 </file>
 
-<file path=customXml/itemProps4.xml><?xml version="1.0" encoding="utf-8"?>
-<ds:datastoreItem xmlns:ds="http://schemas.openxmlformats.org/officeDocument/2006/customXml" ds:itemID="{C36A12F8-4A9B-4F64-B978-B0EE1FD97EBF}">
-  <ds:schemaRefs>
-    <ds:schemaRef ds:uri="http://schemas.openxmlformats.org/officeDocument/2006/bibliography"/>
-  </ds:schemaRefs>
-</ds:datastoreItem>
-</file>
-
 <file path=docMetadata/LabelInfo.xml><?xml version="1.0" encoding="utf-8"?>
 <clbl:labelList xmlns:clbl="http://schemas.microsoft.com/office/2020/mipLabelMetadata"/>
 </file>
</xml_diff>

<commit_message>
segunda entrega, falta revisar detalles y añadir gantt
</commit_message>
<xml_diff>
--- a/SONAURA.docx
+++ b/SONAURA.docx
@@ -824,6 +824,7 @@
           <w:showingPlcHdr/>
           <w15:appearance w15:val="hidden"/>
         </w:sdtPr>
+        <w:sdtEndPr/>
         <w:sdtContent>
           <w:r>
             <w:rPr>
@@ -1180,6 +1181,7 @@
                 </w:placeholder>
                 <w15:appearance w15:val="hidden"/>
               </w:sdtPr>
+              <w:sdtEndPr/>
               <w:sdtContent>
                 <w:r>
                   <w:rPr>
@@ -1227,6 +1229,7 @@
                 </w:placeholder>
                 <w15:appearance w15:val="hidden"/>
               </w:sdtPr>
+              <w:sdtEndPr/>
               <w:sdtContent>
                 <w:r>
                   <w:t>SOBRE LA APLICACIÓN WEB</w:t>
@@ -1919,6 +1922,7 @@
                 </w:placeholder>
                 <w15:appearance w15:val="hidden"/>
               </w:sdtPr>
+              <w:sdtEndPr/>
               <w:sdtContent>
                 <w:r>
                   <w:rPr>
@@ -1965,6 +1969,7 @@
                 </w:placeholder>
                 <w15:appearance w15:val="hidden"/>
               </w:sdtPr>
+              <w:sdtEndPr/>
               <w:sdtContent>
                 <w:r>
                   <w:t>ESPECIFICACION DE REQUISITOS DEL SISTEMA:</w:t>
@@ -2557,18 +2562,18 @@
         <mc:AlternateContent>
           <mc:Choice Requires="wps">
             <w:drawing>
-              <wp:anchor distT="0" distB="0" distL="114300" distR="114300" simplePos="0" relativeHeight="251677696" behindDoc="1" locked="1" layoutInCell="1" allowOverlap="1" wp14:anchorId="47D832B6" wp14:editId="4E12D290">
+              <wp:anchor distT="0" distB="0" distL="114300" distR="114300" simplePos="0" relativeHeight="251686912" behindDoc="1" locked="1" layoutInCell="1" allowOverlap="1" wp14:anchorId="65A0F6CF" wp14:editId="5AB2A44F">
                 <wp:simplePos x="0" y="0"/>
                 <wp:positionH relativeFrom="page">
-                  <wp:posOffset>-188595</wp:posOffset>
+                  <wp:align>left</wp:align>
                 </wp:positionH>
                 <wp:positionV relativeFrom="paragraph">
-                  <wp:posOffset>-7076440</wp:posOffset>
+                  <wp:posOffset>-6877685</wp:posOffset>
                 </wp:positionV>
-                <wp:extent cx="1544955" cy="18557240"/>
-                <wp:effectExtent l="0" t="0" r="0" b="0"/>
+                <wp:extent cx="1323975" cy="10828020"/>
+                <wp:effectExtent l="0" t="0" r="9525" b="0"/>
                 <wp:wrapNone/>
-                <wp:docPr id="366556837" name="Rectángulo 2">
+                <wp:docPr id="1598197688" name="Rectángulo 2">
                   <a:extLst xmlns:a="http://schemas.openxmlformats.org/drawingml/2006/main">
                     <a:ext uri="{C183D7F6-B498-43B3-948B-1728B52AA6E4}">
                       <adec:decorative xmlns:adec="http://schemas.microsoft.com/office/drawing/2017/decorative" val="1"/>
@@ -2583,7 +2588,7 @@
                       <wps:spPr>
                         <a:xfrm>
                           <a:off x="0" y="0"/>
-                          <a:ext cx="1544955" cy="18557240"/>
+                          <a:ext cx="1323975" cy="10828020"/>
                         </a:xfrm>
                         <a:prstGeom prst="rect">
                           <a:avLst/>
@@ -2624,7 +2629,7 @@
                               <w:rPr>
                                 <w:lang w:bidi="es-ES"/>
                               </w:rPr>
-                              <w:t>3</w:t>
+                              <w:t>4</w:t>
                             </w:r>
                           </w:p>
                           <w:p/>
@@ -2650,7 +2655,7 @@
           </mc:Choice>
           <mc:Fallback>
             <w:pict>
-              <v:rect w14:anchorId="47D832B6" id="_x0000_s1033" alt="&quot;&quot;" style="position:absolute;left:0;text-align:left;margin-left:-14.85pt;margin-top:-557.2pt;width:121.65pt;height:1461.2pt;z-index:-251638784;visibility:visible;mso-wrap-style:square;mso-width-percent:0;mso-height-percent:0;mso-wrap-distance-left:9pt;mso-wrap-distance-top:0;mso-wrap-distance-right:9pt;mso-wrap-distance-bottom:0;mso-position-horizontal:absolute;mso-position-horizontal-relative:page;mso-position-vertical:absolute;mso-position-vertical-relative:text;mso-width-percent:0;mso-height-percent:0;mso-width-relative:margin;mso-height-relative:margin;v-text-anchor:bottom" o:gfxdata="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" fillcolor="#404040 [2429]" stroked="f" strokeweight="1pt">
+              <v:rect w14:anchorId="65A0F6CF" id="_x0000_s1033" alt="&quot;&quot;" style="position:absolute;left:0;text-align:left;margin-left:0;margin-top:-541.55pt;width:104.25pt;height:852.6pt;z-index:-251629568;visibility:visible;mso-wrap-style:square;mso-width-percent:0;mso-height-percent:0;mso-wrap-distance-left:9pt;mso-wrap-distance-top:0;mso-wrap-distance-right:9pt;mso-wrap-distance-bottom:0;mso-position-horizontal:left;mso-position-horizontal-relative:page;mso-position-vertical:absolute;mso-position-vertical-relative:text;mso-width-percent:0;mso-height-percent:0;mso-width-relative:margin;mso-height-relative:margin;v-text-anchor:bottom" o:gfxdata="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" fillcolor="#404040 [2429]" stroked="f" strokeweight="1pt">
                 <v:textbox>
                   <w:txbxContent>
                     <w:p>
@@ -2661,7 +2666,7 @@
                         <w:rPr>
                           <w:lang w:bidi="es-ES"/>
                         </w:rPr>
-                        <w:t>3</w:t>
+                        <w:t>4</w:t>
                       </w:r>
                     </w:p>
                     <w:p/>
@@ -2754,161 +2759,24 @@
       </w:pPr>
       <w:r>
         <w:rPr>
-          <w:b/>
-          <w:bCs/>
-        </w:rPr>
-        <w:t>Rendimiento:</w:t>
-      </w:r>
-      <w:r>
-        <w:t xml:space="preserve"> La plataforma debe cargar en menos de 3 segundos para la mayoría de los usuarios.</w:t>
-      </w:r>
-    </w:p>
-    <w:p>
-      <w:pPr>
-        <w:numPr>
-          <w:ilvl w:val="0"/>
-          <w:numId w:val="28"/>
-        </w:numPr>
-      </w:pPr>
-      <w:r>
-        <w:rPr>
-          <w:b/>
-          <w:bCs/>
-        </w:rPr>
-        <w:t>Disponibilidad:</w:t>
-      </w:r>
-      <w:r>
-        <w:t xml:space="preserve"> El sistema debe estar disponible el 99% del tiempo.</w:t>
-      </w:r>
-    </w:p>
-    <w:p>
-      <w:pPr>
-        <w:numPr>
-          <w:ilvl w:val="0"/>
-          <w:numId w:val="28"/>
-        </w:numPr>
-      </w:pPr>
-      <w:r>
-        <w:rPr>
-          <w:b/>
-          <w:bCs/>
-        </w:rPr>
-        <w:t>Seguridad:</w:t>
-      </w:r>
-    </w:p>
-    <w:p>
-      <w:pPr>
-        <w:numPr>
-          <w:ilvl w:val="1"/>
-          <w:numId w:val="28"/>
-        </w:numPr>
-      </w:pPr>
-      <w:r>
-        <w:t>Cifrado de contraseñas.</w:t>
-      </w:r>
-    </w:p>
-    <w:p>
-      <w:pPr>
-        <w:numPr>
-          <w:ilvl w:val="1"/>
-          <w:numId w:val="28"/>
-        </w:numPr>
-      </w:pPr>
-      <w:r>
-        <w:t>Acceso restringido a funciones de administración.</w:t>
-      </w:r>
-    </w:p>
-    <w:p>
-      <w:pPr>
-        <w:numPr>
-          <w:ilvl w:val="1"/>
-          <w:numId w:val="28"/>
-        </w:numPr>
-      </w:pPr>
-      <w:r>
-        <w:t>Protección contra SPAM y contenido ofensivo en comentarios.</w:t>
-      </w:r>
-    </w:p>
-    <w:p>
-      <w:pPr>
-        <w:numPr>
-          <w:ilvl w:val="0"/>
-          <w:numId w:val="28"/>
-        </w:numPr>
-      </w:pPr>
-      <w:r>
-        <w:rPr>
-          <w:b/>
-          <w:bCs/>
-        </w:rPr>
-        <w:t>Escalabilidad:</w:t>
-      </w:r>
-      <w:r>
-        <w:t xml:space="preserve"> Debe permitir escalar en número de usuarios sin afectar el rendimiento.</w:t>
-      </w:r>
-    </w:p>
-    <w:p>
-      <w:pPr>
-        <w:numPr>
-          <w:ilvl w:val="0"/>
-          <w:numId w:val="28"/>
-        </w:numPr>
-      </w:pPr>
-      <w:r>
-        <w:rPr>
-          <w:b/>
-          <w:bCs/>
-        </w:rPr>
-        <w:t>Mantenibilidad:</w:t>
-      </w:r>
-      <w:r>
-        <w:t xml:space="preserve"> Código documentado y arquitectura modular para facilitar actualizaciones.</w:t>
-      </w:r>
-    </w:p>
-    <w:p>
-      <w:pPr>
-        <w:numPr>
-          <w:ilvl w:val="0"/>
-          <w:numId w:val="28"/>
-        </w:numPr>
-      </w:pPr>
-      <w:r>
-        <w:rPr>
-          <w:b/>
-          <w:bCs/>
-        </w:rPr>
-        <w:t>Compatibilidad:</w:t>
-      </w:r>
-      <w:r>
-        <w:t xml:space="preserve"> Funcionar correctamente en los principales navegadores (Chrome, Firefox, Edge, Safari) y en dispositivos móviles.</w:t>
-      </w:r>
-    </w:p>
-    <w:p>
-      <w:pPr>
-        <w:ind w:left="142"/>
-      </w:pPr>
-    </w:p>
-    <w:p>
-      <w:r>
-        <w:rPr>
           <w:noProof/>
           <w:lang w:bidi="es-ES"/>
         </w:rPr>
         <mc:AlternateContent>
           <mc:Choice Requires="wps">
             <w:drawing>
-              <wp:anchor distT="0" distB="0" distL="114300" distR="114300" simplePos="0" relativeHeight="251684864" behindDoc="1" locked="1" layoutInCell="1" allowOverlap="1" wp14:anchorId="6C75D3C0" wp14:editId="10CC9876">
+              <wp:anchor distT="0" distB="0" distL="114300" distR="114300" simplePos="0" relativeHeight="251688960" behindDoc="1" locked="1" layoutInCell="1" allowOverlap="1" wp14:anchorId="66879EF5" wp14:editId="23CBFB25">
                 <wp:simplePos x="0" y="0"/>
                 <wp:positionH relativeFrom="page">
-                  <wp:align>left</wp:align>
+                  <wp:posOffset>19050</wp:posOffset>
                 </wp:positionH>
                 <wp:positionV relativeFrom="paragraph">
-                  <wp:posOffset>-5436870</wp:posOffset>
+                  <wp:posOffset>-1162050</wp:posOffset>
                 </wp:positionV>
-                <wp:extent cx="1362710" cy="18557240"/>
-                <wp:effectExtent l="0" t="0" r="8890" b="0"/>
+                <wp:extent cx="1323975" cy="10828020"/>
+                <wp:effectExtent l="0" t="0" r="9525" b="0"/>
                 <wp:wrapNone/>
-                <wp:docPr id="1106984466" name="Rectángulo 2">
+                <wp:docPr id="449953162" name="Rectángulo 2">
                   <a:extLst xmlns:a="http://schemas.openxmlformats.org/drawingml/2006/main">
                     <a:ext uri="{C183D7F6-B498-43B3-948B-1728B52AA6E4}">
                       <adec:decorative xmlns:adec="http://schemas.microsoft.com/office/drawing/2017/decorative" val="1"/>
@@ -2923,7 +2791,7 @@
                       <wps:spPr>
                         <a:xfrm>
                           <a:off x="0" y="0"/>
-                          <a:ext cx="1362710" cy="18557240"/>
+                          <a:ext cx="1323975" cy="10828020"/>
                         </a:xfrm>
                         <a:prstGeom prst="rect">
                           <a:avLst/>
@@ -2964,7 +2832,7 @@
                               <w:rPr>
                                 <w:lang w:bidi="es-ES"/>
                               </w:rPr>
-                              <w:t>3</w:t>
+                              <w:t>5</w:t>
                             </w:r>
                           </w:p>
                           <w:p/>
@@ -2990,7 +2858,7 @@
           </mc:Choice>
           <mc:Fallback>
             <w:pict>
-              <v:rect w14:anchorId="6C75D3C0" id="_x0000_s1034" alt="&quot;&quot;" style="position:absolute;margin-left:0;margin-top:-428.1pt;width:107.3pt;height:1461.2pt;z-index:-251631616;visibility:visible;mso-wrap-style:square;mso-width-percent:0;mso-height-percent:0;mso-wrap-distance-left:9pt;mso-wrap-distance-top:0;mso-wrap-distance-right:9pt;mso-wrap-distance-bottom:0;mso-position-horizontal:left;mso-position-horizontal-relative:page;mso-position-vertical:absolute;mso-position-vertical-relative:text;mso-width-percent:0;mso-height-percent:0;mso-width-relative:margin;mso-height-relative:margin;v-text-anchor:bottom" o:gfxdata="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" fillcolor="#404040 [2429]" stroked="f" strokeweight="1pt">
+              <v:rect w14:anchorId="66879EF5" id="_x0000_s1034" alt="&quot;&quot;" style="position:absolute;left:0;text-align:left;margin-left:1.5pt;margin-top:-91.5pt;width:104.25pt;height:852.6pt;z-index:-251627520;visibility:visible;mso-wrap-style:square;mso-width-percent:0;mso-height-percent:0;mso-wrap-distance-left:9pt;mso-wrap-distance-top:0;mso-wrap-distance-right:9pt;mso-wrap-distance-bottom:0;mso-position-horizontal:absolute;mso-position-horizontal-relative:page;mso-position-vertical:absolute;mso-position-vertical-relative:text;mso-width-percent:0;mso-height-percent:0;mso-width-relative:margin;mso-height-relative:margin;v-text-anchor:bottom" o:gfxdata="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" fillcolor="#404040 [2429]" stroked="f" strokeweight="1pt">
                 <v:textbox>
                   <w:txbxContent>
                     <w:p>
@@ -3001,7 +2869,7 @@
                         <w:rPr>
                           <w:lang w:bidi="es-ES"/>
                         </w:rPr>
-                        <w:t>3</w:t>
+                        <w:t>5</w:t>
                       </w:r>
                     </w:p>
                     <w:p/>
@@ -3014,6 +2882,143 @@
           </mc:Fallback>
         </mc:AlternateContent>
       </w:r>
+      <w:r>
+        <w:rPr>
+          <w:b/>
+          <w:bCs/>
+        </w:rPr>
+        <w:t>Rendimiento:</w:t>
+      </w:r>
+      <w:r>
+        <w:t xml:space="preserve"> La plataforma debe cargar en menos de 3 segundos para la mayoría de los usuarios.</w:t>
+      </w:r>
+    </w:p>
+    <w:p>
+      <w:pPr>
+        <w:numPr>
+          <w:ilvl w:val="0"/>
+          <w:numId w:val="28"/>
+        </w:numPr>
+      </w:pPr>
+      <w:r>
+        <w:rPr>
+          <w:b/>
+          <w:bCs/>
+        </w:rPr>
+        <w:t>Disponibilidad:</w:t>
+      </w:r>
+      <w:r>
+        <w:t xml:space="preserve"> El sistema debe estar disponible el 99% del tiempo.</w:t>
+      </w:r>
+    </w:p>
+    <w:p>
+      <w:pPr>
+        <w:numPr>
+          <w:ilvl w:val="0"/>
+          <w:numId w:val="28"/>
+        </w:numPr>
+      </w:pPr>
+      <w:r>
+        <w:rPr>
+          <w:b/>
+          <w:bCs/>
+        </w:rPr>
+        <w:t>Seguridad:</w:t>
+      </w:r>
+    </w:p>
+    <w:p>
+      <w:pPr>
+        <w:numPr>
+          <w:ilvl w:val="1"/>
+          <w:numId w:val="28"/>
+        </w:numPr>
+      </w:pPr>
+      <w:r>
+        <w:t>Cifrado de contraseñas.</w:t>
+      </w:r>
+    </w:p>
+    <w:p>
+      <w:pPr>
+        <w:numPr>
+          <w:ilvl w:val="1"/>
+          <w:numId w:val="28"/>
+        </w:numPr>
+      </w:pPr>
+      <w:r>
+        <w:t>Acceso restringido a funciones de administración.</w:t>
+      </w:r>
+    </w:p>
+    <w:p>
+      <w:pPr>
+        <w:numPr>
+          <w:ilvl w:val="1"/>
+          <w:numId w:val="28"/>
+        </w:numPr>
+      </w:pPr>
+      <w:r>
+        <w:t>Protección contra SPAM y contenido ofensivo en comentarios.</w:t>
+      </w:r>
+    </w:p>
+    <w:p>
+      <w:pPr>
+        <w:numPr>
+          <w:ilvl w:val="0"/>
+          <w:numId w:val="28"/>
+        </w:numPr>
+      </w:pPr>
+      <w:r>
+        <w:rPr>
+          <w:b/>
+          <w:bCs/>
+        </w:rPr>
+        <w:t>Escalabilidad:</w:t>
+      </w:r>
+      <w:r>
+        <w:t xml:space="preserve"> Debe permitir escalar en número de usuarios sin afectar el rendimiento.</w:t>
+      </w:r>
+    </w:p>
+    <w:p>
+      <w:pPr>
+        <w:numPr>
+          <w:ilvl w:val="0"/>
+          <w:numId w:val="28"/>
+        </w:numPr>
+      </w:pPr>
+      <w:r>
+        <w:rPr>
+          <w:b/>
+          <w:bCs/>
+        </w:rPr>
+        <w:t>Mantenibilidad:</w:t>
+      </w:r>
+      <w:r>
+        <w:t xml:space="preserve"> Código documentado y arquitectura modular para facilitar actualizaciones.</w:t>
+      </w:r>
+    </w:p>
+    <w:p>
+      <w:pPr>
+        <w:numPr>
+          <w:ilvl w:val="0"/>
+          <w:numId w:val="28"/>
+        </w:numPr>
+      </w:pPr>
+      <w:r>
+        <w:rPr>
+          <w:b/>
+          <w:bCs/>
+        </w:rPr>
+        <w:t>Compatibilidad:</w:t>
+      </w:r>
+      <w:r>
+        <w:t xml:space="preserve"> Funcionar correctamente en los principales navegadores (Chrome, Firefox, Edge, Safari) y en dispositivos móviles.</w:t>
+      </w:r>
+    </w:p>
+    <w:p>
+      <w:pPr>
+        <w:ind w:left="142"/>
+      </w:pPr>
+    </w:p>
+    <w:p>
       <w:r>
         <w:rPr>
           <w:b/>
@@ -3248,6 +3253,131 @@
       </w:pPr>
       <w:r>
         <w:rPr>
+          <w:noProof/>
+          <w:lang w:bidi="es-ES"/>
+        </w:rPr>
+        <mc:AlternateContent>
+          <mc:Choice Requires="wps">
+            <w:drawing>
+              <wp:anchor distT="0" distB="0" distL="114300" distR="114300" simplePos="0" relativeHeight="251691008" behindDoc="1" locked="1" layoutInCell="1" allowOverlap="1" wp14:anchorId="58A61D6F" wp14:editId="32BEB024">
+                <wp:simplePos x="0" y="0"/>
+                <wp:positionH relativeFrom="page">
+                  <wp:align>left</wp:align>
+                </wp:positionH>
+                <wp:positionV relativeFrom="paragraph">
+                  <wp:posOffset>-4572000</wp:posOffset>
+                </wp:positionV>
+                <wp:extent cx="1323975" cy="10828020"/>
+                <wp:effectExtent l="0" t="0" r="9525" b="0"/>
+                <wp:wrapNone/>
+                <wp:docPr id="256919990" name="Rectángulo 2">
+                  <a:extLst xmlns:a="http://schemas.openxmlformats.org/drawingml/2006/main">
+                    <a:ext uri="{C183D7F6-B498-43B3-948B-1728B52AA6E4}">
+                      <adec:decorative xmlns:adec="http://schemas.microsoft.com/office/drawing/2017/decorative" val="1"/>
+                    </a:ext>
+                  </a:extLst>
+                </wp:docPr>
+                <wp:cNvGraphicFramePr/>
+                <a:graphic xmlns:a="http://schemas.openxmlformats.org/drawingml/2006/main">
+                  <a:graphicData uri="http://schemas.microsoft.com/office/word/2010/wordprocessingShape">
+                    <wps:wsp>
+                      <wps:cNvSpPr/>
+                      <wps:spPr>
+                        <a:xfrm>
+                          <a:off x="0" y="0"/>
+                          <a:ext cx="1323975" cy="10828020"/>
+                        </a:xfrm>
+                        <a:prstGeom prst="rect">
+                          <a:avLst/>
+                        </a:prstGeom>
+                        <a:solidFill>
+                          <a:schemeClr val="tx1">
+                            <a:lumMod val="75000"/>
+                            <a:lumOff val="25000"/>
+                          </a:schemeClr>
+                        </a:solidFill>
+                        <a:ln>
+                          <a:noFill/>
+                        </a:ln>
+                      </wps:spPr>
+                      <wps:style>
+                        <a:lnRef idx="2">
+                          <a:schemeClr val="accent1">
+                            <a:shade val="50000"/>
+                          </a:schemeClr>
+                        </a:lnRef>
+                        <a:fillRef idx="1">
+                          <a:schemeClr val="accent1"/>
+                        </a:fillRef>
+                        <a:effectRef idx="0">
+                          <a:schemeClr val="accent1"/>
+                        </a:effectRef>
+                        <a:fontRef idx="minor">
+                          <a:schemeClr val="lt1"/>
+                        </a:fontRef>
+                      </wps:style>
+                      <wps:txbx>
+                        <w:txbxContent>
+                          <w:p>
+                            <w:pPr>
+                              <w:pStyle w:val="Piedepginablanco"/>
+                            </w:pPr>
+                            <w:r>
+                              <w:rPr>
+                                <w:lang w:bidi="es-ES"/>
+                              </w:rPr>
+                              <w:t>6</w:t>
+                            </w:r>
+                          </w:p>
+                          <w:p/>
+                        </w:txbxContent>
+                      </wps:txbx>
+                      <wps:bodyPr rot="0" spcFirstLastPara="0" vertOverflow="overflow" horzOverflow="overflow" vert="horz" wrap="square" lIns="91440" tIns="45720" rIns="91440" bIns="45720" numCol="1" spcCol="0" rtlCol="0" fromWordArt="0" anchor="b" anchorCtr="0" forceAA="0" compatLnSpc="1">
+                        <a:prstTxWarp prst="textNoShape">
+                          <a:avLst/>
+                        </a:prstTxWarp>
+                        <a:noAutofit/>
+                      </wps:bodyPr>
+                    </wps:wsp>
+                  </a:graphicData>
+                </a:graphic>
+                <wp14:sizeRelH relativeFrom="margin">
+                  <wp14:pctWidth>0</wp14:pctWidth>
+                </wp14:sizeRelH>
+                <wp14:sizeRelV relativeFrom="margin">
+                  <wp14:pctHeight>0</wp14:pctHeight>
+                </wp14:sizeRelV>
+              </wp:anchor>
+            </w:drawing>
+          </mc:Choice>
+          <mc:Fallback>
+            <w:pict>
+              <v:rect w14:anchorId="58A61D6F" id="_x0000_s1035" alt="&quot;&quot;" style="position:absolute;left:0;text-align:left;margin-left:0;margin-top:-5in;width:104.25pt;height:852.6pt;z-index:-251625472;visibility:visible;mso-wrap-style:square;mso-width-percent:0;mso-height-percent:0;mso-wrap-distance-left:9pt;mso-wrap-distance-top:0;mso-wrap-distance-right:9pt;mso-wrap-distance-bottom:0;mso-position-horizontal:left;mso-position-horizontal-relative:page;mso-position-vertical:absolute;mso-position-vertical-relative:text;mso-width-percent:0;mso-height-percent:0;mso-width-relative:margin;mso-height-relative:margin;v-text-anchor:bottom" o:gfxdata="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" fillcolor="#404040 [2429]" stroked="f" strokeweight="1pt">
+                <v:textbox>
+                  <w:txbxContent>
+                    <w:p>
+                      <w:pPr>
+                        <w:pStyle w:val="Piedepginablanco"/>
+                      </w:pPr>
+                      <w:r>
+                        <w:rPr>
+                          <w:lang w:bidi="es-ES"/>
+                        </w:rPr>
+                        <w:t>6</w:t>
+                      </w:r>
+                    </w:p>
+                    <w:p/>
+                  </w:txbxContent>
+                </v:textbox>
+                <w10:wrap anchorx="page"/>
+                <w10:anchorlock/>
+              </v:rect>
+            </w:pict>
+          </mc:Fallback>
+        </mc:AlternateContent>
+      </w:r>
+      <w:r>
+        <w:rPr>
           <w:b/>
           <w:bCs/>
         </w:rPr>
@@ -3553,6 +3683,1097 @@
         <w:t xml:space="preserve"> modernas.</w:t>
       </w:r>
     </w:p>
+    <w:p>
+      <w:r>
+        <w:rPr>
+          <w:noProof/>
+          <w:lang w:bidi="es-ES"/>
+        </w:rPr>
+        <mc:AlternateContent>
+          <mc:Choice Requires="wps">
+            <w:drawing>
+              <wp:anchor distT="0" distB="0" distL="114300" distR="114300" simplePos="0" relativeHeight="251693056" behindDoc="1" locked="1" layoutInCell="1" allowOverlap="1" wp14:anchorId="0A27B900" wp14:editId="2ABB7FFF">
+                <wp:simplePos x="0" y="0"/>
+                <wp:positionH relativeFrom="page">
+                  <wp:align>left</wp:align>
+                </wp:positionH>
+                <wp:positionV relativeFrom="paragraph">
+                  <wp:posOffset>-7849235</wp:posOffset>
+                </wp:positionV>
+                <wp:extent cx="1323975" cy="10828020"/>
+                <wp:effectExtent l="0" t="0" r="9525" b="0"/>
+                <wp:wrapNone/>
+                <wp:docPr id="1687418042" name="Rectángulo 2">
+                  <a:extLst xmlns:a="http://schemas.openxmlformats.org/drawingml/2006/main">
+                    <a:ext uri="{C183D7F6-B498-43B3-948B-1728B52AA6E4}">
+                      <adec:decorative xmlns:adec="http://schemas.microsoft.com/office/drawing/2017/decorative" val="1"/>
+                    </a:ext>
+                  </a:extLst>
+                </wp:docPr>
+                <wp:cNvGraphicFramePr/>
+                <a:graphic xmlns:a="http://schemas.openxmlformats.org/drawingml/2006/main">
+                  <a:graphicData uri="http://schemas.microsoft.com/office/word/2010/wordprocessingShape">
+                    <wps:wsp>
+                      <wps:cNvSpPr/>
+                      <wps:spPr>
+                        <a:xfrm>
+                          <a:off x="0" y="0"/>
+                          <a:ext cx="1323975" cy="10828020"/>
+                        </a:xfrm>
+                        <a:prstGeom prst="rect">
+                          <a:avLst/>
+                        </a:prstGeom>
+                        <a:solidFill>
+                          <a:schemeClr val="tx1">
+                            <a:lumMod val="75000"/>
+                            <a:lumOff val="25000"/>
+                          </a:schemeClr>
+                        </a:solidFill>
+                        <a:ln>
+                          <a:noFill/>
+                        </a:ln>
+                      </wps:spPr>
+                      <wps:style>
+                        <a:lnRef idx="2">
+                          <a:schemeClr val="accent1">
+                            <a:shade val="50000"/>
+                          </a:schemeClr>
+                        </a:lnRef>
+                        <a:fillRef idx="1">
+                          <a:schemeClr val="accent1"/>
+                        </a:fillRef>
+                        <a:effectRef idx="0">
+                          <a:schemeClr val="accent1"/>
+                        </a:effectRef>
+                        <a:fontRef idx="minor">
+                          <a:schemeClr val="lt1"/>
+                        </a:fontRef>
+                      </wps:style>
+                      <wps:txbx>
+                        <w:txbxContent>
+                          <w:p>
+                            <w:pPr>
+                              <w:pStyle w:val="Piedepginablanco"/>
+                            </w:pPr>
+                            <w:r>
+                              <w:rPr>
+                                <w:lang w:bidi="es-ES"/>
+                              </w:rPr>
+                              <w:t>7</w:t>
+                            </w:r>
+                          </w:p>
+                          <w:p/>
+                        </w:txbxContent>
+                      </wps:txbx>
+                      <wps:bodyPr rot="0" spcFirstLastPara="0" vertOverflow="overflow" horzOverflow="overflow" vert="horz" wrap="square" lIns="91440" tIns="45720" rIns="91440" bIns="45720" numCol="1" spcCol="0" rtlCol="0" fromWordArt="0" anchor="b" anchorCtr="0" forceAA="0" compatLnSpc="1">
+                        <a:prstTxWarp prst="textNoShape">
+                          <a:avLst/>
+                        </a:prstTxWarp>
+                        <a:noAutofit/>
+                      </wps:bodyPr>
+                    </wps:wsp>
+                  </a:graphicData>
+                </a:graphic>
+                <wp14:sizeRelH relativeFrom="margin">
+                  <wp14:pctWidth>0</wp14:pctWidth>
+                </wp14:sizeRelH>
+                <wp14:sizeRelV relativeFrom="margin">
+                  <wp14:pctHeight>0</wp14:pctHeight>
+                </wp14:sizeRelV>
+              </wp:anchor>
+            </w:drawing>
+          </mc:Choice>
+          <mc:Fallback>
+            <w:pict>
+              <v:rect w14:anchorId="0A27B900" id="_x0000_s1036" alt="&quot;&quot;" style="position:absolute;margin-left:0;margin-top:-618.05pt;width:104.25pt;height:852.6pt;z-index:-251623424;visibility:visible;mso-wrap-style:square;mso-width-percent:0;mso-height-percent:0;mso-wrap-distance-left:9pt;mso-wrap-distance-top:0;mso-wrap-distance-right:9pt;mso-wrap-distance-bottom:0;mso-position-horizontal:left;mso-position-horizontal-relative:page;mso-position-vertical:absolute;mso-position-vertical-relative:text;mso-width-percent:0;mso-height-percent:0;mso-width-relative:margin;mso-height-relative:margin;v-text-anchor:bottom" o:gfxdata="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" fillcolor="#404040 [2429]" stroked="f" strokeweight="1pt">
+                <v:textbox>
+                  <w:txbxContent>
+                    <w:p>
+                      <w:pPr>
+                        <w:pStyle w:val="Piedepginablanco"/>
+                      </w:pPr>
+                      <w:r>
+                        <w:rPr>
+                          <w:lang w:bidi="es-ES"/>
+                        </w:rPr>
+                        <w:t>7</w:t>
+                      </w:r>
+                    </w:p>
+                    <w:p/>
+                  </w:txbxContent>
+                </v:textbox>
+                <w10:wrap anchorx="page"/>
+                <w10:anchorlock/>
+              </v:rect>
+            </w:pict>
+          </mc:Fallback>
+        </mc:AlternateContent>
+      </w:r>
+    </w:p>
+    <w:p/>
+    <w:p/>
+    <w:p/>
+    <w:p/>
+    <w:p>
+      <w:pPr>
+        <w:rPr>
+          <w:b/>
+          <w:bCs/>
+          <w:sz w:val="30"/>
+          <w:szCs w:val="30"/>
+        </w:rPr>
+      </w:pPr>
+      <w:r>
+        <w:rPr>
+          <w:b/>
+          <w:bCs/>
+          <w:sz w:val="30"/>
+          <w:szCs w:val="30"/>
+        </w:rPr>
+        <w:lastRenderedPageBreak/>
+        <w:t>Recursos Materiales</w:t>
+      </w:r>
+    </w:p>
+    <w:p>
+      <w:pPr>
+        <w:rPr>
+          <w:b/>
+          <w:bCs/>
+          <w:sz w:val="30"/>
+          <w:szCs w:val="30"/>
+        </w:rPr>
+      </w:pPr>
+    </w:p>
+    <w:tbl>
+      <w:tblPr>
+        <w:tblStyle w:val="Tablaconcuadrcula"/>
+        <w:tblW w:w="0" w:type="auto"/>
+        <w:tblLook w:val="04A0" w:firstRow="1" w:lastRow="0" w:firstColumn="1" w:lastColumn="0" w:noHBand="0" w:noVBand="1"/>
+      </w:tblPr>
+      <w:tblGrid>
+        <w:gridCol w:w="4148"/>
+        <w:gridCol w:w="4148"/>
+      </w:tblGrid>
+      <w:tr>
+        <w:tc>
+          <w:tcPr>
+            <w:tcW w:w="4148" w:type="dxa"/>
+          </w:tcPr>
+          <w:p>
+            <w:r>
+              <w:t>RECURSO</w:t>
+            </w:r>
+          </w:p>
+        </w:tc>
+        <w:tc>
+          <w:tcPr>
+            <w:tcW w:w="4148" w:type="dxa"/>
+          </w:tcPr>
+          <w:p>
+            <w:r>
+              <w:t>DESCRIPCIÓN</w:t>
+            </w:r>
+          </w:p>
+        </w:tc>
+      </w:tr>
+      <w:tr>
+        <w:tc>
+          <w:tcPr>
+            <w:tcW w:w="4148" w:type="dxa"/>
+          </w:tcPr>
+          <w:p>
+            <w:r>
+              <w:t>Servidor web (hosting)</w:t>
+            </w:r>
+          </w:p>
+        </w:tc>
+        <w:tc>
+          <w:tcPr>
+            <w:tcW w:w="4148" w:type="dxa"/>
+          </w:tcPr>
+          <w:tbl>
+            <w:tblPr>
+              <w:tblW w:w="0" w:type="auto"/>
+              <w:tblCellSpacing w:w="15" w:type="dxa"/>
+              <w:tblCellMar>
+                <w:top w:w="15" w:type="dxa"/>
+                <w:left w:w="15" w:type="dxa"/>
+                <w:bottom w:w="15" w:type="dxa"/>
+                <w:right w:w="15" w:type="dxa"/>
+              </w:tblCellMar>
+              <w:tblLook w:val="04A0" w:firstRow="1" w:lastRow="0" w:firstColumn="1" w:lastColumn="0" w:noHBand="0" w:noVBand="1"/>
+            </w:tblPr>
+            <w:tblGrid>
+              <w:gridCol w:w="96"/>
+            </w:tblGrid>
+            <w:tr>
+              <w:trPr>
+                <w:tblCellSpacing w:w="15" w:type="dxa"/>
+              </w:trPr>
+              <w:tc>
+                <w:tcPr>
+                  <w:tcW w:w="0" w:type="auto"/>
+                  <w:vAlign w:val="center"/>
+                  <w:hideMark/>
+                </w:tcPr>
+                <w:p/>
+              </w:tc>
+            </w:tr>
+          </w:tbl>
+          <w:p>
+            <w:pPr>
+              <w:rPr>
+                <w:vanish/>
+              </w:rPr>
+            </w:pPr>
+          </w:p>
+          <w:tbl>
+            <w:tblPr>
+              <w:tblW w:w="0" w:type="auto"/>
+              <w:tblCellSpacing w:w="15" w:type="dxa"/>
+              <w:tblCellMar>
+                <w:top w:w="15" w:type="dxa"/>
+                <w:left w:w="15" w:type="dxa"/>
+                <w:bottom w:w="15" w:type="dxa"/>
+                <w:right w:w="15" w:type="dxa"/>
+              </w:tblCellMar>
+              <w:tblLook w:val="04A0" w:firstRow="1" w:lastRow="0" w:firstColumn="1" w:lastColumn="0" w:noHBand="0" w:noVBand="1"/>
+            </w:tblPr>
+            <w:tblGrid>
+              <w:gridCol w:w="3552"/>
+            </w:tblGrid>
+            <w:tr>
+              <w:trPr>
+                <w:tblCellSpacing w:w="15" w:type="dxa"/>
+              </w:trPr>
+              <w:tc>
+                <w:tcPr>
+                  <w:tcW w:w="0" w:type="auto"/>
+                  <w:vAlign w:val="center"/>
+                  <w:hideMark/>
+                </w:tcPr>
+                <w:p>
+                  <w:r>
+                    <w:t>Para el despliegue de la aplicación</w:t>
+                  </w:r>
+                </w:p>
+              </w:tc>
+            </w:tr>
+          </w:tbl>
+          <w:p/>
+        </w:tc>
+      </w:tr>
+      <w:tr>
+        <w:tc>
+          <w:tcPr>
+            <w:tcW w:w="4148" w:type="dxa"/>
+          </w:tcPr>
+          <w:p>
+            <w:r>
+              <w:t>Herramientas de diseño</w:t>
+            </w:r>
+          </w:p>
+        </w:tc>
+        <w:tc>
+          <w:tcPr>
+            <w:tcW w:w="4148" w:type="dxa"/>
+          </w:tcPr>
+          <w:tbl>
+            <w:tblPr>
+              <w:tblW w:w="0" w:type="auto"/>
+              <w:tblCellSpacing w:w="15" w:type="dxa"/>
+              <w:tblCellMar>
+                <w:top w:w="15" w:type="dxa"/>
+                <w:left w:w="15" w:type="dxa"/>
+                <w:bottom w:w="15" w:type="dxa"/>
+                <w:right w:w="15" w:type="dxa"/>
+              </w:tblCellMar>
+              <w:tblLook w:val="04A0" w:firstRow="1" w:lastRow="0" w:firstColumn="1" w:lastColumn="0" w:noHBand="0" w:noVBand="1"/>
+            </w:tblPr>
+            <w:tblGrid>
+              <w:gridCol w:w="96"/>
+            </w:tblGrid>
+            <w:tr>
+              <w:trPr>
+                <w:tblCellSpacing w:w="15" w:type="dxa"/>
+              </w:trPr>
+              <w:tc>
+                <w:tcPr>
+                  <w:tcW w:w="0" w:type="auto"/>
+                  <w:vAlign w:val="center"/>
+                  <w:hideMark/>
+                </w:tcPr>
+                <w:p/>
+              </w:tc>
+            </w:tr>
+          </w:tbl>
+          <w:p>
+            <w:pPr>
+              <w:rPr>
+                <w:vanish/>
+              </w:rPr>
+            </w:pPr>
+          </w:p>
+          <w:tbl>
+            <w:tblPr>
+              <w:tblW w:w="0" w:type="auto"/>
+              <w:tblCellSpacing w:w="15" w:type="dxa"/>
+              <w:tblCellMar>
+                <w:top w:w="15" w:type="dxa"/>
+                <w:left w:w="15" w:type="dxa"/>
+                <w:bottom w:w="15" w:type="dxa"/>
+                <w:right w:w="15" w:type="dxa"/>
+              </w:tblCellMar>
+              <w:tblLook w:val="04A0" w:firstRow="1" w:lastRow="0" w:firstColumn="1" w:lastColumn="0" w:noHBand="0" w:noVBand="1"/>
+            </w:tblPr>
+            <w:tblGrid>
+              <w:gridCol w:w="686"/>
+            </w:tblGrid>
+            <w:tr>
+              <w:trPr>
+                <w:tblCellSpacing w:w="15" w:type="dxa"/>
+              </w:trPr>
+              <w:tc>
+                <w:tcPr>
+                  <w:tcW w:w="0" w:type="auto"/>
+                  <w:vAlign w:val="center"/>
+                  <w:hideMark/>
+                </w:tcPr>
+                <w:p>
+                  <w:proofErr w:type="spellStart"/>
+                  <w:r>
+                    <w:t>Figma</w:t>
+                  </w:r>
+                  <w:proofErr w:type="spellEnd"/>
+                </w:p>
+              </w:tc>
+            </w:tr>
+          </w:tbl>
+          <w:p/>
+        </w:tc>
+      </w:tr>
+      <w:tr>
+        <w:tc>
+          <w:tcPr>
+            <w:tcW w:w="4148" w:type="dxa"/>
+          </w:tcPr>
+          <w:p>
+            <w:r>
+              <w:t>Servicios en la nube</w:t>
+            </w:r>
+          </w:p>
+        </w:tc>
+        <w:tc>
+          <w:tcPr>
+            <w:tcW w:w="4148" w:type="dxa"/>
+          </w:tcPr>
+          <w:p>
+            <w:r>
+              <w:t>Base de datos, almacenamiento, sistema de autenticación</w:t>
+            </w:r>
+          </w:p>
+        </w:tc>
+      </w:tr>
+      <w:tr>
+        <w:trPr>
+          <w:trHeight w:val="828"/>
+        </w:trPr>
+        <w:tc>
+          <w:tcPr>
+            <w:tcW w:w="4148" w:type="dxa"/>
+          </w:tcPr>
+          <w:p>
+            <w:r>
+              <w:t>Dominios</w:t>
+            </w:r>
+          </w:p>
+        </w:tc>
+        <w:tc>
+          <w:tcPr>
+            <w:tcW w:w="4148" w:type="dxa"/>
+          </w:tcPr>
+          <w:p>
+            <w:r>
+              <w:t>Registro del nombre de dominio del blog</w:t>
+            </w:r>
+          </w:p>
+        </w:tc>
+      </w:tr>
+    </w:tbl>
+    <w:p/>
+    <w:p>
+      <w:pPr>
+        <w:rPr>
+          <w:b/>
+          <w:bCs/>
+          <w:sz w:val="30"/>
+          <w:szCs w:val="30"/>
+        </w:rPr>
+      </w:pPr>
+      <w:r>
+        <w:rPr>
+          <w:b/>
+          <w:bCs/>
+          <w:sz w:val="30"/>
+          <w:szCs w:val="30"/>
+        </w:rPr>
+        <w:t>Presupuesto Estimado</w:t>
+      </w:r>
+    </w:p>
+    <w:p>
+      <w:pPr>
+        <w:rPr>
+          <w:b/>
+          <w:bCs/>
+          <w:sz w:val="30"/>
+          <w:szCs w:val="30"/>
+        </w:rPr>
+      </w:pPr>
+      <w:r>
+        <w:rPr>
+          <w:b/>
+          <w:bCs/>
+        </w:rPr>
+        <w:t>Suel</w:t>
+      </w:r>
+      <w:r>
+        <w:rPr>
+          <w:b/>
+          <w:bCs/>
+        </w:rPr>
+        <w:t>dos</w:t>
+      </w:r>
+    </w:p>
+    <w:tbl>
+      <w:tblPr>
+        <w:tblStyle w:val="Tablaconcuadrcula"/>
+        <w:tblW w:w="0" w:type="auto"/>
+        <w:tblLook w:val="04A0" w:firstRow="1" w:lastRow="0" w:firstColumn="1" w:lastColumn="0" w:noHBand="0" w:noVBand="1"/>
+      </w:tblPr>
+      <w:tblGrid>
+        <w:gridCol w:w="4148"/>
+        <w:gridCol w:w="4148"/>
+      </w:tblGrid>
+      <w:tr>
+        <w:tc>
+          <w:tcPr>
+            <w:tcW w:w="4148" w:type="dxa"/>
+          </w:tcPr>
+          <w:p>
+            <w:r>
+              <w:t>Jefe de proyecto</w:t>
+            </w:r>
+          </w:p>
+        </w:tc>
+        <w:tc>
+          <w:tcPr>
+            <w:tcW w:w="4148" w:type="dxa"/>
+          </w:tcPr>
+          <w:p>
+            <w:pPr>
+              <w:jc w:val="center"/>
+            </w:pPr>
+            <w:r>
+              <w:t>3.255 €</w:t>
+            </w:r>
+          </w:p>
+        </w:tc>
+      </w:tr>
+      <w:tr>
+        <w:tc>
+          <w:tcPr>
+            <w:tcW w:w="4148" w:type="dxa"/>
+          </w:tcPr>
+          <w:p>
+            <w:r>
+              <w:t>Analista funcional</w:t>
+            </w:r>
+          </w:p>
+        </w:tc>
+        <w:tc>
+          <w:tcPr>
+            <w:tcW w:w="4148" w:type="dxa"/>
+          </w:tcPr>
+          <w:p>
+            <w:pPr>
+              <w:jc w:val="center"/>
+            </w:pPr>
+            <w:r>
+              <w:t>1.115 €</w:t>
+            </w:r>
+          </w:p>
+        </w:tc>
+      </w:tr>
+      <w:tr>
+        <w:tc>
+          <w:tcPr>
+            <w:tcW w:w="4148" w:type="dxa"/>
+          </w:tcPr>
+          <w:p>
+            <w:r>
+              <w:t>Diseñador UX/UI</w:t>
+            </w:r>
+          </w:p>
+        </w:tc>
+        <w:tc>
+          <w:tcPr>
+            <w:tcW w:w="4148" w:type="dxa"/>
+          </w:tcPr>
+          <w:p>
+            <w:pPr>
+              <w:jc w:val="center"/>
+            </w:pPr>
+            <w:r>
+              <w:t>930 €</w:t>
+            </w:r>
+          </w:p>
+        </w:tc>
+      </w:tr>
+      <w:tr>
+        <w:tc>
+          <w:tcPr>
+            <w:tcW w:w="4148" w:type="dxa"/>
+          </w:tcPr>
+          <w:p>
+            <w:r>
+              <w:t>Desarrollador</w:t>
+            </w:r>
+            <w:r>
+              <w:t xml:space="preserve"> Full </w:t>
+            </w:r>
+            <w:proofErr w:type="spellStart"/>
+            <w:r>
+              <w:t>Stack</w:t>
+            </w:r>
+            <w:proofErr w:type="spellEnd"/>
+          </w:p>
+        </w:tc>
+        <w:tc>
+          <w:tcPr>
+            <w:tcW w:w="4148" w:type="dxa"/>
+          </w:tcPr>
+          <w:p>
+            <w:pPr>
+              <w:jc w:val="center"/>
+            </w:pPr>
+            <w:r>
+              <w:t>2.790 €</w:t>
+            </w:r>
+          </w:p>
+        </w:tc>
+      </w:tr>
+      <w:tr>
+        <w:tc>
+          <w:tcPr>
+            <w:tcW w:w="4148" w:type="dxa"/>
+          </w:tcPr>
+          <w:p>
+            <w:proofErr w:type="spellStart"/>
+            <w:r>
+              <w:t>Testers</w:t>
+            </w:r>
+            <w:proofErr w:type="spellEnd"/>
+          </w:p>
+        </w:tc>
+        <w:tc>
+          <w:tcPr>
+            <w:tcW w:w="4148" w:type="dxa"/>
+          </w:tcPr>
+          <w:p>
+            <w:pPr>
+              <w:jc w:val="center"/>
+            </w:pPr>
+            <w:r>
+              <w:t>745 €</w:t>
+            </w:r>
+          </w:p>
+        </w:tc>
+      </w:tr>
+      <w:tr>
+        <w:tc>
+          <w:tcPr>
+            <w:tcW w:w="4148" w:type="dxa"/>
+          </w:tcPr>
+          <w:p>
+            <w:pPr>
+              <w:rPr>
+                <w:b/>
+                <w:bCs/>
+              </w:rPr>
+            </w:pPr>
+            <w:r>
+              <w:rPr>
+                <w:b/>
+                <w:bCs/>
+              </w:rPr>
+              <w:t>Subtotal sueldos</w:t>
+            </w:r>
+          </w:p>
+        </w:tc>
+        <w:tc>
+          <w:tcPr>
+            <w:tcW w:w="4148" w:type="dxa"/>
+          </w:tcPr>
+          <w:p>
+            <w:pPr>
+              <w:jc w:val="center"/>
+              <w:rPr>
+                <w:b/>
+                <w:bCs/>
+              </w:rPr>
+            </w:pPr>
+            <w:r>
+              <w:rPr>
+                <w:b/>
+                <w:bCs/>
+              </w:rPr>
+              <w:t>8835</w:t>
+            </w:r>
+            <w:r>
+              <w:rPr>
+                <w:b/>
+                <w:bCs/>
+              </w:rPr>
+              <w:t>€</w:t>
+            </w:r>
+          </w:p>
+        </w:tc>
+      </w:tr>
+    </w:tbl>
+    <w:p/>
+    <w:p>
+      <w:pPr>
+        <w:rPr>
+          <w:b/>
+          <w:bCs/>
+        </w:rPr>
+      </w:pPr>
+      <w:r>
+        <w:rPr>
+          <w:b/>
+          <w:bCs/>
+        </w:rPr>
+        <w:t>Infraestructura y Herramientas</w:t>
+      </w:r>
+    </w:p>
+    <w:tbl>
+      <w:tblPr>
+        <w:tblStyle w:val="Tablaconcuadrcula"/>
+        <w:tblW w:w="0" w:type="auto"/>
+        <w:tblLook w:val="04A0" w:firstRow="1" w:lastRow="0" w:firstColumn="1" w:lastColumn="0" w:noHBand="0" w:noVBand="1"/>
+      </w:tblPr>
+      <w:tblGrid>
+        <w:gridCol w:w="4148"/>
+        <w:gridCol w:w="4148"/>
+      </w:tblGrid>
+      <w:tr>
+        <w:tc>
+          <w:tcPr>
+            <w:tcW w:w="4148" w:type="dxa"/>
+          </w:tcPr>
+          <w:p>
+            <w:pPr>
+              <w:rPr>
+                <w:b/>
+                <w:bCs/>
+                <w:sz w:val="30"/>
+                <w:szCs w:val="30"/>
+              </w:rPr>
+            </w:pPr>
+            <w:r>
+              <w:t>Hosting</w:t>
+            </w:r>
+            <w:r>
+              <w:t xml:space="preserve"> (1 año)</w:t>
+            </w:r>
+          </w:p>
+        </w:tc>
+        <w:tc>
+          <w:tcPr>
+            <w:tcW w:w="4148" w:type="dxa"/>
+          </w:tcPr>
+          <w:p>
+            <w:pPr>
+              <w:jc w:val="center"/>
+              <w:rPr>
+                <w:b/>
+                <w:bCs/>
+                <w:sz w:val="30"/>
+                <w:szCs w:val="30"/>
+              </w:rPr>
+            </w:pPr>
+            <w:r>
+              <w:t>280€</w:t>
+            </w:r>
+          </w:p>
+        </w:tc>
+      </w:tr>
+      <w:tr>
+        <w:tc>
+          <w:tcPr>
+            <w:tcW w:w="4148" w:type="dxa"/>
+          </w:tcPr>
+          <w:p>
+            <w:pPr>
+              <w:rPr>
+                <w:b/>
+                <w:bCs/>
+                <w:sz w:val="30"/>
+                <w:szCs w:val="30"/>
+              </w:rPr>
+            </w:pPr>
+            <w:r>
+              <w:t>Dominio</w:t>
+            </w:r>
+            <w:r>
+              <w:t xml:space="preserve"> (1 año)</w:t>
+            </w:r>
+          </w:p>
+        </w:tc>
+        <w:tc>
+          <w:tcPr>
+            <w:tcW w:w="4148" w:type="dxa"/>
+          </w:tcPr>
+          <w:p>
+            <w:pPr>
+              <w:jc w:val="center"/>
+              <w:rPr>
+                <w:b/>
+                <w:bCs/>
+                <w:sz w:val="30"/>
+                <w:szCs w:val="30"/>
+              </w:rPr>
+            </w:pPr>
+            <w:r>
+              <w:t>14€</w:t>
+            </w:r>
+          </w:p>
+        </w:tc>
+      </w:tr>
+      <w:tr>
+        <w:tc>
+          <w:tcPr>
+            <w:tcW w:w="4148" w:type="dxa"/>
+          </w:tcPr>
+          <w:p>
+            <w:pPr>
+              <w:rPr>
+                <w:b/>
+                <w:bCs/>
+                <w:sz w:val="30"/>
+                <w:szCs w:val="30"/>
+              </w:rPr>
+            </w:pPr>
+            <w:r>
+              <w:t>Herramientas de diseño</w:t>
+            </w:r>
+          </w:p>
+        </w:tc>
+        <w:tc>
+          <w:tcPr>
+            <w:tcW w:w="4148" w:type="dxa"/>
+          </w:tcPr>
+          <w:p>
+            <w:pPr>
+              <w:jc w:val="center"/>
+              <w:rPr>
+                <w:b/>
+                <w:bCs/>
+                <w:sz w:val="30"/>
+                <w:szCs w:val="30"/>
+              </w:rPr>
+            </w:pPr>
+            <w:r>
+              <w:t>192</w:t>
+            </w:r>
+            <w:r>
+              <w:t>€</w:t>
+            </w:r>
+          </w:p>
+        </w:tc>
+      </w:tr>
+      <w:tr>
+        <w:tc>
+          <w:tcPr>
+            <w:tcW w:w="4148" w:type="dxa"/>
+          </w:tcPr>
+          <w:p>
+            <w:pPr>
+              <w:rPr>
+                <w:b/>
+                <w:bCs/>
+                <w:sz w:val="30"/>
+                <w:szCs w:val="30"/>
+              </w:rPr>
+            </w:pPr>
+            <w:r>
+              <w:t>Servicio</w:t>
+            </w:r>
+            <w:r>
+              <w:rPr>
+                <w:noProof/>
+                <w:lang w:bidi="es-ES"/>
+              </w:rPr>
+              <mc:AlternateContent>
+                <mc:Choice Requires="wps">
+                  <w:drawing>
+                    <wp:anchor distT="0" distB="0" distL="114300" distR="114300" simplePos="0" relativeHeight="251695104" behindDoc="1" locked="1" layoutInCell="1" allowOverlap="1" wp14:anchorId="77719690" wp14:editId="4B5A6FC3">
+                      <wp:simplePos x="0" y="0"/>
+                      <wp:positionH relativeFrom="page">
+                        <wp:posOffset>-1818005</wp:posOffset>
+                      </wp:positionH>
+                      <wp:positionV relativeFrom="paragraph">
+                        <wp:posOffset>-8106410</wp:posOffset>
+                      </wp:positionV>
+                      <wp:extent cx="1323975" cy="10828020"/>
+                      <wp:effectExtent l="0" t="0" r="9525" b="0"/>
+                      <wp:wrapNone/>
+                      <wp:docPr id="924544378" name="Rectángulo 2">
+                        <a:extLst xmlns:a="http://schemas.openxmlformats.org/drawingml/2006/main">
+                          <a:ext uri="{C183D7F6-B498-43B3-948B-1728B52AA6E4}">
+                            <adec:decorative xmlns:adec="http://schemas.microsoft.com/office/drawing/2017/decorative" val="1"/>
+                          </a:ext>
+                        </a:extLst>
+                      </wp:docPr>
+                      <wp:cNvGraphicFramePr/>
+                      <a:graphic xmlns:a="http://schemas.openxmlformats.org/drawingml/2006/main">
+                        <a:graphicData uri="http://schemas.microsoft.com/office/word/2010/wordprocessingShape">
+                          <wps:wsp>
+                            <wps:cNvSpPr/>
+                            <wps:spPr>
+                              <a:xfrm>
+                                <a:off x="0" y="0"/>
+                                <a:ext cx="1323975" cy="10828020"/>
+                              </a:xfrm>
+                              <a:prstGeom prst="rect">
+                                <a:avLst/>
+                              </a:prstGeom>
+                              <a:solidFill>
+                                <a:schemeClr val="tx1">
+                                  <a:lumMod val="75000"/>
+                                  <a:lumOff val="25000"/>
+                                </a:schemeClr>
+                              </a:solidFill>
+                              <a:ln>
+                                <a:noFill/>
+                              </a:ln>
+                            </wps:spPr>
+                            <wps:style>
+                              <a:lnRef idx="2">
+                                <a:schemeClr val="accent1">
+                                  <a:shade val="50000"/>
+                                </a:schemeClr>
+                              </a:lnRef>
+                              <a:fillRef idx="1">
+                                <a:schemeClr val="accent1"/>
+                              </a:fillRef>
+                              <a:effectRef idx="0">
+                                <a:schemeClr val="accent1"/>
+                              </a:effectRef>
+                              <a:fontRef idx="minor">
+                                <a:schemeClr val="lt1"/>
+                              </a:fontRef>
+                            </wps:style>
+                            <wps:txbx>
+                              <w:txbxContent>
+                                <w:p>
+                                  <w:pPr>
+                                    <w:pStyle w:val="Piedepginablanco"/>
+                                  </w:pPr>
+                                  <w:r>
+                                    <w:rPr>
+                                      <w:lang w:bidi="es-ES"/>
+                                    </w:rPr>
+                                    <w:t>8</w:t>
+                                  </w:r>
+                                </w:p>
+                                <w:p/>
+                              </w:txbxContent>
+                            </wps:txbx>
+                            <wps:bodyPr rot="0" spcFirstLastPara="0" vertOverflow="overflow" horzOverflow="overflow" vert="horz" wrap="square" lIns="91440" tIns="45720" rIns="91440" bIns="45720" numCol="1" spcCol="0" rtlCol="0" fromWordArt="0" anchor="b" anchorCtr="0" forceAA="0" compatLnSpc="1">
+                              <a:prstTxWarp prst="textNoShape">
+                                <a:avLst/>
+                              </a:prstTxWarp>
+                              <a:noAutofit/>
+                            </wps:bodyPr>
+                          </wps:wsp>
+                        </a:graphicData>
+                      </a:graphic>
+                      <wp14:sizeRelH relativeFrom="margin">
+                        <wp14:pctWidth>0</wp14:pctWidth>
+                      </wp14:sizeRelH>
+                      <wp14:sizeRelV relativeFrom="margin">
+                        <wp14:pctHeight>0</wp14:pctHeight>
+                      </wp14:sizeRelV>
+                    </wp:anchor>
+                  </w:drawing>
+                </mc:Choice>
+                <mc:Fallback>
+                  <w:pict>
+                    <v:rect w14:anchorId="77719690" id="_x0000_s1037" alt="&quot;&quot;" style="position:absolute;margin-left:-143.15pt;margin-top:-638.3pt;width:104.25pt;height:852.6pt;z-index:-251621376;visibility:visible;mso-wrap-style:square;mso-width-percent:0;mso-height-percent:0;mso-wrap-distance-left:9pt;mso-wrap-distance-top:0;mso-wrap-distance-right:9pt;mso-wrap-distance-bottom:0;mso-position-horizontal:absolute;mso-position-horizontal-relative:page;mso-position-vertical:absolute;mso-position-vertical-relative:text;mso-width-percent:0;mso-height-percent:0;mso-width-relative:margin;mso-height-relative:margin;v-text-anchor:bottom" o:gfxdata="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" fillcolor="#404040 [2429]" stroked="f" strokeweight="1pt">
+                      <v:textbox>
+                        <w:txbxContent>
+                          <w:p>
+                            <w:pPr>
+                              <w:pStyle w:val="Piedepginablanco"/>
+                            </w:pPr>
+                            <w:r>
+                              <w:rPr>
+                                <w:lang w:bidi="es-ES"/>
+                              </w:rPr>
+                              <w:t>8</w:t>
+                            </w:r>
+                          </w:p>
+                          <w:p/>
+                        </w:txbxContent>
+                      </v:textbox>
+                      <w10:wrap anchorx="page"/>
+                      <w10:anchorlock/>
+                    </v:rect>
+                  </w:pict>
+                </mc:Fallback>
+              </mc:AlternateContent>
+            </w:r>
+            <w:r>
+              <w:t>s en la nube</w:t>
+            </w:r>
+          </w:p>
+        </w:tc>
+        <w:tc>
+          <w:tcPr>
+            <w:tcW w:w="4148" w:type="dxa"/>
+          </w:tcPr>
+          <w:p>
+            <w:pPr>
+              <w:jc w:val="center"/>
+              <w:rPr>
+                <w:b/>
+                <w:bCs/>
+                <w:sz w:val="30"/>
+                <w:szCs w:val="30"/>
+              </w:rPr>
+            </w:pPr>
+            <w:r>
+              <w:t>279€</w:t>
+            </w:r>
+          </w:p>
+        </w:tc>
+      </w:tr>
+      <w:tr>
+        <w:tc>
+          <w:tcPr>
+            <w:tcW w:w="4148" w:type="dxa"/>
+          </w:tcPr>
+          <w:p>
+            <w:pPr>
+              <w:rPr>
+                <w:b/>
+                <w:bCs/>
+                <w:sz w:val="30"/>
+                <w:szCs w:val="30"/>
+              </w:rPr>
+            </w:pPr>
+            <w:r>
+              <w:rPr>
+                <w:b/>
+                <w:bCs/>
+              </w:rPr>
+              <w:t xml:space="preserve">Subtotal </w:t>
+            </w:r>
+            <w:r>
+              <w:rPr>
+                <w:b/>
+                <w:bCs/>
+              </w:rPr>
+              <w:t>herramientas</w:t>
+            </w:r>
+          </w:p>
+        </w:tc>
+        <w:tc>
+          <w:tcPr>
+            <w:tcW w:w="4148" w:type="dxa"/>
+          </w:tcPr>
+          <w:p>
+            <w:pPr>
+              <w:jc w:val="center"/>
+              <w:rPr>
+                <w:b/>
+                <w:bCs/>
+                <w:sz w:val="30"/>
+                <w:szCs w:val="30"/>
+              </w:rPr>
+            </w:pPr>
+            <w:r>
+              <w:rPr>
+                <w:b/>
+                <w:bCs/>
+              </w:rPr>
+              <w:t>765</w:t>
+            </w:r>
+            <w:r>
+              <w:rPr>
+                <w:b/>
+                <w:bCs/>
+              </w:rPr>
+              <w:t>€</w:t>
+            </w:r>
+          </w:p>
+        </w:tc>
+      </w:tr>
+    </w:tbl>
+    <w:p>
+      <w:pPr>
+        <w:rPr>
+          <w:b/>
+          <w:bCs/>
+          <w:sz w:val="30"/>
+          <w:szCs w:val="30"/>
+        </w:rPr>
+      </w:pPr>
+    </w:p>
+    <w:tbl>
+      <w:tblPr>
+        <w:tblStyle w:val="Tablaconcuadrcula"/>
+        <w:tblW w:w="0" w:type="auto"/>
+        <w:tblLook w:val="04A0" w:firstRow="1" w:lastRow="0" w:firstColumn="1" w:lastColumn="0" w:noHBand="0" w:noVBand="1"/>
+      </w:tblPr>
+      <w:tblGrid>
+        <w:gridCol w:w="8296"/>
+      </w:tblGrid>
+      <w:tr>
+        <w:tc>
+          <w:tcPr>
+            <w:tcW w:w="8296" w:type="dxa"/>
+          </w:tcPr>
+          <w:p>
+            <w:pPr>
+              <w:jc w:val="center"/>
+            </w:pPr>
+            <w:r>
+              <w:rPr>
+                <w:b/>
+                <w:bCs/>
+              </w:rPr>
+              <w:t>S</w:t>
+            </w:r>
+            <w:r>
+              <w:rPr>
+                <w:b/>
+                <w:bCs/>
+              </w:rPr>
+              <w:t xml:space="preserve">UBTOTAL ESTIMADO: </w:t>
+            </w:r>
+            <w:r>
+              <w:rPr>
+                <w:b/>
+                <w:bCs/>
+              </w:rPr>
+              <w:t>9€</w:t>
+            </w:r>
+          </w:p>
+        </w:tc>
+      </w:tr>
+    </w:tbl>
     <w:p/>
     <w:sectPr>
       <w:footerReference w:type="default" r:id="rId16"/>
@@ -8629,6 +9850,7 @@
     <w:rsid w:val="00121E48"/>
     <w:rsid w:val="001227FE"/>
     <w:rsid w:val="00292F68"/>
+    <w:rsid w:val="00352D52"/>
     <w:rsid w:val="00364CC0"/>
     <w:rsid w:val="003718C0"/>
     <w:rsid w:val="00494B77"/>
@@ -9594,6 +10816,10 @@
 </file>
 
 <file path=customXml/item1.xml><?xml version="1.0" encoding="utf-8"?>
+<b:Sources xmlns:b="http://schemas.openxmlformats.org/officeDocument/2006/bibliography" xmlns="http://schemas.openxmlformats.org/officeDocument/2006/bibliography" SelectedStyle="/APASixthEditionOfficeOnline.xsl" StyleName="APA" Version="6"/>
+</file>
+
+<file path=customXml/item2.xml><?xml version="1.0" encoding="utf-8"?>
 <p:properties xmlns:p="http://schemas.microsoft.com/office/2006/metadata/properties" xmlns:xsi="http://www.w3.org/2001/XMLSchema-instance" xmlns:pc="http://schemas.microsoft.com/office/infopath/2007/PartnerControls">
   <documentManagement>
     <_ip_UnifiedCompliancePolicyUIAction xmlns="http://schemas.microsoft.com/sharepoint/v3" xsi:nil="true"/>
@@ -9613,11 +10839,16 @@
 </p:properties>
 </file>
 
-<file path=customXml/item2.xml><?xml version="1.0" encoding="utf-8"?>
-<b:Sources xmlns:b="http://schemas.openxmlformats.org/officeDocument/2006/bibliography" xmlns="http://schemas.openxmlformats.org/officeDocument/2006/bibliography" SelectedStyle="/APASixthEditionOfficeOnline.xsl" StyleName="APA" Version="6"/>
+<file path=customXml/item3.xml><?xml version="1.0" encoding="utf-8"?>
+<?mso-contentType ?>
+<FormTemplates xmlns="http://schemas.microsoft.com/sharepoint/v3/contenttype/forms">
+  <Display>DocumentLibraryForm</Display>
+  <Edit>DocumentLibraryForm</Edit>
+  <New>DocumentLibraryForm</New>
+</FormTemplates>
 </file>
 
-<file path=customXml/item3.xml><?xml version="1.0" encoding="utf-8"?>
+<file path=customXml/item4.xml><?xml version="1.0" encoding="utf-8"?>
 <ct:contentTypeSchema xmlns:ct="http://schemas.microsoft.com/office/2006/metadata/contentType" xmlns:ma="http://schemas.microsoft.com/office/2006/metadata/properties/metaAttributes" ct:_="" ma:_="" ma:contentTypeName="Document" ma:contentTypeID="0x01010079F111ED35F8CC479449609E8A0923A6" ma:contentTypeVersion="26" ma:contentTypeDescription="Create a new document." ma:contentTypeScope="" ma:versionID="ac37c1753acd5e330d2062ccec26ea66">
   <xsd:schema xmlns:xsd="http://www.w3.org/2001/XMLSchema" xmlns:xs="http://www.w3.org/2001/XMLSchema" xmlns:p="http://schemas.microsoft.com/office/2006/metadata/properties" xmlns:ns1="http://schemas.microsoft.com/sharepoint/v3" xmlns:ns2="71af3243-3dd4-4a8d-8c0d-dd76da1f02a5" xmlns:ns3="16c05727-aa75-4e4a-9b5f-8a80a1165891" xmlns:ns4="230e9df3-be65-4c73-a93b-d1236ebd677e" targetNamespace="http://schemas.microsoft.com/office/2006/metadata/properties" ma:root="true" ma:fieldsID="3b340c7101c92c5120abd06486f94548" ns1:_="" ns2:_="" ns3:_="" ns4:_="">
     <xsd:import namespace="http://schemas.microsoft.com/sharepoint/v3"/>
@@ -9917,16 +11148,15 @@
 </ct:contentTypeSchema>
 </file>
 
-<file path=customXml/item4.xml><?xml version="1.0" encoding="utf-8"?>
-<?mso-contentType ?>
-<FormTemplates xmlns="http://schemas.microsoft.com/sharepoint/v3/contenttype/forms">
-  <Display>DocumentLibraryForm</Display>
-  <Edit>DocumentLibraryForm</Edit>
-  <New>DocumentLibraryForm</New>
-</FormTemplates>
+<file path=customXml/itemProps1.xml><?xml version="1.0" encoding="utf-8"?>
+<ds:datastoreItem xmlns:ds="http://schemas.openxmlformats.org/officeDocument/2006/customXml" ds:itemID="{C36A12F8-4A9B-4F64-B978-B0EE1FD97EBF}">
+  <ds:schemaRefs>
+    <ds:schemaRef ds:uri="http://schemas.openxmlformats.org/officeDocument/2006/bibliography"/>
+  </ds:schemaRefs>
+</ds:datastoreItem>
 </file>
 
-<file path=customXml/itemProps1.xml><?xml version="1.0" encoding="utf-8"?>
+<file path=customXml/itemProps2.xml><?xml version="1.0" encoding="utf-8"?>
 <ds:datastoreItem xmlns:ds="http://schemas.openxmlformats.org/officeDocument/2006/customXml" ds:itemID="{E046B6FE-75F5-4A4A-ADF9-3D55C2808F6A}">
   <ds:schemaRefs>
     <ds:schemaRef ds:uri="http://schemas.microsoft.com/office/2006/metadata/properties"/>
@@ -9938,15 +11168,15 @@
 </ds:datastoreItem>
 </file>
 
-<file path=customXml/itemProps2.xml><?xml version="1.0" encoding="utf-8"?>
-<ds:datastoreItem xmlns:ds="http://schemas.openxmlformats.org/officeDocument/2006/customXml" ds:itemID="{C36A12F8-4A9B-4F64-B978-B0EE1FD97EBF}">
+<file path=customXml/itemProps3.xml><?xml version="1.0" encoding="utf-8"?>
+<ds:datastoreItem xmlns:ds="http://schemas.openxmlformats.org/officeDocument/2006/customXml" ds:itemID="{268A88EA-2CD1-4EB5-AD27-A1454BEC753F}">
   <ds:schemaRefs>
-    <ds:schemaRef ds:uri="http://schemas.openxmlformats.org/officeDocument/2006/bibliography"/>
+    <ds:schemaRef ds:uri="http://schemas.microsoft.com/sharepoint/v3/contenttype/forms"/>
   </ds:schemaRefs>
 </ds:datastoreItem>
 </file>
 
-<file path=customXml/itemProps3.xml><?xml version="1.0" encoding="utf-8"?>
+<file path=customXml/itemProps4.xml><?xml version="1.0" encoding="utf-8"?>
 <ds:datastoreItem xmlns:ds="http://schemas.openxmlformats.org/officeDocument/2006/customXml" ds:itemID="{3B486F6C-1123-466C-A9D5-986F0A3EF9D1}">
   <ds:schemaRefs>
     <ds:schemaRef ds:uri="http://schemas.microsoft.com/office/2006/metadata/contentType"/>
@@ -9967,14 +11197,6 @@
 </ds:datastoreItem>
 </file>
 
-<file path=customXml/itemProps4.xml><?xml version="1.0" encoding="utf-8"?>
-<ds:datastoreItem xmlns:ds="http://schemas.openxmlformats.org/officeDocument/2006/customXml" ds:itemID="{268A88EA-2CD1-4EB5-AD27-A1454BEC753F}">
-  <ds:schemaRefs>
-    <ds:schemaRef ds:uri="http://schemas.microsoft.com/sharepoint/v3/contenttype/forms"/>
-  </ds:schemaRefs>
-</ds:datastoreItem>
-</file>
-
 <file path=docMetadata/LabelInfo.xml><?xml version="1.0" encoding="utf-8"?>
 <clbl:labelList xmlns:clbl="http://schemas.microsoft.com/office/2020/mipLabelMetadata"/>
 </file>
</xml_diff>

<commit_message>
mas cambios para la entrega
</commit_message>
<xml_diff>
--- a/SONAURA.docx
+++ b/SONAURA.docx
@@ -824,7 +824,6 @@
           <w:showingPlcHdr/>
           <w15:appearance w15:val="hidden"/>
         </w:sdtPr>
-        <w:sdtEndPr/>
         <w:sdtContent>
           <w:r>
             <w:rPr>
@@ -1181,7 +1180,6 @@
                 </w:placeholder>
                 <w15:appearance w15:val="hidden"/>
               </w:sdtPr>
-              <w:sdtEndPr/>
               <w:sdtContent>
                 <w:r>
                   <w:rPr>
@@ -1229,7 +1227,6 @@
                 </w:placeholder>
                 <w15:appearance w15:val="hidden"/>
               </w:sdtPr>
-              <w:sdtEndPr/>
               <w:sdtContent>
                 <w:r>
                   <w:t>SOBRE LA APLICACIÓN WEB</w:t>
@@ -1922,7 +1919,6 @@
                 </w:placeholder>
                 <w15:appearance w15:val="hidden"/>
               </w:sdtPr>
-              <w:sdtEndPr/>
               <w:sdtContent>
                 <w:r>
                   <w:rPr>
@@ -1969,7 +1965,6 @@
                 </w:placeholder>
                 <w15:appearance w15:val="hidden"/>
               </w:sdtPr>
-              <w:sdtEndPr/>
               <w:sdtContent>
                 <w:r>
                   <w:t>ESPECIFICACION DE REQUISITOS DEL SISTEMA:</w:t>
@@ -1992,21 +1987,29 @@
         <w:rPr>
           <w:b/>
           <w:bCs/>
+          <w:sz w:val="24"/>
         </w:rPr>
       </w:pPr>
       <w:r>
         <w:rPr>
           <w:b/>
           <w:bCs/>
+          <w:sz w:val="24"/>
         </w:rPr>
-        <w:t>. Identificación de necesidades del cliente</w:t>
+        <w:t>Identificación de necesidades del cliente</w:t>
       </w:r>
     </w:p>
     <w:p>
       <w:pPr>
         <w:spacing w:before="0" w:after="200" w:line="312" w:lineRule="auto"/>
-      </w:pPr>
-      <w:r>
+        <w:rPr>
+          <w:sz w:val="24"/>
+        </w:rPr>
+      </w:pPr>
+      <w:r>
+        <w:rPr>
+          <w:sz w:val="24"/>
+        </w:rPr>
         <w:t>El cliente necesita una aplicación web que:</w:t>
       </w:r>
     </w:p>
@@ -2017,8 +2020,14 @@
           <w:numId w:val="23"/>
         </w:numPr>
         <w:spacing w:before="0" w:after="200" w:line="312" w:lineRule="auto"/>
-      </w:pPr>
-      <w:r>
+        <w:rPr>
+          <w:sz w:val="24"/>
+        </w:rPr>
+      </w:pPr>
+      <w:r>
+        <w:rPr>
+          <w:sz w:val="24"/>
+        </w:rPr>
         <w:t>Ayude a los usuarios a tomar decisiones informadas sobre qué películas o series ver.</w:t>
       </w:r>
     </w:p>
@@ -2029,8 +2038,14 @@
           <w:numId w:val="23"/>
         </w:numPr>
         <w:spacing w:before="0" w:after="200" w:line="312" w:lineRule="auto"/>
-      </w:pPr>
-      <w:r>
+        <w:rPr>
+          <w:sz w:val="24"/>
+        </w:rPr>
+      </w:pPr>
+      <w:r>
+        <w:rPr>
+          <w:sz w:val="24"/>
+        </w:rPr>
         <w:t>Sea visualmente atractiva, moderna y de uso intuitivo.</w:t>
       </w:r>
     </w:p>
@@ -2041,8 +2056,14 @@
           <w:numId w:val="23"/>
         </w:numPr>
         <w:spacing w:before="0" w:after="200" w:line="312" w:lineRule="auto"/>
-      </w:pPr>
-      <w:r>
+        <w:rPr>
+          <w:sz w:val="24"/>
+        </w:rPr>
+      </w:pPr>
+      <w:r>
+        <w:rPr>
+          <w:sz w:val="24"/>
+        </w:rPr>
         <w:t>Ofrezca contenido actualizado y confiable.</w:t>
       </w:r>
     </w:p>
@@ -2053,134 +2074,9 @@
           <w:numId w:val="23"/>
         </w:numPr>
         <w:spacing w:before="0" w:after="200" w:line="312" w:lineRule="auto"/>
-      </w:pPr>
-      <w:r>
-        <w:t>Permita interacción social (comentarios, valoraciones, opiniones).</w:t>
-      </w:r>
-    </w:p>
-    <w:p>
-      <w:pPr>
-        <w:numPr>
-          <w:ilvl w:val="0"/>
-          <w:numId w:val="23"/>
-        </w:numPr>
-        <w:spacing w:before="0" w:after="200" w:line="312" w:lineRule="auto"/>
-      </w:pPr>
-      <w:r>
-        <w:t>Tenga un sistema de suscripción premium para ofrecer funcionalidades avanzadas como listas personalizadas y un calendario de estrenos.</w:t>
-      </w:r>
-    </w:p>
-    <w:p>
-      <w:pPr>
-        <w:numPr>
-          <w:ilvl w:val="0"/>
-          <w:numId w:val="23"/>
-        </w:numPr>
-        <w:spacing w:before="0" w:after="200" w:line="312" w:lineRule="auto"/>
-      </w:pPr>
-      <w:r>
-        <w:t>Presente un top 5 actualizado y recomendaciones destacadas.</w:t>
-      </w:r>
-    </w:p>
-    <w:p>
-      <w:pPr>
-        <w:spacing w:before="0" w:after="200" w:line="312" w:lineRule="auto"/>
-      </w:pPr>
-    </w:p>
-    <w:p>
-      <w:pPr>
-        <w:spacing w:before="0" w:after="200" w:line="312" w:lineRule="auto"/>
         <w:rPr>
-          <w:b/>
-          <w:bCs/>
+          <w:sz w:val="24"/>
         </w:rPr>
-      </w:pPr>
-      <w:r>
-        <w:rPr>
-          <w:b/>
-          <w:bCs/>
-        </w:rPr>
-        <w:t>Requisitos funcionales</w:t>
-      </w:r>
-    </w:p>
-    <w:p>
-      <w:pPr>
-        <w:spacing w:before="0" w:after="200" w:line="312" w:lineRule="auto"/>
-      </w:pPr>
-      <w:r>
-        <w:t>El sistema debe permitir:</w:t>
-      </w:r>
-    </w:p>
-    <w:p>
-      <w:pPr>
-        <w:spacing w:before="0" w:after="200" w:line="312" w:lineRule="auto"/>
-        <w:rPr>
-          <w:b/>
-          <w:bCs/>
-        </w:rPr>
-      </w:pPr>
-      <w:r>
-        <w:rPr>
-          <w:b/>
-          <w:bCs/>
-        </w:rPr>
-        <w:t>2.1 Para usuarios anónimos (no registrados):</w:t>
-      </w:r>
-    </w:p>
-    <w:p>
-      <w:pPr>
-        <w:numPr>
-          <w:ilvl w:val="0"/>
-          <w:numId w:val="24"/>
-        </w:numPr>
-        <w:spacing w:before="0" w:after="200" w:line="312" w:lineRule="auto"/>
-      </w:pPr>
-      <w:r>
-        <w:t>Ver lista de películas y series.</w:t>
-      </w:r>
-    </w:p>
-    <w:p>
-      <w:pPr>
-        <w:numPr>
-          <w:ilvl w:val="0"/>
-          <w:numId w:val="24"/>
-        </w:numPr>
-        <w:spacing w:before="0" w:after="200" w:line="312" w:lineRule="auto"/>
-      </w:pPr>
-      <w:r>
-        <w:t>Consultar detalles de contenido.</w:t>
-      </w:r>
-    </w:p>
-    <w:p>
-      <w:pPr>
-        <w:numPr>
-          <w:ilvl w:val="0"/>
-          <w:numId w:val="24"/>
-        </w:numPr>
-        <w:spacing w:before="0" w:after="200" w:line="312" w:lineRule="auto"/>
-      </w:pPr>
-      <w:r>
-        <w:t>Ver el top 5 de mejor valoradas.</w:t>
-      </w:r>
-    </w:p>
-    <w:p>
-      <w:pPr>
-        <w:spacing w:before="0" w:after="200" w:line="312" w:lineRule="auto"/>
-      </w:pPr>
-    </w:p>
-    <w:p>
-      <w:pPr>
-        <w:spacing w:before="0" w:after="200" w:line="312" w:lineRule="auto"/>
-      </w:pPr>
-    </w:p>
-    <w:p>
-      <w:pPr>
-        <w:spacing w:before="0" w:after="200" w:line="312" w:lineRule="auto"/>
-      </w:pPr>
-    </w:p>
-    <w:p>
-      <w:pPr>
-        <w:spacing w:before="0" w:after="200" w:line="312" w:lineRule="auto"/>
       </w:pPr>
       <w:r>
         <w:rPr>
@@ -2190,18 +2086,18 @@
         <mc:AlternateContent>
           <mc:Choice Requires="wps">
             <w:drawing>
-              <wp:anchor distT="0" distB="0" distL="114300" distR="114300" simplePos="0" relativeHeight="251682816" behindDoc="1" locked="1" layoutInCell="1" allowOverlap="1" wp14:anchorId="0B38A93A" wp14:editId="32C9CF57">
+              <wp:anchor distT="0" distB="0" distL="114300" distR="114300" simplePos="0" relativeHeight="251699200" behindDoc="1" locked="1" layoutInCell="1" allowOverlap="1" wp14:anchorId="760E21C5" wp14:editId="06F57880">
                 <wp:simplePos x="0" y="0"/>
                 <wp:positionH relativeFrom="page">
-                  <wp:posOffset>46990</wp:posOffset>
+                  <wp:align>left</wp:align>
                 </wp:positionH>
                 <wp:positionV relativeFrom="paragraph">
-                  <wp:posOffset>-9288780</wp:posOffset>
+                  <wp:posOffset>-5078730</wp:posOffset>
                 </wp:positionV>
                 <wp:extent cx="1323975" cy="10828020"/>
                 <wp:effectExtent l="0" t="0" r="9525" b="0"/>
                 <wp:wrapNone/>
-                <wp:docPr id="126617488" name="Rectángulo 2">
+                <wp:docPr id="1500647186" name="Rectángulo 2">
                   <a:extLst xmlns:a="http://schemas.openxmlformats.org/drawingml/2006/main">
                     <a:ext uri="{C183D7F6-B498-43B3-948B-1728B52AA6E4}">
                       <adec:decorative xmlns:adec="http://schemas.microsoft.com/office/drawing/2017/decorative" val="1"/>
@@ -2283,7 +2179,7 @@
           </mc:Choice>
           <mc:Fallback>
             <w:pict>
-              <v:rect w14:anchorId="0B38A93A" id="_x0000_s1032" alt="&quot;&quot;" style="position:absolute;margin-left:3.7pt;margin-top:-731.4pt;width:104.25pt;height:852.6pt;z-index:-251633664;visibility:visible;mso-wrap-style:square;mso-width-percent:0;mso-height-percent:0;mso-wrap-distance-left:9pt;mso-wrap-distance-top:0;mso-wrap-distance-right:9pt;mso-wrap-distance-bottom:0;mso-position-horizontal:absolute;mso-position-horizontal-relative:page;mso-position-vertical:absolute;mso-position-vertical-relative:text;mso-width-percent:0;mso-height-percent:0;mso-width-relative:margin;mso-height-relative:margin;v-text-anchor:bottom" o:gfxdata="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" fillcolor="#404040 [2429]" stroked="f" strokeweight="1pt">
+              <v:rect w14:anchorId="760E21C5" id="_x0000_s1032" alt="&quot;&quot;" style="position:absolute;left:0;text-align:left;margin-left:0;margin-top:-399.9pt;width:104.25pt;height:852.6pt;z-index:-251617280;visibility:visible;mso-wrap-style:square;mso-width-percent:0;mso-height-percent:0;mso-wrap-distance-left:9pt;mso-wrap-distance-top:0;mso-wrap-distance-right:9pt;mso-wrap-distance-bottom:0;mso-position-horizontal:left;mso-position-horizontal-relative:page;mso-position-vertical:absolute;mso-position-vertical-relative:text;mso-width-percent:0;mso-height-percent:0;mso-width-relative:margin;mso-height-relative:margin;v-text-anchor:bottom" o:gfxdata="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" fillcolor="#404040 [2429]" stroked="f" strokeweight="1pt">
                 <v:textbox>
                   <w:txbxContent>
                     <w:p>
@@ -2307,6 +2203,53 @@
           </mc:Fallback>
         </mc:AlternateContent>
       </w:r>
+      <w:r>
+        <w:rPr>
+          <w:sz w:val="24"/>
+        </w:rPr>
+        <w:t>Permita interacción social (comentarios, valoraciones, opiniones).</w:t>
+      </w:r>
+    </w:p>
+    <w:p>
+      <w:pPr>
+        <w:numPr>
+          <w:ilvl w:val="0"/>
+          <w:numId w:val="23"/>
+        </w:numPr>
+        <w:spacing w:before="0" w:after="200" w:line="312" w:lineRule="auto"/>
+        <w:rPr>
+          <w:sz w:val="24"/>
+        </w:rPr>
+      </w:pPr>
+      <w:r>
+        <w:rPr>
+          <w:sz w:val="24"/>
+        </w:rPr>
+        <w:t>Tenga un sistema de suscripción premium para ofrecer funcionalidades avanzadas como listas personalizadas y un calendario de estrenos.</w:t>
+      </w:r>
+    </w:p>
+    <w:p>
+      <w:pPr>
+        <w:numPr>
+          <w:ilvl w:val="0"/>
+          <w:numId w:val="23"/>
+        </w:numPr>
+        <w:spacing w:before="0" w:after="200" w:line="312" w:lineRule="auto"/>
+        <w:rPr>
+          <w:sz w:val="24"/>
+        </w:rPr>
+      </w:pPr>
+      <w:r>
+        <w:rPr>
+          <w:sz w:val="24"/>
+        </w:rPr>
+        <w:t>Presente un top 5 actualizado y recomendaciones destacadas.</w:t>
+      </w:r>
+    </w:p>
+    <w:p>
+      <w:pPr>
+        <w:spacing w:before="0" w:after="200" w:line="312" w:lineRule="auto"/>
+      </w:pPr>
     </w:p>
     <w:p>
       <w:pPr>
@@ -2314,143 +2257,30 @@
         <w:rPr>
           <w:b/>
           <w:bCs/>
+          <w:sz w:val="24"/>
         </w:rPr>
       </w:pPr>
       <w:r>
         <w:rPr>
           <w:b/>
           <w:bCs/>
+          <w:sz w:val="24"/>
         </w:rPr>
-        <w:lastRenderedPageBreak/>
-        <w:t>2.2 Para usuarios registrados:</w:t>
+        <w:t>Requisitos funcionales</w:t>
       </w:r>
     </w:p>
     <w:p>
       <w:pPr>
-        <w:numPr>
-          <w:ilvl w:val="0"/>
-          <w:numId w:val="25"/>
-        </w:numPr>
         <w:spacing w:before="0" w:after="200" w:line="312" w:lineRule="auto"/>
-      </w:pPr>
-      <w:r>
-        <w:t>Registrarse e iniciar sesión.</w:t>
-      </w:r>
-    </w:p>
-    <w:p>
-      <w:pPr>
-        <w:numPr>
-          <w:ilvl w:val="0"/>
-          <w:numId w:val="25"/>
-        </w:numPr>
-        <w:spacing w:before="0" w:after="200" w:line="312" w:lineRule="auto"/>
-      </w:pPr>
-      <w:r>
-        <w:t>Consultar listas y detalles de películas/series.</w:t>
-      </w:r>
-    </w:p>
-    <w:p>
-      <w:pPr>
-        <w:numPr>
-          <w:ilvl w:val="0"/>
-          <w:numId w:val="25"/>
-        </w:numPr>
-        <w:spacing w:before="0" w:after="200" w:line="312" w:lineRule="auto"/>
-      </w:pPr>
-      <w:r>
-        <w:t>Ver el top 5.</w:t>
-      </w:r>
-    </w:p>
-    <w:p>
-      <w:pPr>
-        <w:numPr>
-          <w:ilvl w:val="0"/>
-          <w:numId w:val="25"/>
-        </w:numPr>
-        <w:spacing w:before="0" w:after="200" w:line="312" w:lineRule="auto"/>
-      </w:pPr>
-      <w:r>
-        <w:t>Valorar películas y series.</w:t>
-      </w:r>
-    </w:p>
-    <w:p>
-      <w:pPr>
-        <w:numPr>
-          <w:ilvl w:val="0"/>
-          <w:numId w:val="25"/>
-        </w:numPr>
-        <w:spacing w:before="0" w:after="200" w:line="312" w:lineRule="auto"/>
-      </w:pPr>
-      <w:r>
-        <w:t>Escribir comentarios.</w:t>
-      </w:r>
-    </w:p>
-    <w:p>
-      <w:pPr>
-        <w:numPr>
-          <w:ilvl w:val="0"/>
-          <w:numId w:val="25"/>
-        </w:numPr>
-        <w:spacing w:before="0" w:after="200" w:line="312" w:lineRule="auto"/>
-      </w:pPr>
-      <w:r>
-        <w:t>Editar su perfil.</w:t>
-      </w:r>
-    </w:p>
-    <w:p>
-      <w:pPr>
-        <w:numPr>
-          <w:ilvl w:val="0"/>
-          <w:numId w:val="25"/>
-        </w:numPr>
-        <w:spacing w:before="0" w:after="200" w:line="312" w:lineRule="auto"/>
-      </w:pPr>
-      <w:r>
-        <w:t>Suscribirse como usuario premium.</w:t>
-      </w:r>
-    </w:p>
-    <w:p>
-      <w:pPr>
-        <w:numPr>
-          <w:ilvl w:val="0"/>
-          <w:numId w:val="25"/>
-        </w:numPr>
-        <w:spacing w:before="0" w:after="200" w:line="312" w:lineRule="auto"/>
-      </w:pPr>
-      <w:r>
-        <w:t>Acceder a funciones premium.</w:t>
-      </w:r>
-    </w:p>
-    <w:p>
-      <w:pPr>
-        <w:numPr>
-          <w:ilvl w:val="0"/>
-          <w:numId w:val="25"/>
-        </w:numPr>
-        <w:spacing w:before="0" w:after="200" w:line="312" w:lineRule="auto"/>
-      </w:pPr>
-      <w:r>
-        <w:t>Anular la suscripción premium.</w:t>
-      </w:r>
-    </w:p>
-    <w:p>
-      <w:pPr>
-        <w:numPr>
-          <w:ilvl w:val="0"/>
-          <w:numId w:val="25"/>
-        </w:numPr>
-        <w:spacing w:before="0" w:after="200" w:line="312" w:lineRule="auto"/>
-      </w:pPr>
-      <w:r>
-        <w:t xml:space="preserve">Hacer </w:t>
-      </w:r>
-      <w:proofErr w:type="spellStart"/>
-      <w:r>
-        <w:t>logout</w:t>
-      </w:r>
-      <w:proofErr w:type="spellEnd"/>
-      <w:r>
-        <w:t>.</w:t>
+        <w:rPr>
+          <w:sz w:val="24"/>
+        </w:rPr>
+      </w:pPr>
+      <w:r>
+        <w:rPr>
+          <w:sz w:val="24"/>
+        </w:rPr>
+        <w:t>El sistema debe permitir:</w:t>
       </w:r>
     </w:p>
     <w:p>
@@ -2459,121 +2289,101 @@
         <w:rPr>
           <w:b/>
           <w:bCs/>
+          <w:sz w:val="24"/>
         </w:rPr>
       </w:pPr>
       <w:r>
         <w:rPr>
           <w:b/>
           <w:bCs/>
+          <w:sz w:val="24"/>
         </w:rPr>
-        <w:t>2.3 Para usuarios premium:</w:t>
+        <w:t>2.1 Para usuarios anónimos (no registrados):</w:t>
       </w:r>
     </w:p>
     <w:p>
       <w:pPr>
         <w:numPr>
           <w:ilvl w:val="0"/>
-          <w:numId w:val="26"/>
+          <w:numId w:val="24"/>
         </w:numPr>
         <w:spacing w:before="0" w:after="200" w:line="312" w:lineRule="auto"/>
-      </w:pPr>
-      <w:r>
-        <w:t>Acceso a funciones exclusivas como listas personalizadas y calendario de estrenos.</w:t>
+        <w:rPr>
+          <w:sz w:val="24"/>
+        </w:rPr>
+      </w:pPr>
+      <w:r>
+        <w:rPr>
+          <w:sz w:val="24"/>
+        </w:rPr>
+        <w:t>Ver lista de películas y series.</w:t>
       </w:r>
     </w:p>
     <w:p>
       <w:pPr>
+        <w:numPr>
+          <w:ilvl w:val="0"/>
+          <w:numId w:val="24"/>
+        </w:numPr>
         <w:spacing w:before="0" w:after="200" w:line="312" w:lineRule="auto"/>
         <w:rPr>
-          <w:b/>
-          <w:bCs/>
+          <w:sz w:val="24"/>
         </w:rPr>
       </w:pPr>
       <w:r>
         <w:rPr>
-          <w:b/>
-          <w:bCs/>
+          <w:sz w:val="24"/>
         </w:rPr>
-        <w:t>2.4 Para administradores:</w:t>
+        <w:t>Consultar detalles de contenido.</w:t>
       </w:r>
     </w:p>
     <w:p>
       <w:pPr>
         <w:numPr>
           <w:ilvl w:val="0"/>
-          <w:numId w:val="27"/>
+          <w:numId w:val="24"/>
         </w:numPr>
         <w:spacing w:before="0" w:after="200" w:line="312" w:lineRule="auto"/>
-      </w:pPr>
-      <w:r>
-        <w:t>Aprobar o eliminar contenido.</w:t>
+        <w:rPr>
+          <w:sz w:val="24"/>
+        </w:rPr>
+      </w:pPr>
+      <w:r>
+        <w:rPr>
+          <w:sz w:val="24"/>
+        </w:rPr>
+        <w:t>Ver el top 5 de mejor valoradas.</w:t>
       </w:r>
     </w:p>
     <w:p>
       <w:pPr>
-        <w:numPr>
-          <w:ilvl w:val="0"/>
-          <w:numId w:val="27"/>
-        </w:numPr>
         <w:spacing w:before="0" w:after="200" w:line="312" w:lineRule="auto"/>
-      </w:pPr>
-      <w:r>
-        <w:t>Gestionar usuarios.</w:t>
-      </w:r>
-    </w:p>
-    <w:p>
-      <w:pPr>
-        <w:numPr>
-          <w:ilvl w:val="0"/>
-          <w:numId w:val="27"/>
-        </w:numPr>
-        <w:spacing w:before="0" w:after="200" w:line="312" w:lineRule="auto"/>
-      </w:pPr>
-      <w:r>
-        <w:t>Eliminar comentarios.</w:t>
-      </w:r>
-    </w:p>
-    <w:p>
-      <w:pPr>
-        <w:numPr>
-          <w:ilvl w:val="0"/>
-          <w:numId w:val="27"/>
-        </w:numPr>
-        <w:spacing w:before="0" w:after="200" w:line="312" w:lineRule="auto"/>
-      </w:pPr>
-      <w:r>
-        <w:t>Modificar fichas de películas o series.</w:t>
-      </w:r>
-    </w:p>
-    <w:p>
-      <w:pPr>
-        <w:spacing w:before="0" w:after="200" w:line="312" w:lineRule="auto"/>
-      </w:pPr>
-    </w:p>
-    <w:p>
-      <w:pPr>
-        <w:ind w:left="142"/>
+        <w:ind w:left="360"/>
+        <w:rPr>
+          <w:sz w:val="24"/>
+        </w:rPr>
       </w:pPr>
       <w:r>
         <w:rPr>
           <w:noProof/>
           <w:lang w:bidi="es-ES"/>
         </w:rPr>
+        <w:lastRenderedPageBreak/>
         <mc:AlternateContent>
           <mc:Choice Requires="wps">
             <w:drawing>
-              <wp:anchor distT="0" distB="0" distL="114300" distR="114300" simplePos="0" relativeHeight="251686912" behindDoc="1" locked="1" layoutInCell="1" allowOverlap="1" wp14:anchorId="65A0F6CF" wp14:editId="5AB2A44F">
+              <wp:anchor distT="0" distB="0" distL="114300" distR="114300" simplePos="0" relativeHeight="251682816" behindDoc="1" locked="1" layoutInCell="1" allowOverlap="1" wp14:anchorId="0B38A93A" wp14:editId="758C615C">
                 <wp:simplePos x="0" y="0"/>
                 <wp:positionH relativeFrom="page">
-                  <wp:align>left</wp:align>
+                  <wp:posOffset>-635</wp:posOffset>
                 </wp:positionH>
                 <wp:positionV relativeFrom="paragraph">
-                  <wp:posOffset>-6877685</wp:posOffset>
+                  <wp:posOffset>-608965</wp:posOffset>
                 </wp:positionV>
                 <wp:extent cx="1323975" cy="10828020"/>
                 <wp:effectExtent l="0" t="0" r="9525" b="0"/>
                 <wp:wrapNone/>
-                <wp:docPr id="1598197688" name="Rectángulo 2">
+                <wp:docPr id="126617488" name="Rectángulo 2">
                   <a:extLst xmlns:a="http://schemas.openxmlformats.org/drawingml/2006/main">
                     <a:ext uri="{C183D7F6-B498-43B3-948B-1728B52AA6E4}">
                       <adec:decorative xmlns:adec="http://schemas.microsoft.com/office/drawing/2017/decorative" val="1"/>
@@ -2655,7 +2465,7 @@
           </mc:Choice>
           <mc:Fallback>
             <w:pict>
-              <v:rect w14:anchorId="65A0F6CF" id="_x0000_s1033" alt="&quot;&quot;" style="position:absolute;left:0;text-align:left;margin-left:0;margin-top:-541.55pt;width:104.25pt;height:852.6pt;z-index:-251629568;visibility:visible;mso-wrap-style:square;mso-width-percent:0;mso-height-percent:0;mso-wrap-distance-left:9pt;mso-wrap-distance-top:0;mso-wrap-distance-right:9pt;mso-wrap-distance-bottom:0;mso-position-horizontal:left;mso-position-horizontal-relative:page;mso-position-vertical:absolute;mso-position-vertical-relative:text;mso-width-percent:0;mso-height-percent:0;mso-width-relative:margin;mso-height-relative:margin;v-text-anchor:bottom" o:gfxdata="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" fillcolor="#404040 [2429]" stroked="f" strokeweight="1pt">
+              <v:rect w14:anchorId="0B38A93A" id="_x0000_s1033" alt="&quot;&quot;" style="position:absolute;left:0;text-align:left;margin-left:-.05pt;margin-top:-47.95pt;width:104.25pt;height:852.6pt;z-index:-251633664;visibility:visible;mso-wrap-style:square;mso-width-percent:0;mso-height-percent:0;mso-wrap-distance-left:9pt;mso-wrap-distance-top:0;mso-wrap-distance-right:9pt;mso-wrap-distance-bottom:0;mso-position-horizontal:absolute;mso-position-horizontal-relative:page;mso-position-vertical:absolute;mso-position-vertical-relative:text;mso-width-percent:0;mso-height-percent:0;mso-width-relative:margin;mso-height-relative:margin;v-text-anchor:bottom" o:gfxdata="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" fillcolor="#404040 [2429]" stroked="f" strokeweight="1pt">
                 <v:textbox>
                   <w:txbxContent>
                     <w:p>
@@ -2682,51 +2492,291 @@
     </w:p>
     <w:p>
       <w:pPr>
-        <w:ind w:left="142"/>
-      </w:pPr>
+        <w:spacing w:before="0" w:after="200" w:line="312" w:lineRule="auto"/>
+        <w:rPr>
+          <w:b/>
+          <w:bCs/>
+          <w:sz w:val="24"/>
+        </w:rPr>
+      </w:pPr>
+      <w:r>
+        <w:rPr>
+          <w:b/>
+          <w:bCs/>
+          <w:sz w:val="24"/>
+        </w:rPr>
+        <w:t>2.2 Para usuarios registrados:</w:t>
+      </w:r>
     </w:p>
     <w:p>
       <w:pPr>
-        <w:ind w:left="142"/>
-      </w:pPr>
+        <w:numPr>
+          <w:ilvl w:val="0"/>
+          <w:numId w:val="25"/>
+        </w:numPr>
+        <w:spacing w:before="0" w:after="200" w:line="312" w:lineRule="auto"/>
+      </w:pPr>
+      <w:r>
+        <w:t>Registrarse e iniciar sesión.</w:t>
+      </w:r>
     </w:p>
     <w:p>
       <w:pPr>
-        <w:ind w:left="142"/>
-      </w:pPr>
+        <w:numPr>
+          <w:ilvl w:val="0"/>
+          <w:numId w:val="25"/>
+        </w:numPr>
+        <w:spacing w:before="0" w:after="200" w:line="312" w:lineRule="auto"/>
+      </w:pPr>
+      <w:r>
+        <w:t>Consultar listas y detalles de películas/series.</w:t>
+      </w:r>
     </w:p>
     <w:p>
       <w:pPr>
-        <w:ind w:left="142"/>
-      </w:pPr>
+        <w:numPr>
+          <w:ilvl w:val="0"/>
+          <w:numId w:val="25"/>
+        </w:numPr>
+        <w:spacing w:before="0" w:after="200" w:line="312" w:lineRule="auto"/>
+      </w:pPr>
+      <w:r>
+        <w:t>Ver el top 5.</w:t>
+      </w:r>
     </w:p>
     <w:p>
       <w:pPr>
-        <w:ind w:left="142"/>
-      </w:pPr>
+        <w:numPr>
+          <w:ilvl w:val="0"/>
+          <w:numId w:val="25"/>
+        </w:numPr>
+        <w:spacing w:before="0" w:after="200" w:line="312" w:lineRule="auto"/>
+      </w:pPr>
+      <w:r>
+        <w:t>Valorar películas y series.</w:t>
+      </w:r>
     </w:p>
     <w:p>
       <w:pPr>
-        <w:ind w:left="142"/>
-      </w:pPr>
+        <w:numPr>
+          <w:ilvl w:val="0"/>
+          <w:numId w:val="25"/>
+        </w:numPr>
+        <w:spacing w:before="0" w:after="200" w:line="312" w:lineRule="auto"/>
+      </w:pPr>
+      <w:r>
+        <w:t>Escribir comentarios.</w:t>
+      </w:r>
     </w:p>
     <w:p>
       <w:pPr>
+        <w:numPr>
+          <w:ilvl w:val="0"/>
+          <w:numId w:val="25"/>
+        </w:numPr>
+        <w:spacing w:before="0" w:after="200" w:line="312" w:lineRule="auto"/>
+      </w:pPr>
+      <w:r>
+        <w:t>Editar su perfil.</w:t>
+      </w:r>
+    </w:p>
+    <w:p>
+      <w:pPr>
+        <w:numPr>
+          <w:ilvl w:val="0"/>
+          <w:numId w:val="25"/>
+        </w:numPr>
+        <w:spacing w:before="0" w:after="200" w:line="312" w:lineRule="auto"/>
+      </w:pPr>
+      <w:r>
+        <w:t>Suscribirse como usuario premium.</w:t>
+      </w:r>
+    </w:p>
+    <w:p>
+      <w:pPr>
+        <w:numPr>
+          <w:ilvl w:val="0"/>
+          <w:numId w:val="25"/>
+        </w:numPr>
+        <w:spacing w:before="0" w:after="200" w:line="312" w:lineRule="auto"/>
+      </w:pPr>
+      <w:r>
+        <w:t>Acceder a funciones premium.</w:t>
+      </w:r>
+    </w:p>
+    <w:p>
+      <w:pPr>
+        <w:numPr>
+          <w:ilvl w:val="0"/>
+          <w:numId w:val="25"/>
+        </w:numPr>
+        <w:spacing w:before="0" w:after="200" w:line="312" w:lineRule="auto"/>
+      </w:pPr>
+      <w:r>
+        <w:t>Anular la suscripción premium.</w:t>
+      </w:r>
+    </w:p>
+    <w:p>
+      <w:pPr>
+        <w:numPr>
+          <w:ilvl w:val="0"/>
+          <w:numId w:val="25"/>
+        </w:numPr>
+        <w:spacing w:before="0" w:after="200" w:line="312" w:lineRule="auto"/>
+      </w:pPr>
+      <w:r>
+        <w:t xml:space="preserve">Hacer </w:t>
+      </w:r>
+      <w:proofErr w:type="spellStart"/>
+      <w:r>
+        <w:t>logout</w:t>
+      </w:r>
+      <w:proofErr w:type="spellEnd"/>
+      <w:r>
+        <w:t>.</w:t>
+      </w:r>
+    </w:p>
+    <w:p>
+      <w:pPr>
+        <w:spacing w:before="0" w:after="200" w:line="312" w:lineRule="auto"/>
+        <w:rPr>
+          <w:b/>
+          <w:bCs/>
+          <w:sz w:val="24"/>
+        </w:rPr>
+      </w:pPr>
+      <w:r>
+        <w:rPr>
+          <w:b/>
+          <w:bCs/>
+          <w:sz w:val="24"/>
+        </w:rPr>
+        <w:t>2.3 Para usuarios premium:</w:t>
+      </w:r>
+    </w:p>
+    <w:p>
+      <w:pPr>
+        <w:numPr>
+          <w:ilvl w:val="0"/>
+          <w:numId w:val="26"/>
+        </w:numPr>
+        <w:spacing w:before="0" w:after="200" w:line="312" w:lineRule="auto"/>
+      </w:pPr>
+      <w:r>
+        <w:t>Acceso a funciones exclusivas como listas personalizadas y calendario de estrenos.</w:t>
+      </w:r>
+    </w:p>
+    <w:p>
+      <w:pPr>
+        <w:spacing w:before="0" w:after="200" w:line="312" w:lineRule="auto"/>
+        <w:rPr>
+          <w:b/>
+          <w:bCs/>
+          <w:sz w:val="24"/>
+        </w:rPr>
+      </w:pPr>
+      <w:r>
+        <w:rPr>
+          <w:b/>
+          <w:bCs/>
+          <w:sz w:val="24"/>
+        </w:rPr>
+        <w:t>2.4 Para administradores:</w:t>
+      </w:r>
+    </w:p>
+    <w:p>
+      <w:pPr>
+        <w:numPr>
+          <w:ilvl w:val="0"/>
+          <w:numId w:val="27"/>
+        </w:numPr>
+        <w:spacing w:before="0" w:after="200" w:line="312" w:lineRule="auto"/>
+      </w:pPr>
+      <w:r>
+        <w:t>Aprobar o eliminar contenido.</w:t>
+      </w:r>
+    </w:p>
+    <w:p>
+      <w:pPr>
+        <w:numPr>
+          <w:ilvl w:val="0"/>
+          <w:numId w:val="27"/>
+        </w:numPr>
+        <w:spacing w:before="0" w:after="200" w:line="312" w:lineRule="auto"/>
+      </w:pPr>
+      <w:r>
+        <w:t>Gestionar usuarios.</w:t>
+      </w:r>
+    </w:p>
+    <w:p>
+      <w:pPr>
+        <w:numPr>
+          <w:ilvl w:val="0"/>
+          <w:numId w:val="27"/>
+        </w:numPr>
+        <w:spacing w:before="0" w:after="200" w:line="312" w:lineRule="auto"/>
+      </w:pPr>
+      <w:r>
+        <w:t>Eliminar comentarios.</w:t>
+      </w:r>
+    </w:p>
+    <w:p>
+      <w:pPr>
+        <w:numPr>
+          <w:ilvl w:val="0"/>
+          <w:numId w:val="27"/>
+        </w:numPr>
+        <w:spacing w:before="0" w:after="200" w:line="312" w:lineRule="auto"/>
+      </w:pPr>
+      <w:r>
+        <w:t>Modificar fichas de películas o series.</w:t>
+      </w:r>
+    </w:p>
+    <w:p>
+      <w:pPr>
+        <w:spacing w:before="0" w:after="200" w:line="312" w:lineRule="auto"/>
+      </w:pPr>
+    </w:p>
+    <w:p>
+      <w:pPr>
         <w:ind w:left="142"/>
       </w:pPr>
     </w:p>
+    <w:p>
+      <w:pPr>
+        <w:ind w:left="142"/>
+      </w:pPr>
+    </w:p>
+    <w:p>
+      <w:pPr>
+        <w:ind w:left="142"/>
+      </w:pPr>
+    </w:p>
+    <w:p>
+      <w:pPr>
+        <w:ind w:left="142"/>
+      </w:pPr>
+    </w:p>
+    <w:p>
+      <w:pPr>
+        <w:ind w:left="142"/>
+      </w:pPr>
+    </w:p>
+    <w:p/>
     <w:p>
       <w:pPr>
         <w:ind w:left="142"/>
         <w:rPr>
           <w:b/>
           <w:bCs/>
+          <w:sz w:val="24"/>
         </w:rPr>
       </w:pPr>
       <w:r>
         <w:rPr>
           <w:b/>
           <w:bCs/>
+          <w:sz w:val="24"/>
         </w:rPr>
         <w:lastRenderedPageBreak/>
         <w:t>Requisitos no funcionales</w:t>
@@ -2765,13 +2815,13 @@
         <mc:AlternateContent>
           <mc:Choice Requires="wps">
             <w:drawing>
-              <wp:anchor distT="0" distB="0" distL="114300" distR="114300" simplePos="0" relativeHeight="251688960" behindDoc="1" locked="1" layoutInCell="1" allowOverlap="1" wp14:anchorId="66879EF5" wp14:editId="23CBFB25">
+              <wp:anchor distT="0" distB="0" distL="114300" distR="114300" simplePos="0" relativeHeight="251688960" behindDoc="1" locked="1" layoutInCell="1" allowOverlap="1" wp14:anchorId="66879EF5" wp14:editId="637A441D">
                 <wp:simplePos x="0" y="0"/>
                 <wp:positionH relativeFrom="page">
-                  <wp:posOffset>19050</wp:posOffset>
+                  <wp:align>left</wp:align>
                 </wp:positionH>
                 <wp:positionV relativeFrom="paragraph">
-                  <wp:posOffset>-1162050</wp:posOffset>
+                  <wp:posOffset>-1303020</wp:posOffset>
                 </wp:positionV>
                 <wp:extent cx="1323975" cy="10828020"/>
                 <wp:effectExtent l="0" t="0" r="9525" b="0"/>
@@ -2858,7 +2908,7 @@
           </mc:Choice>
           <mc:Fallback>
             <w:pict>
-              <v:rect w14:anchorId="66879EF5" id="_x0000_s1034" alt="&quot;&quot;" style="position:absolute;left:0;text-align:left;margin-left:1.5pt;margin-top:-91.5pt;width:104.25pt;height:852.6pt;z-index:-251627520;visibility:visible;mso-wrap-style:square;mso-width-percent:0;mso-height-percent:0;mso-wrap-distance-left:9pt;mso-wrap-distance-top:0;mso-wrap-distance-right:9pt;mso-wrap-distance-bottom:0;mso-position-horizontal:absolute;mso-position-horizontal-relative:page;mso-position-vertical:absolute;mso-position-vertical-relative:text;mso-width-percent:0;mso-height-percent:0;mso-width-relative:margin;mso-height-relative:margin;v-text-anchor:bottom" o:gfxdata="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" fillcolor="#404040 [2429]" stroked="f" strokeweight="1pt">
+              <v:rect w14:anchorId="66879EF5" id="_x0000_s1034" alt="&quot;&quot;" style="position:absolute;left:0;text-align:left;margin-left:0;margin-top:-102.6pt;width:104.25pt;height:852.6pt;z-index:-251627520;visibility:visible;mso-wrap-style:square;mso-width-percent:0;mso-height-percent:0;mso-wrap-distance-left:9pt;mso-wrap-distance-top:0;mso-wrap-distance-right:9pt;mso-wrap-distance-bottom:0;mso-position-horizontal:left;mso-position-horizontal-relative:page;mso-position-vertical:absolute;mso-position-vertical-relative:text;mso-width-percent:0;mso-height-percent:0;mso-width-relative:margin;mso-height-relative:margin;v-text-anchor:bottom" o:gfxdata="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" fillcolor="#404040 [2429]" stroked="f" strokeweight="1pt">
                 <v:textbox>
                   <w:txbxContent>
                     <w:p>
@@ -3127,14 +3177,23 @@
           <w:szCs w:val="32"/>
         </w:rPr>
       </w:pPr>
-      <w:r>
+    </w:p>
+    <w:p>
+      <w:pPr>
         <w:rPr>
           <w:b/>
           <w:bCs/>
           <w:sz w:val="32"/>
           <w:szCs w:val="32"/>
         </w:rPr>
-        <w:lastRenderedPageBreak/>
+      </w:pPr>
+      <w:r>
+        <w:rPr>
+          <w:b/>
+          <w:bCs/>
+          <w:sz w:val="32"/>
+          <w:szCs w:val="32"/>
+        </w:rPr>
         <w:t>Principios de Usabilidad y Accesibilidad</w:t>
       </w:r>
     </w:p>
@@ -3259,13 +3318,13 @@
         <mc:AlternateContent>
           <mc:Choice Requires="wps">
             <w:drawing>
-              <wp:anchor distT="0" distB="0" distL="114300" distR="114300" simplePos="0" relativeHeight="251691008" behindDoc="1" locked="1" layoutInCell="1" allowOverlap="1" wp14:anchorId="58A61D6F" wp14:editId="32BEB024">
+              <wp:anchor distT="0" distB="0" distL="114300" distR="114300" simplePos="0" relativeHeight="251691008" behindDoc="1" locked="1" layoutInCell="1" allowOverlap="1" wp14:anchorId="58A61D6F" wp14:editId="50034B33">
                 <wp:simplePos x="0" y="0"/>
                 <wp:positionH relativeFrom="page">
                   <wp:align>left</wp:align>
                 </wp:positionH>
                 <wp:positionV relativeFrom="paragraph">
-                  <wp:posOffset>-4572000</wp:posOffset>
+                  <wp:posOffset>-5059045</wp:posOffset>
                 </wp:positionV>
                 <wp:extent cx="1323975" cy="10828020"/>
                 <wp:effectExtent l="0" t="0" r="9525" b="0"/>
@@ -3352,7 +3411,7 @@
           </mc:Choice>
           <mc:Fallback>
             <w:pict>
-              <v:rect w14:anchorId="58A61D6F" id="_x0000_s1035" alt="&quot;&quot;" style="position:absolute;left:0;text-align:left;margin-left:0;margin-top:-5in;width:104.25pt;height:852.6pt;z-index:-251625472;visibility:visible;mso-wrap-style:square;mso-width-percent:0;mso-height-percent:0;mso-wrap-distance-left:9pt;mso-wrap-distance-top:0;mso-wrap-distance-right:9pt;mso-wrap-distance-bottom:0;mso-position-horizontal:left;mso-position-horizontal-relative:page;mso-position-vertical:absolute;mso-position-vertical-relative:text;mso-width-percent:0;mso-height-percent:0;mso-width-relative:margin;mso-height-relative:margin;v-text-anchor:bottom" o:gfxdata="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" fillcolor="#404040 [2429]" stroked="f" strokeweight="1pt">
+              <v:rect w14:anchorId="58A61D6F" id="_x0000_s1035" alt="&quot;&quot;" style="position:absolute;left:0;text-align:left;margin-left:0;margin-top:-398.35pt;width:104.25pt;height:852.6pt;z-index:-251625472;visibility:visible;mso-wrap-style:square;mso-width-percent:0;mso-height-percent:0;mso-wrap-distance-left:9pt;mso-wrap-distance-top:0;mso-wrap-distance-right:9pt;mso-wrap-distance-bottom:0;mso-position-horizontal:left;mso-position-horizontal-relative:page;mso-position-vertical:absolute;mso-position-vertical-relative:text;mso-width-percent:0;mso-height-percent:0;mso-width-relative:margin;mso-height-relative:margin;v-text-anchor:bottom" o:gfxdata="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" fillcolor="#404040 [2429]" stroked="f" strokeweight="1pt">
                 <v:textbox>
                   <w:txbxContent>
                     <w:p>
@@ -3440,54 +3499,6 @@
         <w:rPr>
           <w:b/>
           <w:bCs/>
-        </w:rPr>
-      </w:pPr>
-    </w:p>
-    <w:p>
-      <w:pPr>
-        <w:rPr>
-          <w:b/>
-          <w:bCs/>
-        </w:rPr>
-      </w:pPr>
-    </w:p>
-    <w:p>
-      <w:pPr>
-        <w:rPr>
-          <w:b/>
-          <w:bCs/>
-        </w:rPr>
-      </w:pPr>
-    </w:p>
-    <w:p>
-      <w:pPr>
-        <w:rPr>
-          <w:b/>
-          <w:bCs/>
-        </w:rPr>
-      </w:pPr>
-    </w:p>
-    <w:p>
-      <w:pPr>
-        <w:rPr>
-          <w:b/>
-          <w:bCs/>
-        </w:rPr>
-      </w:pPr>
-    </w:p>
-    <w:p>
-      <w:pPr>
-        <w:rPr>
-          <w:b/>
-          <w:bCs/>
-        </w:rPr>
-      </w:pPr>
-    </w:p>
-    <w:p>
-      <w:pPr>
-        <w:rPr>
-          <w:b/>
-          <w:bCs/>
           <w:sz w:val="30"/>
           <w:szCs w:val="30"/>
         </w:rPr>
@@ -3513,6 +3524,7 @@
           <w:b/>
           <w:bCs/>
         </w:rPr>
+        <w:lastRenderedPageBreak/>
         <w:t>Principios aplicados:</w:t>
       </w:r>
     </w:p>
@@ -3635,55 +3647,8 @@
         </w:numPr>
       </w:pPr>
       <w:r>
-        <w:t>Instrucciones visibles en las funcionalidades más avanzadas, como listas personalizadas o el calendario de seguimiento.</w:t>
-      </w:r>
-    </w:p>
-    <w:p>
-      <w:pPr>
-        <w:numPr>
-          <w:ilvl w:val="0"/>
-          <w:numId w:val="30"/>
-        </w:numPr>
-      </w:pPr>
-      <w:r>
-        <w:rPr>
-          <w:b/>
-          <w:bCs/>
-        </w:rPr>
-        <w:t>Robusto:</w:t>
-      </w:r>
-    </w:p>
-    <w:p>
-      <w:pPr>
-        <w:numPr>
-          <w:ilvl w:val="1"/>
-          <w:numId w:val="30"/>
-        </w:numPr>
-      </w:pPr>
-      <w:r>
-        <w:t>Uso correcto de etiquetas semánticas HTML para garantizar compatibilidad con lectores de pantalla.</w:t>
-      </w:r>
-    </w:p>
-    <w:p>
-      <w:pPr>
-        <w:numPr>
-          <w:ilvl w:val="1"/>
-          <w:numId w:val="30"/>
-        </w:numPr>
-      </w:pPr>
-      <w:r>
-        <w:t xml:space="preserve">La plataforma estará optimizada para su uso con tecnologías </w:t>
-      </w:r>
-      <w:proofErr w:type="spellStart"/>
-      <w:r>
-        <w:t>asistivas</w:t>
-      </w:r>
-      <w:proofErr w:type="spellEnd"/>
-      <w:r>
-        <w:t xml:space="preserve"> modernas.</w:t>
-      </w:r>
-    </w:p>
-    <w:p>
+        <w:t>Instruccio</w:t>
+      </w:r>
       <w:r>
         <w:rPr>
           <w:noProof/>
@@ -3692,13 +3657,13 @@
         <mc:AlternateContent>
           <mc:Choice Requires="wps">
             <w:drawing>
-              <wp:anchor distT="0" distB="0" distL="114300" distR="114300" simplePos="0" relativeHeight="251693056" behindDoc="1" locked="1" layoutInCell="1" allowOverlap="1" wp14:anchorId="0A27B900" wp14:editId="2ABB7FFF">
+              <wp:anchor distT="0" distB="0" distL="114300" distR="114300" simplePos="0" relativeHeight="251697152" behindDoc="1" locked="1" layoutInCell="1" allowOverlap="1" wp14:anchorId="75B307A7" wp14:editId="1C5612D2">
                 <wp:simplePos x="0" y="0"/>
                 <wp:positionH relativeFrom="page">
                   <wp:align>left</wp:align>
                 </wp:positionH>
                 <wp:positionV relativeFrom="paragraph">
-                  <wp:posOffset>-7849235</wp:posOffset>
+                  <wp:posOffset>-5661025</wp:posOffset>
                 </wp:positionV>
                 <wp:extent cx="1323975" cy="10828020"/>
                 <wp:effectExtent l="0" t="0" r="9525" b="0"/>
@@ -3785,7 +3750,7 @@
           </mc:Choice>
           <mc:Fallback>
             <w:pict>
-              <v:rect w14:anchorId="0A27B900" id="_x0000_s1036" alt="&quot;&quot;" style="position:absolute;margin-left:0;margin-top:-618.05pt;width:104.25pt;height:852.6pt;z-index:-251623424;visibility:visible;mso-wrap-style:square;mso-width-percent:0;mso-height-percent:0;mso-wrap-distance-left:9pt;mso-wrap-distance-top:0;mso-wrap-distance-right:9pt;mso-wrap-distance-bottom:0;mso-position-horizontal:left;mso-position-horizontal-relative:page;mso-position-vertical:absolute;mso-position-vertical-relative:text;mso-width-percent:0;mso-height-percent:0;mso-width-relative:margin;mso-height-relative:margin;v-text-anchor:bottom" o:gfxdata="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" fillcolor="#404040 [2429]" stroked="f" strokeweight="1pt">
+              <v:rect w14:anchorId="75B307A7" id="_x0000_s1036" alt="&quot;&quot;" style="position:absolute;left:0;text-align:left;margin-left:0;margin-top:-445.75pt;width:104.25pt;height:852.6pt;z-index:-251619328;visibility:visible;mso-wrap-style:square;mso-width-percent:0;mso-height-percent:0;mso-wrap-distance-left:9pt;mso-wrap-distance-top:0;mso-wrap-distance-right:9pt;mso-wrap-distance-bottom:0;mso-position-horizontal:left;mso-position-horizontal-relative:page;mso-position-vertical:absolute;mso-position-vertical-relative:text;mso-width-percent:0;mso-height-percent:0;mso-width-relative:margin;mso-height-relative:margin;v-text-anchor:bottom" o:gfxdata="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" fillcolor="#404040 [2429]" stroked="f" strokeweight="1pt">
                 <v:textbox>
                   <w:txbxContent>
                     <w:p>
@@ -3809,7 +3774,56 @@
           </mc:Fallback>
         </mc:AlternateContent>
       </w:r>
+      <w:r>
+        <w:t>nes visibles en las funcionalidades más avanzadas, como listas personalizadas o el calendario de seguimiento.</w:t>
+      </w:r>
     </w:p>
+    <w:p>
+      <w:pPr>
+        <w:numPr>
+          <w:ilvl w:val="0"/>
+          <w:numId w:val="30"/>
+        </w:numPr>
+      </w:pPr>
+      <w:r>
+        <w:rPr>
+          <w:b/>
+          <w:bCs/>
+        </w:rPr>
+        <w:t>Robusto:</w:t>
+      </w:r>
+    </w:p>
+    <w:p>
+      <w:pPr>
+        <w:numPr>
+          <w:ilvl w:val="1"/>
+          <w:numId w:val="30"/>
+        </w:numPr>
+      </w:pPr>
+      <w:r>
+        <w:t>Uso correcto de etiquetas semánticas HTML para garantizar compatibilidad con lectores de pantalla.</w:t>
+      </w:r>
+    </w:p>
+    <w:p>
+      <w:pPr>
+        <w:numPr>
+          <w:ilvl w:val="1"/>
+          <w:numId w:val="30"/>
+        </w:numPr>
+      </w:pPr>
+      <w:r>
+        <w:t xml:space="preserve">La plataforma estará optimizada para su uso con tecnologías </w:t>
+      </w:r>
+      <w:proofErr w:type="spellStart"/>
+      <w:r>
+        <w:t>asistivas</w:t>
+      </w:r>
+      <w:proofErr w:type="spellEnd"/>
+      <w:r>
+        <w:t xml:space="preserve"> modernas.</w:t>
+      </w:r>
+    </w:p>
+    <w:p/>
     <w:p/>
     <w:p/>
     <w:p/>
@@ -3830,7 +3844,6 @@
           <w:sz w:val="30"/>
           <w:szCs w:val="30"/>
         </w:rPr>
-        <w:lastRenderedPageBreak/>
         <w:t>Recursos Materiales</w:t>
       </w:r>
     </w:p>
@@ -3970,6 +3983,7 @@
           </w:tcPr>
           <w:p>
             <w:r>
+              <w:lastRenderedPageBreak/>
               <w:t>Herramientas de diseño</w:t>
             </w:r>
           </w:p>
@@ -4050,28 +4064,6 @@
             </w:tr>
           </w:tbl>
           <w:p/>
-        </w:tc>
-      </w:tr>
-      <w:tr>
-        <w:tc>
-          <w:tcPr>
-            <w:tcW w:w="4148" w:type="dxa"/>
-          </w:tcPr>
-          <w:p>
-            <w:r>
-              <w:t>Servicios en la nube</w:t>
-            </w:r>
-          </w:p>
-        </w:tc>
-        <w:tc>
-          <w:tcPr>
-            <w:tcW w:w="4148" w:type="dxa"/>
-          </w:tcPr>
-          <w:p>
-            <w:r>
-              <w:t>Base de datos, almacenamiento, sistema de autenticación</w:t>
-            </w:r>
-          </w:p>
         </w:tc>
       </w:tr>
       <w:tr>
@@ -4507,135 +4499,7 @@
               </w:rPr>
             </w:pPr>
             <w:r>
-              <w:t>Servicio</w:t>
-            </w:r>
-            <w:r>
-              <w:rPr>
-                <w:noProof/>
-                <w:lang w:bidi="es-ES"/>
-              </w:rPr>
-              <mc:AlternateContent>
-                <mc:Choice Requires="wps">
-                  <w:drawing>
-                    <wp:anchor distT="0" distB="0" distL="114300" distR="114300" simplePos="0" relativeHeight="251695104" behindDoc="1" locked="1" layoutInCell="1" allowOverlap="1" wp14:anchorId="77719690" wp14:editId="4B5A6FC3">
-                      <wp:simplePos x="0" y="0"/>
-                      <wp:positionH relativeFrom="page">
-                        <wp:posOffset>-1818005</wp:posOffset>
-                      </wp:positionH>
-                      <wp:positionV relativeFrom="paragraph">
-                        <wp:posOffset>-8106410</wp:posOffset>
-                      </wp:positionV>
-                      <wp:extent cx="1323975" cy="10828020"/>
-                      <wp:effectExtent l="0" t="0" r="9525" b="0"/>
-                      <wp:wrapNone/>
-                      <wp:docPr id="924544378" name="Rectángulo 2">
-                        <a:extLst xmlns:a="http://schemas.openxmlformats.org/drawingml/2006/main">
-                          <a:ext uri="{C183D7F6-B498-43B3-948B-1728B52AA6E4}">
-                            <adec:decorative xmlns:adec="http://schemas.microsoft.com/office/drawing/2017/decorative" val="1"/>
-                          </a:ext>
-                        </a:extLst>
-                      </wp:docPr>
-                      <wp:cNvGraphicFramePr/>
-                      <a:graphic xmlns:a="http://schemas.openxmlformats.org/drawingml/2006/main">
-                        <a:graphicData uri="http://schemas.microsoft.com/office/word/2010/wordprocessingShape">
-                          <wps:wsp>
-                            <wps:cNvSpPr/>
-                            <wps:spPr>
-                              <a:xfrm>
-                                <a:off x="0" y="0"/>
-                                <a:ext cx="1323975" cy="10828020"/>
-                              </a:xfrm>
-                              <a:prstGeom prst="rect">
-                                <a:avLst/>
-                              </a:prstGeom>
-                              <a:solidFill>
-                                <a:schemeClr val="tx1">
-                                  <a:lumMod val="75000"/>
-                                  <a:lumOff val="25000"/>
-                                </a:schemeClr>
-                              </a:solidFill>
-                              <a:ln>
-                                <a:noFill/>
-                              </a:ln>
-                            </wps:spPr>
-                            <wps:style>
-                              <a:lnRef idx="2">
-                                <a:schemeClr val="accent1">
-                                  <a:shade val="50000"/>
-                                </a:schemeClr>
-                              </a:lnRef>
-                              <a:fillRef idx="1">
-                                <a:schemeClr val="accent1"/>
-                              </a:fillRef>
-                              <a:effectRef idx="0">
-                                <a:schemeClr val="accent1"/>
-                              </a:effectRef>
-                              <a:fontRef idx="minor">
-                                <a:schemeClr val="lt1"/>
-                              </a:fontRef>
-                            </wps:style>
-                            <wps:txbx>
-                              <w:txbxContent>
-                                <w:p>
-                                  <w:pPr>
-                                    <w:pStyle w:val="Piedepginablanco"/>
-                                  </w:pPr>
-                                  <w:r>
-                                    <w:rPr>
-                                      <w:lang w:bidi="es-ES"/>
-                                    </w:rPr>
-                                    <w:t>8</w:t>
-                                  </w:r>
-                                </w:p>
-                                <w:p/>
-                              </w:txbxContent>
-                            </wps:txbx>
-                            <wps:bodyPr rot="0" spcFirstLastPara="0" vertOverflow="overflow" horzOverflow="overflow" vert="horz" wrap="square" lIns="91440" tIns="45720" rIns="91440" bIns="45720" numCol="1" spcCol="0" rtlCol="0" fromWordArt="0" anchor="b" anchorCtr="0" forceAA="0" compatLnSpc="1">
-                              <a:prstTxWarp prst="textNoShape">
-                                <a:avLst/>
-                              </a:prstTxWarp>
-                              <a:noAutofit/>
-                            </wps:bodyPr>
-                          </wps:wsp>
-                        </a:graphicData>
-                      </a:graphic>
-                      <wp14:sizeRelH relativeFrom="margin">
-                        <wp14:pctWidth>0</wp14:pctWidth>
-                      </wp14:sizeRelH>
-                      <wp14:sizeRelV relativeFrom="margin">
-                        <wp14:pctHeight>0</wp14:pctHeight>
-                      </wp14:sizeRelV>
-                    </wp:anchor>
-                  </w:drawing>
-                </mc:Choice>
-                <mc:Fallback>
-                  <w:pict>
-                    <v:rect w14:anchorId="77719690" id="_x0000_s1037" alt="&quot;&quot;" style="position:absolute;margin-left:-143.15pt;margin-top:-638.3pt;width:104.25pt;height:852.6pt;z-index:-251621376;visibility:visible;mso-wrap-style:square;mso-width-percent:0;mso-height-percent:0;mso-wrap-distance-left:9pt;mso-wrap-distance-top:0;mso-wrap-distance-right:9pt;mso-wrap-distance-bottom:0;mso-position-horizontal:absolute;mso-position-horizontal-relative:page;mso-position-vertical:absolute;mso-position-vertical-relative:text;mso-width-percent:0;mso-height-percent:0;mso-width-relative:margin;mso-height-relative:margin;v-text-anchor:bottom" o:gfxdata="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" fillcolor="#404040 [2429]" stroked="f" strokeweight="1pt">
-                      <v:textbox>
-                        <w:txbxContent>
-                          <w:p>
-                            <w:pPr>
-                              <w:pStyle w:val="Piedepginablanco"/>
-                            </w:pPr>
-                            <w:r>
-                              <w:rPr>
-                                <w:lang w:bidi="es-ES"/>
-                              </w:rPr>
-                              <w:t>8</w:t>
-                            </w:r>
-                          </w:p>
-                          <w:p/>
-                        </w:txbxContent>
-                      </v:textbox>
-                      <w10:wrap anchorx="page"/>
-                      <w10:anchorlock/>
-                    </v:rect>
-                  </w:pict>
-                </mc:Fallback>
-              </mc:AlternateContent>
-            </w:r>
-            <w:r>
-              <w:t>s en la nube</w:t>
+              <w:t>Servicios en la nube</w:t>
             </w:r>
           </w:p>
         </w:tc>
@@ -7966,6 +7830,7 @@
   <w:style w:type="character" w:default="1" w:styleId="Fuentedeprrafopredeter">
     <w:name w:val="Default Paragraph Font"/>
     <w:uiPriority w:val="1"/>
+    <w:semiHidden/>
     <w:unhideWhenUsed/>
   </w:style>
   <w:style w:type="table" w:default="1" w:styleId="Tablanormal">
@@ -9855,11 +9720,13 @@
     <w:rsid w:val="003718C0"/>
     <w:rsid w:val="00494B77"/>
     <w:rsid w:val="0050145C"/>
+    <w:rsid w:val="00557EF6"/>
     <w:rsid w:val="005A1988"/>
     <w:rsid w:val="00640AD2"/>
     <w:rsid w:val="006A7A1C"/>
     <w:rsid w:val="00706E66"/>
     <w:rsid w:val="007074DB"/>
+    <w:rsid w:val="00721ADF"/>
     <w:rsid w:val="00880F52"/>
     <w:rsid w:val="008C0080"/>
     <w:rsid w:val="00A80C9D"/>
@@ -10816,10 +10683,6 @@
 </file>
 
 <file path=customXml/item1.xml><?xml version="1.0" encoding="utf-8"?>
-<b:Sources xmlns:b="http://schemas.openxmlformats.org/officeDocument/2006/bibliography" xmlns="http://schemas.openxmlformats.org/officeDocument/2006/bibliography" SelectedStyle="/APASixthEditionOfficeOnline.xsl" StyleName="APA" Version="6"/>
-</file>
-
-<file path=customXml/item2.xml><?xml version="1.0" encoding="utf-8"?>
 <p:properties xmlns:p="http://schemas.microsoft.com/office/2006/metadata/properties" xmlns:xsi="http://www.w3.org/2001/XMLSchema-instance" xmlns:pc="http://schemas.microsoft.com/office/infopath/2007/PartnerControls">
   <documentManagement>
     <_ip_UnifiedCompliancePolicyUIAction xmlns="http://schemas.microsoft.com/sharepoint/v3" xsi:nil="true"/>
@@ -10839,16 +10702,11 @@
 </p:properties>
 </file>
 
-<file path=customXml/item3.xml><?xml version="1.0" encoding="utf-8"?>
-<?mso-contentType ?>
-<FormTemplates xmlns="http://schemas.microsoft.com/sharepoint/v3/contenttype/forms">
-  <Display>DocumentLibraryForm</Display>
-  <Edit>DocumentLibraryForm</Edit>
-  <New>DocumentLibraryForm</New>
-</FormTemplates>
+<file path=customXml/item2.xml><?xml version="1.0" encoding="utf-8"?>
+<b:Sources xmlns:b="http://schemas.openxmlformats.org/officeDocument/2006/bibliography" xmlns="http://schemas.openxmlformats.org/officeDocument/2006/bibliography" SelectedStyle="/APASixthEditionOfficeOnline.xsl" StyleName="APA" Version="6"/>
 </file>
 
-<file path=customXml/item4.xml><?xml version="1.0" encoding="utf-8"?>
+<file path=customXml/item3.xml><?xml version="1.0" encoding="utf-8"?>
 <ct:contentTypeSchema xmlns:ct="http://schemas.microsoft.com/office/2006/metadata/contentType" xmlns:ma="http://schemas.microsoft.com/office/2006/metadata/properties/metaAttributes" ct:_="" ma:_="" ma:contentTypeName="Document" ma:contentTypeID="0x01010079F111ED35F8CC479449609E8A0923A6" ma:contentTypeVersion="26" ma:contentTypeDescription="Create a new document." ma:contentTypeScope="" ma:versionID="ac37c1753acd5e330d2062ccec26ea66">
   <xsd:schema xmlns:xsd="http://www.w3.org/2001/XMLSchema" xmlns:xs="http://www.w3.org/2001/XMLSchema" xmlns:p="http://schemas.microsoft.com/office/2006/metadata/properties" xmlns:ns1="http://schemas.microsoft.com/sharepoint/v3" xmlns:ns2="71af3243-3dd4-4a8d-8c0d-dd76da1f02a5" xmlns:ns3="16c05727-aa75-4e4a-9b5f-8a80a1165891" xmlns:ns4="230e9df3-be65-4c73-a93b-d1236ebd677e" targetNamespace="http://schemas.microsoft.com/office/2006/metadata/properties" ma:root="true" ma:fieldsID="3b340c7101c92c5120abd06486f94548" ns1:_="" ns2:_="" ns3:_="" ns4:_="">
     <xsd:import namespace="http://schemas.microsoft.com/sharepoint/v3"/>
@@ -11148,15 +11006,16 @@
 </ct:contentTypeSchema>
 </file>
 
-<file path=customXml/itemProps1.xml><?xml version="1.0" encoding="utf-8"?>
-<ds:datastoreItem xmlns:ds="http://schemas.openxmlformats.org/officeDocument/2006/customXml" ds:itemID="{C36A12F8-4A9B-4F64-B978-B0EE1FD97EBF}">
-  <ds:schemaRefs>
-    <ds:schemaRef ds:uri="http://schemas.openxmlformats.org/officeDocument/2006/bibliography"/>
-  </ds:schemaRefs>
-</ds:datastoreItem>
+<file path=customXml/item4.xml><?xml version="1.0" encoding="utf-8"?>
+<?mso-contentType ?>
+<FormTemplates xmlns="http://schemas.microsoft.com/sharepoint/v3/contenttype/forms">
+  <Display>DocumentLibraryForm</Display>
+  <Edit>DocumentLibraryForm</Edit>
+  <New>DocumentLibraryForm</New>
+</FormTemplates>
 </file>
 
-<file path=customXml/itemProps2.xml><?xml version="1.0" encoding="utf-8"?>
+<file path=customXml/itemProps1.xml><?xml version="1.0" encoding="utf-8"?>
 <ds:datastoreItem xmlns:ds="http://schemas.openxmlformats.org/officeDocument/2006/customXml" ds:itemID="{E046B6FE-75F5-4A4A-ADF9-3D55C2808F6A}">
   <ds:schemaRefs>
     <ds:schemaRef ds:uri="http://schemas.microsoft.com/office/2006/metadata/properties"/>
@@ -11168,15 +11027,15 @@
 </ds:datastoreItem>
 </file>
 
-<file path=customXml/itemProps3.xml><?xml version="1.0" encoding="utf-8"?>
-<ds:datastoreItem xmlns:ds="http://schemas.openxmlformats.org/officeDocument/2006/customXml" ds:itemID="{268A88EA-2CD1-4EB5-AD27-A1454BEC753F}">
+<file path=customXml/itemProps2.xml><?xml version="1.0" encoding="utf-8"?>
+<ds:datastoreItem xmlns:ds="http://schemas.openxmlformats.org/officeDocument/2006/customXml" ds:itemID="{C36A12F8-4A9B-4F64-B978-B0EE1FD97EBF}">
   <ds:schemaRefs>
-    <ds:schemaRef ds:uri="http://schemas.microsoft.com/sharepoint/v3/contenttype/forms"/>
+    <ds:schemaRef ds:uri="http://schemas.openxmlformats.org/officeDocument/2006/bibliography"/>
   </ds:schemaRefs>
 </ds:datastoreItem>
 </file>
 
-<file path=customXml/itemProps4.xml><?xml version="1.0" encoding="utf-8"?>
+<file path=customXml/itemProps3.xml><?xml version="1.0" encoding="utf-8"?>
 <ds:datastoreItem xmlns:ds="http://schemas.openxmlformats.org/officeDocument/2006/customXml" ds:itemID="{3B486F6C-1123-466C-A9D5-986F0A3EF9D1}">
   <ds:schemaRefs>
     <ds:schemaRef ds:uri="http://schemas.microsoft.com/office/2006/metadata/contentType"/>
@@ -11197,6 +11056,14 @@
 </ds:datastoreItem>
 </file>
 
+<file path=customXml/itemProps4.xml><?xml version="1.0" encoding="utf-8"?>
+<ds:datastoreItem xmlns:ds="http://schemas.openxmlformats.org/officeDocument/2006/customXml" ds:itemID="{268A88EA-2CD1-4EB5-AD27-A1454BEC753F}">
+  <ds:schemaRefs>
+    <ds:schemaRef ds:uri="http://schemas.microsoft.com/sharepoint/v3/contenttype/forms"/>
+  </ds:schemaRefs>
+</ds:datastoreItem>
+</file>
+
 <file path=docMetadata/LabelInfo.xml><?xml version="1.0" encoding="utf-8"?>
 <clbl:labelList xmlns:clbl="http://schemas.microsoft.com/office/2020/mipLabelMetadata"/>
 </file>
</xml_diff>

<commit_message>
SUBO CAMBIOS, FALTA DIAGRAMA TEXTUAL Y GANTT
</commit_message>
<xml_diff>
--- a/SONAURA.docx
+++ b/SONAURA.docx
@@ -3657,13 +3657,13 @@
         <mc:AlternateContent>
           <mc:Choice Requires="wps">
             <w:drawing>
-              <wp:anchor distT="0" distB="0" distL="114300" distR="114300" simplePos="0" relativeHeight="251697152" behindDoc="1" locked="1" layoutInCell="1" allowOverlap="1" wp14:anchorId="75B307A7" wp14:editId="1C5612D2">
+              <wp:anchor distT="0" distB="0" distL="114300" distR="114300" simplePos="0" relativeHeight="251697152" behindDoc="1" locked="1" layoutInCell="1" allowOverlap="1" wp14:anchorId="75B307A7" wp14:editId="0AF4E2D8">
                 <wp:simplePos x="0" y="0"/>
                 <wp:positionH relativeFrom="page">
                   <wp:align>left</wp:align>
                 </wp:positionH>
                 <wp:positionV relativeFrom="paragraph">
-                  <wp:posOffset>-5661025</wp:posOffset>
+                  <wp:posOffset>-4305300</wp:posOffset>
                 </wp:positionV>
                 <wp:extent cx="1323975" cy="10828020"/>
                 <wp:effectExtent l="0" t="0" r="9525" b="0"/>
@@ -3750,7 +3750,7 @@
           </mc:Choice>
           <mc:Fallback>
             <w:pict>
-              <v:rect w14:anchorId="75B307A7" id="_x0000_s1036" alt="&quot;&quot;" style="position:absolute;left:0;text-align:left;margin-left:0;margin-top:-445.75pt;width:104.25pt;height:852.6pt;z-index:-251619328;visibility:visible;mso-wrap-style:square;mso-width-percent:0;mso-height-percent:0;mso-wrap-distance-left:9pt;mso-wrap-distance-top:0;mso-wrap-distance-right:9pt;mso-wrap-distance-bottom:0;mso-position-horizontal:left;mso-position-horizontal-relative:page;mso-position-vertical:absolute;mso-position-vertical-relative:text;mso-width-percent:0;mso-height-percent:0;mso-width-relative:margin;mso-height-relative:margin;v-text-anchor:bottom" o:gfxdata="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" fillcolor="#404040 [2429]" stroked="f" strokeweight="1pt">
+              <v:rect w14:anchorId="75B307A7" id="_x0000_s1036" alt="&quot;&quot;" style="position:absolute;left:0;text-align:left;margin-left:0;margin-top:-339pt;width:104.25pt;height:852.6pt;z-index:-251619328;visibility:visible;mso-wrap-style:square;mso-width-percent:0;mso-height-percent:0;mso-wrap-distance-left:9pt;mso-wrap-distance-top:0;mso-wrap-distance-right:9pt;mso-wrap-distance-bottom:0;mso-position-horizontal:left;mso-position-horizontal-relative:page;mso-position-vertical:absolute;mso-position-vertical-relative:text;mso-width-percent:0;mso-height-percent:0;mso-width-relative:margin;mso-height-relative:margin;v-text-anchor:bottom" o:gfxdata="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" fillcolor="#404040 [2429]" stroked="f" strokeweight="1pt">
                 <v:textbox>
                   <w:txbxContent>
                     <w:p>
@@ -3828,6 +3828,11 @@
     <w:p/>
     <w:p/>
     <w:p/>
+    <w:p/>
+    <w:p/>
+    <w:p/>
+    <w:p/>
+    <w:p/>
     <w:p>
       <w:pPr>
         <w:rPr>
@@ -3844,6 +3849,7 @@
           <w:sz w:val="30"/>
           <w:szCs w:val="30"/>
         </w:rPr>
+        <w:lastRenderedPageBreak/>
         <w:t>Recursos Materiales</w:t>
       </w:r>
     </w:p>
@@ -3983,7 +3989,6 @@
           </w:tcPr>
           <w:p>
             <w:r>
-              <w:lastRenderedPageBreak/>
               <w:t>Herramientas de diseño</w:t>
             </w:r>
           </w:p>
@@ -4092,7 +4097,133 @@
         </w:tc>
       </w:tr>
     </w:tbl>
-    <w:p/>
+    <w:p>
+      <w:r>
+        <w:rPr>
+          <w:noProof/>
+          <w:lang w:bidi="es-ES"/>
+        </w:rPr>
+        <mc:AlternateContent>
+          <mc:Choice Requires="wps">
+            <w:drawing>
+              <wp:anchor distT="0" distB="0" distL="114300" distR="114300" simplePos="0" relativeHeight="251701248" behindDoc="1" locked="1" layoutInCell="1" allowOverlap="1" wp14:anchorId="1E9E9CB0" wp14:editId="5477692B">
+                <wp:simplePos x="0" y="0"/>
+                <wp:positionH relativeFrom="page">
+                  <wp:align>left</wp:align>
+                </wp:positionH>
+                <wp:positionV relativeFrom="paragraph">
+                  <wp:posOffset>-2891155</wp:posOffset>
+                </wp:positionV>
+                <wp:extent cx="1323975" cy="10828020"/>
+                <wp:effectExtent l="0" t="0" r="9525" b="0"/>
+                <wp:wrapNone/>
+                <wp:docPr id="1310762053" name="Rectángulo 2">
+                  <a:extLst xmlns:a="http://schemas.openxmlformats.org/drawingml/2006/main">
+                    <a:ext uri="{C183D7F6-B498-43B3-948B-1728B52AA6E4}">
+                      <adec:decorative xmlns:adec="http://schemas.microsoft.com/office/drawing/2017/decorative" val="1"/>
+                    </a:ext>
+                  </a:extLst>
+                </wp:docPr>
+                <wp:cNvGraphicFramePr/>
+                <a:graphic xmlns:a="http://schemas.openxmlformats.org/drawingml/2006/main">
+                  <a:graphicData uri="http://schemas.microsoft.com/office/word/2010/wordprocessingShape">
+                    <wps:wsp>
+                      <wps:cNvSpPr/>
+                      <wps:spPr>
+                        <a:xfrm>
+                          <a:off x="0" y="0"/>
+                          <a:ext cx="1323975" cy="10828020"/>
+                        </a:xfrm>
+                        <a:prstGeom prst="rect">
+                          <a:avLst/>
+                        </a:prstGeom>
+                        <a:solidFill>
+                          <a:schemeClr val="tx1">
+                            <a:lumMod val="75000"/>
+                            <a:lumOff val="25000"/>
+                          </a:schemeClr>
+                        </a:solidFill>
+                        <a:ln>
+                          <a:noFill/>
+                        </a:ln>
+                      </wps:spPr>
+                      <wps:style>
+                        <a:lnRef idx="2">
+                          <a:schemeClr val="accent1">
+                            <a:shade val="50000"/>
+                          </a:schemeClr>
+                        </a:lnRef>
+                        <a:fillRef idx="1">
+                          <a:schemeClr val="accent1"/>
+                        </a:fillRef>
+                        <a:effectRef idx="0">
+                          <a:schemeClr val="accent1"/>
+                        </a:effectRef>
+                        <a:fontRef idx="minor">
+                          <a:schemeClr val="lt1"/>
+                        </a:fontRef>
+                      </wps:style>
+                      <wps:txbx>
+                        <w:txbxContent>
+                          <w:p>
+                            <w:pPr>
+                              <w:pStyle w:val="Piedepginablanco"/>
+                            </w:pPr>
+                            <w:r>
+                              <w:rPr>
+                                <w:lang w:bidi="es-ES"/>
+                              </w:rPr>
+                              <w:t>8</w:t>
+                            </w:r>
+                          </w:p>
+                          <w:p/>
+                        </w:txbxContent>
+                      </wps:txbx>
+                      <wps:bodyPr rot="0" spcFirstLastPara="0" vertOverflow="overflow" horzOverflow="overflow" vert="horz" wrap="square" lIns="91440" tIns="45720" rIns="91440" bIns="45720" numCol="1" spcCol="0" rtlCol="0" fromWordArt="0" anchor="b" anchorCtr="0" forceAA="0" compatLnSpc="1">
+                        <a:prstTxWarp prst="textNoShape">
+                          <a:avLst/>
+                        </a:prstTxWarp>
+                        <a:noAutofit/>
+                      </wps:bodyPr>
+                    </wps:wsp>
+                  </a:graphicData>
+                </a:graphic>
+                <wp14:sizeRelH relativeFrom="margin">
+                  <wp14:pctWidth>0</wp14:pctWidth>
+                </wp14:sizeRelH>
+                <wp14:sizeRelV relativeFrom="margin">
+                  <wp14:pctHeight>0</wp14:pctHeight>
+                </wp14:sizeRelV>
+              </wp:anchor>
+            </w:drawing>
+          </mc:Choice>
+          <mc:Fallback>
+            <w:pict>
+              <v:rect w14:anchorId="1E9E9CB0" id="_x0000_s1037" alt="&quot;&quot;" style="position:absolute;margin-left:0;margin-top:-227.65pt;width:104.25pt;height:852.6pt;z-index:-251615232;visibility:visible;mso-wrap-style:square;mso-width-percent:0;mso-height-percent:0;mso-wrap-distance-left:9pt;mso-wrap-distance-top:0;mso-wrap-distance-right:9pt;mso-wrap-distance-bottom:0;mso-position-horizontal:left;mso-position-horizontal-relative:page;mso-position-vertical:absolute;mso-position-vertical-relative:text;mso-width-percent:0;mso-height-percent:0;mso-width-relative:margin;mso-height-relative:margin;v-text-anchor:bottom" o:gfxdata="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" fillcolor="#404040 [2429]" stroked="f" strokeweight="1pt">
+                <v:textbox>
+                  <w:txbxContent>
+                    <w:p>
+                      <w:pPr>
+                        <w:pStyle w:val="Piedepginablanco"/>
+                      </w:pPr>
+                      <w:r>
+                        <w:rPr>
+                          <w:lang w:bidi="es-ES"/>
+                        </w:rPr>
+                        <w:t>8</w:t>
+                      </w:r>
+                    </w:p>
+                    <w:p/>
+                  </w:txbxContent>
+                </v:textbox>
+                <w10:wrap anchorx="page"/>
+                <w10:anchorlock/>
+              </v:rect>
+            </w:pict>
+          </mc:Fallback>
+        </mc:AlternateContent>
+      </w:r>
+    </w:p>
     <w:p>
       <w:pPr>
         <w:rPr>
@@ -7830,7 +7961,6 @@
   <w:style w:type="character" w:default="1" w:styleId="Fuentedeprrafopredeter">
     <w:name w:val="Default Paragraph Font"/>
     <w:uiPriority w:val="1"/>
-    <w:semiHidden/>
     <w:unhideWhenUsed/>
   </w:style>
   <w:style w:type="table" w:default="1" w:styleId="Tablanormal">
@@ -9715,6 +9845,7 @@
     <w:rsid w:val="00121E48"/>
     <w:rsid w:val="001227FE"/>
     <w:rsid w:val="00292F68"/>
+    <w:rsid w:val="00320DC9"/>
     <w:rsid w:val="00352D52"/>
     <w:rsid w:val="00364CC0"/>
     <w:rsid w:val="003718C0"/>
@@ -9731,6 +9862,7 @@
     <w:rsid w:val="008C0080"/>
     <w:rsid w:val="00A80C9D"/>
     <w:rsid w:val="00A86F88"/>
+    <w:rsid w:val="00B0134D"/>
     <w:rsid w:val="00B506B8"/>
     <w:rsid w:val="00BD20EB"/>
     <w:rsid w:val="00C45535"/>
@@ -10683,6 +10815,10 @@
 </file>
 
 <file path=customXml/item1.xml><?xml version="1.0" encoding="utf-8"?>
+<b:Sources xmlns:b="http://schemas.openxmlformats.org/officeDocument/2006/bibliography" xmlns="http://schemas.openxmlformats.org/officeDocument/2006/bibliography" SelectedStyle="/APASixthEditionOfficeOnline.xsl" StyleName="APA" Version="6"/>
+</file>
+
+<file path=customXml/item2.xml><?xml version="1.0" encoding="utf-8"?>
 <p:properties xmlns:p="http://schemas.microsoft.com/office/2006/metadata/properties" xmlns:xsi="http://www.w3.org/2001/XMLSchema-instance" xmlns:pc="http://schemas.microsoft.com/office/infopath/2007/PartnerControls">
   <documentManagement>
     <_ip_UnifiedCompliancePolicyUIAction xmlns="http://schemas.microsoft.com/sharepoint/v3" xsi:nil="true"/>
@@ -10702,11 +10838,16 @@
 </p:properties>
 </file>
 
-<file path=customXml/item2.xml><?xml version="1.0" encoding="utf-8"?>
-<b:Sources xmlns:b="http://schemas.openxmlformats.org/officeDocument/2006/bibliography" xmlns="http://schemas.openxmlformats.org/officeDocument/2006/bibliography" SelectedStyle="/APASixthEditionOfficeOnline.xsl" StyleName="APA" Version="6"/>
+<file path=customXml/item3.xml><?xml version="1.0" encoding="utf-8"?>
+<?mso-contentType ?>
+<FormTemplates xmlns="http://schemas.microsoft.com/sharepoint/v3/contenttype/forms">
+  <Display>DocumentLibraryForm</Display>
+  <Edit>DocumentLibraryForm</Edit>
+  <New>DocumentLibraryForm</New>
+</FormTemplates>
 </file>
 
-<file path=customXml/item3.xml><?xml version="1.0" encoding="utf-8"?>
+<file path=customXml/item4.xml><?xml version="1.0" encoding="utf-8"?>
 <ct:contentTypeSchema xmlns:ct="http://schemas.microsoft.com/office/2006/metadata/contentType" xmlns:ma="http://schemas.microsoft.com/office/2006/metadata/properties/metaAttributes" ct:_="" ma:_="" ma:contentTypeName="Document" ma:contentTypeID="0x01010079F111ED35F8CC479449609E8A0923A6" ma:contentTypeVersion="26" ma:contentTypeDescription="Create a new document." ma:contentTypeScope="" ma:versionID="ac37c1753acd5e330d2062ccec26ea66">
   <xsd:schema xmlns:xsd="http://www.w3.org/2001/XMLSchema" xmlns:xs="http://www.w3.org/2001/XMLSchema" xmlns:p="http://schemas.microsoft.com/office/2006/metadata/properties" xmlns:ns1="http://schemas.microsoft.com/sharepoint/v3" xmlns:ns2="71af3243-3dd4-4a8d-8c0d-dd76da1f02a5" xmlns:ns3="16c05727-aa75-4e4a-9b5f-8a80a1165891" xmlns:ns4="230e9df3-be65-4c73-a93b-d1236ebd677e" targetNamespace="http://schemas.microsoft.com/office/2006/metadata/properties" ma:root="true" ma:fieldsID="3b340c7101c92c5120abd06486f94548" ns1:_="" ns2:_="" ns3:_="" ns4:_="">
     <xsd:import namespace="http://schemas.microsoft.com/sharepoint/v3"/>
@@ -11006,16 +11147,15 @@
 </ct:contentTypeSchema>
 </file>
 
-<file path=customXml/item4.xml><?xml version="1.0" encoding="utf-8"?>
-<?mso-contentType ?>
-<FormTemplates xmlns="http://schemas.microsoft.com/sharepoint/v3/contenttype/forms">
-  <Display>DocumentLibraryForm</Display>
-  <Edit>DocumentLibraryForm</Edit>
-  <New>DocumentLibraryForm</New>
-</FormTemplates>
+<file path=customXml/itemProps1.xml><?xml version="1.0" encoding="utf-8"?>
+<ds:datastoreItem xmlns:ds="http://schemas.openxmlformats.org/officeDocument/2006/customXml" ds:itemID="{C36A12F8-4A9B-4F64-B978-B0EE1FD97EBF}">
+  <ds:schemaRefs>
+    <ds:schemaRef ds:uri="http://schemas.openxmlformats.org/officeDocument/2006/bibliography"/>
+  </ds:schemaRefs>
+</ds:datastoreItem>
 </file>
 
-<file path=customXml/itemProps1.xml><?xml version="1.0" encoding="utf-8"?>
+<file path=customXml/itemProps2.xml><?xml version="1.0" encoding="utf-8"?>
 <ds:datastoreItem xmlns:ds="http://schemas.openxmlformats.org/officeDocument/2006/customXml" ds:itemID="{E046B6FE-75F5-4A4A-ADF9-3D55C2808F6A}">
   <ds:schemaRefs>
     <ds:schemaRef ds:uri="http://schemas.microsoft.com/office/2006/metadata/properties"/>
@@ -11027,15 +11167,15 @@
 </ds:datastoreItem>
 </file>
 
-<file path=customXml/itemProps2.xml><?xml version="1.0" encoding="utf-8"?>
-<ds:datastoreItem xmlns:ds="http://schemas.openxmlformats.org/officeDocument/2006/customXml" ds:itemID="{C36A12F8-4A9B-4F64-B978-B0EE1FD97EBF}">
+<file path=customXml/itemProps3.xml><?xml version="1.0" encoding="utf-8"?>
+<ds:datastoreItem xmlns:ds="http://schemas.openxmlformats.org/officeDocument/2006/customXml" ds:itemID="{268A88EA-2CD1-4EB5-AD27-A1454BEC753F}">
   <ds:schemaRefs>
-    <ds:schemaRef ds:uri="http://schemas.openxmlformats.org/officeDocument/2006/bibliography"/>
+    <ds:schemaRef ds:uri="http://schemas.microsoft.com/sharepoint/v3/contenttype/forms"/>
   </ds:schemaRefs>
 </ds:datastoreItem>
 </file>
 
-<file path=customXml/itemProps3.xml><?xml version="1.0" encoding="utf-8"?>
+<file path=customXml/itemProps4.xml><?xml version="1.0" encoding="utf-8"?>
 <ds:datastoreItem xmlns:ds="http://schemas.openxmlformats.org/officeDocument/2006/customXml" ds:itemID="{3B486F6C-1123-466C-A9D5-986F0A3EF9D1}">
   <ds:schemaRefs>
     <ds:schemaRef ds:uri="http://schemas.microsoft.com/office/2006/metadata/contentType"/>
@@ -11056,14 +11196,6 @@
 </ds:datastoreItem>
 </file>
 
-<file path=customXml/itemProps4.xml><?xml version="1.0" encoding="utf-8"?>
-<ds:datastoreItem xmlns:ds="http://schemas.openxmlformats.org/officeDocument/2006/customXml" ds:itemID="{268A88EA-2CD1-4EB5-AD27-A1454BEC753F}">
-  <ds:schemaRefs>
-    <ds:schemaRef ds:uri="http://schemas.microsoft.com/sharepoint/v3/contenttype/forms"/>
-  </ds:schemaRefs>
-</ds:datastoreItem>
-</file>
-
 <file path=docMetadata/LabelInfo.xml><?xml version="1.0" encoding="utf-8"?>
 <clbl:labelList xmlns:clbl="http://schemas.microsoft.com/office/2020/mipLabelMetadata"/>
 </file>
</xml_diff>

<commit_message>
subimos gantt y links
</commit_message>
<xml_diff>
--- a/SONAURA.docx
+++ b/SONAURA.docx
@@ -3,6 +3,8 @@
 <w:document xmlns:wpc="http://schemas.microsoft.com/office/word/2010/wordprocessingCanvas" xmlns:cx="http://schemas.microsoft.com/office/drawing/2014/chartex" xmlns:cx1="http://schemas.microsoft.com/office/drawing/2015/9/8/chartex" xmlns:cx2="http://schemas.microsoft.com/office/drawing/2015/10/21/chartex" xmlns:cx3="http://schemas.microsoft.com/office/drawing/2016/5/9/chartex" xmlns:cx4="http://schemas.microsoft.com/office/drawing/2016/5/10/chartex" xmlns:cx5="http://schemas.microsoft.com/office/drawing/2016/5/11/chartex" xmlns:cx6="http://schemas.microsoft.com/office/drawing/2016/5/12/chartex" xmlns:cx7="http://schemas.microsoft.com/office/drawing/2016/5/13/chartex" xmlns:cx8="http://schemas.microsoft.com/office/drawing/2016/5/14/chartex" xmlns:mc="http://schemas.openxmlformats.org/markup-compatibility/2006" xmlns:aink="http://schemas.microsoft.com/office/drawing/2016/ink" xmlns:am3d="http://schemas.microsoft.com/office/drawing/2017/model3d" xmlns:o="urn:schemas-microsoft-com:office:office" xmlns:oel="http://schemas.microsoft.com/office/2019/extlst" xmlns:r="http://schemas.openxmlformats.org/officeDocument/2006/relationships" xmlns:m="http://schemas.openxmlformats.org/officeDocument/2006/math" xmlns:v="urn:schemas-microsoft-com:vml" xmlns:wp14="http://schemas.microsoft.com/office/word/2010/wordprocessingDrawing" xmlns:wp="http://schemas.openxmlformats.org/drawingml/2006/wordprocessingDrawing" xmlns:w10="urn:schemas-microsoft-com:office:word" xmlns:w="http://schemas.openxmlformats.org/wordprocessingml/2006/main" xmlns:w14="http://schemas.microsoft.com/office/word/2010/wordml" xmlns:w15="http://schemas.microsoft.com/office/word/2012/wordml" xmlns:w16cex="http://schemas.microsoft.com/office/word/2018/wordml/cex" xmlns:w16cid="http://schemas.microsoft.com/office/word/2016/wordml/cid" xmlns:w16="http://schemas.microsoft.com/office/word/2018/wordml" xmlns:w16du="http://schemas.microsoft.com/office/word/2023/wordml/word16du" xmlns:w16sdtdh="http://schemas.microsoft.com/office/word/2020/wordml/sdtdatahash" xmlns:w16sdtfl="http://schemas.microsoft.com/office/word/2024/wordml/sdtformatlock" xmlns:w16se="http://schemas.microsoft.com/office/word/2015/wordml/symex" xmlns:wpg="http://schemas.microsoft.com/office/word/2010/wordprocessingGroup" xmlns:wpi="http://schemas.microsoft.com/office/word/2010/wordprocessingInk" xmlns:wne="http://schemas.microsoft.com/office/word/2006/wordml" xmlns:wps="http://schemas.microsoft.com/office/word/2010/wordprocessingShape" mc:Ignorable="w14 w15 w16se w16cid w16 w16cex w16sdtdh w16sdtfl w16du wp14">
   <w:body>
     <w:p>
+      <w:bookmarkStart w:id="0" w:name="_Hlk197676460"/>
+      <w:bookmarkEnd w:id="0"/>
       <w:r>
         <w:rPr>
           <w:noProof/>
@@ -1876,7 +1878,7 @@
     <w:tbl>
       <w:tblPr>
         <w:tblStyle w:val="Tablageneral"/>
-        <w:tblW w:w="8623" w:type="dxa"/>
+        <w:tblW w:w="9041" w:type="dxa"/>
         <w:tblLayout w:type="fixed"/>
         <w:tblCellMar>
           <w:right w:w="0" w:type="dxa"/>
@@ -1884,16 +1886,16 @@
         <w:tblLook w:val="0620" w:firstRow="1" w:lastRow="0" w:firstColumn="0" w:lastColumn="0" w:noHBand="1" w:noVBand="1"/>
       </w:tblPr>
       <w:tblGrid>
-        <w:gridCol w:w="8623"/>
+        <w:gridCol w:w="9041"/>
       </w:tblGrid>
       <w:tr>
         <w:trPr>
           <w:cnfStyle w:val="100000000000" w:firstRow="1" w:lastRow="0" w:firstColumn="0" w:lastColumn="0" w:oddVBand="0" w:evenVBand="0" w:oddHBand="0" w:evenHBand="0" w:firstRowFirstColumn="0" w:firstRowLastColumn="0" w:lastRowFirstColumn="0" w:lastRowLastColumn="0"/>
-          <w:trHeight w:val="1177"/>
+          <w:trHeight w:val="2154"/>
         </w:trPr>
         <w:tc>
           <w:tcPr>
-            <w:tcW w:w="8623" w:type="dxa"/>
+            <w:tcW w:w="9041" w:type="dxa"/>
             <w:tcBorders>
               <w:bottom w:val="single" w:sz="8" w:space="0" w:color="C9C9C9" w:themeColor="text2" w:themeTint="40"/>
             </w:tcBorders>
@@ -1942,11 +1944,11 @@
       </w:tr>
       <w:tr>
         <w:trPr>
-          <w:trHeight w:hRule="exact" w:val="806"/>
+          <w:trHeight w:hRule="exact" w:val="646"/>
         </w:trPr>
         <w:tc>
           <w:tcPr>
-            <w:tcW w:w="8623" w:type="dxa"/>
+            <w:tcW w:w="9041" w:type="dxa"/>
             <w:tcBorders>
               <w:top w:val="single" w:sz="8" w:space="0" w:color="C9C9C9" w:themeColor="text2" w:themeTint="40"/>
               <w:bottom w:val="nil"/>
@@ -1956,31 +1958,50 @@
           <w:p>
             <w:pPr>
               <w:pStyle w:val="Ttulo2"/>
-            </w:pPr>
-            <w:sdt>
-              <w:sdtPr>
-                <w:id w:val="-265540026"/>
-                <w:placeholder>
-                  <w:docPart w:val="54E40328D5D64C90A6EF8250521A599A"/>
-                </w:placeholder>
-                <w15:appearance w15:val="hidden"/>
-              </w:sdtPr>
-              <w:sdtContent>
-                <w:r>
-                  <w:t>ESPECIFICACION DE REQUISITOS DEL SISTEMA:</w:t>
-                </w:r>
-              </w:sdtContent>
-            </w:sdt>
-            <w:r>
               <w:rPr>
                 <w:lang w:bidi="es-ES"/>
               </w:rPr>
-              <w:t xml:space="preserve"> </w:t>
-            </w:r>
+            </w:pPr>
+          </w:p>
+          <w:p>
+            <w:pPr>
+              <w:rPr>
+                <w:lang w:bidi="es-ES"/>
+              </w:rPr>
+            </w:pPr>
           </w:p>
         </w:tc>
       </w:tr>
     </w:tbl>
+    <w:p>
+      <w:pPr>
+        <w:spacing w:before="0" w:after="200" w:line="312" w:lineRule="auto"/>
+        <w:rPr>
+          <w:b/>
+          <w:bCs/>
+          <w:sz w:val="28"/>
+          <w:szCs w:val="28"/>
+        </w:rPr>
+      </w:pPr>
+      <w:r>
+        <w:rPr>
+          <w:b/>
+          <w:bCs/>
+          <w:sz w:val="28"/>
+          <w:szCs w:val="28"/>
+        </w:rPr>
+        <w:t>ES</w:t>
+      </w:r>
+      <w:r>
+        <w:rPr>
+          <w:b/>
+          <w:bCs/>
+          <w:sz w:val="28"/>
+          <w:szCs w:val="28"/>
+        </w:rPr>
+        <w:t>PECIFICACIÓN DE REQUISITOS Y PLANIFICACIÓN:</w:t>
+      </w:r>
+    </w:p>
     <w:p>
       <w:pPr>
         <w:spacing w:before="0" w:after="200" w:line="312" w:lineRule="auto"/>
@@ -2352,6 +2373,7 @@
         <w:rPr>
           <w:sz w:val="24"/>
         </w:rPr>
+        <w:lastRenderedPageBreak/>
         <w:t>Ver el top 5 de mejor valoradas.</w:t>
       </w:r>
     </w:p>
@@ -2368,7 +2390,6 @@
           <w:noProof/>
           <w:lang w:bidi="es-ES"/>
         </w:rPr>
-        <w:lastRenderedPageBreak/>
         <mc:AlternateContent>
           <mc:Choice Requires="wps">
             <w:drawing>
@@ -2778,7 +2799,6 @@
           <w:bCs/>
           <w:sz w:val="24"/>
         </w:rPr>
-        <w:lastRenderedPageBreak/>
         <w:t>Requisitos no funcionales</w:t>
       </w:r>
     </w:p>
@@ -3069,12 +3089,16 @@
       </w:pPr>
     </w:p>
     <w:p>
-      <w:r>
-        <w:rPr>
-          <w:b/>
-          <w:bCs/>
-          <w:sz w:val="32"/>
-          <w:szCs w:val="32"/>
+      <w:pPr>
+        <w:rPr>
+          <w:sz w:val="24"/>
+        </w:rPr>
+      </w:pPr>
+      <w:r>
+        <w:rPr>
+          <w:b/>
+          <w:bCs/>
+          <w:sz w:val="24"/>
         </w:rPr>
         <w:t xml:space="preserve"> </w:t>
       </w:r>
@@ -3082,10 +3106,9 @@
         <w:rPr>
           <w:b/>
           <w:bCs/>
-          <w:sz w:val="32"/>
-          <w:szCs w:val="32"/>
-        </w:rPr>
-        <w:t>DIAGRAMA DE CASOS DE USO</w:t>
+          <w:sz w:val="24"/>
+        </w:rPr>
+        <w:t>Diagrama de casos de uso</w:t>
       </w:r>
     </w:p>
     <w:p>
@@ -3171,145 +3194,50 @@
     <w:p>
       <w:pPr>
         <w:rPr>
-          <w:b/>
-          <w:bCs/>
-          <w:sz w:val="32"/>
-          <w:szCs w:val="32"/>
-        </w:rPr>
-      </w:pPr>
-    </w:p>
-    <w:p>
-      <w:pPr>
-        <w:rPr>
-          <w:b/>
-          <w:bCs/>
-          <w:sz w:val="32"/>
-          <w:szCs w:val="32"/>
-        </w:rPr>
-      </w:pPr>
-      <w:r>
-        <w:rPr>
-          <w:b/>
-          <w:bCs/>
-          <w:sz w:val="32"/>
-          <w:szCs w:val="32"/>
-        </w:rPr>
-        <w:t>Principios de Usabilidad y Accesibilidad</w:t>
-      </w:r>
-    </w:p>
-    <w:p>
-      <w:pPr>
-        <w:rPr>
-          <w:b/>
-          <w:bCs/>
-          <w:sz w:val="30"/>
-          <w:szCs w:val="30"/>
-        </w:rPr>
-      </w:pPr>
-      <w:r>
-        <w:rPr>
-          <w:b/>
-          <w:bCs/>
-          <w:sz w:val="30"/>
-          <w:szCs w:val="30"/>
-        </w:rPr>
-        <w:t>Usabilidad</w:t>
-      </w:r>
-    </w:p>
-    <w:p>
-      <w:r>
-        <w:t>La usabilidad es un aspecto clave en el diseño de nuestro blog de entretenimiento, ya que influye directamente en la facilidad con la que los usuarios interactúan con la plataforma. Para garantizar una experiencia satisfactoria, nos basamos en principios reconocidos como los de Jakob Nielsen.</w:t>
-      </w:r>
-    </w:p>
-    <w:p>
-      <w:r>
-        <w:rPr>
-          <w:b/>
-          <w:bCs/>
-        </w:rPr>
-        <w:t>Principios aplicados:</w:t>
-      </w:r>
-    </w:p>
-    <w:p>
-      <w:pPr>
-        <w:numPr>
-          <w:ilvl w:val="0"/>
-          <w:numId w:val="29"/>
-        </w:numPr>
-      </w:pPr>
-      <w:r>
-        <w:rPr>
-          <w:b/>
-          <w:bCs/>
-        </w:rPr>
-        <w:t>Consistencia visual y funcional:</w:t>
-      </w:r>
-      <w:r>
+          <w:szCs w:val="20"/>
+        </w:rPr>
+      </w:pPr>
+      <w:r>
+        <w:rPr>
+          <w:szCs w:val="20"/>
+        </w:rPr>
+        <w:t>El diagrama muestra los casos de uso del sistema "Blog de Películas y Series", organizando las funcionalidades según cuatro tipos de usuarios: visitante, registrado, premium y administrador.</w:t>
+      </w:r>
+      <w:r>
+        <w:rPr>
+          <w:szCs w:val="20"/>
+        </w:rPr>
         <w:br/>
-        <w:t xml:space="preserve">Todos los elementos interactivos mantendrán un diseño coherente en todas las páginas. La navegación principal (Inicio, Películas, Series, </w:t>
-      </w:r>
-      <w:proofErr w:type="spellStart"/>
-      <w:r>
-        <w:t>Login</w:t>
-      </w:r>
-      <w:proofErr w:type="spellEnd"/>
-      <w:r>
-        <w:t>/</w:t>
-      </w:r>
-      <w:proofErr w:type="spellStart"/>
-      <w:r>
-        <w:t>Logout</w:t>
-      </w:r>
-      <w:proofErr w:type="spellEnd"/>
-      <w:r>
-        <w:t>) será uniforme y siempre visible.</w:t>
-      </w:r>
-    </w:p>
-    <w:p>
-      <w:pPr>
-        <w:numPr>
-          <w:ilvl w:val="0"/>
-          <w:numId w:val="29"/>
-        </w:numPr>
-      </w:pPr>
-      <w:r>
-        <w:rPr>
-          <w:b/>
-          <w:bCs/>
-        </w:rPr>
-        <w:t>Claridad en la interacción:</w:t>
-      </w:r>
-      <w:r>
+        <w:t>Un usuario visitante puede registrarse, iniciar sesión, ver la lista de películas y series y consultar el top 5 de contenidos mejor valorados.</w:t>
+      </w:r>
+      <w:r>
+        <w:rPr>
+          <w:szCs w:val="20"/>
+        </w:rPr>
         <w:br/>
-        <w:t>Los botones y acciones estarán claramente etiquetados. Se priorizará el uso de texto acompañado de iconos para evitar ambigüedades.</w:t>
-      </w:r>
-    </w:p>
-    <w:p>
-      <w:pPr>
-        <w:numPr>
-          <w:ilvl w:val="0"/>
-          <w:numId w:val="29"/>
-        </w:numPr>
-      </w:pPr>
-      <w:r>
-        <w:rPr>
-          <w:b/>
-          <w:bCs/>
-        </w:rPr>
-        <w:t>Retroalimentación inmediata:</w:t>
-      </w:r>
-      <w:r>
+        <w:t>Una vez registrado e identificado, el usuario registrado puede realizar todas las acciones del visitante, y además puede consultar los detalles de los contenidos, valorar películas y series, escribir comentarios, editar su perfil, suscribirse como usuario premium y cerrar sesión.</w:t>
+      </w:r>
+      <w:r>
+        <w:rPr>
+          <w:szCs w:val="20"/>
+        </w:rPr>
         <w:br/>
-        <w:t>El sistema ofrecerá mensajes o señales visuales (como animaciones o alertas) al realizar acciones como valorar una serie, seguir una película o guardar un cambio en una lista.</w:t>
-      </w:r>
-    </w:p>
-    <w:p>
-      <w:pPr>
-        <w:numPr>
-          <w:ilvl w:val="0"/>
-          <w:numId w:val="29"/>
-        </w:numPr>
-      </w:pPr>
+        <w:t>El usuario premium hereda todas las funciones del usuario registrado y tiene acceso a funciones exclusivas, como anular su suscripción premium.</w:t>
+      </w:r>
+      <w:r>
+        <w:rPr>
+          <w:szCs w:val="20"/>
+        </w:rPr>
+        <w:br/>
+        <w:t>Por otro lado, el administrador tiene permisos completos sobre el sistema. Puede aprobar o eliminar contenido, gestionar usuarios, eliminar comentarios, modificar fichas de contenido y también cerrar sesión.</w:t>
+      </w:r>
+      <w:r>
+        <w:rPr>
+          <w:szCs w:val="20"/>
+        </w:rPr>
+        <w:br/>
+        <w:t xml:space="preserve">Este sistema organiza los accesos de forma jerárquica, permitiendo que los usuarios ganen funcionalidades a medida que avanzan en el tipo de cuenta que poseen, </w:t>
+      </w:r>
       <w:r>
         <w:rPr>
           <w:noProof/>
@@ -3318,13 +3246,13 @@
         <mc:AlternateContent>
           <mc:Choice Requires="wps">
             <w:drawing>
-              <wp:anchor distT="0" distB="0" distL="114300" distR="114300" simplePos="0" relativeHeight="251691008" behindDoc="1" locked="1" layoutInCell="1" allowOverlap="1" wp14:anchorId="58A61D6F" wp14:editId="50034B33">
+              <wp:anchor distT="0" distB="0" distL="114300" distR="114300" simplePos="0" relativeHeight="251703296" behindDoc="1" locked="1" layoutInCell="1" allowOverlap="1" wp14:anchorId="5C6E6B79" wp14:editId="45009F93">
                 <wp:simplePos x="0" y="0"/>
                 <wp:positionH relativeFrom="page">
                   <wp:align>left</wp:align>
                 </wp:positionH>
                 <wp:positionV relativeFrom="paragraph">
-                  <wp:posOffset>-5059045</wp:posOffset>
+                  <wp:posOffset>-629920</wp:posOffset>
                 </wp:positionV>
                 <wp:extent cx="1323975" cy="10828020"/>
                 <wp:effectExtent l="0" t="0" r="9525" b="0"/>
@@ -3411,7 +3339,7 @@
           </mc:Choice>
           <mc:Fallback>
             <w:pict>
-              <v:rect w14:anchorId="58A61D6F" id="_x0000_s1035" alt="&quot;&quot;" style="position:absolute;left:0;text-align:left;margin-left:0;margin-top:-398.35pt;width:104.25pt;height:852.6pt;z-index:-251625472;visibility:visible;mso-wrap-style:square;mso-width-percent:0;mso-height-percent:0;mso-wrap-distance-left:9pt;mso-wrap-distance-top:0;mso-wrap-distance-right:9pt;mso-wrap-distance-bottom:0;mso-position-horizontal:left;mso-position-horizontal-relative:page;mso-position-vertical:absolute;mso-position-vertical-relative:text;mso-width-percent:0;mso-height-percent:0;mso-width-relative:margin;mso-height-relative:margin;v-text-anchor:bottom" o:gfxdata="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" fillcolor="#404040 [2429]" stroked="f" strokeweight="1pt">
+              <v:rect w14:anchorId="5C6E6B79" id="_x0000_s1035" alt="&quot;&quot;" style="position:absolute;margin-left:0;margin-top:-49.6pt;width:104.25pt;height:852.6pt;z-index:-251613184;visibility:visible;mso-wrap-style:square;mso-width-percent:0;mso-height-percent:0;mso-wrap-distance-left:9pt;mso-wrap-distance-top:0;mso-wrap-distance-right:9pt;mso-wrap-distance-bottom:0;mso-position-horizontal:left;mso-position-horizontal-relative:page;mso-position-vertical:absolute;mso-position-vertical-relative:text;mso-width-percent:0;mso-height-percent:0;mso-width-relative:margin;mso-height-relative:margin;v-text-anchor:bottom" o:gfxdata="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" fillcolor="#404040 [2429]" stroked="f" strokeweight="1pt">
                 <v:textbox>
                   <w:txbxContent>
                     <w:p>
@@ -3437,14 +3365,1010 @@
       </w:r>
       <w:r>
         <w:rPr>
-          <w:b/>
-          <w:bCs/>
-        </w:rPr>
-        <w:t>Prevención y recuperación de errores:</w:t>
-      </w:r>
-      <w:r>
-        <w:br/>
-        <w:t>Se implementarán validaciones en formularios y confirmaciones para acciones irreversibles (por ejemplo, eliminar contenido de una lista).</w:t>
+          <w:szCs w:val="20"/>
+        </w:rPr>
+        <w:t>mientras que el administrador posee control total sobre la plataforma.</w:t>
+      </w:r>
+    </w:p>
+    <w:tbl>
+      <w:tblPr>
+        <w:tblStyle w:val="Tablageneral"/>
+        <w:tblW w:w="8129" w:type="dxa"/>
+        <w:tblLayout w:type="fixed"/>
+        <w:tblCellMar>
+          <w:right w:w="0" w:type="dxa"/>
+        </w:tblCellMar>
+        <w:tblLook w:val="0620" w:firstRow="1" w:lastRow="0" w:firstColumn="0" w:lastColumn="0" w:noHBand="1" w:noVBand="1"/>
+      </w:tblPr>
+      <w:tblGrid>
+        <w:gridCol w:w="8129"/>
+      </w:tblGrid>
+      <w:tr>
+        <w:trPr>
+          <w:cnfStyle w:val="100000000000" w:firstRow="1" w:lastRow="0" w:firstColumn="0" w:lastColumn="0" w:oddVBand="0" w:evenVBand="0" w:oddHBand="0" w:evenHBand="0" w:firstRowFirstColumn="0" w:firstRowLastColumn="0" w:lastRowFirstColumn="0" w:lastRowLastColumn="0"/>
+          <w:trHeight w:hRule="exact" w:val="62"/>
+        </w:trPr>
+        <w:tc>
+          <w:tcPr>
+            <w:tcW w:w="8129" w:type="dxa"/>
+            <w:tcBorders>
+              <w:top w:val="single" w:sz="8" w:space="0" w:color="C9C9C9" w:themeColor="text2" w:themeTint="40"/>
+            </w:tcBorders>
+            <w:vAlign w:val="center"/>
+          </w:tcPr>
+          <w:p>
+            <w:pPr>
+              <w:pStyle w:val="Ttulo2"/>
+            </w:pPr>
+          </w:p>
+        </w:tc>
+      </w:tr>
+    </w:tbl>
+    <w:p>
+      <w:pPr>
+        <w:spacing w:before="0" w:after="200" w:line="312" w:lineRule="auto"/>
+        <w:rPr>
+          <w:b/>
+          <w:bCs/>
+          <w:sz w:val="28"/>
+          <w:szCs w:val="28"/>
+        </w:rPr>
+      </w:pPr>
+      <w:r>
+        <w:rPr>
+          <w:b/>
+          <w:bCs/>
+          <w:sz w:val="28"/>
+          <w:szCs w:val="28"/>
+        </w:rPr>
+        <w:t>GUÍA DE ESTILO DEL INTERFAZ:</w:t>
+      </w:r>
+    </w:p>
+    <w:p>
+      <w:pPr>
+        <w:rPr>
+          <w:b/>
+          <w:bCs/>
+          <w:sz w:val="28"/>
+          <w:szCs w:val="28"/>
+          <w:u w:val="single"/>
+        </w:rPr>
+      </w:pPr>
+      <w:r>
+        <w:rPr>
+          <w:b/>
+          <w:bCs/>
+          <w:sz w:val="28"/>
+          <w:szCs w:val="28"/>
+          <w:u w:val="single"/>
+        </w:rPr>
+        <w:t xml:space="preserve">Diseño del </w:t>
+      </w:r>
+      <w:proofErr w:type="spellStart"/>
+      <w:r>
+        <w:rPr>
+          <w:b/>
+          <w:bCs/>
+          <w:sz w:val="28"/>
+          <w:szCs w:val="28"/>
+          <w:u w:val="single"/>
+        </w:rPr>
+        <w:t>frontend</w:t>
+      </w:r>
+      <w:proofErr w:type="spellEnd"/>
+      <w:r>
+        <w:rPr>
+          <w:b/>
+          <w:bCs/>
+          <w:sz w:val="28"/>
+          <w:szCs w:val="28"/>
+          <w:u w:val="single"/>
+        </w:rPr>
+        <w:t>:</w:t>
+      </w:r>
+    </w:p>
+    <w:p>
+      <w:pPr>
+        <w:ind w:left="142"/>
+        <w:rPr>
+          <w:b/>
+          <w:bCs/>
+          <w:sz w:val="24"/>
+        </w:rPr>
+      </w:pPr>
+      <w:r>
+        <w:rPr>
+          <w:b/>
+          <w:bCs/>
+          <w:sz w:val="24"/>
+        </w:rPr>
+        <w:t>Página Principal:</w:t>
+      </w:r>
+    </w:p>
+    <w:p>
+      <w:pPr>
+        <w:spacing w:before="0" w:after="200" w:line="312" w:lineRule="auto"/>
+        <w:rPr>
+          <w:b/>
+          <w:bCs/>
+          <w:sz w:val="28"/>
+          <w:szCs w:val="28"/>
+        </w:rPr>
+      </w:pPr>
+      <w:r>
+        <w:rPr>
+          <w:b/>
+          <w:bCs/>
+          <w:sz w:val="28"/>
+          <w:szCs w:val="28"/>
+        </w:rPr>
+        <w:drawing>
+          <wp:anchor distT="0" distB="0" distL="114300" distR="114300" simplePos="0" relativeHeight="251704320" behindDoc="0" locked="0" layoutInCell="1" allowOverlap="1" wp14:anchorId="64413398" wp14:editId="1D70E2D7">
+            <wp:simplePos x="0" y="0"/>
+            <wp:positionH relativeFrom="column">
+              <wp:posOffset>-267970</wp:posOffset>
+            </wp:positionH>
+            <wp:positionV relativeFrom="paragraph">
+              <wp:posOffset>180340</wp:posOffset>
+            </wp:positionV>
+            <wp:extent cx="2490470" cy="5059045"/>
+            <wp:effectExtent l="0" t="0" r="5080" b="8255"/>
+            <wp:wrapNone/>
+            <wp:docPr id="1821736001" name="Imagen 1" descr="Pantalla de un video juego&#10;&#10;El contenido generado por IA puede ser incorrecto."/>
+            <wp:cNvGraphicFramePr>
+              <a:graphicFrameLocks xmlns:a="http://schemas.openxmlformats.org/drawingml/2006/main" noChangeAspect="1"/>
+            </wp:cNvGraphicFramePr>
+            <a:graphic xmlns:a="http://schemas.openxmlformats.org/drawingml/2006/main">
+              <a:graphicData uri="http://schemas.openxmlformats.org/drawingml/2006/picture">
+                <pic:pic xmlns:pic="http://schemas.openxmlformats.org/drawingml/2006/picture">
+                  <pic:nvPicPr>
+                    <pic:cNvPr id="1821736001" name="Imagen 1" descr="Pantalla de un video juego&#10;&#10;El contenido generado por IA puede ser incorrecto."/>
+                    <pic:cNvPicPr/>
+                  </pic:nvPicPr>
+                  <pic:blipFill>
+                    <a:blip r:embed="rId16">
+                      <a:extLst>
+                        <a:ext uri="{28A0092B-C50C-407E-A947-70E740481C1C}">
+                          <a14:useLocalDpi xmlns:a14="http://schemas.microsoft.com/office/drawing/2010/main" val="0"/>
+                        </a:ext>
+                      </a:extLst>
+                    </a:blip>
+                    <a:stretch>
+                      <a:fillRect/>
+                    </a:stretch>
+                  </pic:blipFill>
+                  <pic:spPr>
+                    <a:xfrm>
+                      <a:off x="0" y="0"/>
+                      <a:ext cx="2490470" cy="5059045"/>
+                    </a:xfrm>
+                    <a:prstGeom prst="rect">
+                      <a:avLst/>
+                    </a:prstGeom>
+                  </pic:spPr>
+                </pic:pic>
+              </a:graphicData>
+            </a:graphic>
+            <wp14:sizeRelH relativeFrom="margin">
+              <wp14:pctWidth>0</wp14:pctWidth>
+            </wp14:sizeRelH>
+            <wp14:sizeRelV relativeFrom="margin">
+              <wp14:pctHeight>0</wp14:pctHeight>
+            </wp14:sizeRelV>
+          </wp:anchor>
+        </w:drawing>
+      </w:r>
+    </w:p>
+    <w:p>
+      <w:pPr>
+        <w:spacing w:before="0" w:after="200" w:line="312" w:lineRule="auto"/>
+        <w:rPr>
+          <w:b/>
+          <w:bCs/>
+          <w:sz w:val="28"/>
+          <w:szCs w:val="28"/>
+        </w:rPr>
+      </w:pPr>
+    </w:p>
+    <w:p>
+      <w:pPr>
+        <w:spacing w:before="0" w:after="200" w:line="312" w:lineRule="auto"/>
+        <w:rPr>
+          <w:b/>
+          <w:bCs/>
+          <w:sz w:val="28"/>
+          <w:szCs w:val="28"/>
+        </w:rPr>
+      </w:pPr>
+    </w:p>
+    <w:p>
+      <w:pPr>
+        <w:spacing w:before="0" w:after="200" w:line="312" w:lineRule="auto"/>
+        <w:rPr>
+          <w:b/>
+          <w:bCs/>
+          <w:sz w:val="28"/>
+          <w:szCs w:val="28"/>
+        </w:rPr>
+      </w:pPr>
+    </w:p>
+    <w:p>
+      <w:pPr>
+        <w:spacing w:before="0" w:after="200" w:line="312" w:lineRule="auto"/>
+        <w:rPr>
+          <w:b/>
+          <w:bCs/>
+          <w:sz w:val="28"/>
+          <w:szCs w:val="28"/>
+        </w:rPr>
+      </w:pPr>
+    </w:p>
+    <w:p>
+      <w:pPr>
+        <w:spacing w:before="0" w:after="200" w:line="312" w:lineRule="auto"/>
+        <w:rPr>
+          <w:b/>
+          <w:bCs/>
+          <w:sz w:val="28"/>
+          <w:szCs w:val="28"/>
+        </w:rPr>
+      </w:pPr>
+    </w:p>
+    <w:p>
+      <w:pPr>
+        <w:spacing w:before="0" w:after="200" w:line="312" w:lineRule="auto"/>
+        <w:rPr>
+          <w:b/>
+          <w:bCs/>
+          <w:sz w:val="28"/>
+          <w:szCs w:val="28"/>
+        </w:rPr>
+      </w:pPr>
+    </w:p>
+    <w:p>
+      <w:pPr>
+        <w:spacing w:before="0" w:after="200" w:line="312" w:lineRule="auto"/>
+        <w:rPr>
+          <w:b/>
+          <w:bCs/>
+          <w:sz w:val="28"/>
+          <w:szCs w:val="28"/>
+        </w:rPr>
+      </w:pPr>
+    </w:p>
+    <w:p>
+      <w:pPr>
+        <w:spacing w:before="0" w:after="200" w:line="312" w:lineRule="auto"/>
+        <w:rPr>
+          <w:b/>
+          <w:bCs/>
+          <w:sz w:val="28"/>
+          <w:szCs w:val="28"/>
+        </w:rPr>
+      </w:pPr>
+    </w:p>
+    <w:p>
+      <w:pPr>
+        <w:spacing w:before="0" w:after="200" w:line="312" w:lineRule="auto"/>
+        <w:rPr>
+          <w:b/>
+          <w:bCs/>
+          <w:sz w:val="28"/>
+          <w:szCs w:val="28"/>
+        </w:rPr>
+      </w:pPr>
+    </w:p>
+    <w:p>
+      <w:pPr>
+        <w:spacing w:before="0" w:after="200" w:line="312" w:lineRule="auto"/>
+        <w:rPr>
+          <w:b/>
+          <w:bCs/>
+          <w:sz w:val="28"/>
+          <w:szCs w:val="28"/>
+        </w:rPr>
+      </w:pPr>
+    </w:p>
+    <w:p>
+      <w:pPr>
+        <w:spacing w:before="0" w:after="200" w:line="312" w:lineRule="auto"/>
+        <w:rPr>
+          <w:b/>
+          <w:bCs/>
+          <w:sz w:val="24"/>
+        </w:rPr>
+      </w:pPr>
+      <w:r>
+        <w:rPr>
+          <w:b/>
+          <w:bCs/>
+          <w:sz w:val="24"/>
+        </w:rPr>
+        <w:lastRenderedPageBreak/>
+        <w:t>Página de películas y series</w:t>
+      </w:r>
+    </w:p>
+    <w:p>
+      <w:pPr>
+        <w:spacing w:before="0" w:after="200" w:line="312" w:lineRule="auto"/>
+        <w:rPr>
+          <w:b/>
+          <w:bCs/>
+          <w:sz w:val="28"/>
+          <w:szCs w:val="28"/>
+        </w:rPr>
+      </w:pPr>
+      <w:r>
+        <w:rPr>
+          <w:b/>
+          <w:bCs/>
+          <w:sz w:val="28"/>
+          <w:szCs w:val="28"/>
+        </w:rPr>
+        <w:drawing>
+          <wp:inline distT="0" distB="0" distL="0" distR="0" wp14:anchorId="57FCF02D" wp14:editId="1D96D6A6">
+            <wp:extent cx="4430110" cy="2409198"/>
+            <wp:effectExtent l="0" t="0" r="8890" b="0"/>
+            <wp:docPr id="2145335911" name="Imagen 1" descr="Pantalla de juego de computadora&#10;&#10;El contenido generado por IA puede ser incorrecto."/>
+            <wp:cNvGraphicFramePr>
+              <a:graphicFrameLocks xmlns:a="http://schemas.openxmlformats.org/drawingml/2006/main" noChangeAspect="1"/>
+            </wp:cNvGraphicFramePr>
+            <a:graphic xmlns:a="http://schemas.openxmlformats.org/drawingml/2006/main">
+              <a:graphicData uri="http://schemas.openxmlformats.org/drawingml/2006/picture">
+                <pic:pic xmlns:pic="http://schemas.openxmlformats.org/drawingml/2006/picture">
+                  <pic:nvPicPr>
+                    <pic:cNvPr id="2145335911" name="Imagen 1" descr="Pantalla de juego de computadora&#10;&#10;El contenido generado por IA puede ser incorrecto."/>
+                    <pic:cNvPicPr/>
+                  </pic:nvPicPr>
+                  <pic:blipFill>
+                    <a:blip r:embed="rId17"/>
+                    <a:stretch>
+                      <a:fillRect/>
+                    </a:stretch>
+                  </pic:blipFill>
+                  <pic:spPr>
+                    <a:xfrm>
+                      <a:off x="0" y="0"/>
+                      <a:ext cx="4460047" cy="2425479"/>
+                    </a:xfrm>
+                    <a:prstGeom prst="rect">
+                      <a:avLst/>
+                    </a:prstGeom>
+                  </pic:spPr>
+                </pic:pic>
+              </a:graphicData>
+            </a:graphic>
+          </wp:inline>
+        </w:drawing>
+      </w:r>
+    </w:p>
+    <w:p>
+      <w:pPr>
+        <w:spacing w:before="0" w:after="200" w:line="312" w:lineRule="auto"/>
+        <w:rPr>
+          <w:b/>
+          <w:bCs/>
+          <w:sz w:val="24"/>
+        </w:rPr>
+      </w:pPr>
+      <w:proofErr w:type="spellStart"/>
+      <w:r>
+        <w:rPr>
+          <w:b/>
+          <w:bCs/>
+          <w:sz w:val="24"/>
+        </w:rPr>
+        <w:t>Info</w:t>
+      </w:r>
+      <w:proofErr w:type="spellEnd"/>
+      <w:r>
+        <w:rPr>
+          <w:b/>
+          <w:bCs/>
+          <w:sz w:val="24"/>
+        </w:rPr>
+        <w:t xml:space="preserve"> de cada </w:t>
+      </w:r>
+      <w:r>
+        <w:rPr>
+          <w:b/>
+          <w:bCs/>
+          <w:sz w:val="24"/>
+        </w:rPr>
+        <w:t>película/serie</w:t>
+      </w:r>
+      <w:r>
+        <w:rPr>
+          <w:b/>
+          <w:bCs/>
+          <w:sz w:val="24"/>
+        </w:rPr>
+        <w:t>:</w:t>
+      </w:r>
+    </w:p>
+    <w:p>
+      <w:pPr>
+        <w:spacing w:before="0" w:after="200" w:line="312" w:lineRule="auto"/>
+        <w:rPr>
+          <w:b/>
+          <w:bCs/>
+          <w:sz w:val="28"/>
+          <w:szCs w:val="28"/>
+        </w:rPr>
+      </w:pPr>
+      <w:r>
+        <w:rPr>
+          <w:b/>
+          <w:bCs/>
+          <w:sz w:val="28"/>
+          <w:szCs w:val="28"/>
+        </w:rPr>
+        <w:drawing>
+          <wp:inline distT="0" distB="0" distL="0" distR="0" wp14:anchorId="69426557" wp14:editId="63AA4A05">
+            <wp:extent cx="2459421" cy="5507101"/>
+            <wp:effectExtent l="0" t="0" r="0" b="0"/>
+            <wp:docPr id="682179403" name="Imagen 1" descr="Pantalla de computadora&#10;&#10;El contenido generado por IA puede ser incorrecto."/>
+            <wp:cNvGraphicFramePr>
+              <a:graphicFrameLocks xmlns:a="http://schemas.openxmlformats.org/drawingml/2006/main" noChangeAspect="1"/>
+            </wp:cNvGraphicFramePr>
+            <a:graphic xmlns:a="http://schemas.openxmlformats.org/drawingml/2006/main">
+              <a:graphicData uri="http://schemas.openxmlformats.org/drawingml/2006/picture">
+                <pic:pic xmlns:pic="http://schemas.openxmlformats.org/drawingml/2006/picture">
+                  <pic:nvPicPr>
+                    <pic:cNvPr id="682179403" name="Imagen 1" descr="Pantalla de computadora&#10;&#10;El contenido generado por IA puede ser incorrecto."/>
+                    <pic:cNvPicPr/>
+                  </pic:nvPicPr>
+                  <pic:blipFill>
+                    <a:blip r:embed="rId18"/>
+                    <a:stretch>
+                      <a:fillRect/>
+                    </a:stretch>
+                  </pic:blipFill>
+                  <pic:spPr>
+                    <a:xfrm>
+                      <a:off x="0" y="0"/>
+                      <a:ext cx="2474524" cy="5540919"/>
+                    </a:xfrm>
+                    <a:prstGeom prst="rect">
+                      <a:avLst/>
+                    </a:prstGeom>
+                  </pic:spPr>
+                </pic:pic>
+              </a:graphicData>
+            </a:graphic>
+          </wp:inline>
+        </w:drawing>
+      </w:r>
+    </w:p>
+    <w:p>
+      <w:pPr>
+        <w:spacing w:before="0" w:after="200" w:line="312" w:lineRule="auto"/>
+        <w:rPr>
+          <w:b/>
+          <w:bCs/>
+          <w:sz w:val="24"/>
+        </w:rPr>
+      </w:pPr>
+      <w:r>
+        <w:rPr>
+          <w:b/>
+          <w:bCs/>
+          <w:sz w:val="24"/>
+        </w:rPr>
+        <w:lastRenderedPageBreak/>
+        <w:t>Página Noticias:</w:t>
+      </w:r>
+    </w:p>
+    <w:p>
+      <w:pPr>
+        <w:spacing w:before="0" w:after="200" w:line="312" w:lineRule="auto"/>
+        <w:rPr>
+          <w:b/>
+          <w:bCs/>
+          <w:sz w:val="28"/>
+          <w:szCs w:val="28"/>
+        </w:rPr>
+      </w:pPr>
+      <w:r>
+        <w:rPr>
+          <w:b/>
+          <w:bCs/>
+          <w:sz w:val="28"/>
+          <w:szCs w:val="28"/>
+        </w:rPr>
+        <w:drawing>
+          <wp:inline distT="0" distB="0" distL="0" distR="0" wp14:anchorId="2CE02763" wp14:editId="6102989F">
+            <wp:extent cx="2341586" cy="5990897"/>
+            <wp:effectExtent l="0" t="0" r="1905" b="0"/>
+            <wp:docPr id="1035708748" name="Imagen 1" descr="Interfaz de usuario gráfica, Sitio web&#10;&#10;El contenido generado por IA puede ser incorrecto."/>
+            <wp:cNvGraphicFramePr>
+              <a:graphicFrameLocks xmlns:a="http://schemas.openxmlformats.org/drawingml/2006/main" noChangeAspect="1"/>
+            </wp:cNvGraphicFramePr>
+            <a:graphic xmlns:a="http://schemas.openxmlformats.org/drawingml/2006/main">
+              <a:graphicData uri="http://schemas.openxmlformats.org/drawingml/2006/picture">
+                <pic:pic xmlns:pic="http://schemas.openxmlformats.org/drawingml/2006/picture">
+                  <pic:nvPicPr>
+                    <pic:cNvPr id="1035708748" name="Imagen 1" descr="Interfaz de usuario gráfica, Sitio web&#10;&#10;El contenido generado por IA puede ser incorrecto."/>
+                    <pic:cNvPicPr/>
+                  </pic:nvPicPr>
+                  <pic:blipFill>
+                    <a:blip r:embed="rId19"/>
+                    <a:stretch>
+                      <a:fillRect/>
+                    </a:stretch>
+                  </pic:blipFill>
+                  <pic:spPr>
+                    <a:xfrm>
+                      <a:off x="0" y="0"/>
+                      <a:ext cx="2357888" cy="6032606"/>
+                    </a:xfrm>
+                    <a:prstGeom prst="rect">
+                      <a:avLst/>
+                    </a:prstGeom>
+                  </pic:spPr>
+                </pic:pic>
+              </a:graphicData>
+            </a:graphic>
+          </wp:inline>
+        </w:drawing>
+      </w:r>
+    </w:p>
+    <w:p>
+      <w:pPr>
+        <w:spacing w:before="0" w:after="200" w:line="312" w:lineRule="auto"/>
+        <w:rPr>
+          <w:b/>
+          <w:bCs/>
+          <w:sz w:val="24"/>
+        </w:rPr>
+      </w:pPr>
+      <w:r>
+        <w:rPr>
+          <w:b/>
+          <w:bCs/>
+          <w:sz w:val="24"/>
+        </w:rPr>
+        <w:t>Filtrados de noticias:</w:t>
+      </w:r>
+    </w:p>
+    <w:p>
+      <w:pPr>
+        <w:spacing w:before="0" w:after="200" w:line="312" w:lineRule="auto"/>
+        <w:rPr>
+          <w:b/>
+          <w:bCs/>
+          <w:sz w:val="28"/>
+          <w:szCs w:val="28"/>
+        </w:rPr>
+      </w:pPr>
+      <w:r>
+        <w:rPr>
+          <w:b/>
+          <w:bCs/>
+          <w:sz w:val="28"/>
+          <w:szCs w:val="28"/>
+        </w:rPr>
+        <w:drawing>
+          <wp:inline distT="0" distB="0" distL="0" distR="0" wp14:anchorId="3A050F1A" wp14:editId="65A436AB">
+            <wp:extent cx="5297214" cy="1987252"/>
+            <wp:effectExtent l="0" t="0" r="0" b="0"/>
+            <wp:docPr id="1249468299" name="Imagen 1" descr="Pantalla de un video juego&#10;&#10;El contenido generado por IA puede ser incorrecto."/>
+            <wp:cNvGraphicFramePr>
+              <a:graphicFrameLocks xmlns:a="http://schemas.openxmlformats.org/drawingml/2006/main" noChangeAspect="1"/>
+            </wp:cNvGraphicFramePr>
+            <a:graphic xmlns:a="http://schemas.openxmlformats.org/drawingml/2006/main">
+              <a:graphicData uri="http://schemas.openxmlformats.org/drawingml/2006/picture">
+                <pic:pic xmlns:pic="http://schemas.openxmlformats.org/drawingml/2006/picture">
+                  <pic:nvPicPr>
+                    <pic:cNvPr id="1249468299" name="Imagen 1" descr="Pantalla de un video juego&#10;&#10;El contenido generado por IA puede ser incorrecto."/>
+                    <pic:cNvPicPr/>
+                  </pic:nvPicPr>
+                  <pic:blipFill>
+                    <a:blip r:embed="rId20"/>
+                    <a:stretch>
+                      <a:fillRect/>
+                    </a:stretch>
+                  </pic:blipFill>
+                  <pic:spPr>
+                    <a:xfrm>
+                      <a:off x="0" y="0"/>
+                      <a:ext cx="5349701" cy="2006942"/>
+                    </a:xfrm>
+                    <a:prstGeom prst="rect">
+                      <a:avLst/>
+                    </a:prstGeom>
+                  </pic:spPr>
+                </pic:pic>
+              </a:graphicData>
+            </a:graphic>
+          </wp:inline>
+        </w:drawing>
+      </w:r>
+    </w:p>
+    <w:p>
+      <w:pPr>
+        <w:spacing w:before="0" w:after="200" w:line="312" w:lineRule="auto"/>
+        <w:rPr>
+          <w:b/>
+          <w:bCs/>
+          <w:sz w:val="24"/>
+        </w:rPr>
+      </w:pPr>
+      <w:r>
+        <w:rPr>
+          <w:b/>
+          <w:bCs/>
+          <w:sz w:val="24"/>
+        </w:rPr>
+        <w:lastRenderedPageBreak/>
+        <w:t>Página de información sobre el premium:</w:t>
+      </w:r>
+    </w:p>
+    <w:p>
+      <w:pPr>
+        <w:spacing w:before="0" w:after="200" w:line="312" w:lineRule="auto"/>
+        <w:rPr>
+          <w:b/>
+          <w:bCs/>
+          <w:sz w:val="28"/>
+          <w:szCs w:val="28"/>
+        </w:rPr>
+      </w:pPr>
+      <w:r>
+        <w:rPr>
+          <w:b/>
+          <w:bCs/>
+          <w:sz w:val="28"/>
+          <w:szCs w:val="28"/>
+        </w:rPr>
+        <w:drawing>
+          <wp:inline distT="0" distB="0" distL="0" distR="0" wp14:anchorId="4198A5C7" wp14:editId="1DEA25D6">
+            <wp:extent cx="3124636" cy="7725853"/>
+            <wp:effectExtent l="0" t="0" r="0" b="8890"/>
+            <wp:docPr id="1020444224" name="Imagen 1" descr="Interfaz de usuario gráfica&#10;&#10;El contenido generado por IA puede ser incorrecto."/>
+            <wp:cNvGraphicFramePr>
+              <a:graphicFrameLocks xmlns:a="http://schemas.openxmlformats.org/drawingml/2006/main" noChangeAspect="1"/>
+            </wp:cNvGraphicFramePr>
+            <a:graphic xmlns:a="http://schemas.openxmlformats.org/drawingml/2006/main">
+              <a:graphicData uri="http://schemas.openxmlformats.org/drawingml/2006/picture">
+                <pic:pic xmlns:pic="http://schemas.openxmlformats.org/drawingml/2006/picture">
+                  <pic:nvPicPr>
+                    <pic:cNvPr id="1020444224" name="Imagen 1" descr="Interfaz de usuario gráfica&#10;&#10;El contenido generado por IA puede ser incorrecto."/>
+                    <pic:cNvPicPr/>
+                  </pic:nvPicPr>
+                  <pic:blipFill>
+                    <a:blip r:embed="rId21"/>
+                    <a:stretch>
+                      <a:fillRect/>
+                    </a:stretch>
+                  </pic:blipFill>
+                  <pic:spPr>
+                    <a:xfrm>
+                      <a:off x="0" y="0"/>
+                      <a:ext cx="3124636" cy="7725853"/>
+                    </a:xfrm>
+                    <a:prstGeom prst="rect">
+                      <a:avLst/>
+                    </a:prstGeom>
+                  </pic:spPr>
+                </pic:pic>
+              </a:graphicData>
+            </a:graphic>
+          </wp:inline>
+        </w:drawing>
+      </w:r>
+    </w:p>
+    <w:p>
+      <w:pPr>
+        <w:spacing w:before="0" w:after="200" w:line="312" w:lineRule="auto"/>
+        <w:rPr>
+          <w:b/>
+          <w:bCs/>
+          <w:sz w:val="28"/>
+          <w:szCs w:val="28"/>
+        </w:rPr>
+      </w:pPr>
+    </w:p>
+    <w:p>
+      <w:pPr>
+        <w:spacing w:before="0" w:after="200" w:line="312" w:lineRule="auto"/>
+        <w:rPr>
+          <w:b/>
+          <w:bCs/>
+          <w:sz w:val="28"/>
+          <w:szCs w:val="28"/>
+        </w:rPr>
+      </w:pPr>
+    </w:p>
+    <w:p>
+      <w:pPr>
+        <w:spacing w:before="0" w:after="200" w:line="312" w:lineRule="auto"/>
+        <w:rPr>
+          <w:b/>
+          <w:bCs/>
+          <w:sz w:val="24"/>
+        </w:rPr>
+      </w:pPr>
+      <w:r>
+        <w:rPr>
+          <w:b/>
+          <w:bCs/>
+          <w:sz w:val="24"/>
+        </w:rPr>
+        <w:lastRenderedPageBreak/>
+        <w:t xml:space="preserve">Página de </w:t>
+      </w:r>
+      <w:proofErr w:type="spellStart"/>
+      <w:r>
+        <w:rPr>
+          <w:b/>
+          <w:bCs/>
+          <w:sz w:val="24"/>
+        </w:rPr>
+        <w:t>Login</w:t>
+      </w:r>
+      <w:proofErr w:type="spellEnd"/>
+      <w:r>
+        <w:rPr>
+          <w:b/>
+          <w:bCs/>
+          <w:sz w:val="24"/>
+        </w:rPr>
+        <w:t>:</w:t>
+      </w:r>
+    </w:p>
+    <w:p>
+      <w:pPr>
+        <w:spacing w:before="0" w:after="200" w:line="312" w:lineRule="auto"/>
+        <w:rPr>
+          <w:b/>
+          <w:bCs/>
+          <w:sz w:val="28"/>
+          <w:szCs w:val="28"/>
+        </w:rPr>
+      </w:pPr>
+      <w:r>
+        <w:rPr>
+          <w:b/>
+          <w:bCs/>
+          <w:sz w:val="28"/>
+          <w:szCs w:val="28"/>
+        </w:rPr>
+        <w:drawing>
+          <wp:inline distT="0" distB="0" distL="0" distR="0" wp14:anchorId="79573A8D" wp14:editId="7DB47FC0">
+            <wp:extent cx="5274310" cy="3411855"/>
+            <wp:effectExtent l="0" t="0" r="2540" b="0"/>
+            <wp:docPr id="60230140" name="Imagen 1" descr="Interfaz de usuario gráfica, Sitio web&#10;&#10;El contenido generado por IA puede ser incorrecto."/>
+            <wp:cNvGraphicFramePr>
+              <a:graphicFrameLocks xmlns:a="http://schemas.openxmlformats.org/drawingml/2006/main" noChangeAspect="1"/>
+            </wp:cNvGraphicFramePr>
+            <a:graphic xmlns:a="http://schemas.openxmlformats.org/drawingml/2006/main">
+              <a:graphicData uri="http://schemas.openxmlformats.org/drawingml/2006/picture">
+                <pic:pic xmlns:pic="http://schemas.openxmlformats.org/drawingml/2006/picture">
+                  <pic:nvPicPr>
+                    <pic:cNvPr id="60230140" name="Imagen 1" descr="Interfaz de usuario gráfica, Sitio web&#10;&#10;El contenido generado por IA puede ser incorrecto."/>
+                    <pic:cNvPicPr/>
+                  </pic:nvPicPr>
+                  <pic:blipFill>
+                    <a:blip r:embed="rId22"/>
+                    <a:stretch>
+                      <a:fillRect/>
+                    </a:stretch>
+                  </pic:blipFill>
+                  <pic:spPr>
+                    <a:xfrm>
+                      <a:off x="0" y="0"/>
+                      <a:ext cx="5274310" cy="3411855"/>
+                    </a:xfrm>
+                    <a:prstGeom prst="rect">
+                      <a:avLst/>
+                    </a:prstGeom>
+                  </pic:spPr>
+                </pic:pic>
+              </a:graphicData>
+            </a:graphic>
+          </wp:inline>
+        </w:drawing>
+      </w:r>
+    </w:p>
+    <w:p>
+      <w:pPr>
+        <w:spacing w:before="0" w:after="200" w:line="312" w:lineRule="auto"/>
+        <w:rPr>
+          <w:b/>
+          <w:bCs/>
+          <w:sz w:val="24"/>
+        </w:rPr>
+      </w:pPr>
+      <w:r>
+        <w:rPr>
+          <w:b/>
+          <w:bCs/>
+          <w:sz w:val="24"/>
+        </w:rPr>
+        <w:t>Página de registro:</w:t>
+      </w:r>
+    </w:p>
+    <w:p>
+      <w:pPr>
+        <w:spacing w:before="0" w:after="200" w:line="312" w:lineRule="auto"/>
+        <w:rPr>
+          <w:b/>
+          <w:bCs/>
+          <w:sz w:val="28"/>
+          <w:szCs w:val="28"/>
+        </w:rPr>
+      </w:pPr>
+      <w:r>
+        <w:rPr>
+          <w:b/>
+          <w:bCs/>
+          <w:sz w:val="28"/>
+          <w:szCs w:val="28"/>
+        </w:rPr>
+        <w:drawing>
+          <wp:inline distT="0" distB="0" distL="0" distR="0" wp14:anchorId="2B23358A" wp14:editId="582C093B">
+            <wp:extent cx="5274310" cy="3513455"/>
+            <wp:effectExtent l="0" t="0" r="2540" b="0"/>
+            <wp:docPr id="462427902" name="Imagen 1" descr="Interfaz de usuario gráfica, Sitio web&#10;&#10;El contenido generado por IA puede ser incorrecto."/>
+            <wp:cNvGraphicFramePr>
+              <a:graphicFrameLocks xmlns:a="http://schemas.openxmlformats.org/drawingml/2006/main" noChangeAspect="1"/>
+            </wp:cNvGraphicFramePr>
+            <a:graphic xmlns:a="http://schemas.openxmlformats.org/drawingml/2006/main">
+              <a:graphicData uri="http://schemas.openxmlformats.org/drawingml/2006/picture">
+                <pic:pic xmlns:pic="http://schemas.openxmlformats.org/drawingml/2006/picture">
+                  <pic:nvPicPr>
+                    <pic:cNvPr id="462427902" name="Imagen 1" descr="Interfaz de usuario gráfica, Sitio web&#10;&#10;El contenido generado por IA puede ser incorrecto."/>
+                    <pic:cNvPicPr/>
+                  </pic:nvPicPr>
+                  <pic:blipFill>
+                    <a:blip r:embed="rId23"/>
+                    <a:stretch>
+                      <a:fillRect/>
+                    </a:stretch>
+                  </pic:blipFill>
+                  <pic:spPr>
+                    <a:xfrm>
+                      <a:off x="0" y="0"/>
+                      <a:ext cx="5274310" cy="3513455"/>
+                    </a:xfrm>
+                    <a:prstGeom prst="rect">
+                      <a:avLst/>
+                    </a:prstGeom>
+                  </pic:spPr>
+                </pic:pic>
+              </a:graphicData>
+            </a:graphic>
+          </wp:inline>
+        </w:drawing>
+      </w:r>
+    </w:p>
+    <w:p>
+      <w:pPr>
+        <w:spacing w:before="0" w:after="200" w:line="312" w:lineRule="auto"/>
+        <w:rPr>
+          <w:b/>
+          <w:bCs/>
+          <w:szCs w:val="20"/>
+        </w:rPr>
+      </w:pPr>
+      <w:proofErr w:type="gramStart"/>
+      <w:r>
+        <w:rPr>
+          <w:b/>
+          <w:bCs/>
+          <w:szCs w:val="20"/>
+        </w:rPr>
+        <w:t>Link</w:t>
+      </w:r>
+      <w:proofErr w:type="gramEnd"/>
+      <w:r>
+        <w:rPr>
+          <w:b/>
+          <w:bCs/>
+          <w:szCs w:val="20"/>
+        </w:rPr>
+        <w:t xml:space="preserve"> del </w:t>
+      </w:r>
+      <w:proofErr w:type="spellStart"/>
+      <w:r>
+        <w:rPr>
+          <w:b/>
+          <w:bCs/>
+          <w:szCs w:val="20"/>
+        </w:rPr>
+        <w:t>figma</w:t>
+      </w:r>
+      <w:proofErr w:type="spellEnd"/>
+      <w:r>
+        <w:rPr>
+          <w:b/>
+          <w:bCs/>
+          <w:szCs w:val="20"/>
+        </w:rPr>
+        <w:t>:</w:t>
+      </w:r>
+    </w:p>
+    <w:p>
+      <w:pPr>
+        <w:spacing w:before="0" w:after="200" w:line="312" w:lineRule="auto"/>
+        <w:rPr>
+          <w:szCs w:val="20"/>
+        </w:rPr>
+      </w:pPr>
+      <w:hyperlink r:id="rId24" w:history="1">
+        <w:r>
+          <w:rPr>
+            <w:rStyle w:val="Hipervnculo"/>
+            <w:szCs w:val="20"/>
+          </w:rPr>
+          <w:t>https://www.figma.com/</w:t>
+        </w:r>
+        <w:r>
+          <w:rPr>
+            <w:rStyle w:val="Hipervnculo"/>
+            <w:szCs w:val="20"/>
+          </w:rPr>
+          <w:t>d</w:t>
+        </w:r>
+        <w:r>
+          <w:rPr>
+            <w:rStyle w:val="Hipervnculo"/>
+            <w:szCs w:val="20"/>
+          </w:rPr>
+          <w:t>esign/C0sj9dbzKaRpJshVfNWokc/TFG_SONAURA?node-id=0-1&amp;t=CzU8caVkRHuZb1jB-1</w:t>
+        </w:r>
+      </w:hyperlink>
+    </w:p>
+    <w:p>
+      <w:pPr>
+        <w:rPr>
+          <w:b/>
+          <w:bCs/>
+          <w:sz w:val="28"/>
+          <w:szCs w:val="28"/>
+        </w:rPr>
+      </w:pPr>
+      <w:r>
+        <w:rPr>
+          <w:b/>
+          <w:bCs/>
+          <w:sz w:val="28"/>
+          <w:szCs w:val="28"/>
+        </w:rPr>
+        <w:lastRenderedPageBreak/>
+        <w:t>Principios de Usabilidad y Accesibilidad</w:t>
+      </w:r>
+    </w:p>
+    <w:p>
+      <w:pPr>
+        <w:rPr>
+          <w:b/>
+          <w:bCs/>
+          <w:sz w:val="24"/>
+        </w:rPr>
+      </w:pPr>
+      <w:r>
+        <w:rPr>
+          <w:b/>
+          <w:bCs/>
+          <w:sz w:val="24"/>
+        </w:rPr>
+        <w:t>Usabilidad</w:t>
+      </w:r>
+    </w:p>
+    <w:p>
+      <w:r>
+        <w:t>La usabilidad es un aspecto clave en el diseño de nuestro blog de entretenimiento, ya que influye directamente en la facilidad con la que los usuarios interactúan con la plataforma. Para garantizar una experiencia satisfactoria, nos basamos en principios reconocidos como los de Jakob Nielsen.</w:t>
+      </w:r>
+    </w:p>
+    <w:p>
+      <w:r>
+        <w:rPr>
+          <w:b/>
+          <w:bCs/>
+        </w:rPr>
+        <w:t>Principios aplicados:</w:t>
       </w:r>
     </w:p>
     <w:p>
@@ -3459,11 +4383,27 @@
           <w:b/>
           <w:bCs/>
         </w:rPr>
-        <w:t>Navegación intuitiva:</w:t>
+        <w:t>Consistencia visual y funcional:</w:t>
       </w:r>
       <w:r>
         <w:br/>
-        <w:t>El usuario podrá moverse fácilmente entre secciones, con rutas claras de acceso y retorno, especialmente entre contenido relacionado (como temporadas de una serie o recomendaciones similares).</w:t>
+        <w:t xml:space="preserve">Todos los elementos interactivos mantendrán un diseño coherente en todas las páginas. La navegación principal (Inicio, Películas, Series, </w:t>
+      </w:r>
+      <w:proofErr w:type="spellStart"/>
+      <w:r>
+        <w:t>Login</w:t>
+      </w:r>
+      <w:proofErr w:type="spellEnd"/>
+      <w:r>
+        <w:t>/</w:t>
+      </w:r>
+      <w:proofErr w:type="spellStart"/>
+      <w:r>
+        <w:t>Logout</w:t>
+      </w:r>
+      <w:proofErr w:type="spellEnd"/>
+      <w:r>
+        <w:t>) será uniforme y siempre visible.</w:t>
       </w:r>
     </w:p>
     <w:p>
@@ -3478,6 +4418,87 @@
           <w:b/>
           <w:bCs/>
         </w:rPr>
+        <w:t>Claridad en la interacción:</w:t>
+      </w:r>
+      <w:r>
+        <w:br/>
+        <w:t>Los botones y acciones estarán claramente etiquetados. Se priorizará el uso de texto acompañado de iconos para evitar ambigüedades.</w:t>
+      </w:r>
+    </w:p>
+    <w:p>
+      <w:pPr>
+        <w:numPr>
+          <w:ilvl w:val="0"/>
+          <w:numId w:val="29"/>
+        </w:numPr>
+      </w:pPr>
+      <w:r>
+        <w:rPr>
+          <w:b/>
+          <w:bCs/>
+        </w:rPr>
+        <w:t>Retroalimentación inmediata:</w:t>
+      </w:r>
+      <w:r>
+        <w:br/>
+        <w:t>El sistema ofrecerá mensajes o señales visuales (como animaciones o alertas) al realizar acciones como valorar una serie, seguir una película o guardar un cambio en una lista.</w:t>
+      </w:r>
+    </w:p>
+    <w:p>
+      <w:pPr>
+        <w:numPr>
+          <w:ilvl w:val="0"/>
+          <w:numId w:val="29"/>
+        </w:numPr>
+      </w:pPr>
+      <w:r>
+        <w:rPr>
+          <w:b/>
+          <w:bCs/>
+        </w:rPr>
+        <w:t>Prevención y recuperación de errores:</w:t>
+      </w:r>
+      <w:r>
+        <w:br/>
+        <w:t>Se implementarán validaciones en formularios y confirmaciones para acciones irreversibles (por ejemplo, eliminar contenido de una lista).</w:t>
+      </w:r>
+    </w:p>
+    <w:p>
+      <w:pPr>
+        <w:ind w:left="720"/>
+      </w:pPr>
+    </w:p>
+    <w:p>
+      <w:pPr>
+        <w:numPr>
+          <w:ilvl w:val="0"/>
+          <w:numId w:val="29"/>
+        </w:numPr>
+      </w:pPr>
+      <w:r>
+        <w:rPr>
+          <w:b/>
+          <w:bCs/>
+        </w:rPr>
+        <w:t>Navegación intuitiva:</w:t>
+      </w:r>
+      <w:r>
+        <w:br/>
+        <w:t>El usuario podrá moverse fácilmente entre secciones, con rutas claras de acceso y retorno, especialmente entre contenido relacionado (como temporadas de una serie o recomendaciones similares).</w:t>
+      </w:r>
+    </w:p>
+    <w:p>
+      <w:pPr>
+        <w:numPr>
+          <w:ilvl w:val="0"/>
+          <w:numId w:val="29"/>
+        </w:numPr>
+      </w:pPr>
+      <w:r>
+        <w:rPr>
+          <w:b/>
+          <w:bCs/>
+        </w:rPr>
         <w:t>Adaptación a diferentes niveles de usuario:</w:t>
       </w:r>
       <w:r>
@@ -3485,31 +4506,51 @@
         <w:t>La interfaz será accesible y comprensible para usuarios nuevos, pero también incluirá atajos o funcionalidades adicionales para usuarios registrados y suscriptores.</w:t>
       </w:r>
     </w:p>
-    <w:p/>
-    <w:p>
-      <w:pPr>
-        <w:rPr>
-          <w:b/>
-          <w:bCs/>
-        </w:rPr>
-      </w:pPr>
-    </w:p>
-    <w:p>
-      <w:pPr>
-        <w:rPr>
-          <w:b/>
-          <w:bCs/>
-          <w:sz w:val="30"/>
-          <w:szCs w:val="30"/>
-        </w:rPr>
-      </w:pPr>
-      <w:r>
-        <w:rPr>
-          <w:b/>
-          <w:bCs/>
-          <w:sz w:val="30"/>
-          <w:szCs w:val="30"/>
-        </w:rPr>
+    <w:p>
+      <w:pPr>
+        <w:ind w:left="720"/>
+      </w:pPr>
+    </w:p>
+    <w:p>
+      <w:pPr>
+        <w:ind w:left="720"/>
+      </w:pPr>
+    </w:p>
+    <w:p>
+      <w:pPr>
+        <w:ind w:left="720"/>
+      </w:pPr>
+    </w:p>
+    <w:p>
+      <w:pPr>
+        <w:ind w:left="720"/>
+      </w:pPr>
+    </w:p>
+    <w:p>
+      <w:pPr>
+        <w:ind w:left="720"/>
+      </w:pPr>
+    </w:p>
+    <w:p>
+      <w:pPr>
+        <w:ind w:left="720"/>
+      </w:pPr>
+    </w:p>
+    <w:p>
+      <w:pPr>
+        <w:rPr>
+          <w:b/>
+          <w:bCs/>
+          <w:sz w:val="24"/>
+        </w:rPr>
+      </w:pPr>
+      <w:r>
+        <w:rPr>
+          <w:b/>
+          <w:bCs/>
+          <w:sz w:val="24"/>
+        </w:rPr>
+        <w:lastRenderedPageBreak/>
         <w:t>Accesibilidad</w:t>
       </w:r>
     </w:p>
@@ -3524,7 +4565,6 @@
           <w:b/>
           <w:bCs/>
         </w:rPr>
-        <w:lastRenderedPageBreak/>
         <w:t>Principios aplicados:</w:t>
       </w:r>
     </w:p>
@@ -3647,135 +4687,7 @@
         </w:numPr>
       </w:pPr>
       <w:r>
-        <w:t>Instruccio</w:t>
-      </w:r>
-      <w:r>
-        <w:rPr>
-          <w:noProof/>
-          <w:lang w:bidi="es-ES"/>
-        </w:rPr>
-        <mc:AlternateContent>
-          <mc:Choice Requires="wps">
-            <w:drawing>
-              <wp:anchor distT="0" distB="0" distL="114300" distR="114300" simplePos="0" relativeHeight="251697152" behindDoc="1" locked="1" layoutInCell="1" allowOverlap="1" wp14:anchorId="75B307A7" wp14:editId="0AF4E2D8">
-                <wp:simplePos x="0" y="0"/>
-                <wp:positionH relativeFrom="page">
-                  <wp:align>left</wp:align>
-                </wp:positionH>
-                <wp:positionV relativeFrom="paragraph">
-                  <wp:posOffset>-4305300</wp:posOffset>
-                </wp:positionV>
-                <wp:extent cx="1323975" cy="10828020"/>
-                <wp:effectExtent l="0" t="0" r="9525" b="0"/>
-                <wp:wrapNone/>
-                <wp:docPr id="1687418042" name="Rectángulo 2">
-                  <a:extLst xmlns:a="http://schemas.openxmlformats.org/drawingml/2006/main">
-                    <a:ext uri="{C183D7F6-B498-43B3-948B-1728B52AA6E4}">
-                      <adec:decorative xmlns:adec="http://schemas.microsoft.com/office/drawing/2017/decorative" val="1"/>
-                    </a:ext>
-                  </a:extLst>
-                </wp:docPr>
-                <wp:cNvGraphicFramePr/>
-                <a:graphic xmlns:a="http://schemas.openxmlformats.org/drawingml/2006/main">
-                  <a:graphicData uri="http://schemas.microsoft.com/office/word/2010/wordprocessingShape">
-                    <wps:wsp>
-                      <wps:cNvSpPr/>
-                      <wps:spPr>
-                        <a:xfrm>
-                          <a:off x="0" y="0"/>
-                          <a:ext cx="1323975" cy="10828020"/>
-                        </a:xfrm>
-                        <a:prstGeom prst="rect">
-                          <a:avLst/>
-                        </a:prstGeom>
-                        <a:solidFill>
-                          <a:schemeClr val="tx1">
-                            <a:lumMod val="75000"/>
-                            <a:lumOff val="25000"/>
-                          </a:schemeClr>
-                        </a:solidFill>
-                        <a:ln>
-                          <a:noFill/>
-                        </a:ln>
-                      </wps:spPr>
-                      <wps:style>
-                        <a:lnRef idx="2">
-                          <a:schemeClr val="accent1">
-                            <a:shade val="50000"/>
-                          </a:schemeClr>
-                        </a:lnRef>
-                        <a:fillRef idx="1">
-                          <a:schemeClr val="accent1"/>
-                        </a:fillRef>
-                        <a:effectRef idx="0">
-                          <a:schemeClr val="accent1"/>
-                        </a:effectRef>
-                        <a:fontRef idx="minor">
-                          <a:schemeClr val="lt1"/>
-                        </a:fontRef>
-                      </wps:style>
-                      <wps:txbx>
-                        <w:txbxContent>
-                          <w:p>
-                            <w:pPr>
-                              <w:pStyle w:val="Piedepginablanco"/>
-                            </w:pPr>
-                            <w:r>
-                              <w:rPr>
-                                <w:lang w:bidi="es-ES"/>
-                              </w:rPr>
-                              <w:t>7</w:t>
-                            </w:r>
-                          </w:p>
-                          <w:p/>
-                        </w:txbxContent>
-                      </wps:txbx>
-                      <wps:bodyPr rot="0" spcFirstLastPara="0" vertOverflow="overflow" horzOverflow="overflow" vert="horz" wrap="square" lIns="91440" tIns="45720" rIns="91440" bIns="45720" numCol="1" spcCol="0" rtlCol="0" fromWordArt="0" anchor="b" anchorCtr="0" forceAA="0" compatLnSpc="1">
-                        <a:prstTxWarp prst="textNoShape">
-                          <a:avLst/>
-                        </a:prstTxWarp>
-                        <a:noAutofit/>
-                      </wps:bodyPr>
-                    </wps:wsp>
-                  </a:graphicData>
-                </a:graphic>
-                <wp14:sizeRelH relativeFrom="margin">
-                  <wp14:pctWidth>0</wp14:pctWidth>
-                </wp14:sizeRelH>
-                <wp14:sizeRelV relativeFrom="margin">
-                  <wp14:pctHeight>0</wp14:pctHeight>
-                </wp14:sizeRelV>
-              </wp:anchor>
-            </w:drawing>
-          </mc:Choice>
-          <mc:Fallback>
-            <w:pict>
-              <v:rect w14:anchorId="75B307A7" id="_x0000_s1036" alt="&quot;&quot;" style="position:absolute;left:0;text-align:left;margin-left:0;margin-top:-339pt;width:104.25pt;height:852.6pt;z-index:-251619328;visibility:visible;mso-wrap-style:square;mso-width-percent:0;mso-height-percent:0;mso-wrap-distance-left:9pt;mso-wrap-distance-top:0;mso-wrap-distance-right:9pt;mso-wrap-distance-bottom:0;mso-position-horizontal:left;mso-position-horizontal-relative:page;mso-position-vertical:absolute;mso-position-vertical-relative:text;mso-width-percent:0;mso-height-percent:0;mso-width-relative:margin;mso-height-relative:margin;v-text-anchor:bottom" o:gfxdata="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" fillcolor="#404040 [2429]" stroked="f" strokeweight="1pt">
-                <v:textbox>
-                  <w:txbxContent>
-                    <w:p>
-                      <w:pPr>
-                        <w:pStyle w:val="Piedepginablanco"/>
-                      </w:pPr>
-                      <w:r>
-                        <w:rPr>
-                          <w:lang w:bidi="es-ES"/>
-                        </w:rPr>
-                        <w:t>7</w:t>
-                      </w:r>
-                    </w:p>
-                    <w:p/>
-                  </w:txbxContent>
-                </v:textbox>
-                <w10:wrap anchorx="page"/>
-                <w10:anchorlock/>
-              </v:rect>
-            </w:pict>
-          </mc:Fallback>
-        </mc:AlternateContent>
-      </w:r>
-      <w:r>
-        <w:t>nes visibles en las funcionalidades más avanzadas, como listas personalizadas o el calendario de seguimiento.</w:t>
+        <w:t>Instrucciones visibles en las funcionalidades más avanzadas, como listas personalizadas o el calendario de seguimiento.</w:t>
       </w:r>
     </w:p>
     <w:p>
@@ -3829,27 +4741,193 @@
     <w:p/>
     <w:p/>
     <w:p/>
+    <w:p>
+      <w:pPr>
+        <w:spacing w:before="0" w:after="200" w:line="312" w:lineRule="auto"/>
+        <w:rPr>
+          <w:b/>
+          <w:bCs/>
+          <w:sz w:val="24"/>
+        </w:rPr>
+      </w:pPr>
+      <w:r>
+        <w:lastRenderedPageBreak/>
+        <w:drawing>
+          <wp:anchor distT="0" distB="0" distL="114300" distR="114300" simplePos="0" relativeHeight="251705344" behindDoc="0" locked="0" layoutInCell="1" allowOverlap="1" wp14:anchorId="3310DDFB" wp14:editId="0DE60012">
+            <wp:simplePos x="0" y="0"/>
+            <wp:positionH relativeFrom="margin">
+              <wp:align>left</wp:align>
+            </wp:positionH>
+            <wp:positionV relativeFrom="paragraph">
+              <wp:posOffset>279070</wp:posOffset>
+            </wp:positionV>
+            <wp:extent cx="5658528" cy="961901"/>
+            <wp:effectExtent l="0" t="0" r="0" b="0"/>
+            <wp:wrapNone/>
+            <wp:docPr id="2083713243" name="Imagen 1" descr="Imagen que contiene biombo, juego, reloj&#10;&#10;El contenido generado por IA puede ser incorrecto."/>
+            <wp:cNvGraphicFramePr>
+              <a:graphicFrameLocks xmlns:a="http://schemas.openxmlformats.org/drawingml/2006/main" noChangeAspect="1"/>
+            </wp:cNvGraphicFramePr>
+            <a:graphic xmlns:a="http://schemas.openxmlformats.org/drawingml/2006/main">
+              <a:graphicData uri="http://schemas.openxmlformats.org/drawingml/2006/picture">
+                <pic:pic xmlns:pic="http://schemas.openxmlformats.org/drawingml/2006/picture">
+                  <pic:nvPicPr>
+                    <pic:cNvPr id="2083713243" name="Imagen 1" descr="Imagen que contiene biombo, juego, reloj&#10;&#10;El contenido generado por IA puede ser incorrecto."/>
+                    <pic:cNvPicPr/>
+                  </pic:nvPicPr>
+                  <pic:blipFill>
+                    <a:blip r:embed="rId25" cstate="print">
+                      <a:extLst>
+                        <a:ext uri="{28A0092B-C50C-407E-A947-70E740481C1C}">
+                          <a14:useLocalDpi xmlns:a14="http://schemas.microsoft.com/office/drawing/2010/main" val="0"/>
+                        </a:ext>
+                      </a:extLst>
+                    </a:blip>
+                    <a:stretch>
+                      <a:fillRect/>
+                    </a:stretch>
+                  </pic:blipFill>
+                  <pic:spPr>
+                    <a:xfrm>
+                      <a:off x="0" y="0"/>
+                      <a:ext cx="5658528" cy="961901"/>
+                    </a:xfrm>
+                    <a:prstGeom prst="rect">
+                      <a:avLst/>
+                    </a:prstGeom>
+                  </pic:spPr>
+                </pic:pic>
+              </a:graphicData>
+            </a:graphic>
+            <wp14:sizeRelH relativeFrom="margin">
+              <wp14:pctWidth>0</wp14:pctWidth>
+            </wp14:sizeRelH>
+            <wp14:sizeRelV relativeFrom="margin">
+              <wp14:pctHeight>0</wp14:pctHeight>
+            </wp14:sizeRelV>
+          </wp:anchor>
+        </w:drawing>
+      </w:r>
+      <w:r>
+        <w:rPr>
+          <w:b/>
+          <w:bCs/>
+          <w:sz w:val="24"/>
+        </w:rPr>
+        <w:t>PLANIFICACIÓN Y COSTES:</w:t>
+      </w:r>
+    </w:p>
+    <w:p>
+      <w:pPr>
+        <w:rPr>
+          <w:b/>
+          <w:bCs/>
+          <w:sz w:val="24"/>
+        </w:rPr>
+      </w:pPr>
+      <w:r>
+        <w:rPr>
+          <w:b/>
+          <w:bCs/>
+          <w:sz w:val="24"/>
+        </w:rPr>
+        <w:t>Diagrama de Gant</w:t>
+      </w:r>
+      <w:r>
+        <w:rPr>
+          <w:b/>
+          <w:bCs/>
+          <w:sz w:val="24"/>
+        </w:rPr>
+        <w:t>t con tareas:</w:t>
+      </w:r>
+    </w:p>
     <w:p/>
     <w:p/>
-    <w:p/>
-    <w:p/>
-    <w:p>
-      <w:pPr>
-        <w:rPr>
-          <w:b/>
-          <w:bCs/>
-          <w:sz w:val="30"/>
-          <w:szCs w:val="30"/>
-        </w:rPr>
-      </w:pPr>
-      <w:r>
-        <w:rPr>
-          <w:b/>
-          <w:bCs/>
-          <w:sz w:val="30"/>
-          <w:szCs w:val="30"/>
-        </w:rPr>
-        <w:lastRenderedPageBreak/>
+    <w:p>
+      <w:pPr>
+        <w:spacing w:before="0" w:after="200" w:line="312" w:lineRule="auto"/>
+        <w:rPr>
+          <w:b/>
+          <w:bCs/>
+          <w:szCs w:val="20"/>
+        </w:rPr>
+      </w:pPr>
+      <w:proofErr w:type="gramStart"/>
+      <w:r>
+        <w:rPr>
+          <w:b/>
+          <w:bCs/>
+          <w:szCs w:val="20"/>
+        </w:rPr>
+        <w:t>Link</w:t>
+      </w:r>
+      <w:proofErr w:type="gramEnd"/>
+      <w:r>
+        <w:rPr>
+          <w:b/>
+          <w:bCs/>
+          <w:szCs w:val="20"/>
+        </w:rPr>
+        <w:t xml:space="preserve"> del </w:t>
+      </w:r>
+      <w:proofErr w:type="spellStart"/>
+      <w:r>
+        <w:rPr>
+          <w:b/>
+          <w:bCs/>
+          <w:szCs w:val="20"/>
+        </w:rPr>
+        <w:t>figma</w:t>
+      </w:r>
+      <w:proofErr w:type="spellEnd"/>
+      <w:r>
+        <w:rPr>
+          <w:b/>
+          <w:bCs/>
+          <w:szCs w:val="20"/>
+        </w:rPr>
+        <w:t>:</w:t>
+      </w:r>
+    </w:p>
+    <w:p>
+      <w:hyperlink r:id="rId26" w:history="1">
+        <w:r>
+          <w:rPr>
+            <w:rStyle w:val="Hipervnculo"/>
+          </w:rPr>
+          <w:t>https://drive.google.com/drive/f</w:t>
+        </w:r>
+        <w:r>
+          <w:rPr>
+            <w:rStyle w:val="Hipervnculo"/>
+          </w:rPr>
+          <w:t>o</w:t>
+        </w:r>
+        <w:r>
+          <w:rPr>
+            <w:rStyle w:val="Hipervnculo"/>
+          </w:rPr>
+          <w:t>lders/1wRjZHs_ECa-b2mc8WhSdIt51SMgnP0YV?usp=sharing</w:t>
+        </w:r>
+      </w:hyperlink>
+    </w:p>
+    <w:p>
+      <w:pPr>
+        <w:rPr>
+          <w:b/>
+          <w:bCs/>
+          <w:sz w:val="28"/>
+          <w:szCs w:val="28"/>
+        </w:rPr>
+      </w:pPr>
+      <w:r>
+        <w:rPr>
+          <w:b/>
+          <w:bCs/>
+          <w:sz w:val="28"/>
+          <w:szCs w:val="28"/>
+        </w:rPr>
         <w:t>Recursos Materiales</w:t>
       </w:r>
     </w:p>
@@ -4097,148 +5175,22 @@
         </w:tc>
       </w:tr>
     </w:tbl>
-    <w:p>
-      <w:r>
-        <w:rPr>
-          <w:noProof/>
-          <w:lang w:bidi="es-ES"/>
-        </w:rPr>
-        <mc:AlternateContent>
-          <mc:Choice Requires="wps">
-            <w:drawing>
-              <wp:anchor distT="0" distB="0" distL="114300" distR="114300" simplePos="0" relativeHeight="251701248" behindDoc="1" locked="1" layoutInCell="1" allowOverlap="1" wp14:anchorId="1E9E9CB0" wp14:editId="5477692B">
-                <wp:simplePos x="0" y="0"/>
-                <wp:positionH relativeFrom="page">
-                  <wp:align>left</wp:align>
-                </wp:positionH>
-                <wp:positionV relativeFrom="paragraph">
-                  <wp:posOffset>-2891155</wp:posOffset>
-                </wp:positionV>
-                <wp:extent cx="1323975" cy="10828020"/>
-                <wp:effectExtent l="0" t="0" r="9525" b="0"/>
-                <wp:wrapNone/>
-                <wp:docPr id="1310762053" name="Rectángulo 2">
-                  <a:extLst xmlns:a="http://schemas.openxmlformats.org/drawingml/2006/main">
-                    <a:ext uri="{C183D7F6-B498-43B3-948B-1728B52AA6E4}">
-                      <adec:decorative xmlns:adec="http://schemas.microsoft.com/office/drawing/2017/decorative" val="1"/>
-                    </a:ext>
-                  </a:extLst>
-                </wp:docPr>
-                <wp:cNvGraphicFramePr/>
-                <a:graphic xmlns:a="http://schemas.openxmlformats.org/drawingml/2006/main">
-                  <a:graphicData uri="http://schemas.microsoft.com/office/word/2010/wordprocessingShape">
-                    <wps:wsp>
-                      <wps:cNvSpPr/>
-                      <wps:spPr>
-                        <a:xfrm>
-                          <a:off x="0" y="0"/>
-                          <a:ext cx="1323975" cy="10828020"/>
-                        </a:xfrm>
-                        <a:prstGeom prst="rect">
-                          <a:avLst/>
-                        </a:prstGeom>
-                        <a:solidFill>
-                          <a:schemeClr val="tx1">
-                            <a:lumMod val="75000"/>
-                            <a:lumOff val="25000"/>
-                          </a:schemeClr>
-                        </a:solidFill>
-                        <a:ln>
-                          <a:noFill/>
-                        </a:ln>
-                      </wps:spPr>
-                      <wps:style>
-                        <a:lnRef idx="2">
-                          <a:schemeClr val="accent1">
-                            <a:shade val="50000"/>
-                          </a:schemeClr>
-                        </a:lnRef>
-                        <a:fillRef idx="1">
-                          <a:schemeClr val="accent1"/>
-                        </a:fillRef>
-                        <a:effectRef idx="0">
-                          <a:schemeClr val="accent1"/>
-                        </a:effectRef>
-                        <a:fontRef idx="minor">
-                          <a:schemeClr val="lt1"/>
-                        </a:fontRef>
-                      </wps:style>
-                      <wps:txbx>
-                        <w:txbxContent>
-                          <w:p>
-                            <w:pPr>
-                              <w:pStyle w:val="Piedepginablanco"/>
-                            </w:pPr>
-                            <w:r>
-                              <w:rPr>
-                                <w:lang w:bidi="es-ES"/>
-                              </w:rPr>
-                              <w:t>8</w:t>
-                            </w:r>
-                          </w:p>
-                          <w:p/>
-                        </w:txbxContent>
-                      </wps:txbx>
-                      <wps:bodyPr rot="0" spcFirstLastPara="0" vertOverflow="overflow" horzOverflow="overflow" vert="horz" wrap="square" lIns="91440" tIns="45720" rIns="91440" bIns="45720" numCol="1" spcCol="0" rtlCol="0" fromWordArt="0" anchor="b" anchorCtr="0" forceAA="0" compatLnSpc="1">
-                        <a:prstTxWarp prst="textNoShape">
-                          <a:avLst/>
-                        </a:prstTxWarp>
-                        <a:noAutofit/>
-                      </wps:bodyPr>
-                    </wps:wsp>
-                  </a:graphicData>
-                </a:graphic>
-                <wp14:sizeRelH relativeFrom="margin">
-                  <wp14:pctWidth>0</wp14:pctWidth>
-                </wp14:sizeRelH>
-                <wp14:sizeRelV relativeFrom="margin">
-                  <wp14:pctHeight>0</wp14:pctHeight>
-                </wp14:sizeRelV>
-              </wp:anchor>
-            </w:drawing>
-          </mc:Choice>
-          <mc:Fallback>
-            <w:pict>
-              <v:rect w14:anchorId="1E9E9CB0" id="_x0000_s1037" alt="&quot;&quot;" style="position:absolute;margin-left:0;margin-top:-227.65pt;width:104.25pt;height:852.6pt;z-index:-251615232;visibility:visible;mso-wrap-style:square;mso-width-percent:0;mso-height-percent:0;mso-wrap-distance-left:9pt;mso-wrap-distance-top:0;mso-wrap-distance-right:9pt;mso-wrap-distance-bottom:0;mso-position-horizontal:left;mso-position-horizontal-relative:page;mso-position-vertical:absolute;mso-position-vertical-relative:text;mso-width-percent:0;mso-height-percent:0;mso-width-relative:margin;mso-height-relative:margin;v-text-anchor:bottom" o:gfxdata="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" fillcolor="#404040 [2429]" stroked="f" strokeweight="1pt">
-                <v:textbox>
-                  <w:txbxContent>
-                    <w:p>
-                      <w:pPr>
-                        <w:pStyle w:val="Piedepginablanco"/>
-                      </w:pPr>
-                      <w:r>
-                        <w:rPr>
-                          <w:lang w:bidi="es-ES"/>
-                        </w:rPr>
-                        <w:t>8</w:t>
-                      </w:r>
-                    </w:p>
-                    <w:p/>
-                  </w:txbxContent>
-                </v:textbox>
-                <w10:wrap anchorx="page"/>
-                <w10:anchorlock/>
-              </v:rect>
-            </w:pict>
-          </mc:Fallback>
-        </mc:AlternateContent>
-      </w:r>
-    </w:p>
-    <w:p>
-      <w:pPr>
-        <w:rPr>
-          <w:b/>
-          <w:bCs/>
-          <w:sz w:val="30"/>
-          <w:szCs w:val="30"/>
-        </w:rPr>
-      </w:pPr>
-      <w:r>
-        <w:rPr>
-          <w:b/>
-          <w:bCs/>
-          <w:sz w:val="30"/>
-          <w:szCs w:val="30"/>
+    <w:p/>
+    <w:p>
+      <w:pPr>
+        <w:rPr>
+          <w:b/>
+          <w:bCs/>
+          <w:sz w:val="28"/>
+          <w:szCs w:val="28"/>
+        </w:rPr>
+      </w:pPr>
+      <w:r>
+        <w:rPr>
+          <w:b/>
+          <w:bCs/>
+          <w:sz w:val="28"/>
+          <w:szCs w:val="28"/>
         </w:rPr>
         <w:t>Presupuesto Estimado</w:t>
       </w:r>
@@ -4332,11 +5284,7 @@
           <w:tcPr>
             <w:tcW w:w="4148" w:type="dxa"/>
           </w:tcPr>
-          <w:p>
-            <w:r>
-              <w:t>Diseñador UX/UI</w:t>
-            </w:r>
-          </w:p>
+          <w:p/>
         </w:tc>
         <w:tc>
           <w:tcPr>
@@ -4346,9 +5294,6 @@
             <w:pPr>
               <w:jc w:val="center"/>
             </w:pPr>
-            <w:r>
-              <w:t>930 €</w:t>
-            </w:r>
           </w:p>
         </w:tc>
       </w:tr>
@@ -4469,12 +5414,16 @@
         <w:rPr>
           <w:b/>
           <w:bCs/>
-        </w:rPr>
-      </w:pPr>
-      <w:r>
-        <w:rPr>
-          <w:b/>
-          <w:bCs/>
+          <w:sz w:val="28"/>
+          <w:szCs w:val="28"/>
+        </w:rPr>
+      </w:pPr>
+      <w:r>
+        <w:rPr>
+          <w:b/>
+          <w:bCs/>
+          <w:sz w:val="28"/>
+          <w:szCs w:val="28"/>
         </w:rPr>
         <w:t>Infraestructura y Herramientas</w:t>
       </w:r>
@@ -4588,6 +5537,7 @@
               </w:rPr>
             </w:pPr>
             <w:r>
+              <w:lastRenderedPageBreak/>
               <w:t>Herramientas de diseño</w:t>
             </w:r>
           </w:p>
@@ -4736,6 +5686,9 @@
         <w:gridCol w:w="8296"/>
       </w:tblGrid>
       <w:tr>
+        <w:trPr>
+          <w:trHeight w:val="566"/>
+        </w:trPr>
         <w:tc>
           <w:tcPr>
             <w:tcW w:w="8296" w:type="dxa"/>
@@ -4743,27 +5696,46 @@
           <w:p>
             <w:pPr>
               <w:jc w:val="center"/>
+              <w:rPr>
+                <w:sz w:val="28"/>
+                <w:szCs w:val="28"/>
+              </w:rPr>
             </w:pPr>
             <w:r>
               <w:rPr>
                 <w:b/>
                 <w:bCs/>
+                <w:sz w:val="28"/>
+                <w:szCs w:val="28"/>
               </w:rPr>
-              <w:t>S</w:t>
+              <w:t xml:space="preserve">SUBTOTAL ESTIMADO: </w:t>
             </w:r>
             <w:r>
               <w:rPr>
                 <w:b/>
                 <w:bCs/>
+                <w:sz w:val="28"/>
+                <w:szCs w:val="28"/>
               </w:rPr>
-              <w:t xml:space="preserve">UBTOTAL ESTIMADO: </w:t>
+              <w:t>9</w:t>
             </w:r>
             <w:r>
               <w:rPr>
                 <w:b/>
                 <w:bCs/>
+                <w:sz w:val="28"/>
+                <w:szCs w:val="28"/>
               </w:rPr>
-              <w:t>9€</w:t>
+              <w:t>591</w:t>
+            </w:r>
+            <w:r>
+              <w:rPr>
+                <w:b/>
+                <w:bCs/>
+                <w:sz w:val="28"/>
+                <w:szCs w:val="28"/>
+              </w:rPr>
+              <w:t>€</w:t>
             </w:r>
           </w:p>
         </w:tc>
@@ -4771,7 +5743,7 @@
     </w:tbl>
     <w:p/>
     <w:sectPr>
-      <w:footerReference w:type="default" r:id="rId16"/>
+      <w:footerReference w:type="default" r:id="rId27"/>
       <w:pgSz w:w="11906" w:h="16838" w:code="9"/>
       <w:pgMar w:top="720" w:right="720" w:bottom="720" w:left="2880" w:header="720" w:footer="432" w:gutter="0"/>
       <w:cols w:space="720"/>
@@ -8778,7 +9750,6 @@
     <w:name w:val="Hyperlink"/>
     <w:basedOn w:val="Fuentedeprrafopredeter"/>
     <w:uiPriority w:val="99"/>
-    <w:semiHidden/>
     <w:unhideWhenUsed/>
     <w:rsid w:val="00414F89"/>
     <w:rPr>
@@ -9287,6 +10258,18 @@
       <w:szCs w:val="44"/>
     </w:rPr>
   </w:style>
+  <w:style w:type="character" w:styleId="Mencinsinresolver">
+    <w:name w:val="Unresolved Mention"/>
+    <w:basedOn w:val="Fuentedeprrafopredeter"/>
+    <w:uiPriority w:val="99"/>
+    <w:semiHidden/>
+    <w:unhideWhenUsed/>
+    <w:rsid w:val="001E1029"/>
+    <w:rPr>
+      <w:color w:val="605E5C"/>
+      <w:shd w:val="clear" w:color="auto" w:fill="E1DFDD"/>
+    </w:rPr>
+  </w:style>
 </w:styles>
 </file>
 
@@ -9453,32 +10436,6 @@
         </w:p>
       </w:docPartBody>
     </w:docPart>
-    <w:docPart>
-      <w:docPartPr>
-        <w:name w:val="54E40328D5D64C90A6EF8250521A599A"/>
-        <w:category>
-          <w:name w:val="General"/>
-          <w:gallery w:val="placeholder"/>
-        </w:category>
-        <w:types>
-          <w:type w:val="bbPlcHdr"/>
-        </w:types>
-        <w:behaviors>
-          <w:behavior w:val="content"/>
-        </w:behaviors>
-        <w:guid w:val="{E685C75D-C22D-41A7-B1CE-9A23FAD5ADFC}"/>
-      </w:docPartPr>
-      <w:docPartBody>
-        <w:p>
-          <w:pPr>
-            <w:pStyle w:val="54E40328D5D64C90A6EF8250521A599A"/>
-          </w:pPr>
-          <w:r>
-            <w:t>Una recorrido de riesgo y recompensa</w:t>
-          </w:r>
-        </w:p>
-      </w:docPartBody>
-    </w:docPart>
   </w:docParts>
 </w:glossaryDocument>
 </file>
@@ -9844,6 +10801,7 @@
     <w:rsid w:val="000F4AE6"/>
     <w:rsid w:val="00121E48"/>
     <w:rsid w:val="001227FE"/>
+    <w:rsid w:val="0015202A"/>
     <w:rsid w:val="00292F68"/>
     <w:rsid w:val="00320DC9"/>
     <w:rsid w:val="00352D52"/>
@@ -9860,12 +10818,14 @@
     <w:rsid w:val="00721ADF"/>
     <w:rsid w:val="00880F52"/>
     <w:rsid w:val="008C0080"/>
+    <w:rsid w:val="0098294F"/>
     <w:rsid w:val="00A80C9D"/>
     <w:rsid w:val="00A86F88"/>
     <w:rsid w:val="00B0134D"/>
     <w:rsid w:val="00B506B8"/>
     <w:rsid w:val="00BD20EB"/>
     <w:rsid w:val="00C45535"/>
+    <w:rsid w:val="00C6441D"/>
     <w:rsid w:val="00D35DB1"/>
     <w:rsid w:val="00DD07E3"/>
     <w:rsid w:val="00E5104D"/>
@@ -10603,6 +11563,18 @@
       <w14:ligatures w14:val="standardContextual"/>
     </w:rPr>
   </w:style>
+  <w:style w:type="paragraph" w:customStyle="1" w:styleId="249DCEDF696348DBAAA48900D223A903">
+    <w:name w:val="249DCEDF696348DBAAA48900D223A903"/>
+    <w:rsid w:val="0098294F"/>
+    <w:pPr>
+      <w:spacing w:after="160" w:line="278" w:lineRule="auto"/>
+    </w:pPr>
+    <w:rPr>
+      <w:kern w:val="2"/>
+      <w:lang w:eastAsia="es-ES"/>
+      <w14:ligatures w14:val="standardContextual"/>
+    </w:rPr>
+  </w:style>
 </w:styles>
 </file>
 
@@ -10815,10 +11787,6 @@
 </file>
 
 <file path=customXml/item1.xml><?xml version="1.0" encoding="utf-8"?>
-<b:Sources xmlns:b="http://schemas.openxmlformats.org/officeDocument/2006/bibliography" xmlns="http://schemas.openxmlformats.org/officeDocument/2006/bibliography" SelectedStyle="/APASixthEditionOfficeOnline.xsl" StyleName="APA" Version="6"/>
-</file>
-
-<file path=customXml/item2.xml><?xml version="1.0" encoding="utf-8"?>
 <p:properties xmlns:p="http://schemas.microsoft.com/office/2006/metadata/properties" xmlns:xsi="http://www.w3.org/2001/XMLSchema-instance" xmlns:pc="http://schemas.microsoft.com/office/infopath/2007/PartnerControls">
   <documentManagement>
     <_ip_UnifiedCompliancePolicyUIAction xmlns="http://schemas.microsoft.com/sharepoint/v3" xsi:nil="true"/>
@@ -10838,16 +11806,11 @@
 </p:properties>
 </file>
 
-<file path=customXml/item3.xml><?xml version="1.0" encoding="utf-8"?>
-<?mso-contentType ?>
-<FormTemplates xmlns="http://schemas.microsoft.com/sharepoint/v3/contenttype/forms">
-  <Display>DocumentLibraryForm</Display>
-  <Edit>DocumentLibraryForm</Edit>
-  <New>DocumentLibraryForm</New>
-</FormTemplates>
+<file path=customXml/item2.xml><?xml version="1.0" encoding="utf-8"?>
+<b:Sources xmlns:b="http://schemas.openxmlformats.org/officeDocument/2006/bibliography" xmlns="http://schemas.openxmlformats.org/officeDocument/2006/bibliography" SelectedStyle="/APASixthEditionOfficeOnline.xsl" StyleName="APA" Version="6"/>
 </file>
 
-<file path=customXml/item4.xml><?xml version="1.0" encoding="utf-8"?>
+<file path=customXml/item3.xml><?xml version="1.0" encoding="utf-8"?>
 <ct:contentTypeSchema xmlns:ct="http://schemas.microsoft.com/office/2006/metadata/contentType" xmlns:ma="http://schemas.microsoft.com/office/2006/metadata/properties/metaAttributes" ct:_="" ma:_="" ma:contentTypeName="Document" ma:contentTypeID="0x01010079F111ED35F8CC479449609E8A0923A6" ma:contentTypeVersion="26" ma:contentTypeDescription="Create a new document." ma:contentTypeScope="" ma:versionID="ac37c1753acd5e330d2062ccec26ea66">
   <xsd:schema xmlns:xsd="http://www.w3.org/2001/XMLSchema" xmlns:xs="http://www.w3.org/2001/XMLSchema" xmlns:p="http://schemas.microsoft.com/office/2006/metadata/properties" xmlns:ns1="http://schemas.microsoft.com/sharepoint/v3" xmlns:ns2="71af3243-3dd4-4a8d-8c0d-dd76da1f02a5" xmlns:ns3="16c05727-aa75-4e4a-9b5f-8a80a1165891" xmlns:ns4="230e9df3-be65-4c73-a93b-d1236ebd677e" targetNamespace="http://schemas.microsoft.com/office/2006/metadata/properties" ma:root="true" ma:fieldsID="3b340c7101c92c5120abd06486f94548" ns1:_="" ns2:_="" ns3:_="" ns4:_="">
     <xsd:import namespace="http://schemas.microsoft.com/sharepoint/v3"/>
@@ -11147,15 +12110,16 @@
 </ct:contentTypeSchema>
 </file>
 
-<file path=customXml/itemProps1.xml><?xml version="1.0" encoding="utf-8"?>
-<ds:datastoreItem xmlns:ds="http://schemas.openxmlformats.org/officeDocument/2006/customXml" ds:itemID="{C36A12F8-4A9B-4F64-B978-B0EE1FD97EBF}">
-  <ds:schemaRefs>
-    <ds:schemaRef ds:uri="http://schemas.openxmlformats.org/officeDocument/2006/bibliography"/>
-  </ds:schemaRefs>
-</ds:datastoreItem>
+<file path=customXml/item4.xml><?xml version="1.0" encoding="utf-8"?>
+<?mso-contentType ?>
+<FormTemplates xmlns="http://schemas.microsoft.com/sharepoint/v3/contenttype/forms">
+  <Display>DocumentLibraryForm</Display>
+  <Edit>DocumentLibraryForm</Edit>
+  <New>DocumentLibraryForm</New>
+</FormTemplates>
 </file>
 
-<file path=customXml/itemProps2.xml><?xml version="1.0" encoding="utf-8"?>
+<file path=customXml/itemProps1.xml><?xml version="1.0" encoding="utf-8"?>
 <ds:datastoreItem xmlns:ds="http://schemas.openxmlformats.org/officeDocument/2006/customXml" ds:itemID="{E046B6FE-75F5-4A4A-ADF9-3D55C2808F6A}">
   <ds:schemaRefs>
     <ds:schemaRef ds:uri="http://schemas.microsoft.com/office/2006/metadata/properties"/>
@@ -11167,15 +12131,15 @@
 </ds:datastoreItem>
 </file>
 
-<file path=customXml/itemProps3.xml><?xml version="1.0" encoding="utf-8"?>
-<ds:datastoreItem xmlns:ds="http://schemas.openxmlformats.org/officeDocument/2006/customXml" ds:itemID="{268A88EA-2CD1-4EB5-AD27-A1454BEC753F}">
+<file path=customXml/itemProps2.xml><?xml version="1.0" encoding="utf-8"?>
+<ds:datastoreItem xmlns:ds="http://schemas.openxmlformats.org/officeDocument/2006/customXml" ds:itemID="{C36A12F8-4A9B-4F64-B978-B0EE1FD97EBF}">
   <ds:schemaRefs>
-    <ds:schemaRef ds:uri="http://schemas.microsoft.com/sharepoint/v3/contenttype/forms"/>
+    <ds:schemaRef ds:uri="http://schemas.openxmlformats.org/officeDocument/2006/bibliography"/>
   </ds:schemaRefs>
 </ds:datastoreItem>
 </file>
 
-<file path=customXml/itemProps4.xml><?xml version="1.0" encoding="utf-8"?>
+<file path=customXml/itemProps3.xml><?xml version="1.0" encoding="utf-8"?>
 <ds:datastoreItem xmlns:ds="http://schemas.openxmlformats.org/officeDocument/2006/customXml" ds:itemID="{3B486F6C-1123-466C-A9D5-986F0A3EF9D1}">
   <ds:schemaRefs>
     <ds:schemaRef ds:uri="http://schemas.microsoft.com/office/2006/metadata/contentType"/>
@@ -11196,6 +12160,14 @@
 </ds:datastoreItem>
 </file>
 
+<file path=customXml/itemProps4.xml><?xml version="1.0" encoding="utf-8"?>
+<ds:datastoreItem xmlns:ds="http://schemas.openxmlformats.org/officeDocument/2006/customXml" ds:itemID="{268A88EA-2CD1-4EB5-AD27-A1454BEC753F}">
+  <ds:schemaRefs>
+    <ds:schemaRef ds:uri="http://schemas.microsoft.com/sharepoint/v3/contenttype/forms"/>
+  </ds:schemaRefs>
+</ds:datastoreItem>
+</file>
+
 <file path=docMetadata/LabelInfo.xml><?xml version="1.0" encoding="utf-8"?>
 <clbl:labelList xmlns:clbl="http://schemas.microsoft.com/office/2020/mipLabelMetadata"/>
 </file>
</xml_diff>

<commit_message>
FINALIZADO, SOLO FALTA REPASO
</commit_message>
<xml_diff>
--- a/SONAURA.docx
+++ b/SONAURA.docx
@@ -826,6 +826,7 @@
           <w:showingPlcHdr/>
           <w15:appearance w15:val="hidden"/>
         </w:sdtPr>
+        <w:sdtEndPr/>
         <w:sdtContent>
           <w:r>
             <w:rPr>
@@ -866,7 +867,7 @@
       </w:tblGrid>
       <w:tr>
         <w:trPr>
-          <w:trHeight w:val="1872"/>
+          <w:trHeight w:val="3310"/>
         </w:trPr>
         <w:tc>
           <w:tcPr>
@@ -896,6 +897,75 @@
             </w:pPr>
             <w:r>
               <w:t>INTRODUCCIÓN</w:t>
+            </w:r>
+          </w:p>
+          <w:p>
+            <w:pPr>
+              <w:pStyle w:val="TItledeTDC"/>
+              <w:rPr>
+                <w:sz w:val="24"/>
+                <w:szCs w:val="24"/>
+              </w:rPr>
+            </w:pPr>
+            <w:r>
+              <w:rPr>
+                <w:sz w:val="24"/>
+                <w:szCs w:val="24"/>
+              </w:rPr>
+              <w:t xml:space="preserve">  </w:t>
+            </w:r>
+            <w:r>
+              <w:rPr>
+                <w:sz w:val="24"/>
+                <w:szCs w:val="24"/>
+              </w:rPr>
+              <w:t>nECESIDADES DEL ENTORNO</w:t>
+            </w:r>
+          </w:p>
+          <w:p>
+            <w:pPr>
+              <w:pStyle w:val="TItledeTDC"/>
+              <w:rPr>
+                <w:sz w:val="24"/>
+                <w:szCs w:val="24"/>
+              </w:rPr>
+            </w:pPr>
+            <w:r>
+              <w:rPr>
+                <w:sz w:val="24"/>
+                <w:szCs w:val="24"/>
+              </w:rPr>
+              <w:t xml:space="preserve">  </w:t>
+            </w:r>
+            <w:r>
+              <w:rPr>
+                <w:sz w:val="24"/>
+                <w:szCs w:val="24"/>
+              </w:rPr>
+              <w:t>sOLUCIÓN EXISTENTE</w:t>
+            </w:r>
+          </w:p>
+          <w:p>
+            <w:pPr>
+              <w:pStyle w:val="TItledeTDC"/>
+              <w:rPr>
+                <w:sz w:val="24"/>
+                <w:szCs w:val="24"/>
+              </w:rPr>
+            </w:pPr>
+            <w:r>
+              <w:rPr>
+                <w:sz w:val="24"/>
+                <w:szCs w:val="24"/>
+              </w:rPr>
+              <w:t xml:space="preserve">  </w:t>
+            </w:r>
+            <w:r>
+              <w:rPr>
+                <w:sz w:val="24"/>
+                <w:szCs w:val="24"/>
+              </w:rPr>
+              <w:t>SOLUCIÓN SELECCIONADA</w:t>
             </w:r>
           </w:p>
         </w:tc>
@@ -938,6 +1008,204 @@
             </w:pPr>
             <w:r>
               <w:t>ESPECIFICACIÓN, GUIAS Y PLANIFICACIÓN</w:t>
+            </w:r>
+          </w:p>
+          <w:p>
+            <w:pPr>
+              <w:pStyle w:val="TItledeTDC"/>
+              <w:rPr>
+                <w:sz w:val="24"/>
+                <w:szCs w:val="24"/>
+              </w:rPr>
+            </w:pPr>
+            <w:r>
+              <w:rPr>
+                <w:sz w:val="24"/>
+                <w:szCs w:val="24"/>
+              </w:rPr>
+              <w:t xml:space="preserve">  </w:t>
+            </w:r>
+            <w:r>
+              <w:rPr>
+                <w:sz w:val="24"/>
+                <w:szCs w:val="24"/>
+              </w:rPr>
+              <w:t>IDENTIFICACIÓN DE NECESIDADES DEL CLIENTE</w:t>
+            </w:r>
+          </w:p>
+          <w:p>
+            <w:pPr>
+              <w:pStyle w:val="TItledeTDC"/>
+              <w:rPr>
+                <w:sz w:val="24"/>
+                <w:szCs w:val="24"/>
+              </w:rPr>
+            </w:pPr>
+            <w:r>
+              <w:rPr>
+                <w:sz w:val="24"/>
+                <w:szCs w:val="24"/>
+              </w:rPr>
+              <w:t xml:space="preserve">  </w:t>
+            </w:r>
+            <w:r>
+              <w:rPr>
+                <w:sz w:val="24"/>
+                <w:szCs w:val="24"/>
+              </w:rPr>
+              <w:t>REQUISITOS FUNCIONALES Y NO FUNCIONALES</w:t>
+            </w:r>
+            <w:r>
+              <w:rPr>
+                <w:sz w:val="24"/>
+                <w:szCs w:val="24"/>
+              </w:rPr>
+              <w:t xml:space="preserve"> </w:t>
+            </w:r>
+          </w:p>
+          <w:p>
+            <w:pPr>
+              <w:pStyle w:val="TItledeTDC"/>
+              <w:rPr>
+                <w:sz w:val="24"/>
+                <w:szCs w:val="24"/>
+              </w:rPr>
+            </w:pPr>
+            <w:r>
+              <w:rPr>
+                <w:sz w:val="24"/>
+                <w:szCs w:val="24"/>
+              </w:rPr>
+              <w:t xml:space="preserve">  </w:t>
+            </w:r>
+            <w:r>
+              <w:rPr>
+                <w:sz w:val="24"/>
+                <w:szCs w:val="24"/>
+              </w:rPr>
+              <w:t>DIAGRAMA DE CASOS DE USO</w:t>
+            </w:r>
+          </w:p>
+          <w:p>
+            <w:pPr>
+              <w:pStyle w:val="TItledeTDC"/>
+              <w:rPr>
+                <w:sz w:val="24"/>
+                <w:szCs w:val="24"/>
+              </w:rPr>
+            </w:pPr>
+            <w:r>
+              <w:rPr>
+                <w:sz w:val="24"/>
+                <w:szCs w:val="24"/>
+              </w:rPr>
+              <w:t xml:space="preserve">  </w:t>
+            </w:r>
+            <w:r>
+              <w:rPr>
+                <w:sz w:val="24"/>
+                <w:szCs w:val="24"/>
+              </w:rPr>
+              <w:t>DISEÑO DEL FRONTEND</w:t>
+            </w:r>
+          </w:p>
+          <w:p>
+            <w:pPr>
+              <w:pStyle w:val="TItledeTDC"/>
+              <w:rPr>
+                <w:sz w:val="24"/>
+                <w:szCs w:val="24"/>
+              </w:rPr>
+            </w:pPr>
+            <w:r>
+              <w:rPr>
+                <w:sz w:val="24"/>
+                <w:szCs w:val="24"/>
+              </w:rPr>
+              <w:t xml:space="preserve">  </w:t>
+            </w:r>
+            <w:r>
+              <w:rPr>
+                <w:sz w:val="24"/>
+                <w:szCs w:val="24"/>
+              </w:rPr>
+              <w:t>PRINCIPIOS DE USABILIDAD Y ACCESIBILIDAD</w:t>
+            </w:r>
+          </w:p>
+          <w:p>
+            <w:pPr>
+              <w:pStyle w:val="TItledeTDC"/>
+              <w:rPr>
+                <w:sz w:val="24"/>
+                <w:szCs w:val="24"/>
+              </w:rPr>
+            </w:pPr>
+            <w:r>
+              <w:rPr>
+                <w:sz w:val="24"/>
+                <w:szCs w:val="24"/>
+              </w:rPr>
+              <w:t xml:space="preserve">  </w:t>
+            </w:r>
+            <w:r>
+              <w:rPr>
+                <w:sz w:val="24"/>
+                <w:szCs w:val="24"/>
+              </w:rPr>
+              <w:t>DIAGRAMA DE GANTT CON TAREAS</w:t>
+            </w:r>
+          </w:p>
+          <w:p>
+            <w:pPr>
+              <w:pStyle w:val="TItledeTDC"/>
+              <w:rPr>
+                <w:sz w:val="24"/>
+                <w:szCs w:val="24"/>
+              </w:rPr>
+            </w:pPr>
+            <w:r>
+              <w:rPr>
+                <w:sz w:val="24"/>
+                <w:szCs w:val="24"/>
+              </w:rPr>
+              <w:t xml:space="preserve">  </w:t>
+            </w:r>
+            <w:r>
+              <w:rPr>
+                <w:sz w:val="24"/>
+                <w:szCs w:val="24"/>
+              </w:rPr>
+              <w:t>RECURSOS MATERIALES Y HUMANOS</w:t>
+            </w:r>
+            <w:r>
+              <w:rPr>
+                <w:sz w:val="24"/>
+                <w:szCs w:val="24"/>
+              </w:rPr>
+              <w:t xml:space="preserve"> </w:t>
+            </w:r>
+          </w:p>
+          <w:p>
+            <w:pPr>
+              <w:pStyle w:val="TItledeTDC"/>
+              <w:rPr>
+                <w:sz w:val="24"/>
+                <w:szCs w:val="24"/>
+              </w:rPr>
+            </w:pPr>
+            <w:r>
+              <w:rPr>
+                <w:sz w:val="24"/>
+                <w:szCs w:val="24"/>
+              </w:rPr>
+              <w:t xml:space="preserve">  </w:t>
+            </w:r>
+            <w:r>
+              <w:rPr>
+                <w:sz w:val="24"/>
+                <w:szCs w:val="24"/>
+              </w:rPr>
+              <w:t>PRESUPUESTO ESTIMADO</w:t>
             </w:r>
           </w:p>
         </w:tc>
@@ -1182,6 +1450,7 @@
                 </w:placeholder>
                 <w15:appearance w15:val="hidden"/>
               </w:sdtPr>
+              <w:sdtEndPr/>
               <w:sdtContent>
                 <w:r>
                   <w:rPr>
@@ -1229,6 +1498,7 @@
                 </w:placeholder>
                 <w15:appearance w15:val="hidden"/>
               </w:sdtPr>
+              <w:sdtEndPr/>
               <w:sdtContent>
                 <w:r>
                   <w:t>SOBRE LA APLICACIÓN WEB</w:t>
@@ -1304,8 +1574,7 @@
               </w:sdtPr>
               <w:sdtEndPr>
                 <w:rPr>
-                  <w:sz w:val="28"/>
-                  <w:szCs w:val="28"/>
+                  <w:sz w:val="24"/>
                 </w:rPr>
               </w:sdtEndPr>
               <w:sdtContent>
@@ -1320,8 +1589,7 @@
                 </w:r>
                 <w:r>
                   <w:rPr>
-                    <w:sz w:val="28"/>
-                    <w:szCs w:val="28"/>
+                    <w:sz w:val="24"/>
                   </w:rPr>
                   <w:t>Hoy en día, antes de ver una película o serie, es común buscar información para asegurarnos de que sea una buena elección.</w:t>
                 </w:r>
@@ -1329,50 +1597,43 @@
             </w:sdt>
             <w:r>
               <w:rPr>
-                <w:sz w:val="28"/>
-                <w:szCs w:val="28"/>
+                <w:sz w:val="24"/>
               </w:rPr>
               <w:t xml:space="preserve"> </w:t>
             </w:r>
             <w:r>
               <w:rPr>
-                <w:sz w:val="28"/>
-                <w:szCs w:val="28"/>
+                <w:sz w:val="24"/>
               </w:rPr>
               <w:t xml:space="preserve">Muchas veces tendemos a buscar </w:t>
             </w:r>
             <w:r>
               <w:rPr>
-                <w:sz w:val="28"/>
-                <w:szCs w:val="28"/>
+                <w:sz w:val="24"/>
               </w:rPr>
               <w:t>inspiración o recomendaciones sobre lo que ver en páginas anticuadas y antiguas en internet, pero la mayoría de las vece</w:t>
             </w:r>
             <w:r>
               <w:rPr>
-                <w:sz w:val="28"/>
-                <w:szCs w:val="28"/>
+                <w:sz w:val="24"/>
               </w:rPr>
               <w:t>s</w:t>
             </w:r>
             <w:r>
               <w:rPr>
-                <w:sz w:val="28"/>
-                <w:szCs w:val="28"/>
+                <w:sz w:val="24"/>
               </w:rPr>
               <w:t xml:space="preserve"> no conseguimos solucionar nuestr</w:t>
             </w:r>
             <w:r>
               <w:rPr>
-                <w:sz w:val="28"/>
-                <w:szCs w:val="28"/>
+                <w:sz w:val="24"/>
               </w:rPr>
               <w:t>a problemática</w:t>
             </w:r>
             <w:r>
               <w:rPr>
-                <w:sz w:val="28"/>
-                <w:szCs w:val="28"/>
+                <w:sz w:val="24"/>
               </w:rPr>
               <w:t>.</w:t>
             </w:r>
@@ -1413,91 +1674,78 @@
           <w:p>
             <w:pPr>
               <w:rPr>
-                <w:sz w:val="28"/>
-                <w:szCs w:val="28"/>
+                <w:sz w:val="24"/>
               </w:rPr>
             </w:pPr>
             <w:r>
               <w:rPr>
-                <w:sz w:val="28"/>
-                <w:szCs w:val="28"/>
+                <w:sz w:val="24"/>
               </w:rPr>
               <w:t xml:space="preserve">Actualmente, </w:t>
             </w:r>
             <w:r>
               <w:rPr>
-                <w:sz w:val="28"/>
-                <w:szCs w:val="28"/>
+                <w:sz w:val="24"/>
               </w:rPr>
               <w:t>existen diversas plataformas que intentan resolver esta necesidad</w:t>
             </w:r>
             <w:r>
               <w:rPr>
-                <w:sz w:val="28"/>
-                <w:szCs w:val="28"/>
+                <w:sz w:val="24"/>
               </w:rPr>
               <w:t xml:space="preserve"> como comunidades en redes sociales, foros especializado</w:t>
             </w:r>
             <w:r>
               <w:rPr>
-                <w:sz w:val="28"/>
-                <w:szCs w:val="28"/>
+                <w:sz w:val="24"/>
               </w:rPr>
               <w:t>s, ofreciendo reseñas, puntuaciones,</w:t>
             </w:r>
             <w:r>
               <w:rPr>
-                <w:sz w:val="28"/>
-                <w:szCs w:val="28"/>
+                <w:sz w:val="24"/>
               </w:rPr>
               <w:t xml:space="preserve"> </w:t>
             </w:r>
             <w:r>
               <w:rPr>
-                <w:sz w:val="28"/>
-                <w:szCs w:val="28"/>
+                <w:sz w:val="24"/>
               </w:rPr>
               <w:t xml:space="preserve">críticas profesionales y opiniones de usuarios. Sin embargo, muchas de estas páginas </w:t>
             </w:r>
             <w:r>
               <w:rPr>
-                <w:sz w:val="28"/>
-                <w:szCs w:val="28"/>
+                <w:sz w:val="24"/>
               </w:rPr>
               <w:t>tienen interfaces poco intuitivas</w:t>
             </w:r>
             <w:r>
               <w:rPr>
-                <w:sz w:val="28"/>
-                <w:szCs w:val="28"/>
+                <w:sz w:val="24"/>
               </w:rPr>
               <w:t xml:space="preserve"> o</w:t>
             </w:r>
             <w:r>
               <w:rPr>
-                <w:sz w:val="28"/>
-                <w:szCs w:val="28"/>
+                <w:sz w:val="24"/>
               </w:rPr>
               <w:t xml:space="preserve"> saturadas de publicidad</w:t>
             </w:r>
             <w:r>
               <w:rPr>
-                <w:sz w:val="28"/>
-                <w:szCs w:val="28"/>
+                <w:sz w:val="24"/>
               </w:rPr>
               <w:t xml:space="preserve">. Además </w:t>
             </w:r>
             <w:r>
               <w:rPr>
-                <w:sz w:val="28"/>
-                <w:szCs w:val="28"/>
+                <w:sz w:val="24"/>
               </w:rPr>
               <w:t xml:space="preserve">de contar con un contenido demasiado técnico y un contenido incapaz de estas actualizándose </w:t>
             </w:r>
             <w:r>
               <w:rPr>
-                <w:sz w:val="28"/>
-                <w:szCs w:val="28"/>
+                <w:sz w:val="24"/>
               </w:rPr>
               <w:t>constantemente, lo que dificulta una elección rápida y accesible para un usuario común.</w:t>
             </w:r>
@@ -1505,31 +1753,47 @@
           <w:p>
             <w:pPr>
               <w:rPr>
-                <w:sz w:val="28"/>
-                <w:szCs w:val="28"/>
+                <w:sz w:val="24"/>
               </w:rPr>
             </w:pPr>
             <w:r>
               <w:rPr>
-                <w:sz w:val="28"/>
-                <w:szCs w:val="28"/>
+                <w:sz w:val="24"/>
               </w:rPr>
               <w:t xml:space="preserve">Por tanto, aunque existan soluciones, estas no terminan de cubrir de forma efectiva la necesidad de una guía confiable, visualmente atractiva y adaptada a los hábitos actuales de consumo de </w:t>
             </w:r>
             <w:r>
               <w:rPr>
-                <w:sz w:val="28"/>
-                <w:szCs w:val="28"/>
+                <w:sz w:val="24"/>
               </w:rPr>
               <w:t>entretenimiento</w:t>
             </w:r>
             <w:r>
               <w:rPr>
-                <w:sz w:val="28"/>
-                <w:szCs w:val="28"/>
+                <w:sz w:val="24"/>
               </w:rPr>
               <w:t>.</w:t>
             </w:r>
+          </w:p>
+          <w:p>
+            <w:pPr>
+              <w:rPr>
+                <w:b/>
+                <w:bCs/>
+                <w:sz w:val="32"/>
+                <w:szCs w:val="32"/>
+              </w:rPr>
+            </w:pPr>
+          </w:p>
+          <w:p>
+            <w:pPr>
+              <w:rPr>
+                <w:b/>
+                <w:bCs/>
+                <w:sz w:val="32"/>
+                <w:szCs w:val="32"/>
+              </w:rPr>
+            </w:pPr>
           </w:p>
           <w:p>
             <w:pPr>
@@ -1606,14 +1870,12 @@
             <w:pPr>
               <w:spacing w:after="240"/>
               <w:rPr>
-                <w:sz w:val="28"/>
-                <w:szCs w:val="28"/>
+                <w:sz w:val="24"/>
               </w:rPr>
             </w:pPr>
             <w:r>
               <w:rPr>
-                <w:sz w:val="28"/>
-                <w:szCs w:val="28"/>
+                <w:sz w:val="24"/>
               </w:rPr>
               <w:t>Nuestro equipo ha identificado que dedicamos una parte considerable de nuestra rutina a decidir qué ver, por lo que surgió la idea de crear un blog que facilite esta tarea y ayude a los usuarios a tomar mejores decisiones de entretenimiento.</w:t>
             </w:r>
@@ -1622,63 +1884,61 @@
             <w:pPr>
               <w:spacing w:after="240"/>
               <w:rPr>
-                <w:sz w:val="28"/>
-                <w:szCs w:val="28"/>
+                <w:sz w:val="24"/>
               </w:rPr>
             </w:pPr>
             <w:r>
               <w:rPr>
-                <w:sz w:val="28"/>
-                <w:szCs w:val="28"/>
+                <w:sz w:val="24"/>
               </w:rPr>
               <w:t>La aplicación será un blog donde los usuarios podrán informarse, valorar y opinar sobre una amplia variedad de películas y series, cada una con su propio apartado. Además, ofreceremos funcionalidades mejoradas mediante una suscripción mensual, que incluirá acceso exclusivo a listas personalizadas y un calendario de estrenos.</w:t>
             </w:r>
           </w:p>
-          <w:p/>
+          <w:p>
+            <w:pPr>
+              <w:rPr>
+                <w:sz w:val="24"/>
+              </w:rPr>
+            </w:pPr>
+          </w:p>
           <w:p>
             <w:pPr>
               <w:spacing w:after="240"/>
               <w:rPr>
-                <w:sz w:val="28"/>
-                <w:szCs w:val="28"/>
+                <w:sz w:val="24"/>
               </w:rPr>
             </w:pPr>
             <w:r>
               <w:rPr>
-                <w:sz w:val="28"/>
-                <w:szCs w:val="28"/>
+                <w:sz w:val="24"/>
               </w:rPr>
               <w:t xml:space="preserve">La página de inicio mostrará un Top 5 de las películas o series mejor valoradas, junto con una barra de navegación con enlaces a las categorías de películas, series, inicio, </w:t>
             </w:r>
             <w:proofErr w:type="spellStart"/>
             <w:r>
               <w:rPr>
-                <w:sz w:val="28"/>
-                <w:szCs w:val="28"/>
+                <w:sz w:val="24"/>
               </w:rPr>
               <w:t>login</w:t>
             </w:r>
             <w:proofErr w:type="spellEnd"/>
             <w:r>
               <w:rPr>
-                <w:sz w:val="28"/>
-                <w:szCs w:val="28"/>
+                <w:sz w:val="24"/>
               </w:rPr>
               <w:t xml:space="preserve"> y </w:t>
             </w:r>
             <w:proofErr w:type="spellStart"/>
             <w:r>
               <w:rPr>
-                <w:sz w:val="28"/>
-                <w:szCs w:val="28"/>
+                <w:sz w:val="24"/>
               </w:rPr>
               <w:t>logout</w:t>
             </w:r>
             <w:proofErr w:type="spellEnd"/>
             <w:r>
               <w:rPr>
-                <w:sz w:val="28"/>
-                <w:szCs w:val="28"/>
+                <w:sz w:val="24"/>
               </w:rPr>
               <w:t>. También contará con una sección de noticias con novedades del mundo del cine y las series, entrevistas y recomendaciones semanales para mantener a los usuarios informados sobre los últimos estrenos y tendencias.</w:t>
             </w:r>
@@ -1719,13 +1979,13 @@
         <mc:AlternateContent>
           <mc:Choice Requires="wps">
             <w:drawing>
-              <wp:anchor distT="0" distB="0" distL="114300" distR="114300" simplePos="0" relativeHeight="251675648" behindDoc="1" locked="1" layoutInCell="1" allowOverlap="1" wp14:anchorId="4FBFBBF7" wp14:editId="5B73620D">
+              <wp:anchor distT="0" distB="0" distL="114300" distR="114300" simplePos="0" relativeHeight="251675648" behindDoc="1" locked="1" layoutInCell="1" allowOverlap="1" wp14:anchorId="4FBFBBF7" wp14:editId="7A3F3518">
                 <wp:simplePos x="0" y="0"/>
                 <wp:positionH relativeFrom="page">
                   <wp:align>left</wp:align>
                 </wp:positionH>
                 <wp:positionV relativeFrom="paragraph">
-                  <wp:posOffset>-6377940</wp:posOffset>
+                  <wp:posOffset>-6080125</wp:posOffset>
                 </wp:positionV>
                 <wp:extent cx="1377315" cy="10888980"/>
                 <wp:effectExtent l="0" t="0" r="0" b="7620"/>
@@ -1745,7 +2005,7 @@
                       <wps:spPr>
                         <a:xfrm>
                           <a:off x="0" y="0"/>
-                          <a:ext cx="1377538" cy="10888980"/>
+                          <a:ext cx="1377315" cy="10888980"/>
                         </a:xfrm>
                         <a:prstGeom prst="rect">
                           <a:avLst/>
@@ -1811,7 +2071,7 @@
           </mc:Choice>
           <mc:Fallback>
             <w:pict>
-              <v:rect w14:anchorId="4FBFBBF7" id="_x0000_s1031" alt="&quot;&quot;" style="position:absolute;left:0;text-align:left;margin-left:0;margin-top:-502.2pt;width:108.45pt;height:857.4pt;z-index:-251640832;visibility:visible;mso-wrap-style:square;mso-width-percent:0;mso-height-percent:0;mso-wrap-distance-left:9pt;mso-wrap-distance-top:0;mso-wrap-distance-right:9pt;mso-wrap-distance-bottom:0;mso-position-horizontal:left;mso-position-horizontal-relative:page;mso-position-vertical:absolute;mso-position-vertical-relative:text;mso-width-percent:0;mso-height-percent:0;mso-width-relative:margin;mso-height-relative:margin;v-text-anchor:bottom" o:gfxdata="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" fillcolor="#404040 [2429]" stroked="f" strokeweight="1pt">
+              <v:rect w14:anchorId="4FBFBBF7" id="_x0000_s1031" alt="&quot;&quot;" style="position:absolute;left:0;text-align:left;margin-left:0;margin-top:-478.75pt;width:108.45pt;height:857.4pt;z-index:-251640832;visibility:visible;mso-wrap-style:square;mso-width-percent:0;mso-height-percent:0;mso-wrap-distance-left:9pt;mso-wrap-distance-top:0;mso-wrap-distance-right:9pt;mso-wrap-distance-bottom:0;mso-position-horizontal:left;mso-position-horizontal-relative:page;mso-position-vertical:absolute;mso-position-vertical-relative:text;mso-width-percent:0;mso-height-percent:0;mso-width-relative:margin;mso-height-relative:margin;v-text-anchor:bottom" o:gfxdata="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" fillcolor="#404040 [2429]" stroked="f" strokeweight="1pt">
                 <v:textbox>
                   <w:txbxContent>
                     <w:p>
@@ -1921,6 +2181,7 @@
                 </w:placeholder>
                 <w15:appearance w15:val="hidden"/>
               </w:sdtPr>
+              <w:sdtEndPr/>
               <w:sdtContent>
                 <w:r>
                   <w:rPr>
@@ -2107,13 +2368,13 @@
         <mc:AlternateContent>
           <mc:Choice Requires="wps">
             <w:drawing>
-              <wp:anchor distT="0" distB="0" distL="114300" distR="114300" simplePos="0" relativeHeight="251699200" behindDoc="1" locked="1" layoutInCell="1" allowOverlap="1" wp14:anchorId="760E21C5" wp14:editId="06F57880">
+              <wp:anchor distT="0" distB="0" distL="114300" distR="114300" simplePos="0" relativeHeight="251699200" behindDoc="1" locked="1" layoutInCell="1" allowOverlap="1" wp14:anchorId="760E21C5" wp14:editId="66864154">
                 <wp:simplePos x="0" y="0"/>
                 <wp:positionH relativeFrom="page">
                   <wp:align>left</wp:align>
                 </wp:positionH>
                 <wp:positionV relativeFrom="paragraph">
-                  <wp:posOffset>-5078730</wp:posOffset>
+                  <wp:posOffset>-5361940</wp:posOffset>
                 </wp:positionV>
                 <wp:extent cx="1323975" cy="10828020"/>
                 <wp:effectExtent l="0" t="0" r="9525" b="0"/>
@@ -2200,7 +2461,7 @@
           </mc:Choice>
           <mc:Fallback>
             <w:pict>
-              <v:rect w14:anchorId="760E21C5" id="_x0000_s1032" alt="&quot;&quot;" style="position:absolute;left:0;text-align:left;margin-left:0;margin-top:-399.9pt;width:104.25pt;height:852.6pt;z-index:-251617280;visibility:visible;mso-wrap-style:square;mso-width-percent:0;mso-height-percent:0;mso-wrap-distance-left:9pt;mso-wrap-distance-top:0;mso-wrap-distance-right:9pt;mso-wrap-distance-bottom:0;mso-position-horizontal:left;mso-position-horizontal-relative:page;mso-position-vertical:absolute;mso-position-vertical-relative:text;mso-width-percent:0;mso-height-percent:0;mso-width-relative:margin;mso-height-relative:margin;v-text-anchor:bottom" o:gfxdata="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" fillcolor="#404040 [2429]" stroked="f" strokeweight="1pt">
+              <v:rect w14:anchorId="760E21C5" id="_x0000_s1032" alt="&quot;&quot;" style="position:absolute;left:0;text-align:left;margin-left:0;margin-top:-422.2pt;width:104.25pt;height:852.6pt;z-index:-251617280;visibility:visible;mso-wrap-style:square;mso-width-percent:0;mso-height-percent:0;mso-wrap-distance-left:9pt;mso-wrap-distance-top:0;mso-wrap-distance-right:9pt;mso-wrap-distance-bottom:0;mso-position-horizontal:left;mso-position-horizontal-relative:page;mso-position-vertical:absolute;mso-position-vertical-relative:text;mso-width-percent:0;mso-height-percent:0;mso-width-relative:margin;mso-height-relative:margin;v-text-anchor:bottom" o:gfxdata="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" fillcolor="#404040 [2429]" stroked="f" strokeweight="1pt">
                 <v:textbox>
                   <w:txbxContent>
                     <w:p>
@@ -2393,13 +2654,13 @@
         <mc:AlternateContent>
           <mc:Choice Requires="wps">
             <w:drawing>
-              <wp:anchor distT="0" distB="0" distL="114300" distR="114300" simplePos="0" relativeHeight="251682816" behindDoc="1" locked="1" layoutInCell="1" allowOverlap="1" wp14:anchorId="0B38A93A" wp14:editId="758C615C">
+              <wp:anchor distT="0" distB="0" distL="114300" distR="114300" simplePos="0" relativeHeight="251682816" behindDoc="1" locked="1" layoutInCell="1" allowOverlap="1" wp14:anchorId="0B38A93A" wp14:editId="4B2B7E17">
                 <wp:simplePos x="0" y="0"/>
                 <wp:positionH relativeFrom="page">
                   <wp:posOffset>-635</wp:posOffset>
                 </wp:positionH>
                 <wp:positionV relativeFrom="paragraph">
-                  <wp:posOffset>-608965</wp:posOffset>
+                  <wp:posOffset>-818515</wp:posOffset>
                 </wp:positionV>
                 <wp:extent cx="1323975" cy="10828020"/>
                 <wp:effectExtent l="0" t="0" r="9525" b="0"/>
@@ -2486,7 +2747,7 @@
           </mc:Choice>
           <mc:Fallback>
             <w:pict>
-              <v:rect w14:anchorId="0B38A93A" id="_x0000_s1033" alt="&quot;&quot;" style="position:absolute;left:0;text-align:left;margin-left:-.05pt;margin-top:-47.95pt;width:104.25pt;height:852.6pt;z-index:-251633664;visibility:visible;mso-wrap-style:square;mso-width-percent:0;mso-height-percent:0;mso-wrap-distance-left:9pt;mso-wrap-distance-top:0;mso-wrap-distance-right:9pt;mso-wrap-distance-bottom:0;mso-position-horizontal:absolute;mso-position-horizontal-relative:page;mso-position-vertical:absolute;mso-position-vertical-relative:text;mso-width-percent:0;mso-height-percent:0;mso-width-relative:margin;mso-height-relative:margin;v-text-anchor:bottom" o:gfxdata="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" fillcolor="#404040 [2429]" stroked="f" strokeweight="1pt">
+              <v:rect w14:anchorId="0B38A93A" id="_x0000_s1033" alt="&quot;&quot;" style="position:absolute;left:0;text-align:left;margin-left:-.05pt;margin-top:-64.45pt;width:104.25pt;height:852.6pt;z-index:-251633664;visibility:visible;mso-wrap-style:square;mso-width-percent:0;mso-height-percent:0;mso-wrap-distance-left:9pt;mso-wrap-distance-top:0;mso-wrap-distance-right:9pt;mso-wrap-distance-bottom:0;mso-position-horizontal:absolute;mso-position-horizontal-relative:page;mso-position-vertical:absolute;mso-position-vertical-relative:text;mso-width-percent:0;mso-height-percent:0;mso-width-relative:margin;mso-height-relative:margin;v-text-anchor:bottom" o:gfxdata="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" fillcolor="#404040 [2429]" stroked="f" strokeweight="1pt">
                 <v:textbox>
                   <w:txbxContent>
                     <w:p>
@@ -2835,13 +3096,13 @@
         <mc:AlternateContent>
           <mc:Choice Requires="wps">
             <w:drawing>
-              <wp:anchor distT="0" distB="0" distL="114300" distR="114300" simplePos="0" relativeHeight="251688960" behindDoc="1" locked="1" layoutInCell="1" allowOverlap="1" wp14:anchorId="66879EF5" wp14:editId="637A441D">
+              <wp:anchor distT="0" distB="0" distL="114300" distR="114300" simplePos="0" relativeHeight="251688960" behindDoc="1" locked="1" layoutInCell="1" allowOverlap="1" wp14:anchorId="66879EF5" wp14:editId="7836B435">
                 <wp:simplePos x="0" y="0"/>
                 <wp:positionH relativeFrom="page">
                   <wp:align>left</wp:align>
                 </wp:positionH>
                 <wp:positionV relativeFrom="paragraph">
-                  <wp:posOffset>-1303020</wp:posOffset>
+                  <wp:posOffset>-1474470</wp:posOffset>
                 </wp:positionV>
                 <wp:extent cx="1323975" cy="10828020"/>
                 <wp:effectExtent l="0" t="0" r="9525" b="0"/>
@@ -2928,7 +3189,7 @@
           </mc:Choice>
           <mc:Fallback>
             <w:pict>
-              <v:rect w14:anchorId="66879EF5" id="_x0000_s1034" alt="&quot;&quot;" style="position:absolute;left:0;text-align:left;margin-left:0;margin-top:-102.6pt;width:104.25pt;height:852.6pt;z-index:-251627520;visibility:visible;mso-wrap-style:square;mso-width-percent:0;mso-height-percent:0;mso-wrap-distance-left:9pt;mso-wrap-distance-top:0;mso-wrap-distance-right:9pt;mso-wrap-distance-bottom:0;mso-position-horizontal:left;mso-position-horizontal-relative:page;mso-position-vertical:absolute;mso-position-vertical-relative:text;mso-width-percent:0;mso-height-percent:0;mso-width-relative:margin;mso-height-relative:margin;v-text-anchor:bottom" o:gfxdata="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" fillcolor="#404040 [2429]" stroked="f" strokeweight="1pt">
+              <v:rect w14:anchorId="66879EF5" id="_x0000_s1034" alt="&quot;&quot;" style="position:absolute;left:0;text-align:left;margin-left:0;margin-top:-116.1pt;width:104.25pt;height:852.6pt;z-index:-251627520;visibility:visible;mso-wrap-style:square;mso-width-percent:0;mso-height-percent:0;mso-wrap-distance-left:9pt;mso-wrap-distance-top:0;mso-wrap-distance-right:9pt;mso-wrap-distance-bottom:0;mso-position-horizontal:left;mso-position-horizontal-relative:page;mso-position-vertical:absolute;mso-position-vertical-relative:text;mso-width-percent:0;mso-height-percent:0;mso-width-relative:margin;mso-height-relative:margin;v-text-anchor:bottom" o:gfxdata="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" fillcolor="#404040 [2429]" stroked="f" strokeweight="1pt">
                 <v:textbox>
                   <w:txbxContent>
                     <w:p>
@@ -3499,6 +3760,7 @@
         <w:rPr>
           <w:b/>
           <w:bCs/>
+          <w:noProof/>
           <w:sz w:val="28"/>
           <w:szCs w:val="28"/>
         </w:rPr>
@@ -3702,6 +3964,7 @@
         <w:rPr>
           <w:b/>
           <w:bCs/>
+          <w:noProof/>
           <w:sz w:val="28"/>
           <w:szCs w:val="28"/>
         </w:rPr>
@@ -3798,8 +4061,134 @@
       </w:pPr>
       <w:r>
         <w:rPr>
+          <w:noProof/>
+          <w:lang w:bidi="es-ES"/>
+        </w:rPr>
+        <mc:AlternateContent>
+          <mc:Choice Requires="wps">
+            <w:drawing>
+              <wp:anchor distT="0" distB="0" distL="114300" distR="114300" simplePos="0" relativeHeight="251707392" behindDoc="1" locked="1" layoutInCell="1" allowOverlap="1" wp14:anchorId="1AEA1CDF" wp14:editId="12D7B555">
+                <wp:simplePos x="0" y="0"/>
+                <wp:positionH relativeFrom="page">
+                  <wp:align>left</wp:align>
+                </wp:positionH>
+                <wp:positionV relativeFrom="paragraph">
+                  <wp:posOffset>-3790950</wp:posOffset>
+                </wp:positionV>
+                <wp:extent cx="1323975" cy="10828020"/>
+                <wp:effectExtent l="0" t="0" r="9525" b="0"/>
+                <wp:wrapNone/>
+                <wp:docPr id="1857560326" name="Rectángulo 2">
+                  <a:extLst xmlns:a="http://schemas.openxmlformats.org/drawingml/2006/main">
+                    <a:ext uri="{C183D7F6-B498-43B3-948B-1728B52AA6E4}">
+                      <adec:decorative xmlns:adec="http://schemas.microsoft.com/office/drawing/2017/decorative" val="1"/>
+                    </a:ext>
+                  </a:extLst>
+                </wp:docPr>
+                <wp:cNvGraphicFramePr/>
+                <a:graphic xmlns:a="http://schemas.openxmlformats.org/drawingml/2006/main">
+                  <a:graphicData uri="http://schemas.microsoft.com/office/word/2010/wordprocessingShape">
+                    <wps:wsp>
+                      <wps:cNvSpPr/>
+                      <wps:spPr>
+                        <a:xfrm>
+                          <a:off x="0" y="0"/>
+                          <a:ext cx="1323975" cy="10828020"/>
+                        </a:xfrm>
+                        <a:prstGeom prst="rect">
+                          <a:avLst/>
+                        </a:prstGeom>
+                        <a:solidFill>
+                          <a:schemeClr val="tx1">
+                            <a:lumMod val="75000"/>
+                            <a:lumOff val="25000"/>
+                          </a:schemeClr>
+                        </a:solidFill>
+                        <a:ln>
+                          <a:noFill/>
+                        </a:ln>
+                      </wps:spPr>
+                      <wps:style>
+                        <a:lnRef idx="2">
+                          <a:schemeClr val="accent1">
+                            <a:shade val="50000"/>
+                          </a:schemeClr>
+                        </a:lnRef>
+                        <a:fillRef idx="1">
+                          <a:schemeClr val="accent1"/>
+                        </a:fillRef>
+                        <a:effectRef idx="0">
+                          <a:schemeClr val="accent1"/>
+                        </a:effectRef>
+                        <a:fontRef idx="minor">
+                          <a:schemeClr val="lt1"/>
+                        </a:fontRef>
+                      </wps:style>
+                      <wps:txbx>
+                        <w:txbxContent>
+                          <w:p>
+                            <w:pPr>
+                              <w:pStyle w:val="Piedepginablanco"/>
+                            </w:pPr>
+                            <w:r>
+                              <w:rPr>
+                                <w:lang w:bidi="es-ES"/>
+                              </w:rPr>
+                              <w:t>7</w:t>
+                            </w:r>
+                          </w:p>
+                          <w:p/>
+                        </w:txbxContent>
+                      </wps:txbx>
+                      <wps:bodyPr rot="0" spcFirstLastPara="0" vertOverflow="overflow" horzOverflow="overflow" vert="horz" wrap="square" lIns="91440" tIns="45720" rIns="91440" bIns="45720" numCol="1" spcCol="0" rtlCol="0" fromWordArt="0" anchor="b" anchorCtr="0" forceAA="0" compatLnSpc="1">
+                        <a:prstTxWarp prst="textNoShape">
+                          <a:avLst/>
+                        </a:prstTxWarp>
+                        <a:noAutofit/>
+                      </wps:bodyPr>
+                    </wps:wsp>
+                  </a:graphicData>
+                </a:graphic>
+                <wp14:sizeRelH relativeFrom="margin">
+                  <wp14:pctWidth>0</wp14:pctWidth>
+                </wp14:sizeRelH>
+                <wp14:sizeRelV relativeFrom="margin">
+                  <wp14:pctHeight>0</wp14:pctHeight>
+                </wp14:sizeRelV>
+              </wp:anchor>
+            </w:drawing>
+          </mc:Choice>
+          <mc:Fallback>
+            <w:pict>
+              <v:rect w14:anchorId="1AEA1CDF" id="_x0000_s1036" alt="&quot;&quot;" style="position:absolute;margin-left:0;margin-top:-298.5pt;width:104.25pt;height:852.6pt;z-index:-251609088;visibility:visible;mso-wrap-style:square;mso-width-percent:0;mso-height-percent:0;mso-wrap-distance-left:9pt;mso-wrap-distance-top:0;mso-wrap-distance-right:9pt;mso-wrap-distance-bottom:0;mso-position-horizontal:left;mso-position-horizontal-relative:page;mso-position-vertical:absolute;mso-position-vertical-relative:text;mso-width-percent:0;mso-height-percent:0;mso-width-relative:margin;mso-height-relative:margin;v-text-anchor:bottom" o:gfxdata="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" fillcolor="#404040 [2429]" stroked="f" strokeweight="1pt">
+                <v:textbox>
+                  <w:txbxContent>
+                    <w:p>
+                      <w:pPr>
+                        <w:pStyle w:val="Piedepginablanco"/>
+                      </w:pPr>
+                      <w:r>
+                        <w:rPr>
+                          <w:lang w:bidi="es-ES"/>
+                        </w:rPr>
+                        <w:t>7</w:t>
+                      </w:r>
+                    </w:p>
+                    <w:p/>
+                  </w:txbxContent>
+                </v:textbox>
+                <w10:wrap anchorx="page"/>
+                <w10:anchorlock/>
+              </v:rect>
+            </w:pict>
+          </mc:Fallback>
+        </mc:AlternateContent>
+      </w:r>
+      <w:r>
+        <w:rPr>
           <w:b/>
           <w:bCs/>
+          <w:noProof/>
           <w:sz w:val="28"/>
           <w:szCs w:val="28"/>
         </w:rPr>
@@ -3871,8 +4260,134 @@
       </w:pPr>
       <w:r>
         <w:rPr>
+          <w:noProof/>
+          <w:lang w:bidi="es-ES"/>
+        </w:rPr>
+        <mc:AlternateContent>
+          <mc:Choice Requires="wps">
+            <w:drawing>
+              <wp:anchor distT="0" distB="0" distL="114300" distR="114300" simplePos="0" relativeHeight="251709440" behindDoc="1" locked="1" layoutInCell="1" allowOverlap="1" wp14:anchorId="2FE3111C" wp14:editId="2040BD82">
+                <wp:simplePos x="0" y="0"/>
+                <wp:positionH relativeFrom="page">
+                  <wp:align>left</wp:align>
+                </wp:positionH>
+                <wp:positionV relativeFrom="paragraph">
+                  <wp:posOffset>-819785</wp:posOffset>
+                </wp:positionV>
+                <wp:extent cx="1323975" cy="10828020"/>
+                <wp:effectExtent l="0" t="0" r="9525" b="0"/>
+                <wp:wrapNone/>
+                <wp:docPr id="746796560" name="Rectángulo 2">
+                  <a:extLst xmlns:a="http://schemas.openxmlformats.org/drawingml/2006/main">
+                    <a:ext uri="{C183D7F6-B498-43B3-948B-1728B52AA6E4}">
+                      <adec:decorative xmlns:adec="http://schemas.microsoft.com/office/drawing/2017/decorative" val="1"/>
+                    </a:ext>
+                  </a:extLst>
+                </wp:docPr>
+                <wp:cNvGraphicFramePr/>
+                <a:graphic xmlns:a="http://schemas.openxmlformats.org/drawingml/2006/main">
+                  <a:graphicData uri="http://schemas.microsoft.com/office/word/2010/wordprocessingShape">
+                    <wps:wsp>
+                      <wps:cNvSpPr/>
+                      <wps:spPr>
+                        <a:xfrm>
+                          <a:off x="0" y="0"/>
+                          <a:ext cx="1323975" cy="10828020"/>
+                        </a:xfrm>
+                        <a:prstGeom prst="rect">
+                          <a:avLst/>
+                        </a:prstGeom>
+                        <a:solidFill>
+                          <a:schemeClr val="tx1">
+                            <a:lumMod val="75000"/>
+                            <a:lumOff val="25000"/>
+                          </a:schemeClr>
+                        </a:solidFill>
+                        <a:ln>
+                          <a:noFill/>
+                        </a:ln>
+                      </wps:spPr>
+                      <wps:style>
+                        <a:lnRef idx="2">
+                          <a:schemeClr val="accent1">
+                            <a:shade val="50000"/>
+                          </a:schemeClr>
+                        </a:lnRef>
+                        <a:fillRef idx="1">
+                          <a:schemeClr val="accent1"/>
+                        </a:fillRef>
+                        <a:effectRef idx="0">
+                          <a:schemeClr val="accent1"/>
+                        </a:effectRef>
+                        <a:fontRef idx="minor">
+                          <a:schemeClr val="lt1"/>
+                        </a:fontRef>
+                      </wps:style>
+                      <wps:txbx>
+                        <w:txbxContent>
+                          <w:p>
+                            <w:pPr>
+                              <w:pStyle w:val="Piedepginablanco"/>
+                            </w:pPr>
+                            <w:r>
+                              <w:rPr>
+                                <w:lang w:bidi="es-ES"/>
+                              </w:rPr>
+                              <w:t>8</w:t>
+                            </w:r>
+                          </w:p>
+                          <w:p/>
+                        </w:txbxContent>
+                      </wps:txbx>
+                      <wps:bodyPr rot="0" spcFirstLastPara="0" vertOverflow="overflow" horzOverflow="overflow" vert="horz" wrap="square" lIns="91440" tIns="45720" rIns="91440" bIns="45720" numCol="1" spcCol="0" rtlCol="0" fromWordArt="0" anchor="b" anchorCtr="0" forceAA="0" compatLnSpc="1">
+                        <a:prstTxWarp prst="textNoShape">
+                          <a:avLst/>
+                        </a:prstTxWarp>
+                        <a:noAutofit/>
+                      </wps:bodyPr>
+                    </wps:wsp>
+                  </a:graphicData>
+                </a:graphic>
+                <wp14:sizeRelH relativeFrom="margin">
+                  <wp14:pctWidth>0</wp14:pctWidth>
+                </wp14:sizeRelH>
+                <wp14:sizeRelV relativeFrom="margin">
+                  <wp14:pctHeight>0</wp14:pctHeight>
+                </wp14:sizeRelV>
+              </wp:anchor>
+            </w:drawing>
+          </mc:Choice>
+          <mc:Fallback>
+            <w:pict>
+              <v:rect w14:anchorId="2FE3111C" id="_x0000_s1037" alt="&quot;&quot;" style="position:absolute;margin-left:0;margin-top:-64.55pt;width:104.25pt;height:852.6pt;z-index:-251607040;visibility:visible;mso-wrap-style:square;mso-width-percent:0;mso-height-percent:0;mso-wrap-distance-left:9pt;mso-wrap-distance-top:0;mso-wrap-distance-right:9pt;mso-wrap-distance-bottom:0;mso-position-horizontal:left;mso-position-horizontal-relative:page;mso-position-vertical:absolute;mso-position-vertical-relative:text;mso-width-percent:0;mso-height-percent:0;mso-width-relative:margin;mso-height-relative:margin;v-text-anchor:bottom" o:gfxdata="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" fillcolor="#404040 [2429]" stroked="f" strokeweight="1pt">
+                <v:textbox>
+                  <w:txbxContent>
+                    <w:p>
+                      <w:pPr>
+                        <w:pStyle w:val="Piedepginablanco"/>
+                      </w:pPr>
+                      <w:r>
+                        <w:rPr>
+                          <w:lang w:bidi="es-ES"/>
+                        </w:rPr>
+                        <w:t>8</w:t>
+                      </w:r>
+                    </w:p>
+                    <w:p/>
+                  </w:txbxContent>
+                </v:textbox>
+                <w10:wrap anchorx="page"/>
+                <w10:anchorlock/>
+              </v:rect>
+            </w:pict>
+          </mc:Fallback>
+        </mc:AlternateContent>
+      </w:r>
+      <w:r>
+        <w:rPr>
           <w:b/>
           <w:bCs/>
+          <w:noProof/>
           <w:sz w:val="28"/>
           <w:szCs w:val="28"/>
         </w:rPr>
@@ -3945,6 +4460,7 @@
         <w:rPr>
           <w:b/>
           <w:bCs/>
+          <w:noProof/>
           <w:sz w:val="28"/>
           <w:szCs w:val="28"/>
         </w:rPr>
@@ -4016,8 +4532,134 @@
       </w:pPr>
       <w:r>
         <w:rPr>
+          <w:noProof/>
+          <w:lang w:bidi="es-ES"/>
+        </w:rPr>
+        <mc:AlternateContent>
+          <mc:Choice Requires="wps">
+            <w:drawing>
+              <wp:anchor distT="0" distB="0" distL="114300" distR="114300" simplePos="0" relativeHeight="251711488" behindDoc="1" locked="1" layoutInCell="1" allowOverlap="1" wp14:anchorId="4264EEB8" wp14:editId="4D3FC775">
+                <wp:simplePos x="0" y="0"/>
+                <wp:positionH relativeFrom="page">
+                  <wp:align>left</wp:align>
+                </wp:positionH>
+                <wp:positionV relativeFrom="paragraph">
+                  <wp:posOffset>-972185</wp:posOffset>
+                </wp:positionV>
+                <wp:extent cx="1323975" cy="10828020"/>
+                <wp:effectExtent l="0" t="0" r="9525" b="0"/>
+                <wp:wrapNone/>
+                <wp:docPr id="102552838" name="Rectángulo 2">
+                  <a:extLst xmlns:a="http://schemas.openxmlformats.org/drawingml/2006/main">
+                    <a:ext uri="{C183D7F6-B498-43B3-948B-1728B52AA6E4}">
+                      <adec:decorative xmlns:adec="http://schemas.microsoft.com/office/drawing/2017/decorative" val="1"/>
+                    </a:ext>
+                  </a:extLst>
+                </wp:docPr>
+                <wp:cNvGraphicFramePr/>
+                <a:graphic xmlns:a="http://schemas.openxmlformats.org/drawingml/2006/main">
+                  <a:graphicData uri="http://schemas.microsoft.com/office/word/2010/wordprocessingShape">
+                    <wps:wsp>
+                      <wps:cNvSpPr/>
+                      <wps:spPr>
+                        <a:xfrm>
+                          <a:off x="0" y="0"/>
+                          <a:ext cx="1323975" cy="10828020"/>
+                        </a:xfrm>
+                        <a:prstGeom prst="rect">
+                          <a:avLst/>
+                        </a:prstGeom>
+                        <a:solidFill>
+                          <a:schemeClr val="tx1">
+                            <a:lumMod val="75000"/>
+                            <a:lumOff val="25000"/>
+                          </a:schemeClr>
+                        </a:solidFill>
+                        <a:ln>
+                          <a:noFill/>
+                        </a:ln>
+                      </wps:spPr>
+                      <wps:style>
+                        <a:lnRef idx="2">
+                          <a:schemeClr val="accent1">
+                            <a:shade val="50000"/>
+                          </a:schemeClr>
+                        </a:lnRef>
+                        <a:fillRef idx="1">
+                          <a:schemeClr val="accent1"/>
+                        </a:fillRef>
+                        <a:effectRef idx="0">
+                          <a:schemeClr val="accent1"/>
+                        </a:effectRef>
+                        <a:fontRef idx="minor">
+                          <a:schemeClr val="lt1"/>
+                        </a:fontRef>
+                      </wps:style>
+                      <wps:txbx>
+                        <w:txbxContent>
+                          <w:p>
+                            <w:pPr>
+                              <w:pStyle w:val="Piedepginablanco"/>
+                            </w:pPr>
+                            <w:r>
+                              <w:rPr>
+                                <w:lang w:bidi="es-ES"/>
+                              </w:rPr>
+                              <w:t>9</w:t>
+                            </w:r>
+                          </w:p>
+                          <w:p/>
+                        </w:txbxContent>
+                      </wps:txbx>
+                      <wps:bodyPr rot="0" spcFirstLastPara="0" vertOverflow="overflow" horzOverflow="overflow" vert="horz" wrap="square" lIns="91440" tIns="45720" rIns="91440" bIns="45720" numCol="1" spcCol="0" rtlCol="0" fromWordArt="0" anchor="b" anchorCtr="0" forceAA="0" compatLnSpc="1">
+                        <a:prstTxWarp prst="textNoShape">
+                          <a:avLst/>
+                        </a:prstTxWarp>
+                        <a:noAutofit/>
+                      </wps:bodyPr>
+                    </wps:wsp>
+                  </a:graphicData>
+                </a:graphic>
+                <wp14:sizeRelH relativeFrom="margin">
+                  <wp14:pctWidth>0</wp14:pctWidth>
+                </wp14:sizeRelH>
+                <wp14:sizeRelV relativeFrom="margin">
+                  <wp14:pctHeight>0</wp14:pctHeight>
+                </wp14:sizeRelV>
+              </wp:anchor>
+            </w:drawing>
+          </mc:Choice>
+          <mc:Fallback>
+            <w:pict>
+              <v:rect w14:anchorId="4264EEB8" id="_x0000_s1038" alt="&quot;&quot;" style="position:absolute;margin-left:0;margin-top:-76.55pt;width:104.25pt;height:852.6pt;z-index:-251604992;visibility:visible;mso-wrap-style:square;mso-width-percent:0;mso-height-percent:0;mso-wrap-distance-left:9pt;mso-wrap-distance-top:0;mso-wrap-distance-right:9pt;mso-wrap-distance-bottom:0;mso-position-horizontal:left;mso-position-horizontal-relative:page;mso-position-vertical:absolute;mso-position-vertical-relative:text;mso-width-percent:0;mso-height-percent:0;mso-width-relative:margin;mso-height-relative:margin;v-text-anchor:bottom" o:gfxdata="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" fillcolor="#404040 [2429]" stroked="f" strokeweight="1pt">
+                <v:textbox>
+                  <w:txbxContent>
+                    <w:p>
+                      <w:pPr>
+                        <w:pStyle w:val="Piedepginablanco"/>
+                      </w:pPr>
+                      <w:r>
+                        <w:rPr>
+                          <w:lang w:bidi="es-ES"/>
+                        </w:rPr>
+                        <w:t>9</w:t>
+                      </w:r>
+                    </w:p>
+                    <w:p/>
+                  </w:txbxContent>
+                </v:textbox>
+                <w10:wrap anchorx="page"/>
+                <w10:anchorlock/>
+              </v:rect>
+            </w:pict>
+          </mc:Fallback>
+        </mc:AlternateContent>
+      </w:r>
+      <w:r>
+        <w:rPr>
           <w:b/>
           <w:bCs/>
+          <w:noProof/>
           <w:sz w:val="28"/>
           <w:szCs w:val="28"/>
         </w:rPr>
@@ -4131,6 +4773,7 @@
         <w:rPr>
           <w:b/>
           <w:bCs/>
+          <w:noProof/>
           <w:sz w:val="28"/>
           <w:szCs w:val="28"/>
         </w:rPr>
@@ -4203,6 +4846,7 @@
         <w:rPr>
           <w:b/>
           <w:bCs/>
+          <w:noProof/>
           <w:sz w:val="28"/>
           <w:szCs w:val="28"/>
         </w:rPr>
@@ -4296,27 +4940,138 @@
           <w:szCs w:val="20"/>
         </w:rPr>
       </w:pPr>
+      <w:r>
+        <w:rPr>
+          <w:noProof/>
+          <w:lang w:bidi="es-ES"/>
+        </w:rPr>
+        <mc:AlternateContent>
+          <mc:Choice Requires="wps">
+            <w:drawing>
+              <wp:anchor distT="0" distB="0" distL="114300" distR="114300" simplePos="0" relativeHeight="251713536" behindDoc="1" locked="1" layoutInCell="1" allowOverlap="1" wp14:anchorId="5AD438BF" wp14:editId="611539F1">
+                <wp:simplePos x="0" y="0"/>
+                <wp:positionH relativeFrom="page">
+                  <wp:posOffset>38100</wp:posOffset>
+                </wp:positionH>
+                <wp:positionV relativeFrom="paragraph">
+                  <wp:posOffset>-8839835</wp:posOffset>
+                </wp:positionV>
+                <wp:extent cx="1323975" cy="10828020"/>
+                <wp:effectExtent l="0" t="0" r="9525" b="0"/>
+                <wp:wrapNone/>
+                <wp:docPr id="2060577524" name="Rectángulo 2">
+                  <a:extLst xmlns:a="http://schemas.openxmlformats.org/drawingml/2006/main">
+                    <a:ext uri="{C183D7F6-B498-43B3-948B-1728B52AA6E4}">
+                      <adec:decorative xmlns:adec="http://schemas.microsoft.com/office/drawing/2017/decorative" val="1"/>
+                    </a:ext>
+                  </a:extLst>
+                </wp:docPr>
+                <wp:cNvGraphicFramePr/>
+                <a:graphic xmlns:a="http://schemas.openxmlformats.org/drawingml/2006/main">
+                  <a:graphicData uri="http://schemas.microsoft.com/office/word/2010/wordprocessingShape">
+                    <wps:wsp>
+                      <wps:cNvSpPr/>
+                      <wps:spPr>
+                        <a:xfrm>
+                          <a:off x="0" y="0"/>
+                          <a:ext cx="1323975" cy="10828020"/>
+                        </a:xfrm>
+                        <a:prstGeom prst="rect">
+                          <a:avLst/>
+                        </a:prstGeom>
+                        <a:solidFill>
+                          <a:schemeClr val="tx1">
+                            <a:lumMod val="75000"/>
+                            <a:lumOff val="25000"/>
+                          </a:schemeClr>
+                        </a:solidFill>
+                        <a:ln>
+                          <a:noFill/>
+                        </a:ln>
+                      </wps:spPr>
+                      <wps:style>
+                        <a:lnRef idx="2">
+                          <a:schemeClr val="accent1">
+                            <a:shade val="50000"/>
+                          </a:schemeClr>
+                        </a:lnRef>
+                        <a:fillRef idx="1">
+                          <a:schemeClr val="accent1"/>
+                        </a:fillRef>
+                        <a:effectRef idx="0">
+                          <a:schemeClr val="accent1"/>
+                        </a:effectRef>
+                        <a:fontRef idx="minor">
+                          <a:schemeClr val="lt1"/>
+                        </a:fontRef>
+                      </wps:style>
+                      <wps:txbx>
+                        <w:txbxContent>
+                          <w:p>
+                            <w:pPr>
+                              <w:pStyle w:val="Piedepginablanco"/>
+                            </w:pPr>
+                            <w:r>
+                              <w:rPr>
+                                <w:lang w:bidi="es-ES"/>
+                              </w:rPr>
+                              <w:t>10</w:t>
+                            </w:r>
+                          </w:p>
+                          <w:p/>
+                        </w:txbxContent>
+                      </wps:txbx>
+                      <wps:bodyPr rot="0" spcFirstLastPara="0" vertOverflow="overflow" horzOverflow="overflow" vert="horz" wrap="square" lIns="91440" tIns="45720" rIns="91440" bIns="45720" numCol="1" spcCol="0" rtlCol="0" fromWordArt="0" anchor="b" anchorCtr="0" forceAA="0" compatLnSpc="1">
+                        <a:prstTxWarp prst="textNoShape">
+                          <a:avLst/>
+                        </a:prstTxWarp>
+                        <a:noAutofit/>
+                      </wps:bodyPr>
+                    </wps:wsp>
+                  </a:graphicData>
+                </a:graphic>
+                <wp14:sizeRelH relativeFrom="margin">
+                  <wp14:pctWidth>0</wp14:pctWidth>
+                </wp14:sizeRelH>
+                <wp14:sizeRelV relativeFrom="margin">
+                  <wp14:pctHeight>0</wp14:pctHeight>
+                </wp14:sizeRelV>
+              </wp:anchor>
+            </w:drawing>
+          </mc:Choice>
+          <mc:Fallback>
+            <w:pict>
+              <v:rect w14:anchorId="5AD438BF" id="_x0000_s1039" alt="&quot;&quot;" style="position:absolute;margin-left:3pt;margin-top:-696.05pt;width:104.25pt;height:852.6pt;z-index:-251602944;visibility:visible;mso-wrap-style:square;mso-width-percent:0;mso-height-percent:0;mso-wrap-distance-left:9pt;mso-wrap-distance-top:0;mso-wrap-distance-right:9pt;mso-wrap-distance-bottom:0;mso-position-horizontal:absolute;mso-position-horizontal-relative:page;mso-position-vertical:absolute;mso-position-vertical-relative:text;mso-width-percent:0;mso-height-percent:0;mso-width-relative:margin;mso-height-relative:margin;v-text-anchor:bottom" o:gfxdata="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" fillcolor="#404040 [2429]" stroked="f" strokeweight="1pt">
+                <v:textbox>
+                  <w:txbxContent>
+                    <w:p>
+                      <w:pPr>
+                        <w:pStyle w:val="Piedepginablanco"/>
+                      </w:pPr>
+                      <w:r>
+                        <w:rPr>
+                          <w:lang w:bidi="es-ES"/>
+                        </w:rPr>
+                        <w:t>10</w:t>
+                      </w:r>
+                    </w:p>
+                    <w:p/>
+                  </w:txbxContent>
+                </v:textbox>
+                <w10:wrap anchorx="page"/>
+                <w10:anchorlock/>
+              </v:rect>
+            </w:pict>
+          </mc:Fallback>
+        </mc:AlternateContent>
+      </w:r>
       <w:hyperlink r:id="rId24" w:history="1">
         <w:r>
           <w:rPr>
             <w:rStyle w:val="Hipervnculo"/>
             <w:szCs w:val="20"/>
           </w:rPr>
-          <w:t>https://www.figma.com/</w:t>
-        </w:r>
-        <w:r>
-          <w:rPr>
-            <w:rStyle w:val="Hipervnculo"/>
-            <w:szCs w:val="20"/>
-          </w:rPr>
-          <w:t>d</w:t>
-        </w:r>
-        <w:r>
-          <w:rPr>
-            <w:rStyle w:val="Hipervnculo"/>
-            <w:szCs w:val="20"/>
-          </w:rPr>
-          <w:t>esign/C0sj9dbzKaRpJshVfNWokc/TFG_SONAURA?node-id=0-1&amp;t=CzU8caVkRHuZb1jB-1</w:t>
+          <w:t>https://www.figma.com/design/C0sj9dbzKaRpJshVfNWokc/TFG_SONAURA?node-id=0-1&amp;t=CzU8caVkRHuZb1jB-1</w:t>
         </w:r>
       </w:hyperlink>
     </w:p>
@@ -4475,6 +5230,131 @@
           <w:numId w:val="29"/>
         </w:numPr>
       </w:pPr>
+      <w:r>
+        <w:rPr>
+          <w:noProof/>
+          <w:lang w:bidi="es-ES"/>
+        </w:rPr>
+        <mc:AlternateContent>
+          <mc:Choice Requires="wps">
+            <w:drawing>
+              <wp:anchor distT="0" distB="0" distL="114300" distR="114300" simplePos="0" relativeHeight="251715584" behindDoc="1" locked="1" layoutInCell="1" allowOverlap="1" wp14:anchorId="61E29BC6" wp14:editId="5A3AE856">
+                <wp:simplePos x="0" y="0"/>
+                <wp:positionH relativeFrom="page">
+                  <wp:align>left</wp:align>
+                </wp:positionH>
+                <wp:positionV relativeFrom="paragraph">
+                  <wp:posOffset>-5734685</wp:posOffset>
+                </wp:positionV>
+                <wp:extent cx="1323975" cy="10828020"/>
+                <wp:effectExtent l="0" t="0" r="9525" b="0"/>
+                <wp:wrapNone/>
+                <wp:docPr id="321963092" name="Rectángulo 2">
+                  <a:extLst xmlns:a="http://schemas.openxmlformats.org/drawingml/2006/main">
+                    <a:ext uri="{C183D7F6-B498-43B3-948B-1728B52AA6E4}">
+                      <adec:decorative xmlns:adec="http://schemas.microsoft.com/office/drawing/2017/decorative" val="1"/>
+                    </a:ext>
+                  </a:extLst>
+                </wp:docPr>
+                <wp:cNvGraphicFramePr/>
+                <a:graphic xmlns:a="http://schemas.openxmlformats.org/drawingml/2006/main">
+                  <a:graphicData uri="http://schemas.microsoft.com/office/word/2010/wordprocessingShape">
+                    <wps:wsp>
+                      <wps:cNvSpPr/>
+                      <wps:spPr>
+                        <a:xfrm>
+                          <a:off x="0" y="0"/>
+                          <a:ext cx="1323975" cy="10828020"/>
+                        </a:xfrm>
+                        <a:prstGeom prst="rect">
+                          <a:avLst/>
+                        </a:prstGeom>
+                        <a:solidFill>
+                          <a:schemeClr val="tx1">
+                            <a:lumMod val="75000"/>
+                            <a:lumOff val="25000"/>
+                          </a:schemeClr>
+                        </a:solidFill>
+                        <a:ln>
+                          <a:noFill/>
+                        </a:ln>
+                      </wps:spPr>
+                      <wps:style>
+                        <a:lnRef idx="2">
+                          <a:schemeClr val="accent1">
+                            <a:shade val="50000"/>
+                          </a:schemeClr>
+                        </a:lnRef>
+                        <a:fillRef idx="1">
+                          <a:schemeClr val="accent1"/>
+                        </a:fillRef>
+                        <a:effectRef idx="0">
+                          <a:schemeClr val="accent1"/>
+                        </a:effectRef>
+                        <a:fontRef idx="minor">
+                          <a:schemeClr val="lt1"/>
+                        </a:fontRef>
+                      </wps:style>
+                      <wps:txbx>
+                        <w:txbxContent>
+                          <w:p>
+                            <w:pPr>
+                              <w:pStyle w:val="Piedepginablanco"/>
+                            </w:pPr>
+                            <w:r>
+                              <w:rPr>
+                                <w:lang w:bidi="es-ES"/>
+                              </w:rPr>
+                              <w:t>11</w:t>
+                            </w:r>
+                          </w:p>
+                          <w:p/>
+                        </w:txbxContent>
+                      </wps:txbx>
+                      <wps:bodyPr rot="0" spcFirstLastPara="0" vertOverflow="overflow" horzOverflow="overflow" vert="horz" wrap="square" lIns="91440" tIns="45720" rIns="91440" bIns="45720" numCol="1" spcCol="0" rtlCol="0" fromWordArt="0" anchor="b" anchorCtr="0" forceAA="0" compatLnSpc="1">
+                        <a:prstTxWarp prst="textNoShape">
+                          <a:avLst/>
+                        </a:prstTxWarp>
+                        <a:noAutofit/>
+                      </wps:bodyPr>
+                    </wps:wsp>
+                  </a:graphicData>
+                </a:graphic>
+                <wp14:sizeRelH relativeFrom="margin">
+                  <wp14:pctWidth>0</wp14:pctWidth>
+                </wp14:sizeRelH>
+                <wp14:sizeRelV relativeFrom="margin">
+                  <wp14:pctHeight>0</wp14:pctHeight>
+                </wp14:sizeRelV>
+              </wp:anchor>
+            </w:drawing>
+          </mc:Choice>
+          <mc:Fallback>
+            <w:pict>
+              <v:rect w14:anchorId="61E29BC6" id="_x0000_s1040" alt="&quot;&quot;" style="position:absolute;left:0;text-align:left;margin-left:0;margin-top:-451.55pt;width:104.25pt;height:852.6pt;z-index:-251600896;visibility:visible;mso-wrap-style:square;mso-width-percent:0;mso-height-percent:0;mso-wrap-distance-left:9pt;mso-wrap-distance-top:0;mso-wrap-distance-right:9pt;mso-wrap-distance-bottom:0;mso-position-horizontal:left;mso-position-horizontal-relative:page;mso-position-vertical:absolute;mso-position-vertical-relative:text;mso-width-percent:0;mso-height-percent:0;mso-width-relative:margin;mso-height-relative:margin;v-text-anchor:bottom" o:gfxdata="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" fillcolor="#404040 [2429]" stroked="f" strokeweight="1pt">
+                <v:textbox>
+                  <w:txbxContent>
+                    <w:p>
+                      <w:pPr>
+                        <w:pStyle w:val="Piedepginablanco"/>
+                      </w:pPr>
+                      <w:r>
+                        <w:rPr>
+                          <w:lang w:bidi="es-ES"/>
+                        </w:rPr>
+                        <w:t>11</w:t>
+                      </w:r>
+                    </w:p>
+                    <w:p/>
+                  </w:txbxContent>
+                </v:textbox>
+                <w10:wrap anchorx="page"/>
+                <w10:anchorlock/>
+              </v:rect>
+            </w:pict>
+          </mc:Fallback>
+        </mc:AlternateContent>
+      </w:r>
       <w:r>
         <w:rPr>
           <w:b/>
@@ -4740,7 +5620,133 @@
     <w:p/>
     <w:p/>
     <w:p/>
-    <w:p/>
+    <w:p>
+      <w:r>
+        <w:rPr>
+          <w:noProof/>
+          <w:lang w:bidi="es-ES"/>
+        </w:rPr>
+        <mc:AlternateContent>
+          <mc:Choice Requires="wps">
+            <w:drawing>
+              <wp:anchor distT="0" distB="0" distL="114300" distR="114300" simplePos="0" relativeHeight="251717632" behindDoc="1" locked="1" layoutInCell="1" allowOverlap="1" wp14:anchorId="3EDA2407" wp14:editId="79BE8342">
+                <wp:simplePos x="0" y="0"/>
+                <wp:positionH relativeFrom="page">
+                  <wp:align>left</wp:align>
+                </wp:positionH>
+                <wp:positionV relativeFrom="paragraph">
+                  <wp:posOffset>-9163685</wp:posOffset>
+                </wp:positionV>
+                <wp:extent cx="1323975" cy="10828020"/>
+                <wp:effectExtent l="0" t="0" r="9525" b="0"/>
+                <wp:wrapNone/>
+                <wp:docPr id="1487285743" name="Rectángulo 2">
+                  <a:extLst xmlns:a="http://schemas.openxmlformats.org/drawingml/2006/main">
+                    <a:ext uri="{C183D7F6-B498-43B3-948B-1728B52AA6E4}">
+                      <adec:decorative xmlns:adec="http://schemas.microsoft.com/office/drawing/2017/decorative" val="1"/>
+                    </a:ext>
+                  </a:extLst>
+                </wp:docPr>
+                <wp:cNvGraphicFramePr/>
+                <a:graphic xmlns:a="http://schemas.openxmlformats.org/drawingml/2006/main">
+                  <a:graphicData uri="http://schemas.microsoft.com/office/word/2010/wordprocessingShape">
+                    <wps:wsp>
+                      <wps:cNvSpPr/>
+                      <wps:spPr>
+                        <a:xfrm>
+                          <a:off x="0" y="0"/>
+                          <a:ext cx="1323975" cy="10828020"/>
+                        </a:xfrm>
+                        <a:prstGeom prst="rect">
+                          <a:avLst/>
+                        </a:prstGeom>
+                        <a:solidFill>
+                          <a:schemeClr val="tx1">
+                            <a:lumMod val="75000"/>
+                            <a:lumOff val="25000"/>
+                          </a:schemeClr>
+                        </a:solidFill>
+                        <a:ln>
+                          <a:noFill/>
+                        </a:ln>
+                      </wps:spPr>
+                      <wps:style>
+                        <a:lnRef idx="2">
+                          <a:schemeClr val="accent1">
+                            <a:shade val="50000"/>
+                          </a:schemeClr>
+                        </a:lnRef>
+                        <a:fillRef idx="1">
+                          <a:schemeClr val="accent1"/>
+                        </a:fillRef>
+                        <a:effectRef idx="0">
+                          <a:schemeClr val="accent1"/>
+                        </a:effectRef>
+                        <a:fontRef idx="minor">
+                          <a:schemeClr val="lt1"/>
+                        </a:fontRef>
+                      </wps:style>
+                      <wps:txbx>
+                        <w:txbxContent>
+                          <w:p>
+                            <w:pPr>
+                              <w:pStyle w:val="Piedepginablanco"/>
+                            </w:pPr>
+                            <w:r>
+                              <w:rPr>
+                                <w:lang w:bidi="es-ES"/>
+                              </w:rPr>
+                              <w:t>12</w:t>
+                            </w:r>
+                          </w:p>
+                          <w:p/>
+                        </w:txbxContent>
+                      </wps:txbx>
+                      <wps:bodyPr rot="0" spcFirstLastPara="0" vertOverflow="overflow" horzOverflow="overflow" vert="horz" wrap="square" lIns="91440" tIns="45720" rIns="91440" bIns="45720" numCol="1" spcCol="0" rtlCol="0" fromWordArt="0" anchor="b" anchorCtr="0" forceAA="0" compatLnSpc="1">
+                        <a:prstTxWarp prst="textNoShape">
+                          <a:avLst/>
+                        </a:prstTxWarp>
+                        <a:noAutofit/>
+                      </wps:bodyPr>
+                    </wps:wsp>
+                  </a:graphicData>
+                </a:graphic>
+                <wp14:sizeRelH relativeFrom="margin">
+                  <wp14:pctWidth>0</wp14:pctWidth>
+                </wp14:sizeRelH>
+                <wp14:sizeRelV relativeFrom="margin">
+                  <wp14:pctHeight>0</wp14:pctHeight>
+                </wp14:sizeRelV>
+              </wp:anchor>
+            </w:drawing>
+          </mc:Choice>
+          <mc:Fallback>
+            <w:pict>
+              <v:rect w14:anchorId="3EDA2407" id="_x0000_s1041" alt="&quot;&quot;" style="position:absolute;margin-left:0;margin-top:-721.55pt;width:104.25pt;height:852.6pt;z-index:-251598848;visibility:visible;mso-wrap-style:square;mso-width-percent:0;mso-height-percent:0;mso-wrap-distance-left:9pt;mso-wrap-distance-top:0;mso-wrap-distance-right:9pt;mso-wrap-distance-bottom:0;mso-position-horizontal:left;mso-position-horizontal-relative:page;mso-position-vertical:absolute;mso-position-vertical-relative:text;mso-width-percent:0;mso-height-percent:0;mso-width-relative:margin;mso-height-relative:margin;v-text-anchor:bottom" o:gfxdata="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" fillcolor="#404040 [2429]" stroked="f" strokeweight="1pt">
+                <v:textbox>
+                  <w:txbxContent>
+                    <w:p>
+                      <w:pPr>
+                        <w:pStyle w:val="Piedepginablanco"/>
+                      </w:pPr>
+                      <w:r>
+                        <w:rPr>
+                          <w:lang w:bidi="es-ES"/>
+                        </w:rPr>
+                        <w:t>12</w:t>
+                      </w:r>
+                    </w:p>
+                    <w:p/>
+                  </w:txbxContent>
+                </v:textbox>
+                <w10:wrap anchorx="page"/>
+                <w10:anchorlock/>
+              </v:rect>
+            </w:pict>
+          </mc:Fallback>
+        </mc:AlternateContent>
+      </w:r>
+    </w:p>
     <w:p>
       <w:pPr>
         <w:spacing w:before="0" w:after="200" w:line="312" w:lineRule="auto"/>
@@ -4751,9 +5757,12 @@
         </w:rPr>
       </w:pPr>
       <w:r>
+        <w:rPr>
+          <w:noProof/>
+        </w:rPr>
         <w:lastRenderedPageBreak/>
         <w:drawing>
-          <wp:anchor distT="0" distB="0" distL="114300" distR="114300" simplePos="0" relativeHeight="251705344" behindDoc="0" locked="0" layoutInCell="1" allowOverlap="1" wp14:anchorId="3310DDFB" wp14:editId="0DE60012">
+          <wp:anchor distT="0" distB="0" distL="114300" distR="114300" simplePos="0" relativeHeight="251705344" behindDoc="0" locked="0" layoutInCell="1" allowOverlap="1" wp14:anchorId="3310DDFB" wp14:editId="3E58E6D8">
             <wp:simplePos x="0" y="0"/>
             <wp:positionH relativeFrom="margin">
               <wp:align>left</wp:align>
@@ -4896,19 +5905,7 @@
           <w:rPr>
             <w:rStyle w:val="Hipervnculo"/>
           </w:rPr>
-          <w:t>https://drive.google.com/drive/f</w:t>
-        </w:r>
-        <w:r>
-          <w:rPr>
-            <w:rStyle w:val="Hipervnculo"/>
-          </w:rPr>
-          <w:t>o</w:t>
-        </w:r>
-        <w:r>
-          <w:rPr>
-            <w:rStyle w:val="Hipervnculo"/>
-          </w:rPr>
-          <w:t>lders/1wRjZHs_ECa-b2mc8WhSdIt51SMgnP0YV?usp=sharing</w:t>
+          <w:t>https://drive.google.com/drive/folders/1wRjZHs_ECa-b2mc8WhSdIt51SMgnP0YV?usp=sharing</w:t>
         </w:r>
       </w:hyperlink>
     </w:p>
@@ -5204,6 +6201,131 @@
           <w:szCs w:val="30"/>
         </w:rPr>
       </w:pPr>
+      <w:r>
+        <w:rPr>
+          <w:noProof/>
+          <w:lang w:bidi="es-ES"/>
+        </w:rPr>
+        <mc:AlternateContent>
+          <mc:Choice Requires="wps">
+            <w:drawing>
+              <wp:anchor distT="0" distB="0" distL="114300" distR="114300" simplePos="0" relativeHeight="251719680" behindDoc="1" locked="1" layoutInCell="1" allowOverlap="1" wp14:anchorId="74FBD0F2" wp14:editId="728E27DA">
+                <wp:simplePos x="0" y="0"/>
+                <wp:positionH relativeFrom="page">
+                  <wp:align>left</wp:align>
+                </wp:positionH>
+                <wp:positionV relativeFrom="paragraph">
+                  <wp:posOffset>-5467350</wp:posOffset>
+                </wp:positionV>
+                <wp:extent cx="1323975" cy="10828020"/>
+                <wp:effectExtent l="0" t="0" r="9525" b="0"/>
+                <wp:wrapNone/>
+                <wp:docPr id="728379392" name="Rectángulo 2">
+                  <a:extLst xmlns:a="http://schemas.openxmlformats.org/drawingml/2006/main">
+                    <a:ext uri="{C183D7F6-B498-43B3-948B-1728B52AA6E4}">
+                      <adec:decorative xmlns:adec="http://schemas.microsoft.com/office/drawing/2017/decorative" val="1"/>
+                    </a:ext>
+                  </a:extLst>
+                </wp:docPr>
+                <wp:cNvGraphicFramePr/>
+                <a:graphic xmlns:a="http://schemas.openxmlformats.org/drawingml/2006/main">
+                  <a:graphicData uri="http://schemas.microsoft.com/office/word/2010/wordprocessingShape">
+                    <wps:wsp>
+                      <wps:cNvSpPr/>
+                      <wps:spPr>
+                        <a:xfrm>
+                          <a:off x="0" y="0"/>
+                          <a:ext cx="1323975" cy="10828020"/>
+                        </a:xfrm>
+                        <a:prstGeom prst="rect">
+                          <a:avLst/>
+                        </a:prstGeom>
+                        <a:solidFill>
+                          <a:schemeClr val="tx1">
+                            <a:lumMod val="75000"/>
+                            <a:lumOff val="25000"/>
+                          </a:schemeClr>
+                        </a:solidFill>
+                        <a:ln>
+                          <a:noFill/>
+                        </a:ln>
+                      </wps:spPr>
+                      <wps:style>
+                        <a:lnRef idx="2">
+                          <a:schemeClr val="accent1">
+                            <a:shade val="50000"/>
+                          </a:schemeClr>
+                        </a:lnRef>
+                        <a:fillRef idx="1">
+                          <a:schemeClr val="accent1"/>
+                        </a:fillRef>
+                        <a:effectRef idx="0">
+                          <a:schemeClr val="accent1"/>
+                        </a:effectRef>
+                        <a:fontRef idx="minor">
+                          <a:schemeClr val="lt1"/>
+                        </a:fontRef>
+                      </wps:style>
+                      <wps:txbx>
+                        <w:txbxContent>
+                          <w:p>
+                            <w:pPr>
+                              <w:pStyle w:val="Piedepginablanco"/>
+                            </w:pPr>
+                            <w:r>
+                              <w:rPr>
+                                <w:lang w:bidi="es-ES"/>
+                              </w:rPr>
+                              <w:t>13</w:t>
+                            </w:r>
+                          </w:p>
+                          <w:p/>
+                        </w:txbxContent>
+                      </wps:txbx>
+                      <wps:bodyPr rot="0" spcFirstLastPara="0" vertOverflow="overflow" horzOverflow="overflow" vert="horz" wrap="square" lIns="91440" tIns="45720" rIns="91440" bIns="45720" numCol="1" spcCol="0" rtlCol="0" fromWordArt="0" anchor="b" anchorCtr="0" forceAA="0" compatLnSpc="1">
+                        <a:prstTxWarp prst="textNoShape">
+                          <a:avLst/>
+                        </a:prstTxWarp>
+                        <a:noAutofit/>
+                      </wps:bodyPr>
+                    </wps:wsp>
+                  </a:graphicData>
+                </a:graphic>
+                <wp14:sizeRelH relativeFrom="margin">
+                  <wp14:pctWidth>0</wp14:pctWidth>
+                </wp14:sizeRelH>
+                <wp14:sizeRelV relativeFrom="margin">
+                  <wp14:pctHeight>0</wp14:pctHeight>
+                </wp14:sizeRelV>
+              </wp:anchor>
+            </w:drawing>
+          </mc:Choice>
+          <mc:Fallback>
+            <w:pict>
+              <v:rect w14:anchorId="74FBD0F2" id="_x0000_s1042" alt="&quot;&quot;" style="position:absolute;margin-left:0;margin-top:-430.5pt;width:104.25pt;height:852.6pt;z-index:-251596800;visibility:visible;mso-wrap-style:square;mso-width-percent:0;mso-height-percent:0;mso-wrap-distance-left:9pt;mso-wrap-distance-top:0;mso-wrap-distance-right:9pt;mso-wrap-distance-bottom:0;mso-position-horizontal:left;mso-position-horizontal-relative:page;mso-position-vertical:absolute;mso-position-vertical-relative:text;mso-width-percent:0;mso-height-percent:0;mso-width-relative:margin;mso-height-relative:margin;v-text-anchor:bottom" o:gfxdata="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" fillcolor="#404040 [2429]" stroked="f" strokeweight="1pt">
+                <v:textbox>
+                  <w:txbxContent>
+                    <w:p>
+                      <w:pPr>
+                        <w:pStyle w:val="Piedepginablanco"/>
+                      </w:pPr>
+                      <w:r>
+                        <w:rPr>
+                          <w:lang w:bidi="es-ES"/>
+                        </w:rPr>
+                        <w:t>13</w:t>
+                      </w:r>
+                    </w:p>
+                    <w:p/>
+                  </w:txbxContent>
+                </v:textbox>
+                <w10:wrap anchorx="page"/>
+                <w10:anchorlock/>
+              </v:rect>
+            </w:pict>
+          </mc:Fallback>
+        </mc:AlternateContent>
+      </w:r>
       <w:r>
         <w:rPr>
           <w:b/>
@@ -5741,7 +6863,133 @@
         </w:tc>
       </w:tr>
     </w:tbl>
-    <w:p/>
+    <w:p>
+      <w:r>
+        <w:rPr>
+          <w:noProof/>
+          <w:lang w:bidi="es-ES"/>
+        </w:rPr>
+        <mc:AlternateContent>
+          <mc:Choice Requires="wps">
+            <w:drawing>
+              <wp:anchor distT="0" distB="0" distL="114300" distR="114300" simplePos="0" relativeHeight="251721728" behindDoc="1" locked="1" layoutInCell="1" allowOverlap="1" wp14:anchorId="0875440F" wp14:editId="0FAA7D8F">
+                <wp:simplePos x="0" y="0"/>
+                <wp:positionH relativeFrom="page">
+                  <wp:align>left</wp:align>
+                </wp:positionH>
+                <wp:positionV relativeFrom="paragraph">
+                  <wp:posOffset>-2324100</wp:posOffset>
+                </wp:positionV>
+                <wp:extent cx="1323975" cy="10828020"/>
+                <wp:effectExtent l="0" t="0" r="9525" b="0"/>
+                <wp:wrapNone/>
+                <wp:docPr id="1266176713" name="Rectángulo 2">
+                  <a:extLst xmlns:a="http://schemas.openxmlformats.org/drawingml/2006/main">
+                    <a:ext uri="{C183D7F6-B498-43B3-948B-1728B52AA6E4}">
+                      <adec:decorative xmlns:adec="http://schemas.microsoft.com/office/drawing/2017/decorative" val="1"/>
+                    </a:ext>
+                  </a:extLst>
+                </wp:docPr>
+                <wp:cNvGraphicFramePr/>
+                <a:graphic xmlns:a="http://schemas.openxmlformats.org/drawingml/2006/main">
+                  <a:graphicData uri="http://schemas.microsoft.com/office/word/2010/wordprocessingShape">
+                    <wps:wsp>
+                      <wps:cNvSpPr/>
+                      <wps:spPr>
+                        <a:xfrm>
+                          <a:off x="0" y="0"/>
+                          <a:ext cx="1323975" cy="10828020"/>
+                        </a:xfrm>
+                        <a:prstGeom prst="rect">
+                          <a:avLst/>
+                        </a:prstGeom>
+                        <a:solidFill>
+                          <a:schemeClr val="tx1">
+                            <a:lumMod val="75000"/>
+                            <a:lumOff val="25000"/>
+                          </a:schemeClr>
+                        </a:solidFill>
+                        <a:ln>
+                          <a:noFill/>
+                        </a:ln>
+                      </wps:spPr>
+                      <wps:style>
+                        <a:lnRef idx="2">
+                          <a:schemeClr val="accent1">
+                            <a:shade val="50000"/>
+                          </a:schemeClr>
+                        </a:lnRef>
+                        <a:fillRef idx="1">
+                          <a:schemeClr val="accent1"/>
+                        </a:fillRef>
+                        <a:effectRef idx="0">
+                          <a:schemeClr val="accent1"/>
+                        </a:effectRef>
+                        <a:fontRef idx="minor">
+                          <a:schemeClr val="lt1"/>
+                        </a:fontRef>
+                      </wps:style>
+                      <wps:txbx>
+                        <w:txbxContent>
+                          <w:p>
+                            <w:pPr>
+                              <w:pStyle w:val="Piedepginablanco"/>
+                            </w:pPr>
+                            <w:r>
+                              <w:rPr>
+                                <w:lang w:bidi="es-ES"/>
+                              </w:rPr>
+                              <w:t>14</w:t>
+                            </w:r>
+                          </w:p>
+                          <w:p/>
+                        </w:txbxContent>
+                      </wps:txbx>
+                      <wps:bodyPr rot="0" spcFirstLastPara="0" vertOverflow="overflow" horzOverflow="overflow" vert="horz" wrap="square" lIns="91440" tIns="45720" rIns="91440" bIns="45720" numCol="1" spcCol="0" rtlCol="0" fromWordArt="0" anchor="b" anchorCtr="0" forceAA="0" compatLnSpc="1">
+                        <a:prstTxWarp prst="textNoShape">
+                          <a:avLst/>
+                        </a:prstTxWarp>
+                        <a:noAutofit/>
+                      </wps:bodyPr>
+                    </wps:wsp>
+                  </a:graphicData>
+                </a:graphic>
+                <wp14:sizeRelH relativeFrom="margin">
+                  <wp14:pctWidth>0</wp14:pctWidth>
+                </wp14:sizeRelH>
+                <wp14:sizeRelV relativeFrom="margin">
+                  <wp14:pctHeight>0</wp14:pctHeight>
+                </wp14:sizeRelV>
+              </wp:anchor>
+            </w:drawing>
+          </mc:Choice>
+          <mc:Fallback>
+            <w:pict>
+              <v:rect w14:anchorId="0875440F" id="_x0000_s1043" alt="&quot;&quot;" style="position:absolute;margin-left:0;margin-top:-183pt;width:104.25pt;height:852.6pt;z-index:-251594752;visibility:visible;mso-wrap-style:square;mso-width-percent:0;mso-height-percent:0;mso-wrap-distance-left:9pt;mso-wrap-distance-top:0;mso-wrap-distance-right:9pt;mso-wrap-distance-bottom:0;mso-position-horizontal:left;mso-position-horizontal-relative:page;mso-position-vertical:absolute;mso-position-vertical-relative:text;mso-width-percent:0;mso-height-percent:0;mso-width-relative:margin;mso-height-relative:margin;v-text-anchor:bottom" o:gfxdata="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" fillcolor="#404040 [2429]" stroked="f" strokeweight="1pt">
+                <v:textbox>
+                  <w:txbxContent>
+                    <w:p>
+                      <w:pPr>
+                        <w:pStyle w:val="Piedepginablanco"/>
+                      </w:pPr>
+                      <w:r>
+                        <w:rPr>
+                          <w:lang w:bidi="es-ES"/>
+                        </w:rPr>
+                        <w:t>14</w:t>
+                      </w:r>
+                    </w:p>
+                    <w:p/>
+                  </w:txbxContent>
+                </v:textbox>
+                <w10:wrap anchorx="page"/>
+                <w10:anchorlock/>
+              </v:rect>
+            </w:pict>
+          </mc:Fallback>
+        </mc:AlternateContent>
+      </w:r>
+    </w:p>
     <w:sectPr>
       <w:footerReference w:type="default" r:id="rId27"/>
       <w:pgSz w:w="11906" w:h="16838" w:code="9"/>
@@ -8933,6 +10181,7 @@
   <w:style w:type="character" w:default="1" w:styleId="Fuentedeprrafopredeter">
     <w:name w:val="Default Paragraph Font"/>
     <w:uiPriority w:val="1"/>
+    <w:semiHidden/>
     <w:unhideWhenUsed/>
   </w:style>
   <w:style w:type="table" w:default="1" w:styleId="Tablanormal">
@@ -10796,6 +12045,7 @@
     <w:rsidRoot w:val="00FD7CF7"/>
     <w:rsid w:val="00025326"/>
     <w:rsid w:val="00041E79"/>
+    <w:rsid w:val="0007375E"/>
     <w:rsid w:val="00092183"/>
     <w:rsid w:val="000D44BA"/>
     <w:rsid w:val="000F4AE6"/>
@@ -11551,30 +12801,6 @@
       <w14:ligatures w14:val="standardContextual"/>
     </w:rPr>
   </w:style>
-  <w:style w:type="paragraph" w:customStyle="1" w:styleId="54E40328D5D64C90A6EF8250521A599A">
-    <w:name w:val="54E40328D5D64C90A6EF8250521A599A"/>
-    <w:rsid w:val="0050145C"/>
-    <w:pPr>
-      <w:spacing w:after="160" w:line="278" w:lineRule="auto"/>
-    </w:pPr>
-    <w:rPr>
-      <w:kern w:val="2"/>
-      <w:lang w:eastAsia="es-ES"/>
-      <w14:ligatures w14:val="standardContextual"/>
-    </w:rPr>
-  </w:style>
-  <w:style w:type="paragraph" w:customStyle="1" w:styleId="249DCEDF696348DBAAA48900D223A903">
-    <w:name w:val="249DCEDF696348DBAAA48900D223A903"/>
-    <w:rsid w:val="0098294F"/>
-    <w:pPr>
-      <w:spacing w:after="160" w:line="278" w:lineRule="auto"/>
-    </w:pPr>
-    <w:rPr>
-      <w:kern w:val="2"/>
-      <w:lang w:eastAsia="es-ES"/>
-      <w14:ligatures w14:val="standardContextual"/>
-    </w:rPr>
-  </w:style>
 </w:styles>
 </file>
 
@@ -11787,6 +13013,10 @@
 </file>
 
 <file path=customXml/item1.xml><?xml version="1.0" encoding="utf-8"?>
+<b:Sources xmlns:b="http://schemas.openxmlformats.org/officeDocument/2006/bibliography" xmlns="http://schemas.openxmlformats.org/officeDocument/2006/bibliography" SelectedStyle="/APASixthEditionOfficeOnline.xsl" StyleName="APA" Version="6"/>
+</file>
+
+<file path=customXml/item2.xml><?xml version="1.0" encoding="utf-8"?>
 <p:properties xmlns:p="http://schemas.microsoft.com/office/2006/metadata/properties" xmlns:xsi="http://www.w3.org/2001/XMLSchema-instance" xmlns:pc="http://schemas.microsoft.com/office/infopath/2007/PartnerControls">
   <documentManagement>
     <_ip_UnifiedCompliancePolicyUIAction xmlns="http://schemas.microsoft.com/sharepoint/v3" xsi:nil="true"/>
@@ -11806,11 +13036,16 @@
 </p:properties>
 </file>
 
-<file path=customXml/item2.xml><?xml version="1.0" encoding="utf-8"?>
-<b:Sources xmlns:b="http://schemas.openxmlformats.org/officeDocument/2006/bibliography" xmlns="http://schemas.openxmlformats.org/officeDocument/2006/bibliography" SelectedStyle="/APASixthEditionOfficeOnline.xsl" StyleName="APA" Version="6"/>
+<file path=customXml/item3.xml><?xml version="1.0" encoding="utf-8"?>
+<?mso-contentType ?>
+<FormTemplates xmlns="http://schemas.microsoft.com/sharepoint/v3/contenttype/forms">
+  <Display>DocumentLibraryForm</Display>
+  <Edit>DocumentLibraryForm</Edit>
+  <New>DocumentLibraryForm</New>
+</FormTemplates>
 </file>
 
-<file path=customXml/item3.xml><?xml version="1.0" encoding="utf-8"?>
+<file path=customXml/item4.xml><?xml version="1.0" encoding="utf-8"?>
 <ct:contentTypeSchema xmlns:ct="http://schemas.microsoft.com/office/2006/metadata/contentType" xmlns:ma="http://schemas.microsoft.com/office/2006/metadata/properties/metaAttributes" ct:_="" ma:_="" ma:contentTypeName="Document" ma:contentTypeID="0x01010079F111ED35F8CC479449609E8A0923A6" ma:contentTypeVersion="26" ma:contentTypeDescription="Create a new document." ma:contentTypeScope="" ma:versionID="ac37c1753acd5e330d2062ccec26ea66">
   <xsd:schema xmlns:xsd="http://www.w3.org/2001/XMLSchema" xmlns:xs="http://www.w3.org/2001/XMLSchema" xmlns:p="http://schemas.microsoft.com/office/2006/metadata/properties" xmlns:ns1="http://schemas.microsoft.com/sharepoint/v3" xmlns:ns2="71af3243-3dd4-4a8d-8c0d-dd76da1f02a5" xmlns:ns3="16c05727-aa75-4e4a-9b5f-8a80a1165891" xmlns:ns4="230e9df3-be65-4c73-a93b-d1236ebd677e" targetNamespace="http://schemas.microsoft.com/office/2006/metadata/properties" ma:root="true" ma:fieldsID="3b340c7101c92c5120abd06486f94548" ns1:_="" ns2:_="" ns3:_="" ns4:_="">
     <xsd:import namespace="http://schemas.microsoft.com/sharepoint/v3"/>
@@ -12110,16 +13345,15 @@
 </ct:contentTypeSchema>
 </file>
 
-<file path=customXml/item4.xml><?xml version="1.0" encoding="utf-8"?>
-<?mso-contentType ?>
-<FormTemplates xmlns="http://schemas.microsoft.com/sharepoint/v3/contenttype/forms">
-  <Display>DocumentLibraryForm</Display>
-  <Edit>DocumentLibraryForm</Edit>
-  <New>DocumentLibraryForm</New>
-</FormTemplates>
+<file path=customXml/itemProps1.xml><?xml version="1.0" encoding="utf-8"?>
+<ds:datastoreItem xmlns:ds="http://schemas.openxmlformats.org/officeDocument/2006/customXml" ds:itemID="{C36A12F8-4A9B-4F64-B978-B0EE1FD97EBF}">
+  <ds:schemaRefs>
+    <ds:schemaRef ds:uri="http://schemas.openxmlformats.org/officeDocument/2006/bibliography"/>
+  </ds:schemaRefs>
+</ds:datastoreItem>
 </file>
 
-<file path=customXml/itemProps1.xml><?xml version="1.0" encoding="utf-8"?>
+<file path=customXml/itemProps2.xml><?xml version="1.0" encoding="utf-8"?>
 <ds:datastoreItem xmlns:ds="http://schemas.openxmlformats.org/officeDocument/2006/customXml" ds:itemID="{E046B6FE-75F5-4A4A-ADF9-3D55C2808F6A}">
   <ds:schemaRefs>
     <ds:schemaRef ds:uri="http://schemas.microsoft.com/office/2006/metadata/properties"/>
@@ -12131,15 +13365,15 @@
 </ds:datastoreItem>
 </file>
 
-<file path=customXml/itemProps2.xml><?xml version="1.0" encoding="utf-8"?>
-<ds:datastoreItem xmlns:ds="http://schemas.openxmlformats.org/officeDocument/2006/customXml" ds:itemID="{C36A12F8-4A9B-4F64-B978-B0EE1FD97EBF}">
+<file path=customXml/itemProps3.xml><?xml version="1.0" encoding="utf-8"?>
+<ds:datastoreItem xmlns:ds="http://schemas.openxmlformats.org/officeDocument/2006/customXml" ds:itemID="{268A88EA-2CD1-4EB5-AD27-A1454BEC753F}">
   <ds:schemaRefs>
-    <ds:schemaRef ds:uri="http://schemas.openxmlformats.org/officeDocument/2006/bibliography"/>
+    <ds:schemaRef ds:uri="http://schemas.microsoft.com/sharepoint/v3/contenttype/forms"/>
   </ds:schemaRefs>
 </ds:datastoreItem>
 </file>
 
-<file path=customXml/itemProps3.xml><?xml version="1.0" encoding="utf-8"?>
+<file path=customXml/itemProps4.xml><?xml version="1.0" encoding="utf-8"?>
 <ds:datastoreItem xmlns:ds="http://schemas.openxmlformats.org/officeDocument/2006/customXml" ds:itemID="{3B486F6C-1123-466C-A9D5-986F0A3EF9D1}">
   <ds:schemaRefs>
     <ds:schemaRef ds:uri="http://schemas.microsoft.com/office/2006/metadata/contentType"/>
@@ -12160,14 +13394,6 @@
 </ds:datastoreItem>
 </file>
 
-<file path=customXml/itemProps4.xml><?xml version="1.0" encoding="utf-8"?>
-<ds:datastoreItem xmlns:ds="http://schemas.openxmlformats.org/officeDocument/2006/customXml" ds:itemID="{268A88EA-2CD1-4EB5-AD27-A1454BEC753F}">
-  <ds:schemaRefs>
-    <ds:schemaRef ds:uri="http://schemas.microsoft.com/sharepoint/v3/contenttype/forms"/>
-  </ds:schemaRefs>
-</ds:datastoreItem>
-</file>
-
 <file path=docMetadata/LabelInfo.xml><?xml version="1.0" encoding="utf-8"?>
 <clbl:labelList xmlns:clbl="http://schemas.microsoft.com/office/2020/mipLabelMetadata"/>
 </file>
</xml_diff>

<commit_message>
Cambios en organizacion y creacion modelos y esquemas BBDD
</commit_message>
<xml_diff>
--- a/SONAURA.docx
+++ b/SONAURA.docx
@@ -826,7 +826,6 @@
           <w:showingPlcHdr/>
           <w15:appearance w15:val="hidden"/>
         </w:sdtPr>
-        <w:sdtEndPr/>
         <w:sdtContent>
           <w:r>
             <w:rPr>
@@ -1450,7 +1449,6 @@
                 </w:placeholder>
                 <w15:appearance w15:val="hidden"/>
               </w:sdtPr>
-              <w:sdtEndPr/>
               <w:sdtContent>
                 <w:r>
                   <w:rPr>
@@ -1498,7 +1496,6 @@
                 </w:placeholder>
                 <w15:appearance w15:val="hidden"/>
               </w:sdtPr>
-              <w:sdtEndPr/>
               <w:sdtContent>
                 <w:r>
                   <w:t>SOBRE LA APLICACIÓN WEB</w:t>
@@ -2181,7 +2178,6 @@
                 </w:placeholder>
                 <w15:appearance w15:val="hidden"/>
               </w:sdtPr>
-              <w:sdtEndPr/>
               <w:sdtContent>
                 <w:r>
                   <w:rPr>
@@ -5762,7 +5758,7 @@
         </w:rPr>
         <w:lastRenderedPageBreak/>
         <w:drawing>
-          <wp:anchor distT="0" distB="0" distL="114300" distR="114300" simplePos="0" relativeHeight="251705344" behindDoc="0" locked="0" layoutInCell="1" allowOverlap="1" wp14:anchorId="3310DDFB" wp14:editId="3E58E6D8">
+          <wp:anchor distT="0" distB="0" distL="114300" distR="114300" simplePos="0" relativeHeight="251705344" behindDoc="0" locked="0" layoutInCell="1" allowOverlap="1" wp14:anchorId="3310DDFB" wp14:editId="2E95CD87">
             <wp:simplePos x="0" y="0"/>
             <wp:positionH relativeFrom="margin">
               <wp:align>left</wp:align>
@@ -6429,13 +6425,8 @@
               <w:t>Desarrollador</w:t>
             </w:r>
             <w:r>
-              <w:t xml:space="preserve"> Full </w:t>
+              <w:t xml:space="preserve"> Full Stack</w:t>
             </w:r>
-            <w:proofErr w:type="spellStart"/>
-            <w:r>
-              <w:t>Stack</w:t>
-            </w:r>
-            <w:proofErr w:type="spellEnd"/>
           </w:p>
         </w:tc>
         <w:tc>
@@ -12066,12 +12057,14 @@
     <w:rsid w:val="00706E66"/>
     <w:rsid w:val="007074DB"/>
     <w:rsid w:val="00721ADF"/>
+    <w:rsid w:val="007A04E3"/>
     <w:rsid w:val="00880F52"/>
     <w:rsid w:val="008C0080"/>
     <w:rsid w:val="0098294F"/>
     <w:rsid w:val="00A80C9D"/>
     <w:rsid w:val="00A86F88"/>
     <w:rsid w:val="00B0134D"/>
+    <w:rsid w:val="00B36636"/>
     <w:rsid w:val="00B506B8"/>
     <w:rsid w:val="00BD20EB"/>
     <w:rsid w:val="00C45535"/>
@@ -13013,10 +13006,6 @@
 </file>
 
 <file path=customXml/item1.xml><?xml version="1.0" encoding="utf-8"?>
-<b:Sources xmlns:b="http://schemas.openxmlformats.org/officeDocument/2006/bibliography" xmlns="http://schemas.openxmlformats.org/officeDocument/2006/bibliography" SelectedStyle="/APASixthEditionOfficeOnline.xsl" StyleName="APA" Version="6"/>
-</file>
-
-<file path=customXml/item2.xml><?xml version="1.0" encoding="utf-8"?>
 <p:properties xmlns:p="http://schemas.microsoft.com/office/2006/metadata/properties" xmlns:xsi="http://www.w3.org/2001/XMLSchema-instance" xmlns:pc="http://schemas.microsoft.com/office/infopath/2007/PartnerControls">
   <documentManagement>
     <_ip_UnifiedCompliancePolicyUIAction xmlns="http://schemas.microsoft.com/sharepoint/v3" xsi:nil="true"/>
@@ -13036,16 +13025,11 @@
 </p:properties>
 </file>
 
-<file path=customXml/item3.xml><?xml version="1.0" encoding="utf-8"?>
-<?mso-contentType ?>
-<FormTemplates xmlns="http://schemas.microsoft.com/sharepoint/v3/contenttype/forms">
-  <Display>DocumentLibraryForm</Display>
-  <Edit>DocumentLibraryForm</Edit>
-  <New>DocumentLibraryForm</New>
-</FormTemplates>
+<file path=customXml/item2.xml><?xml version="1.0" encoding="utf-8"?>
+<b:Sources xmlns:b="http://schemas.openxmlformats.org/officeDocument/2006/bibliography" xmlns="http://schemas.openxmlformats.org/officeDocument/2006/bibliography" SelectedStyle="/APASixthEditionOfficeOnline.xsl" StyleName="APA" Version="6"/>
 </file>
 
-<file path=customXml/item4.xml><?xml version="1.0" encoding="utf-8"?>
+<file path=customXml/item3.xml><?xml version="1.0" encoding="utf-8"?>
 <ct:contentTypeSchema xmlns:ct="http://schemas.microsoft.com/office/2006/metadata/contentType" xmlns:ma="http://schemas.microsoft.com/office/2006/metadata/properties/metaAttributes" ct:_="" ma:_="" ma:contentTypeName="Document" ma:contentTypeID="0x01010079F111ED35F8CC479449609E8A0923A6" ma:contentTypeVersion="26" ma:contentTypeDescription="Create a new document." ma:contentTypeScope="" ma:versionID="ac37c1753acd5e330d2062ccec26ea66">
   <xsd:schema xmlns:xsd="http://www.w3.org/2001/XMLSchema" xmlns:xs="http://www.w3.org/2001/XMLSchema" xmlns:p="http://schemas.microsoft.com/office/2006/metadata/properties" xmlns:ns1="http://schemas.microsoft.com/sharepoint/v3" xmlns:ns2="71af3243-3dd4-4a8d-8c0d-dd76da1f02a5" xmlns:ns3="16c05727-aa75-4e4a-9b5f-8a80a1165891" xmlns:ns4="230e9df3-be65-4c73-a93b-d1236ebd677e" targetNamespace="http://schemas.microsoft.com/office/2006/metadata/properties" ma:root="true" ma:fieldsID="3b340c7101c92c5120abd06486f94548" ns1:_="" ns2:_="" ns3:_="" ns4:_="">
     <xsd:import namespace="http://schemas.microsoft.com/sharepoint/v3"/>
@@ -13345,15 +13329,16 @@
 </ct:contentTypeSchema>
 </file>
 
-<file path=customXml/itemProps1.xml><?xml version="1.0" encoding="utf-8"?>
-<ds:datastoreItem xmlns:ds="http://schemas.openxmlformats.org/officeDocument/2006/customXml" ds:itemID="{C36A12F8-4A9B-4F64-B978-B0EE1FD97EBF}">
-  <ds:schemaRefs>
-    <ds:schemaRef ds:uri="http://schemas.openxmlformats.org/officeDocument/2006/bibliography"/>
-  </ds:schemaRefs>
-</ds:datastoreItem>
+<file path=customXml/item4.xml><?xml version="1.0" encoding="utf-8"?>
+<?mso-contentType ?>
+<FormTemplates xmlns="http://schemas.microsoft.com/sharepoint/v3/contenttype/forms">
+  <Display>DocumentLibraryForm</Display>
+  <Edit>DocumentLibraryForm</Edit>
+  <New>DocumentLibraryForm</New>
+</FormTemplates>
 </file>
 
-<file path=customXml/itemProps2.xml><?xml version="1.0" encoding="utf-8"?>
+<file path=customXml/itemProps1.xml><?xml version="1.0" encoding="utf-8"?>
 <ds:datastoreItem xmlns:ds="http://schemas.openxmlformats.org/officeDocument/2006/customXml" ds:itemID="{E046B6FE-75F5-4A4A-ADF9-3D55C2808F6A}">
   <ds:schemaRefs>
     <ds:schemaRef ds:uri="http://schemas.microsoft.com/office/2006/metadata/properties"/>
@@ -13365,15 +13350,15 @@
 </ds:datastoreItem>
 </file>
 
-<file path=customXml/itemProps3.xml><?xml version="1.0" encoding="utf-8"?>
-<ds:datastoreItem xmlns:ds="http://schemas.openxmlformats.org/officeDocument/2006/customXml" ds:itemID="{268A88EA-2CD1-4EB5-AD27-A1454BEC753F}">
+<file path=customXml/itemProps2.xml><?xml version="1.0" encoding="utf-8"?>
+<ds:datastoreItem xmlns:ds="http://schemas.openxmlformats.org/officeDocument/2006/customXml" ds:itemID="{C36A12F8-4A9B-4F64-B978-B0EE1FD97EBF}">
   <ds:schemaRefs>
-    <ds:schemaRef ds:uri="http://schemas.microsoft.com/sharepoint/v3/contenttype/forms"/>
+    <ds:schemaRef ds:uri="http://schemas.openxmlformats.org/officeDocument/2006/bibliography"/>
   </ds:schemaRefs>
 </ds:datastoreItem>
 </file>
 
-<file path=customXml/itemProps4.xml><?xml version="1.0" encoding="utf-8"?>
+<file path=customXml/itemProps3.xml><?xml version="1.0" encoding="utf-8"?>
 <ds:datastoreItem xmlns:ds="http://schemas.openxmlformats.org/officeDocument/2006/customXml" ds:itemID="{3B486F6C-1123-466C-A9D5-986F0A3EF9D1}">
   <ds:schemaRefs>
     <ds:schemaRef ds:uri="http://schemas.microsoft.com/office/2006/metadata/contentType"/>
@@ -13394,6 +13379,14 @@
 </ds:datastoreItem>
 </file>
 
+<file path=customXml/itemProps4.xml><?xml version="1.0" encoding="utf-8"?>
+<ds:datastoreItem xmlns:ds="http://schemas.openxmlformats.org/officeDocument/2006/customXml" ds:itemID="{268A88EA-2CD1-4EB5-AD27-A1454BEC753F}">
+  <ds:schemaRefs>
+    <ds:schemaRef ds:uri="http://schemas.microsoft.com/sharepoint/v3/contenttype/forms"/>
+  </ds:schemaRefs>
+</ds:datastoreItem>
+</file>
+
 <file path=docMetadata/LabelInfo.xml><?xml version="1.0" encoding="utf-8"?>
 <clbl:labelList xmlns:clbl="http://schemas.microsoft.com/office/2020/mipLabelMetadata"/>
 </file>
</xml_diff>